<commit_message>
feat: implementacao completa do CRUD de produtos (TASK-05), Optional e GlobalExceptionHandler para 404 e 400
</commit_message>
<xml_diff>
--- a/API Ecommerce.docx
+++ b/API Ecommerce.docx
@@ -6325,6 +6325,7 @@
       <w:r>
         <w:rPr>
           <w:rFonts w:asciiTheme="minorHAnsi" w:hAnsiTheme="minorHAnsi" w:cstheme="minorHAnsi"/>
+          <w:noProof/>
         </w:rPr>
         <w:drawing>
           <wp:inline distT="0" distB="0" distL="0" distR="0" wp14:anchorId="0E4B1F3A" wp14:editId="72F9BAA6">
@@ -6506,6 +6507,7 @@
       <w:r>
         <w:rPr>
           <w:rFonts w:asciiTheme="minorHAnsi" w:hAnsiTheme="minorHAnsi" w:cstheme="minorHAnsi"/>
+          <w:noProof/>
         </w:rPr>
         <w:drawing>
           <wp:inline distT="0" distB="0" distL="0" distR="0" wp14:anchorId="10C2D974" wp14:editId="5A286A63">
@@ -6635,6 +6637,7 @@
       <w:r>
         <w:rPr>
           <w:rFonts w:asciiTheme="minorHAnsi" w:hAnsiTheme="minorHAnsi" w:cstheme="minorHAnsi"/>
+          <w:noProof/>
         </w:rPr>
         <w:drawing>
           <wp:inline distT="0" distB="0" distL="0" distR="0" wp14:anchorId="3E5DA237" wp14:editId="6377484C">
@@ -6809,6 +6812,7 @@
       <w:r>
         <w:rPr>
           <w:rFonts w:asciiTheme="minorHAnsi" w:hAnsiTheme="minorHAnsi" w:cstheme="minorHAnsi"/>
+          <w:noProof/>
         </w:rPr>
         <w:drawing>
           <wp:inline distT="0" distB="0" distL="0" distR="0" wp14:anchorId="2425945C" wp14:editId="15F8A1C0">
@@ -6892,6 +6896,7 @@
       <w:r>
         <w:rPr>
           <w:rFonts w:asciiTheme="minorHAnsi" w:hAnsiTheme="minorHAnsi" w:cstheme="minorHAnsi"/>
+          <w:noProof/>
         </w:rPr>
         <w:drawing>
           <wp:inline distT="0" distB="0" distL="0" distR="0" wp14:anchorId="467760BA" wp14:editId="24235C85">
@@ -6987,6 +6992,7 @@
       <w:r>
         <w:rPr>
           <w:rFonts w:asciiTheme="minorHAnsi" w:hAnsiTheme="minorHAnsi" w:cstheme="minorHAnsi"/>
+          <w:noProof/>
         </w:rPr>
         <w:drawing>
           <wp:inline distT="0" distB="0" distL="0" distR="0" wp14:anchorId="73B74437" wp14:editId="6929F98E">
@@ -7553,6 +7559,7 @@
       <w:r>
         <w:rPr>
           <w:rFonts w:asciiTheme="minorHAnsi" w:hAnsiTheme="minorHAnsi" w:cstheme="minorHAnsi"/>
+          <w:noProof/>
         </w:rPr>
         <w:drawing>
           <wp:inline distT="0" distB="0" distL="0" distR="0" wp14:anchorId="23F1667B" wp14:editId="0AD6FEEB">
@@ -7698,6 +7705,7 @@
       <w:r>
         <w:rPr>
           <w:rFonts w:cstheme="minorHAnsi"/>
+          <w:noProof/>
         </w:rPr>
         <w:drawing>
           <wp:inline distT="0" distB="0" distL="0" distR="0" wp14:anchorId="7B69D3AA" wp14:editId="1DAE1C2F">
@@ -7753,6 +7761,2288 @@
         </w:rPr>
       </w:pPr>
     </w:p>
+    <w:p>
+      <w:pPr>
+        <w:pStyle w:val="NormalWeb"/>
+        <w:rPr>
+          <w:rFonts w:asciiTheme="minorHAnsi" w:hAnsiTheme="minorHAnsi" w:cstheme="minorHAnsi"/>
+        </w:rPr>
+      </w:pPr>
+    </w:p>
+    <w:p>
+      <w:pPr>
+        <w:pStyle w:val="NormalWeb"/>
+        <w:rPr>
+          <w:rFonts w:asciiTheme="minorHAnsi" w:hAnsiTheme="minorHAnsi" w:cstheme="minorHAnsi"/>
+        </w:rPr>
+      </w:pPr>
+    </w:p>
+    <w:p>
+      <w:pPr>
+        <w:pStyle w:val="NormalWeb"/>
+        <w:numPr>
+          <w:ilvl w:val="0"/>
+          <w:numId w:val="1"/>
+        </w:numPr>
+        <w:jc w:val="center"/>
+        <w:rPr>
+          <w:rFonts w:asciiTheme="minorHAnsi" w:hAnsiTheme="minorHAnsi" w:cstheme="minorHAnsi"/>
+          <w:b/>
+          <w:bCs/>
+          <w:sz w:val="32"/>
+          <w:szCs w:val="32"/>
+        </w:rPr>
+      </w:pPr>
+      <w:r>
+        <w:rPr>
+          <w:rFonts w:asciiTheme="minorHAnsi" w:hAnsiTheme="minorHAnsi" w:cstheme="minorHAnsi"/>
+          <w:b/>
+          <w:bCs/>
+          <w:sz w:val="32"/>
+          <w:szCs w:val="32"/>
+        </w:rPr>
+        <w:lastRenderedPageBreak/>
+        <w:t>TASK-05: Fechamento do CRUD (GET por ID, PUT e DELETE) + Tratamento de 404</w:t>
+      </w:r>
+    </w:p>
+    <w:p>
+      <w:pPr>
+        <w:pStyle w:val="Ttulo2"/>
+        <w:rPr>
+          <w:rFonts w:asciiTheme="minorHAnsi" w:hAnsiTheme="minorHAnsi" w:cstheme="minorHAnsi"/>
+          <w:sz w:val="24"/>
+          <w:szCs w:val="24"/>
+        </w:rPr>
+      </w:pPr>
+      <w:r>
+        <w:rPr>
+          <w:rFonts w:asciiTheme="minorHAnsi" w:hAnsiTheme="minorHAnsi" w:cstheme="minorHAnsi"/>
+          <w:sz w:val="24"/>
+          <w:szCs w:val="24"/>
+        </w:rPr>
+        <w:t>Visão de Negócio:</w:t>
+      </w:r>
+    </w:p>
+    <w:p>
+      <w:pPr>
+        <w:pStyle w:val="NormalWeb"/>
+        <w:rPr>
+          <w:rFonts w:asciiTheme="minorHAnsi" w:hAnsiTheme="minorHAnsi" w:cstheme="minorHAnsi"/>
+        </w:rPr>
+      </w:pPr>
+      <w:r>
+        <w:rPr>
+          <w:rFonts w:asciiTheme="minorHAnsi" w:hAnsiTheme="minorHAnsi" w:cstheme="minorHAnsi"/>
+          <w:i/>
+          <w:iCs/>
+        </w:rPr>
+        <w:t xml:space="preserve">"Agora que o cadastro e a listagem geral estão operacionais, o e-commerce precisa consultar itens específicos (por ID), atualizar informações (como alteração de preço ou ajuste de estoque) e remover produtos descontinuados. Caso a requisição tente manipular um ID que não existe na base de dados, a API deve responder com um status </w:t>
+      </w:r>
+      <w:r>
+        <w:rPr>
+          <w:rStyle w:val="CdigoHTML"/>
+          <w:rFonts w:asciiTheme="minorHAnsi" w:eastAsiaTheme="majorEastAsia" w:hAnsiTheme="minorHAnsi" w:cstheme="minorHAnsi"/>
+          <w:i/>
+          <w:iCs/>
+          <w:sz w:val="24"/>
+          <w:szCs w:val="24"/>
+        </w:rPr>
+        <w:t xml:space="preserve">404 Not </w:t>
+      </w:r>
+      <w:proofErr w:type="spellStart"/>
+      <w:r>
+        <w:rPr>
+          <w:rStyle w:val="CdigoHTML"/>
+          <w:rFonts w:asciiTheme="minorHAnsi" w:eastAsiaTheme="majorEastAsia" w:hAnsiTheme="minorHAnsi" w:cstheme="minorHAnsi"/>
+          <w:i/>
+          <w:iCs/>
+          <w:sz w:val="24"/>
+          <w:szCs w:val="24"/>
+        </w:rPr>
+        <w:t>Found</w:t>
+      </w:r>
+      <w:proofErr w:type="spellEnd"/>
+      <w:r>
+        <w:rPr>
+          <w:rFonts w:asciiTheme="minorHAnsi" w:hAnsiTheme="minorHAnsi" w:cstheme="minorHAnsi"/>
+          <w:i/>
+          <w:iCs/>
+        </w:rPr>
+        <w:t xml:space="preserve"> estruturado no nosso </w:t>
+      </w:r>
+      <w:proofErr w:type="spellStart"/>
+      <w:r>
+        <w:rPr>
+          <w:rStyle w:val="CdigoHTML"/>
+          <w:rFonts w:asciiTheme="minorHAnsi" w:eastAsiaTheme="majorEastAsia" w:hAnsiTheme="minorHAnsi" w:cstheme="minorHAnsi"/>
+          <w:i/>
+          <w:iCs/>
+          <w:sz w:val="24"/>
+          <w:szCs w:val="24"/>
+        </w:rPr>
+        <w:t>StandardErrorDTO</w:t>
+      </w:r>
+      <w:proofErr w:type="spellEnd"/>
+      <w:r>
+        <w:rPr>
+          <w:rFonts w:asciiTheme="minorHAnsi" w:hAnsiTheme="minorHAnsi" w:cstheme="minorHAnsi"/>
+          <w:i/>
+          <w:iCs/>
+        </w:rPr>
+        <w:t>."</w:t>
+      </w:r>
+    </w:p>
+    <w:p>
+      <w:pPr>
+        <w:pStyle w:val="Ttulo2"/>
+        <w:rPr>
+          <w:rFonts w:asciiTheme="minorHAnsi" w:hAnsiTheme="minorHAnsi" w:cstheme="minorHAnsi"/>
+          <w:sz w:val="24"/>
+          <w:szCs w:val="24"/>
+        </w:rPr>
+      </w:pPr>
+      <w:r>
+        <w:rPr>
+          <w:rFonts w:asciiTheme="minorHAnsi" w:hAnsiTheme="minorHAnsi" w:cstheme="minorHAnsi"/>
+          <w:sz w:val="24"/>
+          <w:szCs w:val="24"/>
+        </w:rPr>
+        <w:t>Seus Desafios de Desenvolvimento:</w:t>
+      </w:r>
+    </w:p>
+    <w:p>
+      <w:pPr>
+        <w:pStyle w:val="Ttulo3"/>
+        <w:rPr>
+          <w:rFonts w:asciiTheme="minorHAnsi" w:hAnsiTheme="minorHAnsi" w:cstheme="minorHAnsi"/>
+        </w:rPr>
+      </w:pPr>
+      <w:r>
+        <w:rPr>
+          <w:rFonts w:asciiTheme="minorHAnsi" w:hAnsiTheme="minorHAnsi" w:cstheme="minorHAnsi"/>
+        </w:rPr>
+        <w:t>1. Exceção Customizada de Recurso Não Encontrado</w:t>
+      </w:r>
+    </w:p>
+    <w:p>
+      <w:pPr>
+        <w:pStyle w:val="NormalWeb"/>
+        <w:numPr>
+          <w:ilvl w:val="0"/>
+          <w:numId w:val="25"/>
+        </w:numPr>
+        <w:rPr>
+          <w:rFonts w:asciiTheme="minorHAnsi" w:hAnsiTheme="minorHAnsi" w:cstheme="minorHAnsi"/>
+        </w:rPr>
+      </w:pPr>
+      <w:r>
+        <w:rPr>
+          <w:rFonts w:asciiTheme="minorHAnsi" w:hAnsiTheme="minorHAnsi" w:cstheme="minorHAnsi"/>
+          <w:b/>
+          <w:bCs/>
+        </w:rPr>
+        <w:t>O que fazer:</w:t>
+      </w:r>
+      <w:r>
+        <w:rPr>
+          <w:rFonts w:asciiTheme="minorHAnsi" w:hAnsiTheme="minorHAnsi" w:cstheme="minorHAnsi"/>
+        </w:rPr>
+        <w:t xml:space="preserve"> Crie uma nova classe de exceção para representar casos em que um produto pesquisado pelo ID não é encontrado.</w:t>
+      </w:r>
+    </w:p>
+    <w:p>
+      <w:pPr>
+        <w:pStyle w:val="NormalWeb"/>
+        <w:numPr>
+          <w:ilvl w:val="0"/>
+          <w:numId w:val="25"/>
+        </w:numPr>
+        <w:rPr>
+          <w:rFonts w:asciiTheme="minorHAnsi" w:hAnsiTheme="minorHAnsi" w:cstheme="minorHAnsi"/>
+        </w:rPr>
+      </w:pPr>
+      <w:r>
+        <w:rPr>
+          <w:rFonts w:asciiTheme="minorHAnsi" w:hAnsiTheme="minorHAnsi" w:cstheme="minorHAnsi"/>
+          <w:b/>
+          <w:bCs/>
+        </w:rPr>
+        <w:t>Ponto de atenção:</w:t>
+      </w:r>
+      <w:r>
+        <w:rPr>
+          <w:rFonts w:asciiTheme="minorHAnsi" w:hAnsiTheme="minorHAnsi" w:cstheme="minorHAnsi"/>
+        </w:rPr>
+        <w:t xml:space="preserve"> Lembre-se de qual classe padrão do Java ela deve herdar para funcionar como uma exceção não checada (</w:t>
+      </w:r>
+      <w:proofErr w:type="spellStart"/>
+      <w:r>
+        <w:rPr>
+          <w:rFonts w:asciiTheme="minorHAnsi" w:hAnsiTheme="minorHAnsi" w:cstheme="minorHAnsi"/>
+        </w:rPr>
+        <w:t>runtime</w:t>
+      </w:r>
+      <w:proofErr w:type="spellEnd"/>
+      <w:r>
+        <w:rPr>
+          <w:rFonts w:asciiTheme="minorHAnsi" w:hAnsiTheme="minorHAnsi" w:cstheme="minorHAnsi"/>
+        </w:rPr>
+        <w:t>).</w:t>
+      </w:r>
+    </w:p>
+    <w:p>
+      <w:pPr>
+        <w:pStyle w:val="NormalWeb"/>
+        <w:rPr>
+          <w:rFonts w:asciiTheme="minorHAnsi" w:hAnsiTheme="minorHAnsi" w:cstheme="minorHAnsi"/>
+        </w:rPr>
+      </w:pPr>
+      <w:r>
+        <w:rPr>
+          <w:rFonts w:asciiTheme="minorHAnsi" w:hAnsiTheme="minorHAnsi" w:cstheme="minorHAnsi"/>
+        </w:rPr>
+        <w:drawing>
+          <wp:inline distT="0" distB="0" distL="0" distR="0" wp14:anchorId="0598385F" wp14:editId="5B822D70">
+            <wp:extent cx="5908431" cy="1358900"/>
+            <wp:effectExtent l="0" t="0" r="0" b="0"/>
+            <wp:docPr id="17" name="Imagem 17"/>
+            <wp:cNvGraphicFramePr>
+              <a:graphicFrameLocks xmlns:a="http://schemas.openxmlformats.org/drawingml/2006/main" noChangeAspect="1"/>
+            </wp:cNvGraphicFramePr>
+            <a:graphic xmlns:a="http://schemas.openxmlformats.org/drawingml/2006/main">
+              <a:graphicData uri="http://schemas.openxmlformats.org/drawingml/2006/picture">
+                <pic:pic xmlns:pic="http://schemas.openxmlformats.org/drawingml/2006/picture">
+                  <pic:nvPicPr>
+                    <pic:cNvPr id="1" name=""/>
+                    <pic:cNvPicPr/>
+                  </pic:nvPicPr>
+                  <pic:blipFill>
+                    <a:blip r:embed="rId25"/>
+                    <a:stretch>
+                      <a:fillRect/>
+                    </a:stretch>
+                  </pic:blipFill>
+                  <pic:spPr>
+                    <a:xfrm>
+                      <a:off x="0" y="0"/>
+                      <a:ext cx="5910188" cy="1359304"/>
+                    </a:xfrm>
+                    <a:prstGeom prst="rect">
+                      <a:avLst/>
+                    </a:prstGeom>
+                  </pic:spPr>
+                </pic:pic>
+              </a:graphicData>
+            </a:graphic>
+          </wp:inline>
+        </w:drawing>
+      </w:r>
+    </w:p>
+    <w:p>
+      <w:pPr>
+        <w:pStyle w:val="Ttulo3"/>
+        <w:rPr>
+          <w:rFonts w:asciiTheme="minorHAnsi" w:hAnsiTheme="minorHAnsi" w:cstheme="minorHAnsi"/>
+        </w:rPr>
+      </w:pPr>
+      <w:r>
+        <w:rPr>
+          <w:rFonts w:asciiTheme="minorHAnsi" w:hAnsiTheme="minorHAnsi" w:cstheme="minorHAnsi"/>
+        </w:rPr>
+        <w:t xml:space="preserve">2. Mapeamento no </w:t>
+      </w:r>
+      <w:proofErr w:type="spellStart"/>
+      <w:r>
+        <w:rPr>
+          <w:rFonts w:asciiTheme="minorHAnsi" w:hAnsiTheme="minorHAnsi" w:cstheme="minorHAnsi"/>
+        </w:rPr>
+        <w:t>Handler</w:t>
+      </w:r>
+      <w:proofErr w:type="spellEnd"/>
+      <w:r>
+        <w:rPr>
+          <w:rFonts w:asciiTheme="minorHAnsi" w:hAnsiTheme="minorHAnsi" w:cstheme="minorHAnsi"/>
+        </w:rPr>
+        <w:t xml:space="preserve"> Global (</w:t>
+      </w:r>
+      <w:proofErr w:type="spellStart"/>
+      <w:r>
+        <w:rPr>
+          <w:rStyle w:val="CdigoHTML"/>
+          <w:rFonts w:asciiTheme="minorHAnsi" w:eastAsiaTheme="majorEastAsia" w:hAnsiTheme="minorHAnsi" w:cstheme="minorHAnsi"/>
+          <w:sz w:val="24"/>
+          <w:szCs w:val="24"/>
+        </w:rPr>
+        <w:t>GlobalExceptionHandler</w:t>
+      </w:r>
+      <w:proofErr w:type="spellEnd"/>
+      <w:r>
+        <w:rPr>
+          <w:rFonts w:asciiTheme="minorHAnsi" w:hAnsiTheme="minorHAnsi" w:cstheme="minorHAnsi"/>
+        </w:rPr>
+        <w:t>)</w:t>
+      </w:r>
+    </w:p>
+    <w:p>
+      <w:pPr>
+        <w:pStyle w:val="NormalWeb"/>
+        <w:numPr>
+          <w:ilvl w:val="0"/>
+          <w:numId w:val="26"/>
+        </w:numPr>
+        <w:rPr>
+          <w:rFonts w:asciiTheme="minorHAnsi" w:hAnsiTheme="minorHAnsi" w:cstheme="minorHAnsi"/>
+        </w:rPr>
+      </w:pPr>
+      <w:r>
+        <w:rPr>
+          <w:rFonts w:asciiTheme="minorHAnsi" w:hAnsiTheme="minorHAnsi" w:cstheme="minorHAnsi"/>
+          <w:b/>
+          <w:bCs/>
+        </w:rPr>
+        <w:t>O que fazer:</w:t>
+      </w:r>
+      <w:r>
+        <w:rPr>
+          <w:rFonts w:asciiTheme="minorHAnsi" w:hAnsiTheme="minorHAnsi" w:cstheme="minorHAnsi"/>
+        </w:rPr>
+        <w:t xml:space="preserve"> Adicione um método no seu </w:t>
+      </w:r>
+      <w:r>
+        <w:rPr>
+          <w:rStyle w:val="CdigoHTML"/>
+          <w:rFonts w:asciiTheme="minorHAnsi" w:hAnsiTheme="minorHAnsi" w:cstheme="minorHAnsi"/>
+          <w:sz w:val="24"/>
+          <w:szCs w:val="24"/>
+        </w:rPr>
+        <w:t>@RestControllerAdvice</w:t>
+      </w:r>
+      <w:r>
+        <w:rPr>
+          <w:rFonts w:asciiTheme="minorHAnsi" w:hAnsiTheme="minorHAnsi" w:cstheme="minorHAnsi"/>
+        </w:rPr>
+        <w:t xml:space="preserve"> focado em capturar essa nova exceção.</w:t>
+      </w:r>
+    </w:p>
+    <w:p>
+      <w:pPr>
+        <w:pStyle w:val="NormalWeb"/>
+        <w:numPr>
+          <w:ilvl w:val="0"/>
+          <w:numId w:val="26"/>
+        </w:numPr>
+        <w:rPr>
+          <w:rFonts w:asciiTheme="minorHAnsi" w:hAnsiTheme="minorHAnsi" w:cstheme="minorHAnsi"/>
+        </w:rPr>
+      </w:pPr>
+      <w:r>
+        <w:rPr>
+          <w:rFonts w:asciiTheme="minorHAnsi" w:hAnsiTheme="minorHAnsi" w:cstheme="minorHAnsi"/>
+          <w:b/>
+          <w:bCs/>
+        </w:rPr>
+        <w:t>Ponto de atenção:</w:t>
+      </w:r>
+      <w:r>
+        <w:rPr>
+          <w:rFonts w:asciiTheme="minorHAnsi" w:hAnsiTheme="minorHAnsi" w:cstheme="minorHAnsi"/>
+        </w:rPr>
+        <w:t xml:space="preserve"> Configure a resposta HTTP para usar o código </w:t>
+      </w:r>
+      <w:r>
+        <w:rPr>
+          <w:rStyle w:val="CdigoHTML"/>
+          <w:rFonts w:asciiTheme="minorHAnsi" w:hAnsiTheme="minorHAnsi" w:cstheme="minorHAnsi"/>
+          <w:sz w:val="24"/>
+          <w:szCs w:val="24"/>
+        </w:rPr>
+        <w:t>404 NOT FOUND</w:t>
+      </w:r>
+      <w:r>
+        <w:rPr>
+          <w:rFonts w:asciiTheme="minorHAnsi" w:hAnsiTheme="minorHAnsi" w:cstheme="minorHAnsi"/>
+        </w:rPr>
+        <w:t xml:space="preserve"> e instancie o seu </w:t>
+      </w:r>
+      <w:proofErr w:type="spellStart"/>
+      <w:r>
+        <w:rPr>
+          <w:rStyle w:val="CdigoHTML"/>
+          <w:rFonts w:asciiTheme="minorHAnsi" w:hAnsiTheme="minorHAnsi" w:cstheme="minorHAnsi"/>
+          <w:sz w:val="24"/>
+          <w:szCs w:val="24"/>
+        </w:rPr>
+        <w:t>StandardErrorDTO</w:t>
+      </w:r>
+      <w:proofErr w:type="spellEnd"/>
+      <w:r>
+        <w:rPr>
+          <w:rFonts w:asciiTheme="minorHAnsi" w:hAnsiTheme="minorHAnsi" w:cstheme="minorHAnsi"/>
+        </w:rPr>
+        <w:t xml:space="preserve"> passando o caminho da requisição e a mensagem da exceção.</w:t>
+      </w:r>
+    </w:p>
+    <w:p>
+      <w:pPr>
+        <w:pStyle w:val="NormalWeb"/>
+        <w:rPr>
+          <w:rFonts w:asciiTheme="minorHAnsi" w:hAnsiTheme="minorHAnsi" w:cstheme="minorHAnsi"/>
+        </w:rPr>
+      </w:pPr>
+      <w:r>
+        <w:rPr>
+          <w:rFonts w:asciiTheme="minorHAnsi" w:hAnsiTheme="minorHAnsi" w:cstheme="minorHAnsi"/>
+        </w:rPr>
+        <w:drawing>
+          <wp:inline distT="0" distB="0" distL="0" distR="0" wp14:anchorId="7C36D4E5" wp14:editId="471EB225">
+            <wp:extent cx="5926015" cy="2021840"/>
+            <wp:effectExtent l="0" t="0" r="0" b="0"/>
+            <wp:docPr id="23" name="Imagem 23"/>
+            <wp:cNvGraphicFramePr>
+              <a:graphicFrameLocks xmlns:a="http://schemas.openxmlformats.org/drawingml/2006/main" noChangeAspect="1"/>
+            </wp:cNvGraphicFramePr>
+            <a:graphic xmlns:a="http://schemas.openxmlformats.org/drawingml/2006/main">
+              <a:graphicData uri="http://schemas.openxmlformats.org/drawingml/2006/picture">
+                <pic:pic xmlns:pic="http://schemas.openxmlformats.org/drawingml/2006/picture">
+                  <pic:nvPicPr>
+                    <pic:cNvPr id="1" name=""/>
+                    <pic:cNvPicPr/>
+                  </pic:nvPicPr>
+                  <pic:blipFill>
+                    <a:blip r:embed="rId26"/>
+                    <a:stretch>
+                      <a:fillRect/>
+                    </a:stretch>
+                  </pic:blipFill>
+                  <pic:spPr>
+                    <a:xfrm>
+                      <a:off x="0" y="0"/>
+                      <a:ext cx="5950978" cy="2030357"/>
+                    </a:xfrm>
+                    <a:prstGeom prst="rect">
+                      <a:avLst/>
+                    </a:prstGeom>
+                  </pic:spPr>
+                </pic:pic>
+              </a:graphicData>
+            </a:graphic>
+          </wp:inline>
+        </w:drawing>
+      </w:r>
+    </w:p>
+    <w:p>
+      <w:pPr>
+        <w:pStyle w:val="Ttulo3"/>
+        <w:rPr>
+          <w:rFonts w:asciiTheme="minorHAnsi" w:hAnsiTheme="minorHAnsi" w:cstheme="minorHAnsi"/>
+        </w:rPr>
+      </w:pPr>
+      <w:r>
+        <w:rPr>
+          <w:rFonts w:asciiTheme="minorHAnsi" w:hAnsiTheme="minorHAnsi" w:cstheme="minorHAnsi"/>
+        </w:rPr>
+        <w:lastRenderedPageBreak/>
+        <w:t>3. Regras de Negócio na Camada de Serviço (</w:t>
+      </w:r>
+      <w:proofErr w:type="spellStart"/>
+      <w:r>
+        <w:rPr>
+          <w:rStyle w:val="CdigoHTML"/>
+          <w:rFonts w:asciiTheme="minorHAnsi" w:eastAsiaTheme="majorEastAsia" w:hAnsiTheme="minorHAnsi" w:cstheme="minorHAnsi"/>
+          <w:sz w:val="24"/>
+          <w:szCs w:val="24"/>
+        </w:rPr>
+        <w:t>ProdutoService</w:t>
+      </w:r>
+      <w:proofErr w:type="spellEnd"/>
+      <w:r>
+        <w:rPr>
+          <w:rFonts w:asciiTheme="minorHAnsi" w:hAnsiTheme="minorHAnsi" w:cstheme="minorHAnsi"/>
+        </w:rPr>
+        <w:t>)</w:t>
+      </w:r>
+    </w:p>
+    <w:p>
+      <w:pPr>
+        <w:pStyle w:val="NormalWeb"/>
+        <w:numPr>
+          <w:ilvl w:val="0"/>
+          <w:numId w:val="27"/>
+        </w:numPr>
+        <w:rPr>
+          <w:rFonts w:asciiTheme="minorHAnsi" w:hAnsiTheme="minorHAnsi" w:cstheme="minorHAnsi"/>
+        </w:rPr>
+      </w:pPr>
+      <w:r>
+        <w:rPr>
+          <w:rFonts w:asciiTheme="minorHAnsi" w:hAnsiTheme="minorHAnsi" w:cstheme="minorHAnsi"/>
+          <w:b/>
+          <w:bCs/>
+        </w:rPr>
+        <w:t>Buscar por ID:</w:t>
+      </w:r>
+      <w:r>
+        <w:rPr>
+          <w:rFonts w:asciiTheme="minorHAnsi" w:hAnsiTheme="minorHAnsi" w:cstheme="minorHAnsi"/>
+        </w:rPr>
+        <w:t xml:space="preserve"> Utilize o método do repositório que busca por ID e retorna um </w:t>
+      </w:r>
+      <w:proofErr w:type="spellStart"/>
+      <w:r>
+        <w:rPr>
+          <w:rStyle w:val="CdigoHTML"/>
+          <w:rFonts w:asciiTheme="minorHAnsi" w:hAnsiTheme="minorHAnsi" w:cstheme="minorHAnsi"/>
+          <w:sz w:val="24"/>
+          <w:szCs w:val="24"/>
+        </w:rPr>
+        <w:t>Optional</w:t>
+      </w:r>
+      <w:proofErr w:type="spellEnd"/>
+      <w:r>
+        <w:rPr>
+          <w:rFonts w:asciiTheme="minorHAnsi" w:hAnsiTheme="minorHAnsi" w:cstheme="minorHAnsi"/>
+        </w:rPr>
+        <w:t>. Se o objeto estiver presente, retorne-o; se estiver vazio, lance a sua exceção de recurso não encontrado.</w:t>
+      </w:r>
+    </w:p>
+    <w:p>
+      <w:pPr>
+        <w:pStyle w:val="NormalWeb"/>
+        <w:rPr>
+          <w:rFonts w:asciiTheme="minorHAnsi" w:hAnsiTheme="minorHAnsi" w:cstheme="minorHAnsi"/>
+        </w:rPr>
+      </w:pPr>
+      <w:r>
+        <w:rPr>
+          <w:rFonts w:asciiTheme="minorHAnsi" w:hAnsiTheme="minorHAnsi" w:cstheme="minorHAnsi"/>
+          <w:b/>
+          <w:bCs/>
+        </w:rPr>
+        <w:t>Service</w:t>
+      </w:r>
+      <w:r>
+        <w:rPr>
+          <w:rFonts w:asciiTheme="minorHAnsi" w:hAnsiTheme="minorHAnsi" w:cstheme="minorHAnsi"/>
+        </w:rPr>
+        <w:t>:</w:t>
+      </w:r>
+      <w:r>
+        <w:rPr>
+          <w:rFonts w:asciiTheme="minorHAnsi" w:hAnsiTheme="minorHAnsi" w:cstheme="minorHAnsi"/>
+        </w:rPr>
+        <w:br/>
+      </w:r>
+      <w:r>
+        <w:rPr>
+          <w:rFonts w:asciiTheme="minorHAnsi" w:hAnsiTheme="minorHAnsi" w:cstheme="minorHAnsi"/>
+        </w:rPr>
+        <w:drawing>
+          <wp:inline distT="0" distB="0" distL="0" distR="0" wp14:anchorId="6169DB82" wp14:editId="21A81F36">
+            <wp:extent cx="5926015" cy="1589405"/>
+            <wp:effectExtent l="0" t="0" r="0" b="0"/>
+            <wp:docPr id="25" name="Imagem 25"/>
+            <wp:cNvGraphicFramePr>
+              <a:graphicFrameLocks xmlns:a="http://schemas.openxmlformats.org/drawingml/2006/main" noChangeAspect="1"/>
+            </wp:cNvGraphicFramePr>
+            <a:graphic xmlns:a="http://schemas.openxmlformats.org/drawingml/2006/main">
+              <a:graphicData uri="http://schemas.openxmlformats.org/drawingml/2006/picture">
+                <pic:pic xmlns:pic="http://schemas.openxmlformats.org/drawingml/2006/picture">
+                  <pic:nvPicPr>
+                    <pic:cNvPr id="1" name=""/>
+                    <pic:cNvPicPr/>
+                  </pic:nvPicPr>
+                  <pic:blipFill>
+                    <a:blip r:embed="rId27"/>
+                    <a:stretch>
+                      <a:fillRect/>
+                    </a:stretch>
+                  </pic:blipFill>
+                  <pic:spPr>
+                    <a:xfrm>
+                      <a:off x="0" y="0"/>
+                      <a:ext cx="5940132" cy="1593191"/>
+                    </a:xfrm>
+                    <a:prstGeom prst="rect">
+                      <a:avLst/>
+                    </a:prstGeom>
+                  </pic:spPr>
+                </pic:pic>
+              </a:graphicData>
+            </a:graphic>
+          </wp:inline>
+        </w:drawing>
+      </w:r>
+    </w:p>
+    <w:p>
+      <w:pPr>
+        <w:pStyle w:val="NormalWeb"/>
+        <w:rPr>
+          <w:rFonts w:asciiTheme="minorHAnsi" w:hAnsiTheme="minorHAnsi" w:cstheme="minorHAnsi"/>
+        </w:rPr>
+      </w:pPr>
+      <w:proofErr w:type="spellStart"/>
+      <w:r>
+        <w:rPr>
+          <w:rFonts w:asciiTheme="minorHAnsi" w:hAnsiTheme="minorHAnsi" w:cstheme="minorHAnsi"/>
+          <w:b/>
+          <w:bCs/>
+        </w:rPr>
+        <w:t>Controller</w:t>
+      </w:r>
+      <w:proofErr w:type="spellEnd"/>
+      <w:r>
+        <w:rPr>
+          <w:rFonts w:asciiTheme="minorHAnsi" w:hAnsiTheme="minorHAnsi" w:cstheme="minorHAnsi"/>
+        </w:rPr>
+        <w:t>:</w:t>
+      </w:r>
+    </w:p>
+    <w:p>
+      <w:pPr>
+        <w:pStyle w:val="NormalWeb"/>
+        <w:rPr>
+          <w:rFonts w:asciiTheme="minorHAnsi" w:hAnsiTheme="minorHAnsi" w:cstheme="minorHAnsi"/>
+        </w:rPr>
+      </w:pPr>
+      <w:r>
+        <w:rPr>
+          <w:rFonts w:asciiTheme="minorHAnsi" w:hAnsiTheme="minorHAnsi" w:cstheme="minorHAnsi"/>
+        </w:rPr>
+        <w:drawing>
+          <wp:inline distT="0" distB="0" distL="0" distR="0" wp14:anchorId="11A1993B" wp14:editId="5A71A636">
+            <wp:extent cx="5400040" cy="685165"/>
+            <wp:effectExtent l="0" t="0" r="0" b="635"/>
+            <wp:docPr id="26" name="Imagem 26"/>
+            <wp:cNvGraphicFramePr>
+              <a:graphicFrameLocks xmlns:a="http://schemas.openxmlformats.org/drawingml/2006/main" noChangeAspect="1"/>
+            </wp:cNvGraphicFramePr>
+            <a:graphic xmlns:a="http://schemas.openxmlformats.org/drawingml/2006/main">
+              <a:graphicData uri="http://schemas.openxmlformats.org/drawingml/2006/picture">
+                <pic:pic xmlns:pic="http://schemas.openxmlformats.org/drawingml/2006/picture">
+                  <pic:nvPicPr>
+                    <pic:cNvPr id="1" name=""/>
+                    <pic:cNvPicPr/>
+                  </pic:nvPicPr>
+                  <pic:blipFill>
+                    <a:blip r:embed="rId28"/>
+                    <a:stretch>
+                      <a:fillRect/>
+                    </a:stretch>
+                  </pic:blipFill>
+                  <pic:spPr>
+                    <a:xfrm>
+                      <a:off x="0" y="0"/>
+                      <a:ext cx="5400040" cy="685165"/>
+                    </a:xfrm>
+                    <a:prstGeom prst="rect">
+                      <a:avLst/>
+                    </a:prstGeom>
+                  </pic:spPr>
+                </pic:pic>
+              </a:graphicData>
+            </a:graphic>
+          </wp:inline>
+        </w:drawing>
+      </w:r>
+    </w:p>
+    <w:p>
+      <w:pPr>
+        <w:pStyle w:val="NormalWeb"/>
+        <w:rPr>
+          <w:rFonts w:asciiTheme="minorHAnsi" w:hAnsiTheme="minorHAnsi" w:cstheme="minorHAnsi"/>
+        </w:rPr>
+      </w:pPr>
+    </w:p>
+    <w:p>
+      <w:pPr>
+        <w:pStyle w:val="NormalWeb"/>
+        <w:numPr>
+          <w:ilvl w:val="0"/>
+          <w:numId w:val="27"/>
+        </w:numPr>
+        <w:rPr>
+          <w:rFonts w:asciiTheme="minorHAnsi" w:hAnsiTheme="minorHAnsi" w:cstheme="minorHAnsi"/>
+        </w:rPr>
+      </w:pPr>
+      <w:r>
+        <w:rPr>
+          <w:rFonts w:asciiTheme="minorHAnsi" w:hAnsiTheme="minorHAnsi" w:cstheme="minorHAnsi"/>
+          <w:b/>
+          <w:bCs/>
+        </w:rPr>
+        <w:t>Atualizar Produto:</w:t>
+      </w:r>
+      <w:r>
+        <w:rPr>
+          <w:rFonts w:asciiTheme="minorHAnsi" w:hAnsiTheme="minorHAnsi" w:cstheme="minorHAnsi"/>
+        </w:rPr>
+        <w:t xml:space="preserve"> Busque o produto pelo ID (aproveitando o fluxo de validação da busca por ID). Em seguida, substitua os dados atuais pelos dados novos recebidos e persista o objeto atualizado no banco.</w:t>
+      </w:r>
+    </w:p>
+    <w:p>
+      <w:pPr>
+        <w:pStyle w:val="NormalWeb"/>
+        <w:rPr>
+          <w:rFonts w:asciiTheme="minorHAnsi" w:hAnsiTheme="minorHAnsi" w:cstheme="minorHAnsi"/>
+          <w:b/>
+          <w:bCs/>
+        </w:rPr>
+      </w:pPr>
+      <w:r>
+        <w:rPr>
+          <w:rFonts w:asciiTheme="minorHAnsi" w:hAnsiTheme="minorHAnsi" w:cstheme="minorHAnsi"/>
+          <w:b/>
+          <w:bCs/>
+        </w:rPr>
+        <w:t>Service:</w:t>
+      </w:r>
+    </w:p>
+    <w:p>
+      <w:pPr>
+        <w:pStyle w:val="NormalWeb"/>
+        <w:rPr>
+          <w:rFonts w:asciiTheme="minorHAnsi" w:hAnsiTheme="minorHAnsi" w:cstheme="minorHAnsi"/>
+        </w:rPr>
+      </w:pPr>
+      <w:r>
+        <w:rPr>
+          <w:rFonts w:asciiTheme="minorHAnsi" w:hAnsiTheme="minorHAnsi" w:cstheme="minorHAnsi"/>
+        </w:rPr>
+        <w:drawing>
+          <wp:inline distT="0" distB="0" distL="0" distR="0" wp14:anchorId="31C43F9E" wp14:editId="547C9D66">
+            <wp:extent cx="5400040" cy="2775585"/>
+            <wp:effectExtent l="0" t="0" r="0" b="5715"/>
+            <wp:docPr id="28" name="Imagem 28"/>
+            <wp:cNvGraphicFramePr>
+              <a:graphicFrameLocks xmlns:a="http://schemas.openxmlformats.org/drawingml/2006/main" noChangeAspect="1"/>
+            </wp:cNvGraphicFramePr>
+            <a:graphic xmlns:a="http://schemas.openxmlformats.org/drawingml/2006/main">
+              <a:graphicData uri="http://schemas.openxmlformats.org/drawingml/2006/picture">
+                <pic:pic xmlns:pic="http://schemas.openxmlformats.org/drawingml/2006/picture">
+                  <pic:nvPicPr>
+                    <pic:cNvPr id="1" name=""/>
+                    <pic:cNvPicPr/>
+                  </pic:nvPicPr>
+                  <pic:blipFill>
+                    <a:blip r:embed="rId29"/>
+                    <a:stretch>
+                      <a:fillRect/>
+                    </a:stretch>
+                  </pic:blipFill>
+                  <pic:spPr>
+                    <a:xfrm>
+                      <a:off x="0" y="0"/>
+                      <a:ext cx="5400040" cy="2775585"/>
+                    </a:xfrm>
+                    <a:prstGeom prst="rect">
+                      <a:avLst/>
+                    </a:prstGeom>
+                  </pic:spPr>
+                </pic:pic>
+              </a:graphicData>
+            </a:graphic>
+          </wp:inline>
+        </w:drawing>
+      </w:r>
+    </w:p>
+    <w:p>
+      <w:pPr>
+        <w:pStyle w:val="NormalWeb"/>
+        <w:rPr>
+          <w:rFonts w:asciiTheme="minorHAnsi" w:hAnsiTheme="minorHAnsi" w:cstheme="minorHAnsi"/>
+          <w:b/>
+          <w:bCs/>
+        </w:rPr>
+      </w:pPr>
+      <w:proofErr w:type="spellStart"/>
+      <w:r>
+        <w:rPr>
+          <w:rFonts w:asciiTheme="minorHAnsi" w:hAnsiTheme="minorHAnsi" w:cstheme="minorHAnsi"/>
+          <w:b/>
+          <w:bCs/>
+        </w:rPr>
+        <w:lastRenderedPageBreak/>
+        <w:t>Controller</w:t>
+      </w:r>
+      <w:proofErr w:type="spellEnd"/>
+      <w:r>
+        <w:rPr>
+          <w:rFonts w:asciiTheme="minorHAnsi" w:hAnsiTheme="minorHAnsi" w:cstheme="minorHAnsi"/>
+          <w:b/>
+          <w:bCs/>
+        </w:rPr>
+        <w:t>:</w:t>
+      </w:r>
+    </w:p>
+    <w:p>
+      <w:pPr>
+        <w:pStyle w:val="NormalWeb"/>
+        <w:rPr>
+          <w:rFonts w:asciiTheme="minorHAnsi" w:hAnsiTheme="minorHAnsi" w:cstheme="minorHAnsi"/>
+          <w:b/>
+          <w:bCs/>
+        </w:rPr>
+      </w:pPr>
+      <w:r>
+        <w:rPr>
+          <w:rFonts w:asciiTheme="minorHAnsi" w:hAnsiTheme="minorHAnsi" w:cstheme="minorHAnsi"/>
+          <w:b/>
+          <w:bCs/>
+        </w:rPr>
+        <w:drawing>
+          <wp:inline distT="0" distB="0" distL="0" distR="0" wp14:anchorId="7548B9C7" wp14:editId="6CAE137C">
+            <wp:extent cx="5400040" cy="951865"/>
+            <wp:effectExtent l="0" t="0" r="0" b="635"/>
+            <wp:docPr id="29" name="Imagem 29"/>
+            <wp:cNvGraphicFramePr>
+              <a:graphicFrameLocks xmlns:a="http://schemas.openxmlformats.org/drawingml/2006/main" noChangeAspect="1"/>
+            </wp:cNvGraphicFramePr>
+            <a:graphic xmlns:a="http://schemas.openxmlformats.org/drawingml/2006/main">
+              <a:graphicData uri="http://schemas.openxmlformats.org/drawingml/2006/picture">
+                <pic:pic xmlns:pic="http://schemas.openxmlformats.org/drawingml/2006/picture">
+                  <pic:nvPicPr>
+                    <pic:cNvPr id="1" name=""/>
+                    <pic:cNvPicPr/>
+                  </pic:nvPicPr>
+                  <pic:blipFill>
+                    <a:blip r:embed="rId30"/>
+                    <a:stretch>
+                      <a:fillRect/>
+                    </a:stretch>
+                  </pic:blipFill>
+                  <pic:spPr>
+                    <a:xfrm>
+                      <a:off x="0" y="0"/>
+                      <a:ext cx="5400040" cy="951865"/>
+                    </a:xfrm>
+                    <a:prstGeom prst="rect">
+                      <a:avLst/>
+                    </a:prstGeom>
+                  </pic:spPr>
+                </pic:pic>
+              </a:graphicData>
+            </a:graphic>
+          </wp:inline>
+        </w:drawing>
+      </w:r>
+    </w:p>
+    <w:p>
+      <w:pPr>
+        <w:pStyle w:val="NormalWeb"/>
+        <w:numPr>
+          <w:ilvl w:val="0"/>
+          <w:numId w:val="27"/>
+        </w:numPr>
+        <w:rPr>
+          <w:rFonts w:asciiTheme="minorHAnsi" w:hAnsiTheme="minorHAnsi" w:cstheme="minorHAnsi"/>
+        </w:rPr>
+      </w:pPr>
+      <w:r>
+        <w:rPr>
+          <w:rFonts w:asciiTheme="minorHAnsi" w:hAnsiTheme="minorHAnsi" w:cstheme="minorHAnsi"/>
+          <w:b/>
+          <w:bCs/>
+        </w:rPr>
+        <w:t>Deletar Produto:</w:t>
+      </w:r>
+      <w:r>
+        <w:rPr>
+          <w:rFonts w:asciiTheme="minorHAnsi" w:hAnsiTheme="minorHAnsi" w:cstheme="minorHAnsi"/>
+        </w:rPr>
+        <w:t xml:space="preserve"> Garanta primeiro que o produto existe pelo ID e, em seguida, chame o método de exclusão do repositório.</w:t>
+      </w:r>
+    </w:p>
+    <w:p>
+      <w:pPr>
+        <w:pStyle w:val="NormalWeb"/>
+        <w:rPr>
+          <w:rFonts w:asciiTheme="minorHAnsi" w:hAnsiTheme="minorHAnsi" w:cstheme="minorHAnsi"/>
+          <w:b/>
+          <w:bCs/>
+        </w:rPr>
+      </w:pPr>
+      <w:r>
+        <w:rPr>
+          <w:rFonts w:asciiTheme="minorHAnsi" w:hAnsiTheme="minorHAnsi" w:cstheme="minorHAnsi"/>
+          <w:b/>
+          <w:bCs/>
+        </w:rPr>
+        <w:t>Service:</w:t>
+      </w:r>
+    </w:p>
+    <w:p>
+      <w:pPr>
+        <w:pStyle w:val="NormalWeb"/>
+        <w:rPr>
+          <w:rFonts w:asciiTheme="minorHAnsi" w:hAnsiTheme="minorHAnsi" w:cstheme="minorHAnsi"/>
+          <w:b/>
+          <w:bCs/>
+        </w:rPr>
+      </w:pPr>
+      <w:r>
+        <w:rPr>
+          <w:rFonts w:asciiTheme="minorHAnsi" w:hAnsiTheme="minorHAnsi" w:cstheme="minorHAnsi"/>
+          <w:b/>
+          <w:bCs/>
+        </w:rPr>
+        <w:drawing>
+          <wp:inline distT="0" distB="0" distL="0" distR="0" wp14:anchorId="260093E3" wp14:editId="6A86AA2F">
+            <wp:extent cx="5673969" cy="1364615"/>
+            <wp:effectExtent l="0" t="0" r="3175" b="6985"/>
+            <wp:docPr id="30" name="Imagem 30"/>
+            <wp:cNvGraphicFramePr>
+              <a:graphicFrameLocks xmlns:a="http://schemas.openxmlformats.org/drawingml/2006/main" noChangeAspect="1"/>
+            </wp:cNvGraphicFramePr>
+            <a:graphic xmlns:a="http://schemas.openxmlformats.org/drawingml/2006/main">
+              <a:graphicData uri="http://schemas.openxmlformats.org/drawingml/2006/picture">
+                <pic:pic xmlns:pic="http://schemas.openxmlformats.org/drawingml/2006/picture">
+                  <pic:nvPicPr>
+                    <pic:cNvPr id="1" name=""/>
+                    <pic:cNvPicPr/>
+                  </pic:nvPicPr>
+                  <pic:blipFill>
+                    <a:blip r:embed="rId31"/>
+                    <a:stretch>
+                      <a:fillRect/>
+                    </a:stretch>
+                  </pic:blipFill>
+                  <pic:spPr>
+                    <a:xfrm>
+                      <a:off x="0" y="0"/>
+                      <a:ext cx="5686862" cy="1367716"/>
+                    </a:xfrm>
+                    <a:prstGeom prst="rect">
+                      <a:avLst/>
+                    </a:prstGeom>
+                  </pic:spPr>
+                </pic:pic>
+              </a:graphicData>
+            </a:graphic>
+          </wp:inline>
+        </w:drawing>
+      </w:r>
+      <w:r>
+        <w:rPr>
+          <w:rFonts w:asciiTheme="minorHAnsi" w:hAnsiTheme="minorHAnsi" w:cstheme="minorHAnsi"/>
+          <w:b/>
+          <w:bCs/>
+        </w:rPr>
+        <w:br/>
+      </w:r>
+      <w:r>
+        <w:rPr>
+          <w:rFonts w:asciiTheme="minorHAnsi" w:hAnsiTheme="minorHAnsi" w:cstheme="minorHAnsi"/>
+        </w:rPr>
+        <w:br/>
+      </w:r>
+      <w:proofErr w:type="spellStart"/>
+      <w:r>
+        <w:rPr>
+          <w:rFonts w:asciiTheme="minorHAnsi" w:hAnsiTheme="minorHAnsi" w:cstheme="minorHAnsi"/>
+          <w:b/>
+          <w:bCs/>
+        </w:rPr>
+        <w:t>Controller</w:t>
+      </w:r>
+      <w:proofErr w:type="spellEnd"/>
+      <w:r>
+        <w:rPr>
+          <w:rFonts w:asciiTheme="minorHAnsi" w:hAnsiTheme="minorHAnsi" w:cstheme="minorHAnsi"/>
+          <w:b/>
+          <w:bCs/>
+        </w:rPr>
+        <w:t>:</w:t>
+      </w:r>
+    </w:p>
+    <w:p>
+      <w:pPr>
+        <w:pStyle w:val="NormalWeb"/>
+        <w:rPr>
+          <w:rFonts w:asciiTheme="minorHAnsi" w:hAnsiTheme="minorHAnsi" w:cstheme="minorHAnsi"/>
+          <w:b/>
+          <w:bCs/>
+        </w:rPr>
+      </w:pPr>
+      <w:r>
+        <w:rPr>
+          <w:rFonts w:asciiTheme="minorHAnsi" w:hAnsiTheme="minorHAnsi" w:cstheme="minorHAnsi"/>
+          <w:b/>
+          <w:bCs/>
+        </w:rPr>
+        <w:drawing>
+          <wp:inline distT="0" distB="0" distL="0" distR="0" wp14:anchorId="135C8523" wp14:editId="29F0D6CE">
+            <wp:extent cx="5400040" cy="705485"/>
+            <wp:effectExtent l="0" t="0" r="0" b="0"/>
+            <wp:docPr id="31" name="Imagem 31"/>
+            <wp:cNvGraphicFramePr>
+              <a:graphicFrameLocks xmlns:a="http://schemas.openxmlformats.org/drawingml/2006/main" noChangeAspect="1"/>
+            </wp:cNvGraphicFramePr>
+            <a:graphic xmlns:a="http://schemas.openxmlformats.org/drawingml/2006/main">
+              <a:graphicData uri="http://schemas.openxmlformats.org/drawingml/2006/picture">
+                <pic:pic xmlns:pic="http://schemas.openxmlformats.org/drawingml/2006/picture">
+                  <pic:nvPicPr>
+                    <pic:cNvPr id="1" name=""/>
+                    <pic:cNvPicPr/>
+                  </pic:nvPicPr>
+                  <pic:blipFill>
+                    <a:blip r:embed="rId32"/>
+                    <a:stretch>
+                      <a:fillRect/>
+                    </a:stretch>
+                  </pic:blipFill>
+                  <pic:spPr>
+                    <a:xfrm>
+                      <a:off x="0" y="0"/>
+                      <a:ext cx="5400040" cy="705485"/>
+                    </a:xfrm>
+                    <a:prstGeom prst="rect">
+                      <a:avLst/>
+                    </a:prstGeom>
+                  </pic:spPr>
+                </pic:pic>
+              </a:graphicData>
+            </a:graphic>
+          </wp:inline>
+        </w:drawing>
+      </w:r>
+    </w:p>
+    <w:p>
+      <w:pPr>
+        <w:pStyle w:val="Ttulo3"/>
+        <w:rPr>
+          <w:rFonts w:asciiTheme="minorHAnsi" w:hAnsiTheme="minorHAnsi" w:cstheme="minorHAnsi"/>
+        </w:rPr>
+      </w:pPr>
+      <w:r>
+        <w:rPr>
+          <w:rFonts w:asciiTheme="minorHAnsi" w:hAnsiTheme="minorHAnsi" w:cstheme="minorHAnsi"/>
+        </w:rPr>
+        <w:t xml:space="preserve">4. </w:t>
+      </w:r>
+      <w:proofErr w:type="spellStart"/>
+      <w:r>
+        <w:rPr>
+          <w:rFonts w:asciiTheme="minorHAnsi" w:hAnsiTheme="minorHAnsi" w:cstheme="minorHAnsi"/>
+        </w:rPr>
+        <w:t>Endpoints</w:t>
+      </w:r>
+      <w:proofErr w:type="spellEnd"/>
+      <w:r>
+        <w:rPr>
+          <w:rFonts w:asciiTheme="minorHAnsi" w:hAnsiTheme="minorHAnsi" w:cstheme="minorHAnsi"/>
+        </w:rPr>
+        <w:t xml:space="preserve"> na Camada de Controle (</w:t>
+      </w:r>
+      <w:proofErr w:type="spellStart"/>
+      <w:r>
+        <w:rPr>
+          <w:rStyle w:val="CdigoHTML"/>
+          <w:rFonts w:asciiTheme="minorHAnsi" w:eastAsiaTheme="majorEastAsia" w:hAnsiTheme="minorHAnsi" w:cstheme="minorHAnsi"/>
+          <w:sz w:val="24"/>
+          <w:szCs w:val="24"/>
+        </w:rPr>
+        <w:t>ProdutoController</w:t>
+      </w:r>
+      <w:proofErr w:type="spellEnd"/>
+      <w:r>
+        <w:rPr>
+          <w:rFonts w:asciiTheme="minorHAnsi" w:hAnsiTheme="minorHAnsi" w:cstheme="minorHAnsi"/>
+        </w:rPr>
+        <w:t>)</w:t>
+      </w:r>
+    </w:p>
+    <w:p>
+      <w:pPr>
+        <w:pStyle w:val="NormalWeb"/>
+        <w:numPr>
+          <w:ilvl w:val="0"/>
+          <w:numId w:val="28"/>
+        </w:numPr>
+        <w:rPr>
+          <w:rFonts w:asciiTheme="minorHAnsi" w:hAnsiTheme="minorHAnsi" w:cstheme="minorHAnsi"/>
+        </w:rPr>
+      </w:pPr>
+      <w:r>
+        <w:rPr>
+          <w:rFonts w:asciiTheme="minorHAnsi" w:hAnsiTheme="minorHAnsi" w:cstheme="minorHAnsi"/>
+          <w:b/>
+          <w:bCs/>
+        </w:rPr>
+        <w:t>GET por ID (</w:t>
+      </w:r>
+      <w:r>
+        <w:rPr>
+          <w:rStyle w:val="CdigoHTML"/>
+          <w:rFonts w:asciiTheme="minorHAnsi" w:hAnsiTheme="minorHAnsi" w:cstheme="minorHAnsi"/>
+          <w:b/>
+          <w:bCs/>
+          <w:sz w:val="24"/>
+          <w:szCs w:val="24"/>
+        </w:rPr>
+        <w:t>/</w:t>
+      </w:r>
+      <w:proofErr w:type="spellStart"/>
+      <w:r>
+        <w:rPr>
+          <w:rStyle w:val="CdigoHTML"/>
+          <w:rFonts w:asciiTheme="minorHAnsi" w:hAnsiTheme="minorHAnsi" w:cstheme="minorHAnsi"/>
+          <w:b/>
+          <w:bCs/>
+          <w:sz w:val="24"/>
+          <w:szCs w:val="24"/>
+        </w:rPr>
+        <w:t>api</w:t>
+      </w:r>
+      <w:proofErr w:type="spellEnd"/>
+      <w:r>
+        <w:rPr>
+          <w:rStyle w:val="CdigoHTML"/>
+          <w:rFonts w:asciiTheme="minorHAnsi" w:hAnsiTheme="minorHAnsi" w:cstheme="minorHAnsi"/>
+          <w:b/>
+          <w:bCs/>
+          <w:sz w:val="24"/>
+          <w:szCs w:val="24"/>
+        </w:rPr>
+        <w:t>/produtos/{id}</w:t>
+      </w:r>
+      <w:r>
+        <w:rPr>
+          <w:rFonts w:asciiTheme="minorHAnsi" w:hAnsiTheme="minorHAnsi" w:cstheme="minorHAnsi"/>
+          <w:b/>
+          <w:bCs/>
+        </w:rPr>
+        <w:t>):</w:t>
+      </w:r>
+      <w:r>
+        <w:rPr>
+          <w:rFonts w:asciiTheme="minorHAnsi" w:hAnsiTheme="minorHAnsi" w:cstheme="minorHAnsi"/>
+        </w:rPr>
+        <w:t xml:space="preserve"> Receba o ID da URL via anotação de parâmetro de caminho, chame o </w:t>
+      </w:r>
+      <w:proofErr w:type="spellStart"/>
+      <w:r>
+        <w:rPr>
+          <w:rFonts w:asciiTheme="minorHAnsi" w:hAnsiTheme="minorHAnsi" w:cstheme="minorHAnsi"/>
+        </w:rPr>
+        <w:t>service</w:t>
+      </w:r>
+      <w:proofErr w:type="spellEnd"/>
+      <w:r>
+        <w:rPr>
+          <w:rFonts w:asciiTheme="minorHAnsi" w:hAnsiTheme="minorHAnsi" w:cstheme="minorHAnsi"/>
+        </w:rPr>
+        <w:t xml:space="preserve"> e retorne </w:t>
+      </w:r>
+      <w:r>
+        <w:rPr>
+          <w:rStyle w:val="CdigoHTML"/>
+          <w:rFonts w:asciiTheme="minorHAnsi" w:hAnsiTheme="minorHAnsi" w:cstheme="minorHAnsi"/>
+          <w:sz w:val="24"/>
+          <w:szCs w:val="24"/>
+        </w:rPr>
+        <w:t>200 OK</w:t>
+      </w:r>
+      <w:r>
+        <w:rPr>
+          <w:rFonts w:asciiTheme="minorHAnsi" w:hAnsiTheme="minorHAnsi" w:cstheme="minorHAnsi"/>
+        </w:rPr>
+        <w:t xml:space="preserve"> com o produto.</w:t>
+      </w:r>
+    </w:p>
+    <w:p>
+      <w:pPr>
+        <w:pStyle w:val="NormalWeb"/>
+        <w:rPr>
+          <w:rFonts w:asciiTheme="minorHAnsi" w:hAnsiTheme="minorHAnsi" w:cstheme="minorHAnsi"/>
+        </w:rPr>
+      </w:pPr>
+      <w:r>
+        <w:rPr>
+          <w:rFonts w:asciiTheme="minorHAnsi" w:hAnsiTheme="minorHAnsi" w:cstheme="minorHAnsi"/>
+        </w:rPr>
+        <w:drawing>
+          <wp:inline distT="0" distB="0" distL="0" distR="0" wp14:anchorId="4286736E" wp14:editId="6E35C493">
+            <wp:extent cx="5621215" cy="2106295"/>
+            <wp:effectExtent l="0" t="0" r="0" b="8255"/>
+            <wp:docPr id="32" name="Imagem 32"/>
+            <wp:cNvGraphicFramePr>
+              <a:graphicFrameLocks xmlns:a="http://schemas.openxmlformats.org/drawingml/2006/main" noChangeAspect="1"/>
+            </wp:cNvGraphicFramePr>
+            <a:graphic xmlns:a="http://schemas.openxmlformats.org/drawingml/2006/main">
+              <a:graphicData uri="http://schemas.openxmlformats.org/drawingml/2006/picture">
+                <pic:pic xmlns:pic="http://schemas.openxmlformats.org/drawingml/2006/picture">
+                  <pic:nvPicPr>
+                    <pic:cNvPr id="1" name=""/>
+                    <pic:cNvPicPr/>
+                  </pic:nvPicPr>
+                  <pic:blipFill>
+                    <a:blip r:embed="rId33"/>
+                    <a:stretch>
+                      <a:fillRect/>
+                    </a:stretch>
+                  </pic:blipFill>
+                  <pic:spPr>
+                    <a:xfrm>
+                      <a:off x="0" y="0"/>
+                      <a:ext cx="5642323" cy="2114204"/>
+                    </a:xfrm>
+                    <a:prstGeom prst="rect">
+                      <a:avLst/>
+                    </a:prstGeom>
+                  </pic:spPr>
+                </pic:pic>
+              </a:graphicData>
+            </a:graphic>
+          </wp:inline>
+        </w:drawing>
+      </w:r>
+    </w:p>
+    <w:p>
+      <w:pPr>
+        <w:pStyle w:val="NormalWeb"/>
+        <w:numPr>
+          <w:ilvl w:val="0"/>
+          <w:numId w:val="28"/>
+        </w:numPr>
+        <w:rPr>
+          <w:rFonts w:asciiTheme="minorHAnsi" w:hAnsiTheme="minorHAnsi" w:cstheme="minorHAnsi"/>
+        </w:rPr>
+      </w:pPr>
+      <w:r>
+        <w:rPr>
+          <w:rFonts w:asciiTheme="minorHAnsi" w:hAnsiTheme="minorHAnsi" w:cstheme="minorHAnsi"/>
+          <w:b/>
+          <w:bCs/>
+        </w:rPr>
+        <w:lastRenderedPageBreak/>
+        <w:t>PUT (</w:t>
+      </w:r>
+      <w:r>
+        <w:rPr>
+          <w:rStyle w:val="CdigoHTML"/>
+          <w:rFonts w:asciiTheme="minorHAnsi" w:hAnsiTheme="minorHAnsi" w:cstheme="minorHAnsi"/>
+          <w:b/>
+          <w:bCs/>
+          <w:sz w:val="24"/>
+          <w:szCs w:val="24"/>
+        </w:rPr>
+        <w:t>/</w:t>
+      </w:r>
+      <w:proofErr w:type="spellStart"/>
+      <w:r>
+        <w:rPr>
+          <w:rStyle w:val="CdigoHTML"/>
+          <w:rFonts w:asciiTheme="minorHAnsi" w:hAnsiTheme="minorHAnsi" w:cstheme="minorHAnsi"/>
+          <w:b/>
+          <w:bCs/>
+          <w:sz w:val="24"/>
+          <w:szCs w:val="24"/>
+        </w:rPr>
+        <w:t>api</w:t>
+      </w:r>
+      <w:proofErr w:type="spellEnd"/>
+      <w:r>
+        <w:rPr>
+          <w:rStyle w:val="CdigoHTML"/>
+          <w:rFonts w:asciiTheme="minorHAnsi" w:hAnsiTheme="minorHAnsi" w:cstheme="minorHAnsi"/>
+          <w:b/>
+          <w:bCs/>
+          <w:sz w:val="24"/>
+          <w:szCs w:val="24"/>
+        </w:rPr>
+        <w:t>/produtos/{id}</w:t>
+      </w:r>
+      <w:r>
+        <w:rPr>
+          <w:rFonts w:asciiTheme="minorHAnsi" w:hAnsiTheme="minorHAnsi" w:cstheme="minorHAnsi"/>
+          <w:b/>
+          <w:bCs/>
+        </w:rPr>
+        <w:t>):</w:t>
+      </w:r>
+      <w:r>
+        <w:rPr>
+          <w:rFonts w:asciiTheme="minorHAnsi" w:hAnsiTheme="minorHAnsi" w:cstheme="minorHAnsi"/>
+        </w:rPr>
+        <w:t xml:space="preserve"> Receba o ID da URL e o corpo da requisição (JSON) com as validações ativas (</w:t>
+      </w:r>
+      <w:r>
+        <w:rPr>
+          <w:rStyle w:val="CdigoHTML"/>
+          <w:rFonts w:asciiTheme="minorHAnsi" w:hAnsiTheme="minorHAnsi" w:cstheme="minorHAnsi"/>
+          <w:sz w:val="24"/>
+          <w:szCs w:val="24"/>
+        </w:rPr>
+        <w:t>@Valid</w:t>
+      </w:r>
+      <w:r>
+        <w:rPr>
+          <w:rFonts w:asciiTheme="minorHAnsi" w:hAnsiTheme="minorHAnsi" w:cstheme="minorHAnsi"/>
+        </w:rPr>
+        <w:t xml:space="preserve">). Chame o </w:t>
+      </w:r>
+      <w:proofErr w:type="spellStart"/>
+      <w:r>
+        <w:rPr>
+          <w:rFonts w:asciiTheme="minorHAnsi" w:hAnsiTheme="minorHAnsi" w:cstheme="minorHAnsi"/>
+        </w:rPr>
+        <w:t>service</w:t>
+      </w:r>
+      <w:proofErr w:type="spellEnd"/>
+      <w:r>
+        <w:rPr>
+          <w:rFonts w:asciiTheme="minorHAnsi" w:hAnsiTheme="minorHAnsi" w:cstheme="minorHAnsi"/>
+        </w:rPr>
+        <w:t xml:space="preserve"> e retorne </w:t>
+      </w:r>
+      <w:r>
+        <w:rPr>
+          <w:rStyle w:val="CdigoHTML"/>
+          <w:rFonts w:asciiTheme="minorHAnsi" w:hAnsiTheme="minorHAnsi" w:cstheme="minorHAnsi"/>
+          <w:sz w:val="24"/>
+          <w:szCs w:val="24"/>
+        </w:rPr>
+        <w:t>200 OK</w:t>
+      </w:r>
+      <w:r>
+        <w:rPr>
+          <w:rFonts w:asciiTheme="minorHAnsi" w:hAnsiTheme="minorHAnsi" w:cstheme="minorHAnsi"/>
+        </w:rPr>
+        <w:t xml:space="preserve"> com o produto atualizado.</w:t>
+      </w:r>
+    </w:p>
+    <w:p>
+      <w:pPr>
+        <w:pStyle w:val="NormalWeb"/>
+        <w:rPr>
+          <w:rFonts w:asciiTheme="minorHAnsi" w:hAnsiTheme="minorHAnsi" w:cstheme="minorHAnsi"/>
+        </w:rPr>
+      </w:pPr>
+      <w:r>
+        <w:rPr>
+          <w:rFonts w:asciiTheme="minorHAnsi" w:hAnsiTheme="minorHAnsi" w:cstheme="minorHAnsi"/>
+        </w:rPr>
+        <w:drawing>
+          <wp:inline distT="0" distB="0" distL="0" distR="0" wp14:anchorId="67CACD26" wp14:editId="68B830B8">
+            <wp:extent cx="5726723" cy="2959735"/>
+            <wp:effectExtent l="0" t="0" r="7620" b="0"/>
+            <wp:docPr id="33" name="Imagem 33"/>
+            <wp:cNvGraphicFramePr>
+              <a:graphicFrameLocks xmlns:a="http://schemas.openxmlformats.org/drawingml/2006/main" noChangeAspect="1"/>
+            </wp:cNvGraphicFramePr>
+            <a:graphic xmlns:a="http://schemas.openxmlformats.org/drawingml/2006/main">
+              <a:graphicData uri="http://schemas.openxmlformats.org/drawingml/2006/picture">
+                <pic:pic xmlns:pic="http://schemas.openxmlformats.org/drawingml/2006/picture">
+                  <pic:nvPicPr>
+                    <pic:cNvPr id="1" name=""/>
+                    <pic:cNvPicPr/>
+                  </pic:nvPicPr>
+                  <pic:blipFill>
+                    <a:blip r:embed="rId34"/>
+                    <a:stretch>
+                      <a:fillRect/>
+                    </a:stretch>
+                  </pic:blipFill>
+                  <pic:spPr>
+                    <a:xfrm>
+                      <a:off x="0" y="0"/>
+                      <a:ext cx="5736503" cy="2964789"/>
+                    </a:xfrm>
+                    <a:prstGeom prst="rect">
+                      <a:avLst/>
+                    </a:prstGeom>
+                  </pic:spPr>
+                </pic:pic>
+              </a:graphicData>
+            </a:graphic>
+          </wp:inline>
+        </w:drawing>
+      </w:r>
+    </w:p>
+    <w:p>
+      <w:pPr>
+        <w:pStyle w:val="NormalWeb"/>
+        <w:numPr>
+          <w:ilvl w:val="0"/>
+          <w:numId w:val="28"/>
+        </w:numPr>
+        <w:rPr>
+          <w:rFonts w:asciiTheme="minorHAnsi" w:hAnsiTheme="minorHAnsi" w:cstheme="minorHAnsi"/>
+        </w:rPr>
+      </w:pPr>
+      <w:r>
+        <w:rPr>
+          <w:rFonts w:asciiTheme="minorHAnsi" w:hAnsiTheme="minorHAnsi" w:cstheme="minorHAnsi"/>
+          <w:b/>
+          <w:bCs/>
+        </w:rPr>
+        <w:t>DELETE (</w:t>
+      </w:r>
+      <w:r>
+        <w:rPr>
+          <w:rStyle w:val="CdigoHTML"/>
+          <w:rFonts w:asciiTheme="minorHAnsi" w:hAnsiTheme="minorHAnsi" w:cstheme="minorHAnsi"/>
+          <w:b/>
+          <w:bCs/>
+          <w:sz w:val="24"/>
+          <w:szCs w:val="24"/>
+        </w:rPr>
+        <w:t>/</w:t>
+      </w:r>
+      <w:proofErr w:type="spellStart"/>
+      <w:r>
+        <w:rPr>
+          <w:rStyle w:val="CdigoHTML"/>
+          <w:rFonts w:asciiTheme="minorHAnsi" w:hAnsiTheme="minorHAnsi" w:cstheme="minorHAnsi"/>
+          <w:b/>
+          <w:bCs/>
+          <w:sz w:val="24"/>
+          <w:szCs w:val="24"/>
+        </w:rPr>
+        <w:t>api</w:t>
+      </w:r>
+      <w:proofErr w:type="spellEnd"/>
+      <w:r>
+        <w:rPr>
+          <w:rStyle w:val="CdigoHTML"/>
+          <w:rFonts w:asciiTheme="minorHAnsi" w:hAnsiTheme="minorHAnsi" w:cstheme="minorHAnsi"/>
+          <w:b/>
+          <w:bCs/>
+          <w:sz w:val="24"/>
+          <w:szCs w:val="24"/>
+        </w:rPr>
+        <w:t>/produtos/{id}</w:t>
+      </w:r>
+      <w:r>
+        <w:rPr>
+          <w:rFonts w:asciiTheme="minorHAnsi" w:hAnsiTheme="minorHAnsi" w:cstheme="minorHAnsi"/>
+          <w:b/>
+          <w:bCs/>
+        </w:rPr>
+        <w:t>):</w:t>
+      </w:r>
+      <w:r>
+        <w:rPr>
+          <w:rFonts w:asciiTheme="minorHAnsi" w:hAnsiTheme="minorHAnsi" w:cstheme="minorHAnsi"/>
+        </w:rPr>
+        <w:t xml:space="preserve"> Receba o ID da URL, chame a deleção do </w:t>
+      </w:r>
+      <w:proofErr w:type="spellStart"/>
+      <w:r>
+        <w:rPr>
+          <w:rFonts w:asciiTheme="minorHAnsi" w:hAnsiTheme="minorHAnsi" w:cstheme="minorHAnsi"/>
+        </w:rPr>
+        <w:t>service</w:t>
+      </w:r>
+      <w:proofErr w:type="spellEnd"/>
+      <w:r>
+        <w:rPr>
+          <w:rFonts w:asciiTheme="minorHAnsi" w:hAnsiTheme="minorHAnsi" w:cstheme="minorHAnsi"/>
+        </w:rPr>
+        <w:t xml:space="preserve"> e retorne o status HTTP ideal para exclusão bem-sucedida sem corpo de resposta (</w:t>
+      </w:r>
+      <w:r>
+        <w:rPr>
+          <w:rStyle w:val="CdigoHTML"/>
+          <w:rFonts w:asciiTheme="minorHAnsi" w:hAnsiTheme="minorHAnsi" w:cstheme="minorHAnsi"/>
+          <w:sz w:val="24"/>
+          <w:szCs w:val="24"/>
+        </w:rPr>
+        <w:t xml:space="preserve">204 No </w:t>
+      </w:r>
+      <w:proofErr w:type="spellStart"/>
+      <w:r>
+        <w:rPr>
+          <w:rStyle w:val="CdigoHTML"/>
+          <w:rFonts w:asciiTheme="minorHAnsi" w:hAnsiTheme="minorHAnsi" w:cstheme="minorHAnsi"/>
+          <w:sz w:val="24"/>
+          <w:szCs w:val="24"/>
+        </w:rPr>
+        <w:t>Content</w:t>
+      </w:r>
+      <w:proofErr w:type="spellEnd"/>
+      <w:r>
+        <w:rPr>
+          <w:rFonts w:asciiTheme="minorHAnsi" w:hAnsiTheme="minorHAnsi" w:cstheme="minorHAnsi"/>
+        </w:rPr>
+        <w:t>).</w:t>
+      </w:r>
+    </w:p>
+    <w:p>
+      <w:pPr>
+        <w:pStyle w:val="NormalWeb"/>
+        <w:rPr>
+          <w:rFonts w:asciiTheme="minorHAnsi" w:hAnsiTheme="minorHAnsi" w:cstheme="minorHAnsi"/>
+        </w:rPr>
+      </w:pPr>
+      <w:r>
+        <w:rPr>
+          <w:rFonts w:asciiTheme="minorHAnsi" w:hAnsiTheme="minorHAnsi" w:cstheme="minorHAnsi"/>
+        </w:rPr>
+        <w:drawing>
+          <wp:inline distT="0" distB="0" distL="0" distR="0" wp14:anchorId="7251EF98" wp14:editId="53923723">
+            <wp:extent cx="5400040" cy="1808480"/>
+            <wp:effectExtent l="0" t="0" r="0" b="1270"/>
+            <wp:docPr id="34" name="Imagem 34"/>
+            <wp:cNvGraphicFramePr>
+              <a:graphicFrameLocks xmlns:a="http://schemas.openxmlformats.org/drawingml/2006/main" noChangeAspect="1"/>
+            </wp:cNvGraphicFramePr>
+            <a:graphic xmlns:a="http://schemas.openxmlformats.org/drawingml/2006/main">
+              <a:graphicData uri="http://schemas.openxmlformats.org/drawingml/2006/picture">
+                <pic:pic xmlns:pic="http://schemas.openxmlformats.org/drawingml/2006/picture">
+                  <pic:nvPicPr>
+                    <pic:cNvPr id="1" name=""/>
+                    <pic:cNvPicPr/>
+                  </pic:nvPicPr>
+                  <pic:blipFill>
+                    <a:blip r:embed="rId35"/>
+                    <a:stretch>
+                      <a:fillRect/>
+                    </a:stretch>
+                  </pic:blipFill>
+                  <pic:spPr>
+                    <a:xfrm>
+                      <a:off x="0" y="0"/>
+                      <a:ext cx="5400040" cy="1808480"/>
+                    </a:xfrm>
+                    <a:prstGeom prst="rect">
+                      <a:avLst/>
+                    </a:prstGeom>
+                  </pic:spPr>
+                </pic:pic>
+              </a:graphicData>
+            </a:graphic>
+          </wp:inline>
+        </w:drawing>
+      </w:r>
+    </w:p>
+    <w:p>
+      <w:pPr>
+        <w:pStyle w:val="NormalWeb"/>
+        <w:rPr>
+          <w:rFonts w:asciiTheme="minorHAnsi" w:hAnsiTheme="minorHAnsi" w:cstheme="minorHAnsi"/>
+        </w:rPr>
+      </w:pPr>
+      <w:r>
+        <w:rPr>
+          <w:rFonts w:asciiTheme="minorHAnsi" w:hAnsiTheme="minorHAnsi" w:cstheme="minorHAnsi"/>
+        </w:rPr>
+        <w:drawing>
+          <wp:inline distT="0" distB="0" distL="0" distR="0" wp14:anchorId="632F87AD" wp14:editId="54D02BDC">
+            <wp:extent cx="5603631" cy="2082800"/>
+            <wp:effectExtent l="0" t="0" r="0" b="0"/>
+            <wp:docPr id="35" name="Imagem 35"/>
+            <wp:cNvGraphicFramePr>
+              <a:graphicFrameLocks xmlns:a="http://schemas.openxmlformats.org/drawingml/2006/main" noChangeAspect="1"/>
+            </wp:cNvGraphicFramePr>
+            <a:graphic xmlns:a="http://schemas.openxmlformats.org/drawingml/2006/main">
+              <a:graphicData uri="http://schemas.openxmlformats.org/drawingml/2006/picture">
+                <pic:pic xmlns:pic="http://schemas.openxmlformats.org/drawingml/2006/picture">
+                  <pic:nvPicPr>
+                    <pic:cNvPr id="1" name=""/>
+                    <pic:cNvPicPr/>
+                  </pic:nvPicPr>
+                  <pic:blipFill>
+                    <a:blip r:embed="rId36"/>
+                    <a:stretch>
+                      <a:fillRect/>
+                    </a:stretch>
+                  </pic:blipFill>
+                  <pic:spPr>
+                    <a:xfrm>
+                      <a:off x="0" y="0"/>
+                      <a:ext cx="5616868" cy="2087720"/>
+                    </a:xfrm>
+                    <a:prstGeom prst="rect">
+                      <a:avLst/>
+                    </a:prstGeom>
+                  </pic:spPr>
+                </pic:pic>
+              </a:graphicData>
+            </a:graphic>
+          </wp:inline>
+        </w:drawing>
+      </w:r>
+    </w:p>
+    <w:p>
+      <w:pPr>
+        <w:pStyle w:val="Ttulo1"/>
+        <w:rPr>
+          <w:rFonts w:asciiTheme="minorHAnsi" w:hAnsiTheme="minorHAnsi" w:cstheme="minorHAnsi"/>
+          <w:sz w:val="24"/>
+          <w:szCs w:val="24"/>
+        </w:rPr>
+      </w:pPr>
+      <w:r>
+        <w:rPr>
+          <w:rFonts w:asciiTheme="minorHAnsi" w:hAnsiTheme="minorHAnsi" w:cstheme="minorHAnsi"/>
+          <w:sz w:val="24"/>
+          <w:szCs w:val="24"/>
+        </w:rPr>
+        <w:lastRenderedPageBreak/>
+        <w:t>Diário de Bordo — TASK-05</w:t>
+      </w:r>
+    </w:p>
+    <w:p>
+      <w:pPr>
+        <w:pStyle w:val="NormalWeb"/>
+        <w:numPr>
+          <w:ilvl w:val="0"/>
+          <w:numId w:val="29"/>
+        </w:numPr>
+        <w:rPr>
+          <w:rFonts w:asciiTheme="minorHAnsi" w:hAnsiTheme="minorHAnsi" w:cstheme="minorHAnsi"/>
+        </w:rPr>
+      </w:pPr>
+      <w:r>
+        <w:rPr>
+          <w:rFonts w:asciiTheme="minorHAnsi" w:hAnsiTheme="minorHAnsi" w:cstheme="minorHAnsi"/>
+          <w:b/>
+          <w:bCs/>
+        </w:rPr>
+        <w:t>Módulo:</w:t>
+      </w:r>
+      <w:r>
+        <w:rPr>
+          <w:rFonts w:asciiTheme="minorHAnsi" w:hAnsiTheme="minorHAnsi" w:cstheme="minorHAnsi"/>
+        </w:rPr>
+        <w:t xml:space="preserve"> E-commerce </w:t>
+      </w:r>
+      <w:proofErr w:type="spellStart"/>
+      <w:r>
+        <w:rPr>
+          <w:rFonts w:asciiTheme="minorHAnsi" w:hAnsiTheme="minorHAnsi" w:cstheme="minorHAnsi"/>
+        </w:rPr>
+        <w:t>Product</w:t>
+      </w:r>
+      <w:proofErr w:type="spellEnd"/>
+      <w:r>
+        <w:rPr>
+          <w:rFonts w:asciiTheme="minorHAnsi" w:hAnsiTheme="minorHAnsi" w:cstheme="minorHAnsi"/>
+        </w:rPr>
+        <w:t xml:space="preserve"> API</w:t>
+      </w:r>
+    </w:p>
+    <w:p>
+      <w:pPr>
+        <w:pStyle w:val="NormalWeb"/>
+        <w:numPr>
+          <w:ilvl w:val="0"/>
+          <w:numId w:val="29"/>
+        </w:numPr>
+        <w:rPr>
+          <w:rFonts w:asciiTheme="minorHAnsi" w:hAnsiTheme="minorHAnsi" w:cstheme="minorHAnsi"/>
+        </w:rPr>
+      </w:pPr>
+      <w:r>
+        <w:rPr>
+          <w:rFonts w:asciiTheme="minorHAnsi" w:hAnsiTheme="minorHAnsi" w:cstheme="minorHAnsi"/>
+          <w:b/>
+          <w:bCs/>
+        </w:rPr>
+        <w:t>Assunto:</w:t>
+      </w:r>
+      <w:r>
+        <w:rPr>
+          <w:rFonts w:asciiTheme="minorHAnsi" w:hAnsiTheme="minorHAnsi" w:cstheme="minorHAnsi"/>
+        </w:rPr>
+        <w:t xml:space="preserve"> Conclusão do CRUD Completo (Busca por ID, Atualização e Deleção) + Exceção </w:t>
+      </w:r>
+      <w:r>
+        <w:rPr>
+          <w:rStyle w:val="CdigoHTML"/>
+          <w:rFonts w:asciiTheme="minorHAnsi" w:eastAsiaTheme="majorEastAsia" w:hAnsiTheme="minorHAnsi" w:cstheme="minorHAnsi"/>
+          <w:sz w:val="24"/>
+          <w:szCs w:val="24"/>
+        </w:rPr>
+        <w:t xml:space="preserve">404 Not </w:t>
+      </w:r>
+      <w:proofErr w:type="spellStart"/>
+      <w:r>
+        <w:rPr>
+          <w:rStyle w:val="CdigoHTML"/>
+          <w:rFonts w:asciiTheme="minorHAnsi" w:eastAsiaTheme="majorEastAsia" w:hAnsiTheme="minorHAnsi" w:cstheme="minorHAnsi"/>
+          <w:sz w:val="24"/>
+          <w:szCs w:val="24"/>
+        </w:rPr>
+        <w:t>Found</w:t>
+      </w:r>
+      <w:proofErr w:type="spellEnd"/>
+      <w:r>
+        <w:rPr>
+          <w:rFonts w:asciiTheme="minorHAnsi" w:hAnsiTheme="minorHAnsi" w:cstheme="minorHAnsi"/>
+        </w:rPr>
+        <w:t xml:space="preserve"> (</w:t>
+      </w:r>
+      <w:proofErr w:type="spellStart"/>
+      <w:r>
+        <w:rPr>
+          <w:rStyle w:val="CdigoHTML"/>
+          <w:rFonts w:asciiTheme="minorHAnsi" w:eastAsiaTheme="majorEastAsia" w:hAnsiTheme="minorHAnsi" w:cstheme="minorHAnsi"/>
+          <w:sz w:val="24"/>
+          <w:szCs w:val="24"/>
+        </w:rPr>
+        <w:t>ResourceNotFoundException</w:t>
+      </w:r>
+      <w:proofErr w:type="spellEnd"/>
+      <w:r>
+        <w:rPr>
+          <w:rFonts w:asciiTheme="minorHAnsi" w:hAnsiTheme="minorHAnsi" w:cstheme="minorHAnsi"/>
+        </w:rPr>
+        <w:t>)</w:t>
+      </w:r>
+    </w:p>
+    <w:p>
+      <w:pPr>
+        <w:pStyle w:val="Ttulo3"/>
+        <w:rPr>
+          <w:rFonts w:asciiTheme="minorHAnsi" w:hAnsiTheme="minorHAnsi" w:cstheme="minorHAnsi"/>
+        </w:rPr>
+      </w:pPr>
+      <w:r>
+        <w:rPr>
+          <w:rFonts w:asciiTheme="minorHAnsi" w:hAnsiTheme="minorHAnsi" w:cstheme="minorHAnsi"/>
+        </w:rPr>
+        <w:t xml:space="preserve">Objetivo da </w:t>
+      </w:r>
+      <w:proofErr w:type="spellStart"/>
+      <w:r>
+        <w:rPr>
+          <w:rFonts w:asciiTheme="minorHAnsi" w:hAnsiTheme="minorHAnsi" w:cstheme="minorHAnsi"/>
+        </w:rPr>
+        <w:t>Task</w:t>
+      </w:r>
+      <w:proofErr w:type="spellEnd"/>
+    </w:p>
+    <w:p>
+      <w:pPr>
+        <w:pStyle w:val="NormalWeb"/>
+        <w:rPr>
+          <w:rFonts w:asciiTheme="minorHAnsi" w:hAnsiTheme="minorHAnsi" w:cstheme="minorHAnsi"/>
+        </w:rPr>
+      </w:pPr>
+      <w:r>
+        <w:rPr>
+          <w:rFonts w:asciiTheme="minorHAnsi" w:hAnsiTheme="minorHAnsi" w:cstheme="minorHAnsi"/>
+        </w:rPr>
+        <w:t>Evoluir a API para dar suporte completo ao ciclo de vida de um produto no e-commerce, permitindo a consulta individual por ID (</w:t>
+      </w:r>
+      <w:r>
+        <w:rPr>
+          <w:rStyle w:val="CdigoHTML"/>
+          <w:rFonts w:asciiTheme="minorHAnsi" w:eastAsiaTheme="majorEastAsia" w:hAnsiTheme="minorHAnsi" w:cstheme="minorHAnsi"/>
+          <w:sz w:val="24"/>
+          <w:szCs w:val="24"/>
+        </w:rPr>
+        <w:t>GET</w:t>
+      </w:r>
+      <w:r>
+        <w:rPr>
+          <w:rFonts w:asciiTheme="minorHAnsi" w:hAnsiTheme="minorHAnsi" w:cstheme="minorHAnsi"/>
+        </w:rPr>
+        <w:t>), a atualização de dados cadastrais (</w:t>
+      </w:r>
+      <w:r>
+        <w:rPr>
+          <w:rStyle w:val="CdigoHTML"/>
+          <w:rFonts w:asciiTheme="minorHAnsi" w:eastAsiaTheme="majorEastAsia" w:hAnsiTheme="minorHAnsi" w:cstheme="minorHAnsi"/>
+          <w:sz w:val="24"/>
+          <w:szCs w:val="24"/>
+        </w:rPr>
+        <w:t>PUT</w:t>
+      </w:r>
+      <w:r>
+        <w:rPr>
+          <w:rFonts w:asciiTheme="minorHAnsi" w:hAnsiTheme="minorHAnsi" w:cstheme="minorHAnsi"/>
+        </w:rPr>
+        <w:t>) e a remoção de itens (</w:t>
+      </w:r>
+      <w:r>
+        <w:rPr>
+          <w:rStyle w:val="CdigoHTML"/>
+          <w:rFonts w:asciiTheme="minorHAnsi" w:eastAsiaTheme="majorEastAsia" w:hAnsiTheme="minorHAnsi" w:cstheme="minorHAnsi"/>
+          <w:sz w:val="24"/>
+          <w:szCs w:val="24"/>
+        </w:rPr>
+        <w:t>DELETE</w:t>
+      </w:r>
+      <w:r>
+        <w:rPr>
+          <w:rFonts w:asciiTheme="minorHAnsi" w:hAnsiTheme="minorHAnsi" w:cstheme="minorHAnsi"/>
+        </w:rPr>
+        <w:t xml:space="preserve">), garantindo que qualquer tentativa de manipular um registro inexistente resulte em um erro HTTP </w:t>
+      </w:r>
+      <w:r>
+        <w:rPr>
+          <w:rStyle w:val="CdigoHTML"/>
+          <w:rFonts w:asciiTheme="minorHAnsi" w:eastAsiaTheme="majorEastAsia" w:hAnsiTheme="minorHAnsi" w:cstheme="minorHAnsi"/>
+          <w:sz w:val="24"/>
+          <w:szCs w:val="24"/>
+        </w:rPr>
+        <w:t xml:space="preserve">404 Not </w:t>
+      </w:r>
+      <w:proofErr w:type="spellStart"/>
+      <w:r>
+        <w:rPr>
+          <w:rStyle w:val="CdigoHTML"/>
+          <w:rFonts w:asciiTheme="minorHAnsi" w:eastAsiaTheme="majorEastAsia" w:hAnsiTheme="minorHAnsi" w:cstheme="minorHAnsi"/>
+          <w:sz w:val="24"/>
+          <w:szCs w:val="24"/>
+        </w:rPr>
+        <w:t>Found</w:t>
+      </w:r>
+      <w:proofErr w:type="spellEnd"/>
+      <w:r>
+        <w:rPr>
+          <w:rFonts w:asciiTheme="minorHAnsi" w:hAnsiTheme="minorHAnsi" w:cstheme="minorHAnsi"/>
+        </w:rPr>
+        <w:t xml:space="preserve"> padronizado.</w:t>
+      </w:r>
+    </w:p>
+    <w:p>
+      <w:pPr>
+        <w:pStyle w:val="Ttulo3"/>
+        <w:rPr>
+          <w:rFonts w:asciiTheme="minorHAnsi" w:hAnsiTheme="minorHAnsi" w:cstheme="minorHAnsi"/>
+        </w:rPr>
+      </w:pPr>
+      <w:r>
+        <w:rPr>
+          <w:rFonts w:ascii="Segoe UI Emoji" w:hAnsi="Segoe UI Emoji" w:cs="Segoe UI Emoji"/>
+        </w:rPr>
+        <w:t>💡</w:t>
+      </w:r>
+      <w:r>
+        <w:rPr>
+          <w:rFonts w:asciiTheme="minorHAnsi" w:hAnsiTheme="minorHAnsi" w:cstheme="minorHAnsi"/>
+        </w:rPr>
+        <w:t xml:space="preserve"> O </w:t>
+      </w:r>
+      <w:proofErr w:type="gramStart"/>
+      <w:r>
+        <w:rPr>
+          <w:rFonts w:asciiTheme="minorHAnsi" w:hAnsiTheme="minorHAnsi" w:cstheme="minorHAnsi"/>
+        </w:rPr>
+        <w:t>que Desenvolvi</w:t>
+      </w:r>
+      <w:proofErr w:type="gramEnd"/>
+      <w:r>
+        <w:rPr>
+          <w:rFonts w:asciiTheme="minorHAnsi" w:hAnsiTheme="minorHAnsi" w:cstheme="minorHAnsi"/>
+        </w:rPr>
+        <w:t xml:space="preserve"> / Conceitos Chave</w:t>
+      </w:r>
+    </w:p>
+    <w:p>
+      <w:pPr>
+        <w:pStyle w:val="PargrafodaLista"/>
+        <w:numPr>
+          <w:ilvl w:val="0"/>
+          <w:numId w:val="30"/>
+        </w:numPr>
+      </w:pPr>
+      <w:r>
+        <w:rPr>
+          <w:b/>
+          <w:bCs/>
+        </w:rPr>
+        <w:t xml:space="preserve">Exceção </w:t>
+      </w:r>
+      <w:r>
+        <w:rPr>
+          <w:b/>
+          <w:bCs/>
+        </w:rPr>
+        <w:t>Customizada (</w:t>
+      </w:r>
+      <w:proofErr w:type="spellStart"/>
+      <w:r>
+        <w:rPr>
+          <w:b/>
+          <w:bCs/>
+        </w:rPr>
+        <w:t>ResourceNotFoundException</w:t>
+      </w:r>
+      <w:proofErr w:type="spellEnd"/>
+      <w:r>
+        <w:rPr>
+          <w:b/>
+          <w:bCs/>
+        </w:rPr>
+        <w:t xml:space="preserve">): </w:t>
+      </w:r>
+      <w:r>
+        <w:t>Criação de uma exceção de tempo de execução para representar falhas de recursos não encontrados na base de dados.</w:t>
+      </w:r>
+    </w:p>
+    <w:p>
+      <w:pPr>
+        <w:pStyle w:val="PargrafodaLista"/>
+        <w:numPr>
+          <w:ilvl w:val="0"/>
+          <w:numId w:val="30"/>
+        </w:numPr>
+      </w:pPr>
+      <w:r>
+        <w:rPr>
+          <w:b/>
+          <w:bCs/>
+        </w:rPr>
+        <w:t xml:space="preserve">Tratamento Global </w:t>
+      </w:r>
+      <w:proofErr w:type="spellStart"/>
+      <w:r>
+        <w:rPr>
+          <w:b/>
+          <w:bCs/>
+        </w:rPr>
+        <w:t>Error</w:t>
+      </w:r>
+      <w:proofErr w:type="spellEnd"/>
+      <w:r>
+        <w:rPr>
+          <w:b/>
+          <w:bCs/>
+        </w:rPr>
+        <w:t xml:space="preserve"> 404 (</w:t>
+      </w:r>
+      <w:proofErr w:type="spellStart"/>
+      <w:r>
+        <w:rPr>
+          <w:b/>
+          <w:bCs/>
+        </w:rPr>
+        <w:t>GlobalExceptionHandler</w:t>
+      </w:r>
+      <w:proofErr w:type="spellEnd"/>
+      <w:r>
+        <w:rPr>
+          <w:b/>
+          <w:bCs/>
+        </w:rPr>
+        <w:t>):</w:t>
+      </w:r>
+      <w:r>
+        <w:t xml:space="preserve"> Mapeamento da nova exceção no </w:t>
+      </w:r>
+      <w:r>
+        <w:rPr>
+          <w:b/>
+          <w:bCs/>
+        </w:rPr>
+        <w:t>@RestControllerAdvice</w:t>
+      </w:r>
+      <w:r>
+        <w:t xml:space="preserve">, </w:t>
+      </w:r>
+      <w:proofErr w:type="spellStart"/>
+      <w:r>
+        <w:t>intergrando</w:t>
+      </w:r>
+      <w:proofErr w:type="spellEnd"/>
+      <w:r>
+        <w:t xml:space="preserve"> ao nosso contrato padronizado </w:t>
+      </w:r>
+      <w:proofErr w:type="spellStart"/>
+      <w:r>
+        <w:rPr>
+          <w:b/>
+          <w:bCs/>
+        </w:rPr>
+        <w:t>StandardErrorDTO</w:t>
+      </w:r>
+      <w:proofErr w:type="spellEnd"/>
+      <w:r>
+        <w:t xml:space="preserve"> para retornar mensagens limpas e o código HTTP 404.</w:t>
+      </w:r>
+    </w:p>
+    <w:p>
+      <w:pPr>
+        <w:pStyle w:val="PargrafodaLista"/>
+        <w:numPr>
+          <w:ilvl w:val="0"/>
+          <w:numId w:val="30"/>
+        </w:numPr>
+      </w:pPr>
+      <w:r>
+        <w:rPr>
+          <w:b/>
+          <w:bCs/>
+        </w:rPr>
+        <w:t>Uso do Spring Data JPA (</w:t>
+      </w:r>
+      <w:proofErr w:type="spellStart"/>
+      <w:r>
+        <w:rPr>
+          <w:b/>
+          <w:bCs/>
+        </w:rPr>
+        <w:t>ProdutoRepository</w:t>
+      </w:r>
+      <w:proofErr w:type="spellEnd"/>
+      <w:r>
+        <w:rPr>
+          <w:b/>
+          <w:bCs/>
+        </w:rPr>
+        <w:t>):</w:t>
+      </w:r>
+      <w:r>
+        <w:t xml:space="preserve"> </w:t>
+      </w:r>
+      <w:r>
+        <w:br/>
+        <w:t xml:space="preserve">Aproveitamento do método herdado </w:t>
+      </w:r>
+      <w:proofErr w:type="spellStart"/>
+      <w:r>
+        <w:rPr>
+          <w:b/>
+          <w:bCs/>
+        </w:rPr>
+        <w:t>FindById</w:t>
+      </w:r>
+      <w:proofErr w:type="spellEnd"/>
+      <w:r>
+        <w:t xml:space="preserve"> que retorna um </w:t>
+      </w:r>
+      <w:proofErr w:type="spellStart"/>
+      <w:r>
+        <w:rPr>
+          <w:b/>
+          <w:bCs/>
+        </w:rPr>
+        <w:t>Optional</w:t>
+      </w:r>
+      <w:proofErr w:type="spellEnd"/>
+      <w:r>
+        <w:rPr>
+          <w:b/>
+          <w:bCs/>
+        </w:rPr>
+        <w:t>&lt;Produto&gt;</w:t>
+      </w:r>
+      <w:r>
+        <w:rPr>
+          <w:b/>
+          <w:bCs/>
+        </w:rPr>
+        <w:br/>
+      </w:r>
+      <w:r>
+        <w:t xml:space="preserve">Uso do </w:t>
+      </w:r>
+      <w:proofErr w:type="spellStart"/>
+      <w:r>
+        <w:rPr>
+          <w:b/>
+          <w:bCs/>
+        </w:rPr>
+        <w:t>Optional</w:t>
+      </w:r>
+      <w:proofErr w:type="spellEnd"/>
+      <w:r>
+        <w:t xml:space="preserve"> força o desenvolvedor a tratar explicitamente a ausência do dado evitando o </w:t>
+      </w:r>
+      <w:proofErr w:type="spellStart"/>
+      <w:r>
+        <w:t>NullPointerException</w:t>
+      </w:r>
+      <w:proofErr w:type="spellEnd"/>
+      <w:r>
+        <w:t xml:space="preserve">, integrando-se perfeitamente com lançamento da nossa </w:t>
+      </w:r>
+      <w:proofErr w:type="spellStart"/>
+      <w:r>
+        <w:rPr>
+          <w:b/>
+          <w:bCs/>
+        </w:rPr>
+        <w:t>ResourceNotFoundException</w:t>
+      </w:r>
+      <w:proofErr w:type="spellEnd"/>
+      <w:r>
+        <w:rPr>
+          <w:b/>
+          <w:bCs/>
+        </w:rPr>
+        <w:t>.</w:t>
+      </w:r>
+    </w:p>
+    <w:p>
+      <w:pPr>
+        <w:pStyle w:val="PargrafodaLista"/>
+        <w:numPr>
+          <w:ilvl w:val="0"/>
+          <w:numId w:val="30"/>
+        </w:numPr>
+      </w:pPr>
+      <w:r>
+        <w:rPr>
+          <w:b/>
+          <w:bCs/>
+        </w:rPr>
+        <w:t xml:space="preserve">Regras de Negócio na Camada de </w:t>
+      </w:r>
+      <w:proofErr w:type="gramStart"/>
+      <w:r>
+        <w:rPr>
+          <w:b/>
+          <w:bCs/>
+        </w:rPr>
+        <w:t>Serviço(</w:t>
+      </w:r>
+      <w:proofErr w:type="spellStart"/>
+      <w:proofErr w:type="gramEnd"/>
+      <w:r>
+        <w:rPr>
+          <w:b/>
+          <w:bCs/>
+        </w:rPr>
+        <w:t>ProdutoService</w:t>
+      </w:r>
+      <w:proofErr w:type="spellEnd"/>
+      <w:r>
+        <w:rPr>
+          <w:b/>
+          <w:bCs/>
+        </w:rPr>
+        <w:t>):</w:t>
+      </w:r>
+      <w:r>
+        <w:br/>
+        <w:t xml:space="preserve">Utilização do </w:t>
+      </w:r>
+      <w:proofErr w:type="spellStart"/>
+      <w:r>
+        <w:t>Optional</w:t>
+      </w:r>
+      <w:proofErr w:type="spellEnd"/>
+      <w:r>
+        <w:t xml:space="preserve"> do Spring Data JPA para verificar a existência do produto por ID antes de prosseguir com as buscas, atualizações ou exclusões</w:t>
+      </w:r>
+      <w:r>
+        <w:br/>
+        <w:t>Centralização da lógica da alteração de atributos (nome, descrição, preço e estoque) e remoção segura</w:t>
+      </w:r>
+    </w:p>
+    <w:p>
+      <w:pPr>
+        <w:pStyle w:val="PargrafodaLista"/>
+        <w:numPr>
+          <w:ilvl w:val="0"/>
+          <w:numId w:val="30"/>
+        </w:numPr>
+      </w:pPr>
+      <w:r>
+        <w:rPr>
+          <w:b/>
+          <w:bCs/>
+        </w:rPr>
+        <w:t xml:space="preserve">Exposição de </w:t>
+      </w:r>
+      <w:proofErr w:type="spellStart"/>
+      <w:r>
+        <w:rPr>
+          <w:b/>
+          <w:bCs/>
+        </w:rPr>
+        <w:t>Endpoints</w:t>
+      </w:r>
+      <w:proofErr w:type="spellEnd"/>
+      <w:r>
+        <w:rPr>
+          <w:b/>
+          <w:bCs/>
+        </w:rPr>
+        <w:t xml:space="preserve"> da camada </w:t>
+      </w:r>
+      <w:proofErr w:type="spellStart"/>
+      <w:proofErr w:type="gramStart"/>
+      <w:r>
+        <w:rPr>
+          <w:b/>
+          <w:bCs/>
+        </w:rPr>
+        <w:t>Controller</w:t>
+      </w:r>
+      <w:proofErr w:type="spellEnd"/>
+      <w:r>
+        <w:rPr>
+          <w:b/>
+          <w:bCs/>
+        </w:rPr>
+        <w:t>(</w:t>
+      </w:r>
+      <w:proofErr w:type="spellStart"/>
+      <w:proofErr w:type="gramEnd"/>
+      <w:r>
+        <w:rPr>
+          <w:b/>
+          <w:bCs/>
+        </w:rPr>
+        <w:t>ProdutoController</w:t>
+      </w:r>
+      <w:proofErr w:type="spellEnd"/>
+      <w:r>
+        <w:rPr>
+          <w:b/>
+          <w:bCs/>
+        </w:rPr>
+        <w:t>):</w:t>
+      </w:r>
+      <w:r>
+        <w:t xml:space="preserve"> Implementação dos mapeamentos </w:t>
+      </w:r>
+      <w:r>
+        <w:rPr>
+          <w:b/>
+          <w:bCs/>
+        </w:rPr>
+        <w:t>@GetMapping, @PutMapping e @DeleteMapping</w:t>
+      </w:r>
+      <w:r>
+        <w:t xml:space="preserve"> utilizando variáveis de caminho </w:t>
+      </w:r>
+      <w:r>
+        <w:rPr>
+          <w:b/>
+          <w:bCs/>
+        </w:rPr>
+        <w:t>@PathVariable</w:t>
+      </w:r>
+      <w:r>
+        <w:t xml:space="preserve">, validações ativas com </w:t>
+      </w:r>
+      <w:r>
+        <w:rPr>
+          <w:b/>
+          <w:bCs/>
+        </w:rPr>
+        <w:t>@Valid</w:t>
+      </w:r>
+      <w:r>
+        <w:t xml:space="preserve"> e repostas HTTP adequadas ao padrão REST.</w:t>
+      </w:r>
+    </w:p>
+    <w:p>
+      <w:pPr>
+        <w:pStyle w:val="NormalWeb"/>
+        <w:rPr>
+          <w:rFonts w:asciiTheme="minorHAnsi" w:hAnsiTheme="minorHAnsi" w:cstheme="minorHAnsi"/>
+          <w:sz w:val="32"/>
+          <w:szCs w:val="32"/>
+        </w:rPr>
+      </w:pPr>
+    </w:p>
+    <w:p>
+      <w:pPr>
+        <w:pStyle w:val="NormalWeb"/>
+        <w:rPr>
+          <w:rFonts w:asciiTheme="minorHAnsi" w:hAnsiTheme="minorHAnsi" w:cstheme="minorHAnsi"/>
+        </w:rPr>
+      </w:pPr>
+    </w:p>
     <w:p/>
     <w:p>
       <w:pPr>
@@ -7865,6 +10155,155 @@
 <file path=word/numbering.xml><?xml version="1.0" encoding="utf-8"?>
 <w:numbering xmlns:wpc="http://schemas.microsoft.com/office/word/2010/wordprocessingCanvas" xmlns:cx="http://schemas.microsoft.com/office/drawing/2014/chartex" xmlns:cx1="http://schemas.microsoft.com/office/drawing/2015/9/8/chartex" xmlns:cx2="http://schemas.microsoft.com/office/drawing/2015/10/21/chartex" xmlns:cx3="http://schemas.microsoft.com/office/drawing/2016/5/9/chartex" xmlns:cx4="http://schemas.microsoft.com/office/drawing/2016/5/10/chartex" xmlns:cx5="http://schemas.microsoft.com/office/drawing/2016/5/11/chartex" xmlns:cx6="http://schemas.microsoft.com/office/drawing/2016/5/12/chartex" xmlns:cx7="http://schemas.microsoft.com/office/drawing/2016/5/13/chartex" xmlns:cx8="http://schemas.microsoft.com/office/drawing/2016/5/14/chartex" xmlns:mc="http://schemas.openxmlformats.org/markup-compatibility/2006" xmlns:aink="http://schemas.microsoft.com/office/drawing/2016/ink" xmlns:am3d="http://schemas.microsoft.com/office/drawing/2017/model3d" xmlns:o="urn:schemas-microsoft-com:office:office" xmlns:r="http://schemas.openxmlformats.org/officeDocument/2006/relationships" xmlns:m="http://schemas.openxmlformats.org/officeDocument/2006/math" xmlns:v="urn:schemas-microsoft-com:vml" xmlns:wp14="http://schemas.microsoft.com/office/word/2010/wordprocessingDrawing" xmlns:wp="http://schemas.openxmlformats.org/drawingml/2006/wordprocessingDrawing" xmlns:w10="urn:schemas-microsoft-com:office:word" xmlns:w="http://schemas.openxmlformats.org/wordprocessingml/2006/main" xmlns:w14="http://schemas.microsoft.com/office/word/2010/wordml" xmlns:w15="http://schemas.microsoft.com/office/word/2012/wordml" xmlns:w16cex="http://schemas.microsoft.com/office/word/2018/wordml/cex" xmlns:w16cid="http://schemas.microsoft.com/office/word/2016/wordml/cid" xmlns:w16="http://schemas.microsoft.com/office/word/2018/wordml" xmlns:w16sdtdh="http://schemas.microsoft.com/office/word/2020/wordml/sdtdatahash" xmlns:w16se="http://schemas.microsoft.com/office/word/2015/wordml/symex" xmlns:wpg="http://schemas.microsoft.com/office/word/2010/wordprocessingGroup" xmlns:wpi="http://schemas.microsoft.com/office/word/2010/wordprocessingInk" xmlns:wne="http://schemas.microsoft.com/office/word/2006/wordml" xmlns:wps="http://schemas.microsoft.com/office/word/2010/wordprocessingShape" mc:Ignorable="w14 w15 w16se w16cid w16 w16cex w16sdtdh wp14">
   <w:abstractNum w:abstractNumId="0" w15:restartNumberingAfterBreak="0">
+    <w:nsid w:val="00253D24"/>
+    <w:multiLevelType w:val="multilevel"/>
+    <w:tmpl w:val="848C912E"/>
+    <w:lvl w:ilvl="0">
+      <w:start w:val="1"/>
+      <w:numFmt w:val="bullet"/>
+      <w:lvlText w:val=""/>
+      <w:lvlJc w:val="left"/>
+      <w:pPr>
+        <w:tabs>
+          <w:tab w:val="num" w:pos="720"/>
+        </w:tabs>
+        <w:ind w:left="720" w:hanging="360"/>
+      </w:pPr>
+      <w:rPr>
+        <w:rFonts w:ascii="Symbol" w:hAnsi="Symbol" w:hint="default"/>
+        <w:sz w:val="20"/>
+      </w:rPr>
+    </w:lvl>
+    <w:lvl w:ilvl="1" w:tentative="1">
+      <w:start w:val="1"/>
+      <w:numFmt w:val="bullet"/>
+      <w:lvlText w:val="o"/>
+      <w:lvlJc w:val="left"/>
+      <w:pPr>
+        <w:tabs>
+          <w:tab w:val="num" w:pos="1440"/>
+        </w:tabs>
+        <w:ind w:left="1440" w:hanging="360"/>
+      </w:pPr>
+      <w:rPr>
+        <w:rFonts w:ascii="Courier New" w:hAnsi="Courier New" w:hint="default"/>
+        <w:sz w:val="20"/>
+      </w:rPr>
+    </w:lvl>
+    <w:lvl w:ilvl="2" w:tentative="1">
+      <w:start w:val="1"/>
+      <w:numFmt w:val="bullet"/>
+      <w:lvlText w:val=""/>
+      <w:lvlJc w:val="left"/>
+      <w:pPr>
+        <w:tabs>
+          <w:tab w:val="num" w:pos="2160"/>
+        </w:tabs>
+        <w:ind w:left="2160" w:hanging="360"/>
+      </w:pPr>
+      <w:rPr>
+        <w:rFonts w:ascii="Wingdings" w:hAnsi="Wingdings" w:hint="default"/>
+        <w:sz w:val="20"/>
+      </w:rPr>
+    </w:lvl>
+    <w:lvl w:ilvl="3" w:tentative="1">
+      <w:start w:val="1"/>
+      <w:numFmt w:val="bullet"/>
+      <w:lvlText w:val=""/>
+      <w:lvlJc w:val="left"/>
+      <w:pPr>
+        <w:tabs>
+          <w:tab w:val="num" w:pos="2880"/>
+        </w:tabs>
+        <w:ind w:left="2880" w:hanging="360"/>
+      </w:pPr>
+      <w:rPr>
+        <w:rFonts w:ascii="Wingdings" w:hAnsi="Wingdings" w:hint="default"/>
+        <w:sz w:val="20"/>
+      </w:rPr>
+    </w:lvl>
+    <w:lvl w:ilvl="4" w:tentative="1">
+      <w:start w:val="1"/>
+      <w:numFmt w:val="bullet"/>
+      <w:lvlText w:val=""/>
+      <w:lvlJc w:val="left"/>
+      <w:pPr>
+        <w:tabs>
+          <w:tab w:val="num" w:pos="3600"/>
+        </w:tabs>
+        <w:ind w:left="3600" w:hanging="360"/>
+      </w:pPr>
+      <w:rPr>
+        <w:rFonts w:ascii="Wingdings" w:hAnsi="Wingdings" w:hint="default"/>
+        <w:sz w:val="20"/>
+      </w:rPr>
+    </w:lvl>
+    <w:lvl w:ilvl="5" w:tentative="1">
+      <w:start w:val="1"/>
+      <w:numFmt w:val="bullet"/>
+      <w:lvlText w:val=""/>
+      <w:lvlJc w:val="left"/>
+      <w:pPr>
+        <w:tabs>
+          <w:tab w:val="num" w:pos="4320"/>
+        </w:tabs>
+        <w:ind w:left="4320" w:hanging="360"/>
+      </w:pPr>
+      <w:rPr>
+        <w:rFonts w:ascii="Wingdings" w:hAnsi="Wingdings" w:hint="default"/>
+        <w:sz w:val="20"/>
+      </w:rPr>
+    </w:lvl>
+    <w:lvl w:ilvl="6" w:tentative="1">
+      <w:start w:val="1"/>
+      <w:numFmt w:val="bullet"/>
+      <w:lvlText w:val=""/>
+      <w:lvlJc w:val="left"/>
+      <w:pPr>
+        <w:tabs>
+          <w:tab w:val="num" w:pos="5040"/>
+        </w:tabs>
+        <w:ind w:left="5040" w:hanging="360"/>
+      </w:pPr>
+      <w:rPr>
+        <w:rFonts w:ascii="Wingdings" w:hAnsi="Wingdings" w:hint="default"/>
+        <w:sz w:val="20"/>
+      </w:rPr>
+    </w:lvl>
+    <w:lvl w:ilvl="7" w:tentative="1">
+      <w:start w:val="1"/>
+      <w:numFmt w:val="bullet"/>
+      <w:lvlText w:val=""/>
+      <w:lvlJc w:val="left"/>
+      <w:pPr>
+        <w:tabs>
+          <w:tab w:val="num" w:pos="5760"/>
+        </w:tabs>
+        <w:ind w:left="5760" w:hanging="360"/>
+      </w:pPr>
+      <w:rPr>
+        <w:rFonts w:ascii="Wingdings" w:hAnsi="Wingdings" w:hint="default"/>
+        <w:sz w:val="20"/>
+      </w:rPr>
+    </w:lvl>
+    <w:lvl w:ilvl="8" w:tentative="1">
+      <w:start w:val="1"/>
+      <w:numFmt w:val="bullet"/>
+      <w:lvlText w:val=""/>
+      <w:lvlJc w:val="left"/>
+      <w:pPr>
+        <w:tabs>
+          <w:tab w:val="num" w:pos="6480"/>
+        </w:tabs>
+        <w:ind w:left="6480" w:hanging="360"/>
+      </w:pPr>
+      <w:rPr>
+        <w:rFonts w:ascii="Wingdings" w:hAnsi="Wingdings" w:hint="default"/>
+        <w:sz w:val="20"/>
+      </w:rPr>
+    </w:lvl>
+  </w:abstractNum>
+  <w:abstractNum w:abstractNumId="1" w15:restartNumberingAfterBreak="0">
     <w:nsid w:val="01722A28"/>
     <w:multiLevelType w:val="multilevel"/>
     <w:tmpl w:val="0A18AF16"/>
@@ -8013,7 +10452,156 @@
       </w:rPr>
     </w:lvl>
   </w:abstractNum>
-  <w:abstractNum w:abstractNumId="1" w15:restartNumberingAfterBreak="0">
+  <w:abstractNum w:abstractNumId="2" w15:restartNumberingAfterBreak="0">
+    <w:nsid w:val="05930AE3"/>
+    <w:multiLevelType w:val="multilevel"/>
+    <w:tmpl w:val="C2B0914C"/>
+    <w:lvl w:ilvl="0">
+      <w:start w:val="1"/>
+      <w:numFmt w:val="bullet"/>
+      <w:lvlText w:val=""/>
+      <w:lvlJc w:val="left"/>
+      <w:pPr>
+        <w:tabs>
+          <w:tab w:val="num" w:pos="720"/>
+        </w:tabs>
+        <w:ind w:left="720" w:hanging="360"/>
+      </w:pPr>
+      <w:rPr>
+        <w:rFonts w:ascii="Symbol" w:hAnsi="Symbol" w:hint="default"/>
+        <w:sz w:val="20"/>
+      </w:rPr>
+    </w:lvl>
+    <w:lvl w:ilvl="1" w:tentative="1">
+      <w:start w:val="1"/>
+      <w:numFmt w:val="bullet"/>
+      <w:lvlText w:val="o"/>
+      <w:lvlJc w:val="left"/>
+      <w:pPr>
+        <w:tabs>
+          <w:tab w:val="num" w:pos="1440"/>
+        </w:tabs>
+        <w:ind w:left="1440" w:hanging="360"/>
+      </w:pPr>
+      <w:rPr>
+        <w:rFonts w:ascii="Courier New" w:hAnsi="Courier New" w:hint="default"/>
+        <w:sz w:val="20"/>
+      </w:rPr>
+    </w:lvl>
+    <w:lvl w:ilvl="2" w:tentative="1">
+      <w:start w:val="1"/>
+      <w:numFmt w:val="bullet"/>
+      <w:lvlText w:val=""/>
+      <w:lvlJc w:val="left"/>
+      <w:pPr>
+        <w:tabs>
+          <w:tab w:val="num" w:pos="2160"/>
+        </w:tabs>
+        <w:ind w:left="2160" w:hanging="360"/>
+      </w:pPr>
+      <w:rPr>
+        <w:rFonts w:ascii="Wingdings" w:hAnsi="Wingdings" w:hint="default"/>
+        <w:sz w:val="20"/>
+      </w:rPr>
+    </w:lvl>
+    <w:lvl w:ilvl="3" w:tentative="1">
+      <w:start w:val="1"/>
+      <w:numFmt w:val="bullet"/>
+      <w:lvlText w:val=""/>
+      <w:lvlJc w:val="left"/>
+      <w:pPr>
+        <w:tabs>
+          <w:tab w:val="num" w:pos="2880"/>
+        </w:tabs>
+        <w:ind w:left="2880" w:hanging="360"/>
+      </w:pPr>
+      <w:rPr>
+        <w:rFonts w:ascii="Wingdings" w:hAnsi="Wingdings" w:hint="default"/>
+        <w:sz w:val="20"/>
+      </w:rPr>
+    </w:lvl>
+    <w:lvl w:ilvl="4" w:tentative="1">
+      <w:start w:val="1"/>
+      <w:numFmt w:val="bullet"/>
+      <w:lvlText w:val=""/>
+      <w:lvlJc w:val="left"/>
+      <w:pPr>
+        <w:tabs>
+          <w:tab w:val="num" w:pos="3600"/>
+        </w:tabs>
+        <w:ind w:left="3600" w:hanging="360"/>
+      </w:pPr>
+      <w:rPr>
+        <w:rFonts w:ascii="Wingdings" w:hAnsi="Wingdings" w:hint="default"/>
+        <w:sz w:val="20"/>
+      </w:rPr>
+    </w:lvl>
+    <w:lvl w:ilvl="5" w:tentative="1">
+      <w:start w:val="1"/>
+      <w:numFmt w:val="bullet"/>
+      <w:lvlText w:val=""/>
+      <w:lvlJc w:val="left"/>
+      <w:pPr>
+        <w:tabs>
+          <w:tab w:val="num" w:pos="4320"/>
+        </w:tabs>
+        <w:ind w:left="4320" w:hanging="360"/>
+      </w:pPr>
+      <w:rPr>
+        <w:rFonts w:ascii="Wingdings" w:hAnsi="Wingdings" w:hint="default"/>
+        <w:sz w:val="20"/>
+      </w:rPr>
+    </w:lvl>
+    <w:lvl w:ilvl="6" w:tentative="1">
+      <w:start w:val="1"/>
+      <w:numFmt w:val="bullet"/>
+      <w:lvlText w:val=""/>
+      <w:lvlJc w:val="left"/>
+      <w:pPr>
+        <w:tabs>
+          <w:tab w:val="num" w:pos="5040"/>
+        </w:tabs>
+        <w:ind w:left="5040" w:hanging="360"/>
+      </w:pPr>
+      <w:rPr>
+        <w:rFonts w:ascii="Wingdings" w:hAnsi="Wingdings" w:hint="default"/>
+        <w:sz w:val="20"/>
+      </w:rPr>
+    </w:lvl>
+    <w:lvl w:ilvl="7" w:tentative="1">
+      <w:start w:val="1"/>
+      <w:numFmt w:val="bullet"/>
+      <w:lvlText w:val=""/>
+      <w:lvlJc w:val="left"/>
+      <w:pPr>
+        <w:tabs>
+          <w:tab w:val="num" w:pos="5760"/>
+        </w:tabs>
+        <w:ind w:left="5760" w:hanging="360"/>
+      </w:pPr>
+      <w:rPr>
+        <w:rFonts w:ascii="Wingdings" w:hAnsi="Wingdings" w:hint="default"/>
+        <w:sz w:val="20"/>
+      </w:rPr>
+    </w:lvl>
+    <w:lvl w:ilvl="8" w:tentative="1">
+      <w:start w:val="1"/>
+      <w:numFmt w:val="bullet"/>
+      <w:lvlText w:val=""/>
+      <w:lvlJc w:val="left"/>
+      <w:pPr>
+        <w:tabs>
+          <w:tab w:val="num" w:pos="6480"/>
+        </w:tabs>
+        <w:ind w:left="6480" w:hanging="360"/>
+      </w:pPr>
+      <w:rPr>
+        <w:rFonts w:ascii="Wingdings" w:hAnsi="Wingdings" w:hint="default"/>
+        <w:sz w:val="20"/>
+      </w:rPr>
+    </w:lvl>
+  </w:abstractNum>
+  <w:abstractNum w:abstractNumId="3" w15:restartNumberingAfterBreak="0">
     <w:nsid w:val="0CF7182D"/>
     <w:multiLevelType w:val="multilevel"/>
     <w:tmpl w:val="6B54E8CC"/>
@@ -8130,7 +10718,7 @@
       </w:pPr>
     </w:lvl>
   </w:abstractNum>
-  <w:abstractNum w:abstractNumId="2" w15:restartNumberingAfterBreak="0">
+  <w:abstractNum w:abstractNumId="4" w15:restartNumberingAfterBreak="0">
     <w:nsid w:val="16B67384"/>
     <w:multiLevelType w:val="hybridMultilevel"/>
     <w:tmpl w:val="E542BEF8"/>
@@ -8243,7 +10831,7 @@
       </w:rPr>
     </w:lvl>
   </w:abstractNum>
-  <w:abstractNum w:abstractNumId="3" w15:restartNumberingAfterBreak="0">
+  <w:abstractNum w:abstractNumId="5" w15:restartNumberingAfterBreak="0">
     <w:nsid w:val="18DC5F17"/>
     <w:multiLevelType w:val="multilevel"/>
     <w:tmpl w:val="6F6C15D2"/>
@@ -8360,7 +10948,7 @@
       </w:pPr>
     </w:lvl>
   </w:abstractNum>
-  <w:abstractNum w:abstractNumId="4" w15:restartNumberingAfterBreak="0">
+  <w:abstractNum w:abstractNumId="6" w15:restartNumberingAfterBreak="0">
     <w:nsid w:val="1EBF3377"/>
     <w:multiLevelType w:val="hybridMultilevel"/>
     <w:tmpl w:val="12B89DD6"/>
@@ -8473,7 +11061,7 @@
       </w:rPr>
     </w:lvl>
   </w:abstractNum>
-  <w:abstractNum w:abstractNumId="5" w15:restartNumberingAfterBreak="0">
+  <w:abstractNum w:abstractNumId="7" w15:restartNumberingAfterBreak="0">
     <w:nsid w:val="37CE0CFB"/>
     <w:multiLevelType w:val="multilevel"/>
     <w:tmpl w:val="33E8DADC"/>
@@ -8622,7 +11210,7 @@
       </w:rPr>
     </w:lvl>
   </w:abstractNum>
-  <w:abstractNum w:abstractNumId="6" w15:restartNumberingAfterBreak="0">
+  <w:abstractNum w:abstractNumId="8" w15:restartNumberingAfterBreak="0">
     <w:nsid w:val="3AA935FA"/>
     <w:multiLevelType w:val="multilevel"/>
     <w:tmpl w:val="F5BCCEAE"/>
@@ -8771,10 +11359,385 @@
       </w:rPr>
     </w:lvl>
   </w:abstractNum>
-  <w:abstractNum w:abstractNumId="7" w15:restartNumberingAfterBreak="0">
+  <w:abstractNum w:abstractNumId="9" w15:restartNumberingAfterBreak="0">
+    <w:nsid w:val="3D105E2B"/>
+    <w:multiLevelType w:val="multilevel"/>
+    <w:tmpl w:val="E0CEC248"/>
+    <w:lvl w:ilvl="0">
+      <w:start w:val="1"/>
+      <w:numFmt w:val="bullet"/>
+      <w:lvlText w:val=""/>
+      <w:lvlJc w:val="left"/>
+      <w:pPr>
+        <w:tabs>
+          <w:tab w:val="num" w:pos="720"/>
+        </w:tabs>
+        <w:ind w:left="720" w:hanging="360"/>
+      </w:pPr>
+      <w:rPr>
+        <w:rFonts w:ascii="Symbol" w:hAnsi="Symbol" w:hint="default"/>
+        <w:sz w:val="20"/>
+      </w:rPr>
+    </w:lvl>
+    <w:lvl w:ilvl="1" w:tentative="1">
+      <w:start w:val="1"/>
+      <w:numFmt w:val="bullet"/>
+      <w:lvlText w:val="o"/>
+      <w:lvlJc w:val="left"/>
+      <w:pPr>
+        <w:tabs>
+          <w:tab w:val="num" w:pos="1440"/>
+        </w:tabs>
+        <w:ind w:left="1440" w:hanging="360"/>
+      </w:pPr>
+      <w:rPr>
+        <w:rFonts w:ascii="Courier New" w:hAnsi="Courier New" w:hint="default"/>
+        <w:sz w:val="20"/>
+      </w:rPr>
+    </w:lvl>
+    <w:lvl w:ilvl="2" w:tentative="1">
+      <w:start w:val="1"/>
+      <w:numFmt w:val="bullet"/>
+      <w:lvlText w:val=""/>
+      <w:lvlJc w:val="left"/>
+      <w:pPr>
+        <w:tabs>
+          <w:tab w:val="num" w:pos="2160"/>
+        </w:tabs>
+        <w:ind w:left="2160" w:hanging="360"/>
+      </w:pPr>
+      <w:rPr>
+        <w:rFonts w:ascii="Wingdings" w:hAnsi="Wingdings" w:hint="default"/>
+        <w:sz w:val="20"/>
+      </w:rPr>
+    </w:lvl>
+    <w:lvl w:ilvl="3" w:tentative="1">
+      <w:start w:val="1"/>
+      <w:numFmt w:val="bullet"/>
+      <w:lvlText w:val=""/>
+      <w:lvlJc w:val="left"/>
+      <w:pPr>
+        <w:tabs>
+          <w:tab w:val="num" w:pos="2880"/>
+        </w:tabs>
+        <w:ind w:left="2880" w:hanging="360"/>
+      </w:pPr>
+      <w:rPr>
+        <w:rFonts w:ascii="Wingdings" w:hAnsi="Wingdings" w:hint="default"/>
+        <w:sz w:val="20"/>
+      </w:rPr>
+    </w:lvl>
+    <w:lvl w:ilvl="4" w:tentative="1">
+      <w:start w:val="1"/>
+      <w:numFmt w:val="bullet"/>
+      <w:lvlText w:val=""/>
+      <w:lvlJc w:val="left"/>
+      <w:pPr>
+        <w:tabs>
+          <w:tab w:val="num" w:pos="3600"/>
+        </w:tabs>
+        <w:ind w:left="3600" w:hanging="360"/>
+      </w:pPr>
+      <w:rPr>
+        <w:rFonts w:ascii="Wingdings" w:hAnsi="Wingdings" w:hint="default"/>
+        <w:sz w:val="20"/>
+      </w:rPr>
+    </w:lvl>
+    <w:lvl w:ilvl="5" w:tentative="1">
+      <w:start w:val="1"/>
+      <w:numFmt w:val="bullet"/>
+      <w:lvlText w:val=""/>
+      <w:lvlJc w:val="left"/>
+      <w:pPr>
+        <w:tabs>
+          <w:tab w:val="num" w:pos="4320"/>
+        </w:tabs>
+        <w:ind w:left="4320" w:hanging="360"/>
+      </w:pPr>
+      <w:rPr>
+        <w:rFonts w:ascii="Wingdings" w:hAnsi="Wingdings" w:hint="default"/>
+        <w:sz w:val="20"/>
+      </w:rPr>
+    </w:lvl>
+    <w:lvl w:ilvl="6" w:tentative="1">
+      <w:start w:val="1"/>
+      <w:numFmt w:val="bullet"/>
+      <w:lvlText w:val=""/>
+      <w:lvlJc w:val="left"/>
+      <w:pPr>
+        <w:tabs>
+          <w:tab w:val="num" w:pos="5040"/>
+        </w:tabs>
+        <w:ind w:left="5040" w:hanging="360"/>
+      </w:pPr>
+      <w:rPr>
+        <w:rFonts w:ascii="Wingdings" w:hAnsi="Wingdings" w:hint="default"/>
+        <w:sz w:val="20"/>
+      </w:rPr>
+    </w:lvl>
+    <w:lvl w:ilvl="7" w:tentative="1">
+      <w:start w:val="1"/>
+      <w:numFmt w:val="bullet"/>
+      <w:lvlText w:val=""/>
+      <w:lvlJc w:val="left"/>
+      <w:pPr>
+        <w:tabs>
+          <w:tab w:val="num" w:pos="5760"/>
+        </w:tabs>
+        <w:ind w:left="5760" w:hanging="360"/>
+      </w:pPr>
+      <w:rPr>
+        <w:rFonts w:ascii="Wingdings" w:hAnsi="Wingdings" w:hint="default"/>
+        <w:sz w:val="20"/>
+      </w:rPr>
+    </w:lvl>
+    <w:lvl w:ilvl="8" w:tentative="1">
+      <w:start w:val="1"/>
+      <w:numFmt w:val="bullet"/>
+      <w:lvlText w:val=""/>
+      <w:lvlJc w:val="left"/>
+      <w:pPr>
+        <w:tabs>
+          <w:tab w:val="num" w:pos="6480"/>
+        </w:tabs>
+        <w:ind w:left="6480" w:hanging="360"/>
+      </w:pPr>
+      <w:rPr>
+        <w:rFonts w:ascii="Wingdings" w:hAnsi="Wingdings" w:hint="default"/>
+        <w:sz w:val="20"/>
+      </w:rPr>
+    </w:lvl>
+  </w:abstractNum>
+  <w:abstractNum w:abstractNumId="10" w15:restartNumberingAfterBreak="0">
+    <w:nsid w:val="3E655DC9"/>
+    <w:multiLevelType w:val="hybridMultilevel"/>
+    <w:tmpl w:val="5EFA183E"/>
+    <w:lvl w:ilvl="0" w:tplc="04160001">
+      <w:start w:val="1"/>
+      <w:numFmt w:val="bullet"/>
+      <w:lvlText w:val=""/>
+      <w:lvlJc w:val="left"/>
+      <w:pPr>
+        <w:ind w:left="720" w:hanging="360"/>
+      </w:pPr>
+      <w:rPr>
+        <w:rFonts w:ascii="Symbol" w:hAnsi="Symbol" w:hint="default"/>
+      </w:rPr>
+    </w:lvl>
+    <w:lvl w:ilvl="1" w:tplc="04160003" w:tentative="1">
+      <w:start w:val="1"/>
+      <w:numFmt w:val="bullet"/>
+      <w:lvlText w:val="o"/>
+      <w:lvlJc w:val="left"/>
+      <w:pPr>
+        <w:ind w:left="1440" w:hanging="360"/>
+      </w:pPr>
+      <w:rPr>
+        <w:rFonts w:ascii="Courier New" w:hAnsi="Courier New" w:cs="Courier New" w:hint="default"/>
+      </w:rPr>
+    </w:lvl>
+    <w:lvl w:ilvl="2" w:tplc="04160005" w:tentative="1">
+      <w:start w:val="1"/>
+      <w:numFmt w:val="bullet"/>
+      <w:lvlText w:val=""/>
+      <w:lvlJc w:val="left"/>
+      <w:pPr>
+        <w:ind w:left="2160" w:hanging="360"/>
+      </w:pPr>
+      <w:rPr>
+        <w:rFonts w:ascii="Wingdings" w:hAnsi="Wingdings" w:hint="default"/>
+      </w:rPr>
+    </w:lvl>
+    <w:lvl w:ilvl="3" w:tplc="04160001" w:tentative="1">
+      <w:start w:val="1"/>
+      <w:numFmt w:val="bullet"/>
+      <w:lvlText w:val=""/>
+      <w:lvlJc w:val="left"/>
+      <w:pPr>
+        <w:ind w:left="2880" w:hanging="360"/>
+      </w:pPr>
+      <w:rPr>
+        <w:rFonts w:ascii="Symbol" w:hAnsi="Symbol" w:hint="default"/>
+      </w:rPr>
+    </w:lvl>
+    <w:lvl w:ilvl="4" w:tplc="04160003" w:tentative="1">
+      <w:start w:val="1"/>
+      <w:numFmt w:val="bullet"/>
+      <w:lvlText w:val="o"/>
+      <w:lvlJc w:val="left"/>
+      <w:pPr>
+        <w:ind w:left="3600" w:hanging="360"/>
+      </w:pPr>
+      <w:rPr>
+        <w:rFonts w:ascii="Courier New" w:hAnsi="Courier New" w:cs="Courier New" w:hint="default"/>
+      </w:rPr>
+    </w:lvl>
+    <w:lvl w:ilvl="5" w:tplc="04160005" w:tentative="1">
+      <w:start w:val="1"/>
+      <w:numFmt w:val="bullet"/>
+      <w:lvlText w:val=""/>
+      <w:lvlJc w:val="left"/>
+      <w:pPr>
+        <w:ind w:left="4320" w:hanging="360"/>
+      </w:pPr>
+      <w:rPr>
+        <w:rFonts w:ascii="Wingdings" w:hAnsi="Wingdings" w:hint="default"/>
+      </w:rPr>
+    </w:lvl>
+    <w:lvl w:ilvl="6" w:tplc="04160001" w:tentative="1">
+      <w:start w:val="1"/>
+      <w:numFmt w:val="bullet"/>
+      <w:lvlText w:val=""/>
+      <w:lvlJc w:val="left"/>
+      <w:pPr>
+        <w:ind w:left="5040" w:hanging="360"/>
+      </w:pPr>
+      <w:rPr>
+        <w:rFonts w:ascii="Symbol" w:hAnsi="Symbol" w:hint="default"/>
+      </w:rPr>
+    </w:lvl>
+    <w:lvl w:ilvl="7" w:tplc="04160003" w:tentative="1">
+      <w:start w:val="1"/>
+      <w:numFmt w:val="bullet"/>
+      <w:lvlText w:val="o"/>
+      <w:lvlJc w:val="left"/>
+      <w:pPr>
+        <w:ind w:left="5760" w:hanging="360"/>
+      </w:pPr>
+      <w:rPr>
+        <w:rFonts w:ascii="Courier New" w:hAnsi="Courier New" w:cs="Courier New" w:hint="default"/>
+      </w:rPr>
+    </w:lvl>
+    <w:lvl w:ilvl="8" w:tplc="04160005" w:tentative="1">
+      <w:start w:val="1"/>
+      <w:numFmt w:val="bullet"/>
+      <w:lvlText w:val=""/>
+      <w:lvlJc w:val="left"/>
+      <w:pPr>
+        <w:ind w:left="6480" w:hanging="360"/>
+      </w:pPr>
+      <w:rPr>
+        <w:rFonts w:ascii="Wingdings" w:hAnsi="Wingdings" w:hint="default"/>
+      </w:rPr>
+    </w:lvl>
+  </w:abstractNum>
+  <w:abstractNum w:abstractNumId="11" w15:restartNumberingAfterBreak="0">
+    <w:nsid w:val="40716A41"/>
+    <w:multiLevelType w:val="hybridMultilevel"/>
+    <w:tmpl w:val="389C314C"/>
+    <w:lvl w:ilvl="0" w:tplc="04160001">
+      <w:start w:val="1"/>
+      <w:numFmt w:val="bullet"/>
+      <w:lvlText w:val=""/>
+      <w:lvlJc w:val="left"/>
+      <w:pPr>
+        <w:ind w:left="720" w:hanging="360"/>
+      </w:pPr>
+      <w:rPr>
+        <w:rFonts w:ascii="Symbol" w:hAnsi="Symbol" w:hint="default"/>
+      </w:rPr>
+    </w:lvl>
+    <w:lvl w:ilvl="1" w:tplc="04160003" w:tentative="1">
+      <w:start w:val="1"/>
+      <w:numFmt w:val="bullet"/>
+      <w:lvlText w:val="o"/>
+      <w:lvlJc w:val="left"/>
+      <w:pPr>
+        <w:ind w:left="1440" w:hanging="360"/>
+      </w:pPr>
+      <w:rPr>
+        <w:rFonts w:ascii="Courier New" w:hAnsi="Courier New" w:cs="Courier New" w:hint="default"/>
+      </w:rPr>
+    </w:lvl>
+    <w:lvl w:ilvl="2" w:tplc="04160005" w:tentative="1">
+      <w:start w:val="1"/>
+      <w:numFmt w:val="bullet"/>
+      <w:lvlText w:val=""/>
+      <w:lvlJc w:val="left"/>
+      <w:pPr>
+        <w:ind w:left="2160" w:hanging="360"/>
+      </w:pPr>
+      <w:rPr>
+        <w:rFonts w:ascii="Wingdings" w:hAnsi="Wingdings" w:hint="default"/>
+      </w:rPr>
+    </w:lvl>
+    <w:lvl w:ilvl="3" w:tplc="04160001" w:tentative="1">
+      <w:start w:val="1"/>
+      <w:numFmt w:val="bullet"/>
+      <w:lvlText w:val=""/>
+      <w:lvlJc w:val="left"/>
+      <w:pPr>
+        <w:ind w:left="2880" w:hanging="360"/>
+      </w:pPr>
+      <w:rPr>
+        <w:rFonts w:ascii="Symbol" w:hAnsi="Symbol" w:hint="default"/>
+      </w:rPr>
+    </w:lvl>
+    <w:lvl w:ilvl="4" w:tplc="04160003" w:tentative="1">
+      <w:start w:val="1"/>
+      <w:numFmt w:val="bullet"/>
+      <w:lvlText w:val="o"/>
+      <w:lvlJc w:val="left"/>
+      <w:pPr>
+        <w:ind w:left="3600" w:hanging="360"/>
+      </w:pPr>
+      <w:rPr>
+        <w:rFonts w:ascii="Courier New" w:hAnsi="Courier New" w:cs="Courier New" w:hint="default"/>
+      </w:rPr>
+    </w:lvl>
+    <w:lvl w:ilvl="5" w:tplc="04160005" w:tentative="1">
+      <w:start w:val="1"/>
+      <w:numFmt w:val="bullet"/>
+      <w:lvlText w:val=""/>
+      <w:lvlJc w:val="left"/>
+      <w:pPr>
+        <w:ind w:left="4320" w:hanging="360"/>
+      </w:pPr>
+      <w:rPr>
+        <w:rFonts w:ascii="Wingdings" w:hAnsi="Wingdings" w:hint="default"/>
+      </w:rPr>
+    </w:lvl>
+    <w:lvl w:ilvl="6" w:tplc="04160001" w:tentative="1">
+      <w:start w:val="1"/>
+      <w:numFmt w:val="bullet"/>
+      <w:lvlText w:val=""/>
+      <w:lvlJc w:val="left"/>
+      <w:pPr>
+        <w:ind w:left="5040" w:hanging="360"/>
+      </w:pPr>
+      <w:rPr>
+        <w:rFonts w:ascii="Symbol" w:hAnsi="Symbol" w:hint="default"/>
+      </w:rPr>
+    </w:lvl>
+    <w:lvl w:ilvl="7" w:tplc="04160003" w:tentative="1">
+      <w:start w:val="1"/>
+      <w:numFmt w:val="bullet"/>
+      <w:lvlText w:val="o"/>
+      <w:lvlJc w:val="left"/>
+      <w:pPr>
+        <w:ind w:left="5760" w:hanging="360"/>
+      </w:pPr>
+      <w:rPr>
+        <w:rFonts w:ascii="Courier New" w:hAnsi="Courier New" w:cs="Courier New" w:hint="default"/>
+      </w:rPr>
+    </w:lvl>
+    <w:lvl w:ilvl="8" w:tplc="04160005" w:tentative="1">
+      <w:start w:val="1"/>
+      <w:numFmt w:val="bullet"/>
+      <w:lvlText w:val=""/>
+      <w:lvlJc w:val="left"/>
+      <w:pPr>
+        <w:ind w:left="6480" w:hanging="360"/>
+      </w:pPr>
+      <w:rPr>
+        <w:rFonts w:ascii="Wingdings" w:hAnsi="Wingdings" w:hint="default"/>
+      </w:rPr>
+    </w:lvl>
+  </w:abstractNum>
+  <w:abstractNum w:abstractNumId="12" w15:restartNumberingAfterBreak="0">
     <w:nsid w:val="40B80731"/>
     <w:multiLevelType w:val="hybridMultilevel"/>
-    <w:tmpl w:val="34C25554"/>
+    <w:tmpl w:val="A120DF80"/>
     <w:lvl w:ilvl="0" w:tplc="0416000F">
       <w:start w:val="1"/>
       <w:numFmt w:val="decimal"/>
@@ -8857,7 +11820,156 @@
       </w:pPr>
     </w:lvl>
   </w:abstractNum>
-  <w:abstractNum w:abstractNumId="8" w15:restartNumberingAfterBreak="0">
+  <w:abstractNum w:abstractNumId="13" w15:restartNumberingAfterBreak="0">
+    <w:nsid w:val="475A0EB4"/>
+    <w:multiLevelType w:val="multilevel"/>
+    <w:tmpl w:val="892251C2"/>
+    <w:lvl w:ilvl="0">
+      <w:start w:val="1"/>
+      <w:numFmt w:val="bullet"/>
+      <w:lvlText w:val=""/>
+      <w:lvlJc w:val="left"/>
+      <w:pPr>
+        <w:tabs>
+          <w:tab w:val="num" w:pos="720"/>
+        </w:tabs>
+        <w:ind w:left="720" w:hanging="360"/>
+      </w:pPr>
+      <w:rPr>
+        <w:rFonts w:ascii="Symbol" w:hAnsi="Symbol" w:hint="default"/>
+        <w:sz w:val="20"/>
+      </w:rPr>
+    </w:lvl>
+    <w:lvl w:ilvl="1" w:tentative="1">
+      <w:start w:val="1"/>
+      <w:numFmt w:val="bullet"/>
+      <w:lvlText w:val="o"/>
+      <w:lvlJc w:val="left"/>
+      <w:pPr>
+        <w:tabs>
+          <w:tab w:val="num" w:pos="1440"/>
+        </w:tabs>
+        <w:ind w:left="1440" w:hanging="360"/>
+      </w:pPr>
+      <w:rPr>
+        <w:rFonts w:ascii="Courier New" w:hAnsi="Courier New" w:hint="default"/>
+        <w:sz w:val="20"/>
+      </w:rPr>
+    </w:lvl>
+    <w:lvl w:ilvl="2" w:tentative="1">
+      <w:start w:val="1"/>
+      <w:numFmt w:val="bullet"/>
+      <w:lvlText w:val=""/>
+      <w:lvlJc w:val="left"/>
+      <w:pPr>
+        <w:tabs>
+          <w:tab w:val="num" w:pos="2160"/>
+        </w:tabs>
+        <w:ind w:left="2160" w:hanging="360"/>
+      </w:pPr>
+      <w:rPr>
+        <w:rFonts w:ascii="Wingdings" w:hAnsi="Wingdings" w:hint="default"/>
+        <w:sz w:val="20"/>
+      </w:rPr>
+    </w:lvl>
+    <w:lvl w:ilvl="3" w:tentative="1">
+      <w:start w:val="1"/>
+      <w:numFmt w:val="bullet"/>
+      <w:lvlText w:val=""/>
+      <w:lvlJc w:val="left"/>
+      <w:pPr>
+        <w:tabs>
+          <w:tab w:val="num" w:pos="2880"/>
+        </w:tabs>
+        <w:ind w:left="2880" w:hanging="360"/>
+      </w:pPr>
+      <w:rPr>
+        <w:rFonts w:ascii="Wingdings" w:hAnsi="Wingdings" w:hint="default"/>
+        <w:sz w:val="20"/>
+      </w:rPr>
+    </w:lvl>
+    <w:lvl w:ilvl="4" w:tentative="1">
+      <w:start w:val="1"/>
+      <w:numFmt w:val="bullet"/>
+      <w:lvlText w:val=""/>
+      <w:lvlJc w:val="left"/>
+      <w:pPr>
+        <w:tabs>
+          <w:tab w:val="num" w:pos="3600"/>
+        </w:tabs>
+        <w:ind w:left="3600" w:hanging="360"/>
+      </w:pPr>
+      <w:rPr>
+        <w:rFonts w:ascii="Wingdings" w:hAnsi="Wingdings" w:hint="default"/>
+        <w:sz w:val="20"/>
+      </w:rPr>
+    </w:lvl>
+    <w:lvl w:ilvl="5" w:tentative="1">
+      <w:start w:val="1"/>
+      <w:numFmt w:val="bullet"/>
+      <w:lvlText w:val=""/>
+      <w:lvlJc w:val="left"/>
+      <w:pPr>
+        <w:tabs>
+          <w:tab w:val="num" w:pos="4320"/>
+        </w:tabs>
+        <w:ind w:left="4320" w:hanging="360"/>
+      </w:pPr>
+      <w:rPr>
+        <w:rFonts w:ascii="Wingdings" w:hAnsi="Wingdings" w:hint="default"/>
+        <w:sz w:val="20"/>
+      </w:rPr>
+    </w:lvl>
+    <w:lvl w:ilvl="6" w:tentative="1">
+      <w:start w:val="1"/>
+      <w:numFmt w:val="bullet"/>
+      <w:lvlText w:val=""/>
+      <w:lvlJc w:val="left"/>
+      <w:pPr>
+        <w:tabs>
+          <w:tab w:val="num" w:pos="5040"/>
+        </w:tabs>
+        <w:ind w:left="5040" w:hanging="360"/>
+      </w:pPr>
+      <w:rPr>
+        <w:rFonts w:ascii="Wingdings" w:hAnsi="Wingdings" w:hint="default"/>
+        <w:sz w:val="20"/>
+      </w:rPr>
+    </w:lvl>
+    <w:lvl w:ilvl="7" w:tentative="1">
+      <w:start w:val="1"/>
+      <w:numFmt w:val="bullet"/>
+      <w:lvlText w:val=""/>
+      <w:lvlJc w:val="left"/>
+      <w:pPr>
+        <w:tabs>
+          <w:tab w:val="num" w:pos="5760"/>
+        </w:tabs>
+        <w:ind w:left="5760" w:hanging="360"/>
+      </w:pPr>
+      <w:rPr>
+        <w:rFonts w:ascii="Wingdings" w:hAnsi="Wingdings" w:hint="default"/>
+        <w:sz w:val="20"/>
+      </w:rPr>
+    </w:lvl>
+    <w:lvl w:ilvl="8" w:tentative="1">
+      <w:start w:val="1"/>
+      <w:numFmt w:val="bullet"/>
+      <w:lvlText w:val=""/>
+      <w:lvlJc w:val="left"/>
+      <w:pPr>
+        <w:tabs>
+          <w:tab w:val="num" w:pos="6480"/>
+        </w:tabs>
+        <w:ind w:left="6480" w:hanging="360"/>
+      </w:pPr>
+      <w:rPr>
+        <w:rFonts w:ascii="Wingdings" w:hAnsi="Wingdings" w:hint="default"/>
+        <w:sz w:val="20"/>
+      </w:rPr>
+    </w:lvl>
+  </w:abstractNum>
+  <w:abstractNum w:abstractNumId="14" w15:restartNumberingAfterBreak="0">
     <w:nsid w:val="4AB832C4"/>
     <w:multiLevelType w:val="multilevel"/>
     <w:tmpl w:val="96D04A62"/>
@@ -9006,7 +12118,7 @@
       </w:rPr>
     </w:lvl>
   </w:abstractNum>
-  <w:abstractNum w:abstractNumId="9" w15:restartNumberingAfterBreak="0">
+  <w:abstractNum w:abstractNumId="15" w15:restartNumberingAfterBreak="0">
     <w:nsid w:val="58EE5E10"/>
     <w:multiLevelType w:val="multilevel"/>
     <w:tmpl w:val="CD6E82FC"/>
@@ -9155,7 +12267,7 @@
       </w:rPr>
     </w:lvl>
   </w:abstractNum>
-  <w:abstractNum w:abstractNumId="10" w15:restartNumberingAfterBreak="0">
+  <w:abstractNum w:abstractNumId="16" w15:restartNumberingAfterBreak="0">
     <w:nsid w:val="59211560"/>
     <w:multiLevelType w:val="multilevel"/>
     <w:tmpl w:val="4D0C3446"/>
@@ -9304,7 +12416,7 @@
       </w:rPr>
     </w:lvl>
   </w:abstractNum>
-  <w:abstractNum w:abstractNumId="11" w15:restartNumberingAfterBreak="0">
+  <w:abstractNum w:abstractNumId="17" w15:restartNumberingAfterBreak="0">
     <w:nsid w:val="593B7802"/>
     <w:multiLevelType w:val="multilevel"/>
     <w:tmpl w:val="51FEE8A6"/>
@@ -9449,7 +12561,7 @@
       </w:rPr>
     </w:lvl>
   </w:abstractNum>
-  <w:abstractNum w:abstractNumId="12" w15:restartNumberingAfterBreak="0">
+  <w:abstractNum w:abstractNumId="18" w15:restartNumberingAfterBreak="0">
     <w:nsid w:val="5B0E7E21"/>
     <w:multiLevelType w:val="multilevel"/>
     <w:tmpl w:val="24D4249E"/>
@@ -9598,7 +12710,156 @@
       </w:rPr>
     </w:lvl>
   </w:abstractNum>
-  <w:abstractNum w:abstractNumId="13" w15:restartNumberingAfterBreak="0">
+  <w:abstractNum w:abstractNumId="19" w15:restartNumberingAfterBreak="0">
+    <w:nsid w:val="5D80315B"/>
+    <w:multiLevelType w:val="multilevel"/>
+    <w:tmpl w:val="3530E922"/>
+    <w:lvl w:ilvl="0">
+      <w:start w:val="1"/>
+      <w:numFmt w:val="bullet"/>
+      <w:lvlText w:val=""/>
+      <w:lvlJc w:val="left"/>
+      <w:pPr>
+        <w:tabs>
+          <w:tab w:val="num" w:pos="720"/>
+        </w:tabs>
+        <w:ind w:left="720" w:hanging="360"/>
+      </w:pPr>
+      <w:rPr>
+        <w:rFonts w:ascii="Symbol" w:hAnsi="Symbol" w:hint="default"/>
+        <w:sz w:val="20"/>
+      </w:rPr>
+    </w:lvl>
+    <w:lvl w:ilvl="1" w:tentative="1">
+      <w:start w:val="1"/>
+      <w:numFmt w:val="bullet"/>
+      <w:lvlText w:val="o"/>
+      <w:lvlJc w:val="left"/>
+      <w:pPr>
+        <w:tabs>
+          <w:tab w:val="num" w:pos="1440"/>
+        </w:tabs>
+        <w:ind w:left="1440" w:hanging="360"/>
+      </w:pPr>
+      <w:rPr>
+        <w:rFonts w:ascii="Courier New" w:hAnsi="Courier New" w:hint="default"/>
+        <w:sz w:val="20"/>
+      </w:rPr>
+    </w:lvl>
+    <w:lvl w:ilvl="2" w:tentative="1">
+      <w:start w:val="1"/>
+      <w:numFmt w:val="bullet"/>
+      <w:lvlText w:val=""/>
+      <w:lvlJc w:val="left"/>
+      <w:pPr>
+        <w:tabs>
+          <w:tab w:val="num" w:pos="2160"/>
+        </w:tabs>
+        <w:ind w:left="2160" w:hanging="360"/>
+      </w:pPr>
+      <w:rPr>
+        <w:rFonts w:ascii="Wingdings" w:hAnsi="Wingdings" w:hint="default"/>
+        <w:sz w:val="20"/>
+      </w:rPr>
+    </w:lvl>
+    <w:lvl w:ilvl="3" w:tentative="1">
+      <w:start w:val="1"/>
+      <w:numFmt w:val="bullet"/>
+      <w:lvlText w:val=""/>
+      <w:lvlJc w:val="left"/>
+      <w:pPr>
+        <w:tabs>
+          <w:tab w:val="num" w:pos="2880"/>
+        </w:tabs>
+        <w:ind w:left="2880" w:hanging="360"/>
+      </w:pPr>
+      <w:rPr>
+        <w:rFonts w:ascii="Wingdings" w:hAnsi="Wingdings" w:hint="default"/>
+        <w:sz w:val="20"/>
+      </w:rPr>
+    </w:lvl>
+    <w:lvl w:ilvl="4" w:tentative="1">
+      <w:start w:val="1"/>
+      <w:numFmt w:val="bullet"/>
+      <w:lvlText w:val=""/>
+      <w:lvlJc w:val="left"/>
+      <w:pPr>
+        <w:tabs>
+          <w:tab w:val="num" w:pos="3600"/>
+        </w:tabs>
+        <w:ind w:left="3600" w:hanging="360"/>
+      </w:pPr>
+      <w:rPr>
+        <w:rFonts w:ascii="Wingdings" w:hAnsi="Wingdings" w:hint="default"/>
+        <w:sz w:val="20"/>
+      </w:rPr>
+    </w:lvl>
+    <w:lvl w:ilvl="5" w:tentative="1">
+      <w:start w:val="1"/>
+      <w:numFmt w:val="bullet"/>
+      <w:lvlText w:val=""/>
+      <w:lvlJc w:val="left"/>
+      <w:pPr>
+        <w:tabs>
+          <w:tab w:val="num" w:pos="4320"/>
+        </w:tabs>
+        <w:ind w:left="4320" w:hanging="360"/>
+      </w:pPr>
+      <w:rPr>
+        <w:rFonts w:ascii="Wingdings" w:hAnsi="Wingdings" w:hint="default"/>
+        <w:sz w:val="20"/>
+      </w:rPr>
+    </w:lvl>
+    <w:lvl w:ilvl="6" w:tentative="1">
+      <w:start w:val="1"/>
+      <w:numFmt w:val="bullet"/>
+      <w:lvlText w:val=""/>
+      <w:lvlJc w:val="left"/>
+      <w:pPr>
+        <w:tabs>
+          <w:tab w:val="num" w:pos="5040"/>
+        </w:tabs>
+        <w:ind w:left="5040" w:hanging="360"/>
+      </w:pPr>
+      <w:rPr>
+        <w:rFonts w:ascii="Wingdings" w:hAnsi="Wingdings" w:hint="default"/>
+        <w:sz w:val="20"/>
+      </w:rPr>
+    </w:lvl>
+    <w:lvl w:ilvl="7" w:tentative="1">
+      <w:start w:val="1"/>
+      <w:numFmt w:val="bullet"/>
+      <w:lvlText w:val=""/>
+      <w:lvlJc w:val="left"/>
+      <w:pPr>
+        <w:tabs>
+          <w:tab w:val="num" w:pos="5760"/>
+        </w:tabs>
+        <w:ind w:left="5760" w:hanging="360"/>
+      </w:pPr>
+      <w:rPr>
+        <w:rFonts w:ascii="Wingdings" w:hAnsi="Wingdings" w:hint="default"/>
+        <w:sz w:val="20"/>
+      </w:rPr>
+    </w:lvl>
+    <w:lvl w:ilvl="8" w:tentative="1">
+      <w:start w:val="1"/>
+      <w:numFmt w:val="bullet"/>
+      <w:lvlText w:val=""/>
+      <w:lvlJc w:val="left"/>
+      <w:pPr>
+        <w:tabs>
+          <w:tab w:val="num" w:pos="6480"/>
+        </w:tabs>
+        <w:ind w:left="6480" w:hanging="360"/>
+      </w:pPr>
+      <w:rPr>
+        <w:rFonts w:ascii="Wingdings" w:hAnsi="Wingdings" w:hint="default"/>
+        <w:sz w:val="20"/>
+      </w:rPr>
+    </w:lvl>
+  </w:abstractNum>
+  <w:abstractNum w:abstractNumId="20" w15:restartNumberingAfterBreak="0">
     <w:nsid w:val="63080127"/>
     <w:multiLevelType w:val="multilevel"/>
     <w:tmpl w:val="E46A3900"/>
@@ -9747,7 +13008,7 @@
       </w:rPr>
     </w:lvl>
   </w:abstractNum>
-  <w:abstractNum w:abstractNumId="14" w15:restartNumberingAfterBreak="0">
+  <w:abstractNum w:abstractNumId="21" w15:restartNumberingAfterBreak="0">
     <w:nsid w:val="644B4CE7"/>
     <w:multiLevelType w:val="multilevel"/>
     <w:tmpl w:val="F8625AEE"/>
@@ -9896,7 +13157,7 @@
       </w:rPr>
     </w:lvl>
   </w:abstractNum>
-  <w:abstractNum w:abstractNumId="15" w15:restartNumberingAfterBreak="0">
+  <w:abstractNum w:abstractNumId="22" w15:restartNumberingAfterBreak="0">
     <w:nsid w:val="687513C2"/>
     <w:multiLevelType w:val="multilevel"/>
     <w:tmpl w:val="410E12DC"/>
@@ -10045,7 +13306,7 @@
       </w:rPr>
     </w:lvl>
   </w:abstractNum>
-  <w:abstractNum w:abstractNumId="16" w15:restartNumberingAfterBreak="0">
+  <w:abstractNum w:abstractNumId="23" w15:restartNumberingAfterBreak="0">
     <w:nsid w:val="6AFE50EE"/>
     <w:multiLevelType w:val="multilevel"/>
     <w:tmpl w:val="E826B948"/>
@@ -10194,7 +13455,7 @@
       </w:rPr>
     </w:lvl>
   </w:abstractNum>
-  <w:abstractNum w:abstractNumId="17" w15:restartNumberingAfterBreak="0">
+  <w:abstractNum w:abstractNumId="24" w15:restartNumberingAfterBreak="0">
     <w:nsid w:val="6D0B1F67"/>
     <w:multiLevelType w:val="multilevel"/>
     <w:tmpl w:val="CCFEE40A"/>
@@ -10343,7 +13604,7 @@
       </w:rPr>
     </w:lvl>
   </w:abstractNum>
-  <w:abstractNum w:abstractNumId="18" w15:restartNumberingAfterBreak="0">
+  <w:abstractNum w:abstractNumId="25" w15:restartNumberingAfterBreak="0">
     <w:nsid w:val="6D7E522B"/>
     <w:multiLevelType w:val="multilevel"/>
     <w:tmpl w:val="FA54FB1A"/>
@@ -10492,7 +13753,7 @@
       </w:rPr>
     </w:lvl>
   </w:abstractNum>
-  <w:abstractNum w:abstractNumId="19" w15:restartNumberingAfterBreak="0">
+  <w:abstractNum w:abstractNumId="26" w15:restartNumberingAfterBreak="0">
     <w:nsid w:val="75A3362A"/>
     <w:multiLevelType w:val="hybridMultilevel"/>
     <w:tmpl w:val="630C620C"/>
@@ -10605,7 +13866,7 @@
       </w:rPr>
     </w:lvl>
   </w:abstractNum>
-  <w:abstractNum w:abstractNumId="20" w15:restartNumberingAfterBreak="0">
+  <w:abstractNum w:abstractNumId="27" w15:restartNumberingAfterBreak="0">
     <w:nsid w:val="775E2E2D"/>
     <w:multiLevelType w:val="multilevel"/>
     <w:tmpl w:val="6F8A8C6E"/>
@@ -10754,7 +14015,7 @@
       </w:rPr>
     </w:lvl>
   </w:abstractNum>
-  <w:abstractNum w:abstractNumId="21" w15:restartNumberingAfterBreak="0">
+  <w:abstractNum w:abstractNumId="28" w15:restartNumberingAfterBreak="0">
     <w:nsid w:val="79A21BD2"/>
     <w:multiLevelType w:val="hybridMultilevel"/>
     <w:tmpl w:val="FE9422B6"/>
@@ -10867,7 +14128,7 @@
       </w:rPr>
     </w:lvl>
   </w:abstractNum>
-  <w:abstractNum w:abstractNumId="22" w15:restartNumberingAfterBreak="0">
+  <w:abstractNum w:abstractNumId="29" w15:restartNumberingAfterBreak="0">
     <w:nsid w:val="7ADF7EEB"/>
     <w:multiLevelType w:val="hybridMultilevel"/>
     <w:tmpl w:val="9F7006D2"/>
@@ -10981,73 +14242,94 @@
     </w:lvl>
   </w:abstractNum>
   <w:num w:numId="1">
+    <w:abstractNumId w:val="12"/>
+  </w:num>
+  <w:num w:numId="2">
+    <w:abstractNumId w:val="16"/>
+  </w:num>
+  <w:num w:numId="3">
+    <w:abstractNumId w:val="18"/>
+  </w:num>
+  <w:num w:numId="4">
+    <w:abstractNumId w:val="1"/>
+  </w:num>
+  <w:num w:numId="5">
+    <w:abstractNumId w:val="17"/>
+  </w:num>
+  <w:num w:numId="6">
+    <w:abstractNumId w:val="26"/>
+  </w:num>
+  <w:num w:numId="7">
+    <w:abstractNumId w:val="5"/>
+  </w:num>
+  <w:num w:numId="8">
     <w:abstractNumId w:val="7"/>
   </w:num>
-  <w:num w:numId="2">
-    <w:abstractNumId w:val="10"/>
+  <w:num w:numId="9">
+    <w:abstractNumId w:val="27"/>
   </w:num>
-  <w:num w:numId="3">
-    <w:abstractNumId w:val="12"/>
+  <w:num w:numId="10">
+    <w:abstractNumId w:val="6"/>
   </w:num>
-  <w:num w:numId="4">
+  <w:num w:numId="11">
+    <w:abstractNumId w:val="29"/>
+  </w:num>
+  <w:num w:numId="12">
+    <w:abstractNumId w:val="20"/>
+  </w:num>
+  <w:num w:numId="13">
+    <w:abstractNumId w:val="3"/>
+  </w:num>
+  <w:num w:numId="14">
+    <w:abstractNumId w:val="14"/>
+  </w:num>
+  <w:num w:numId="15">
+    <w:abstractNumId w:val="15"/>
+  </w:num>
+  <w:num w:numId="16">
+    <w:abstractNumId w:val="28"/>
+  </w:num>
+  <w:num w:numId="17">
+    <w:abstractNumId w:val="21"/>
+  </w:num>
+  <w:num w:numId="18">
+    <w:abstractNumId w:val="24"/>
+  </w:num>
+  <w:num w:numId="19">
+    <w:abstractNumId w:val="23"/>
+  </w:num>
+  <w:num w:numId="20">
+    <w:abstractNumId w:val="8"/>
+  </w:num>
+  <w:num w:numId="21">
+    <w:abstractNumId w:val="25"/>
+  </w:num>
+  <w:num w:numId="22">
+    <w:abstractNumId w:val="4"/>
+  </w:num>
+  <w:num w:numId="23">
+    <w:abstractNumId w:val="22"/>
+  </w:num>
+  <w:num w:numId="24">
+    <w:abstractNumId w:val="11"/>
+  </w:num>
+  <w:num w:numId="25">
     <w:abstractNumId w:val="0"/>
   </w:num>
-  <w:num w:numId="5">
-    <w:abstractNumId w:val="11"/>
+  <w:num w:numId="26">
+    <w:abstractNumId w:val="2"/>
   </w:num>
-  <w:num w:numId="6">
+  <w:num w:numId="27">
+    <w:abstractNumId w:val="9"/>
+  </w:num>
+  <w:num w:numId="28">
     <w:abstractNumId w:val="19"/>
   </w:num>
-  <w:num w:numId="7">
-    <w:abstractNumId w:val="3"/>
-  </w:num>
-  <w:num w:numId="8">
-    <w:abstractNumId w:val="5"/>
-  </w:num>
-  <w:num w:numId="9">
-    <w:abstractNumId w:val="20"/>
-  </w:num>
-  <w:num w:numId="10">
-    <w:abstractNumId w:val="4"/>
-  </w:num>
-  <w:num w:numId="11">
-    <w:abstractNumId w:val="22"/>
-  </w:num>
-  <w:num w:numId="12">
+  <w:num w:numId="29">
     <w:abstractNumId w:val="13"/>
   </w:num>
-  <w:num w:numId="13">
-    <w:abstractNumId w:val="1"/>
-  </w:num>
-  <w:num w:numId="14">
-    <w:abstractNumId w:val="8"/>
-  </w:num>
-  <w:num w:numId="15">
-    <w:abstractNumId w:val="9"/>
-  </w:num>
-  <w:num w:numId="16">
-    <w:abstractNumId w:val="21"/>
-  </w:num>
-  <w:num w:numId="17">
-    <w:abstractNumId w:val="14"/>
-  </w:num>
-  <w:num w:numId="18">
-    <w:abstractNumId w:val="17"/>
-  </w:num>
-  <w:num w:numId="19">
-    <w:abstractNumId w:val="16"/>
-  </w:num>
-  <w:num w:numId="20">
-    <w:abstractNumId w:val="6"/>
-  </w:num>
-  <w:num w:numId="21">
-    <w:abstractNumId w:val="18"/>
-  </w:num>
-  <w:num w:numId="22">
-    <w:abstractNumId w:val="2"/>
-  </w:num>
-  <w:num w:numId="23">
-    <w:abstractNumId w:val="15"/>
+  <w:num w:numId="30">
+    <w:abstractNumId w:val="10"/>
   </w:num>
 </w:numbering>
 </file>

</xml_diff>

<commit_message>
feat: implementacao ta TASK 06 com paginacao, ordenacao, filtros e integração ao SpringDoc
</commit_message>
<xml_diff>
--- a/API Ecommerce.docx
+++ b/API Ecommerce.docx
@@ -8000,6 +8000,7 @@
       <w:r>
         <w:rPr>
           <w:rFonts w:asciiTheme="minorHAnsi" w:hAnsiTheme="minorHAnsi" w:cstheme="minorHAnsi"/>
+          <w:noProof/>
         </w:rPr>
         <w:drawing>
           <wp:inline distT="0" distB="0" distL="0" distR="0" wp14:anchorId="0598385F" wp14:editId="5B822D70">
@@ -8192,6 +8193,7 @@
       <w:r>
         <w:rPr>
           <w:rFonts w:asciiTheme="minorHAnsi" w:hAnsiTheme="minorHAnsi" w:cstheme="minorHAnsi"/>
+          <w:noProof/>
         </w:rPr>
         <w:drawing>
           <wp:inline distT="0" distB="0" distL="0" distR="0" wp14:anchorId="7C36D4E5" wp14:editId="471EB225">
@@ -8335,6 +8337,7 @@
       <w:r>
         <w:rPr>
           <w:rFonts w:asciiTheme="minorHAnsi" w:hAnsiTheme="minorHAnsi" w:cstheme="minorHAnsi"/>
+          <w:noProof/>
         </w:rPr>
         <w:drawing>
           <wp:inline distT="0" distB="0" distL="0" distR="0" wp14:anchorId="6169DB82" wp14:editId="21A81F36">
@@ -8407,6 +8410,7 @@
       <w:r>
         <w:rPr>
           <w:rFonts w:asciiTheme="minorHAnsi" w:hAnsiTheme="minorHAnsi" w:cstheme="minorHAnsi"/>
+          <w:noProof/>
         </w:rPr>
         <w:drawing>
           <wp:inline distT="0" distB="0" distL="0" distR="0" wp14:anchorId="11A1993B" wp14:editId="5A71A636">
@@ -8507,6 +8511,7 @@
       <w:r>
         <w:rPr>
           <w:rFonts w:asciiTheme="minorHAnsi" w:hAnsiTheme="minorHAnsi" w:cstheme="minorHAnsi"/>
+          <w:noProof/>
         </w:rPr>
         <w:drawing>
           <wp:inline distT="0" distB="0" distL="0" distR="0" wp14:anchorId="31C43F9E" wp14:editId="547C9D66">
@@ -8588,6 +8593,7 @@
           <w:rFonts w:asciiTheme="minorHAnsi" w:hAnsiTheme="minorHAnsi" w:cstheme="minorHAnsi"/>
           <w:b/>
           <w:bCs/>
+          <w:noProof/>
         </w:rPr>
         <w:drawing>
           <wp:inline distT="0" distB="0" distL="0" distR="0" wp14:anchorId="7548B9C7" wp14:editId="6CAE137C">
@@ -8684,6 +8690,7 @@
           <w:rFonts w:asciiTheme="minorHAnsi" w:hAnsiTheme="minorHAnsi" w:cstheme="minorHAnsi"/>
           <w:b/>
           <w:bCs/>
+          <w:noProof/>
         </w:rPr>
         <w:drawing>
           <wp:inline distT="0" distB="0" distL="0" distR="0" wp14:anchorId="260093E3" wp14:editId="6A86AA2F">
@@ -8768,6 +8775,7 @@
           <w:rFonts w:asciiTheme="minorHAnsi" w:hAnsiTheme="minorHAnsi" w:cstheme="minorHAnsi"/>
           <w:b/>
           <w:bCs/>
+          <w:noProof/>
         </w:rPr>
         <w:drawing>
           <wp:inline distT="0" distB="0" distL="0" distR="0" wp14:anchorId="135C8523" wp14:editId="29F0D6CE">
@@ -8959,6 +8967,7 @@
       <w:r>
         <w:rPr>
           <w:rFonts w:asciiTheme="minorHAnsi" w:hAnsiTheme="minorHAnsi" w:cstheme="minorHAnsi"/>
+          <w:noProof/>
         </w:rPr>
         <w:drawing>
           <wp:inline distT="0" distB="0" distL="0" distR="0" wp14:anchorId="4286736E" wp14:editId="6E35C493">
@@ -9121,6 +9130,7 @@
       <w:r>
         <w:rPr>
           <w:rFonts w:asciiTheme="minorHAnsi" w:hAnsiTheme="minorHAnsi" w:cstheme="minorHAnsi"/>
+          <w:noProof/>
         </w:rPr>
         <w:drawing>
           <wp:inline distT="0" distB="0" distL="0" distR="0" wp14:anchorId="67CACD26" wp14:editId="68B830B8">
@@ -9278,6 +9288,7 @@
       <w:r>
         <w:rPr>
           <w:rFonts w:asciiTheme="minorHAnsi" w:hAnsiTheme="minorHAnsi" w:cstheme="minorHAnsi"/>
+          <w:noProof/>
         </w:rPr>
         <w:drawing>
           <wp:inline distT="0" distB="0" distL="0" distR="0" wp14:anchorId="7251EF98" wp14:editId="53923723">
@@ -9326,6 +9337,7 @@
       <w:r>
         <w:rPr>
           <w:rFonts w:asciiTheme="minorHAnsi" w:hAnsiTheme="minorHAnsi" w:cstheme="minorHAnsi"/>
+          <w:noProof/>
         </w:rPr>
         <w:drawing>
           <wp:inline distT="0" distB="0" distL="0" distR="0" wp14:anchorId="632F87AD" wp14:editId="54D02BDC">
@@ -10027,13 +10039,1285 @@
     </w:p>
     <w:p>
       <w:pPr>
-        <w:pStyle w:val="NormalWeb"/>
-        <w:rPr>
-          <w:rFonts w:asciiTheme="minorHAnsi" w:hAnsiTheme="minorHAnsi" w:cstheme="minorHAnsi"/>
+        <w:pStyle w:val="PargrafodaLista"/>
+        <w:numPr>
+          <w:ilvl w:val="0"/>
+          <w:numId w:val="1"/>
+        </w:numPr>
+        <w:jc w:val="center"/>
+        <w:rPr>
+          <w:b/>
+          <w:bCs/>
           <w:sz w:val="32"/>
           <w:szCs w:val="32"/>
         </w:rPr>
       </w:pPr>
+      <w:r>
+        <w:rPr>
+          <w:b/>
+          <w:bCs/>
+          <w:sz w:val="32"/>
+          <w:szCs w:val="32"/>
+        </w:rPr>
+        <w:t>TASK-06: Paginação, Ordenação e Filtro por Categoria/Preço no Catálogo de Produtos</w:t>
+      </w:r>
+    </w:p>
+    <w:p>
+      <w:pPr>
+        <w:pStyle w:val="Ttulo3"/>
+        <w:rPr>
+          <w:rFonts w:asciiTheme="minorHAnsi" w:hAnsiTheme="minorHAnsi" w:cstheme="minorHAnsi"/>
+        </w:rPr>
+      </w:pPr>
+      <w:r>
+        <w:rPr>
+          <w:rFonts w:asciiTheme="minorHAnsi" w:hAnsiTheme="minorHAnsi" w:cstheme="minorHAnsi"/>
+        </w:rPr>
+        <w:t>Objetivo</w:t>
+      </w:r>
+    </w:p>
+    <w:p>
+      <w:pPr>
+        <w:pStyle w:val="NormalWeb"/>
+        <w:rPr>
+          <w:rFonts w:asciiTheme="minorHAnsi" w:hAnsiTheme="minorHAnsi" w:cstheme="minorHAnsi"/>
+        </w:rPr>
+      </w:pPr>
+      <w:r>
+        <w:rPr>
+          <w:rFonts w:asciiTheme="minorHAnsi" w:hAnsiTheme="minorHAnsi" w:cstheme="minorHAnsi"/>
+        </w:rPr>
+        <w:t>Evoluir a listagem geral de produtos (</w:t>
+      </w:r>
+      <w:r>
+        <w:rPr>
+          <w:rStyle w:val="CdigoHTML"/>
+          <w:rFonts w:asciiTheme="minorHAnsi" w:eastAsiaTheme="majorEastAsia" w:hAnsiTheme="minorHAnsi" w:cstheme="minorHAnsi"/>
+          <w:sz w:val="24"/>
+          <w:szCs w:val="24"/>
+        </w:rPr>
+        <w:t>GET /</w:t>
+      </w:r>
+      <w:proofErr w:type="spellStart"/>
+      <w:r>
+        <w:rPr>
+          <w:rStyle w:val="CdigoHTML"/>
+          <w:rFonts w:asciiTheme="minorHAnsi" w:eastAsiaTheme="majorEastAsia" w:hAnsiTheme="minorHAnsi" w:cstheme="minorHAnsi"/>
+          <w:sz w:val="24"/>
+          <w:szCs w:val="24"/>
+        </w:rPr>
+        <w:t>api</w:t>
+      </w:r>
+      <w:proofErr w:type="spellEnd"/>
+      <w:r>
+        <w:rPr>
+          <w:rStyle w:val="CdigoHTML"/>
+          <w:rFonts w:asciiTheme="minorHAnsi" w:eastAsiaTheme="majorEastAsia" w:hAnsiTheme="minorHAnsi" w:cstheme="minorHAnsi"/>
+          <w:sz w:val="24"/>
+          <w:szCs w:val="24"/>
+        </w:rPr>
+        <w:t>/produtos</w:t>
+      </w:r>
+      <w:r>
+        <w:rPr>
+          <w:rFonts w:asciiTheme="minorHAnsi" w:hAnsiTheme="minorHAnsi" w:cstheme="minorHAnsi"/>
+        </w:rPr>
+        <w:t xml:space="preserve">) para suportar alto volume de dados através de </w:t>
+      </w:r>
+      <w:r>
+        <w:rPr>
+          <w:rFonts w:asciiTheme="minorHAnsi" w:hAnsiTheme="minorHAnsi" w:cstheme="minorHAnsi"/>
+          <w:b/>
+          <w:bCs/>
+        </w:rPr>
+        <w:t>Paginação</w:t>
+      </w:r>
+      <w:r>
+        <w:rPr>
+          <w:rFonts w:asciiTheme="minorHAnsi" w:hAnsiTheme="minorHAnsi" w:cstheme="minorHAnsi"/>
+        </w:rPr>
+        <w:t xml:space="preserve"> (</w:t>
+      </w:r>
+      <w:proofErr w:type="spellStart"/>
+      <w:r>
+        <w:rPr>
+          <w:rStyle w:val="CdigoHTML"/>
+          <w:rFonts w:asciiTheme="minorHAnsi" w:eastAsiaTheme="majorEastAsia" w:hAnsiTheme="minorHAnsi" w:cstheme="minorHAnsi"/>
+          <w:sz w:val="24"/>
+          <w:szCs w:val="24"/>
+        </w:rPr>
+        <w:t>Pageable</w:t>
+      </w:r>
+      <w:proofErr w:type="spellEnd"/>
+      <w:r>
+        <w:rPr>
+          <w:rFonts w:asciiTheme="minorHAnsi" w:hAnsiTheme="minorHAnsi" w:cstheme="minorHAnsi"/>
+        </w:rPr>
+        <w:t xml:space="preserve">), </w:t>
+      </w:r>
+      <w:r>
+        <w:rPr>
+          <w:rFonts w:asciiTheme="minorHAnsi" w:hAnsiTheme="minorHAnsi" w:cstheme="minorHAnsi"/>
+          <w:b/>
+          <w:bCs/>
+        </w:rPr>
+        <w:t>Ordenação</w:t>
+      </w:r>
+      <w:r>
+        <w:rPr>
+          <w:rFonts w:asciiTheme="minorHAnsi" w:hAnsiTheme="minorHAnsi" w:cstheme="minorHAnsi"/>
+        </w:rPr>
+        <w:t xml:space="preserve"> dinâmica e </w:t>
+      </w:r>
+      <w:r>
+        <w:rPr>
+          <w:rFonts w:asciiTheme="minorHAnsi" w:hAnsiTheme="minorHAnsi" w:cstheme="minorHAnsi"/>
+          <w:b/>
+          <w:bCs/>
+        </w:rPr>
+        <w:t>Filtros de busca</w:t>
+      </w:r>
+      <w:r>
+        <w:rPr>
+          <w:rFonts w:asciiTheme="minorHAnsi" w:hAnsiTheme="minorHAnsi" w:cstheme="minorHAnsi"/>
+        </w:rPr>
+        <w:t xml:space="preserve"> por faixa de preço ou nome parcial.</w:t>
+      </w:r>
+    </w:p>
+    <w:p>
+      <w:pPr>
+        <w:pStyle w:val="Ttulo3"/>
+        <w:rPr>
+          <w:rFonts w:asciiTheme="minorHAnsi" w:hAnsiTheme="minorHAnsi" w:cstheme="minorHAnsi"/>
+        </w:rPr>
+      </w:pPr>
+      <w:r>
+        <w:rPr>
+          <w:rFonts w:asciiTheme="minorHAnsi" w:hAnsiTheme="minorHAnsi" w:cstheme="minorHAnsi"/>
+        </w:rPr>
+        <w:lastRenderedPageBreak/>
+        <w:t>Passos de Implementação:</w:t>
+      </w:r>
+    </w:p>
+    <w:p>
+      <w:pPr>
+        <w:pStyle w:val="NormalWeb"/>
+        <w:numPr>
+          <w:ilvl w:val="0"/>
+          <w:numId w:val="31"/>
+        </w:numPr>
+        <w:rPr>
+          <w:rFonts w:asciiTheme="minorHAnsi" w:hAnsiTheme="minorHAnsi" w:cstheme="minorHAnsi"/>
+        </w:rPr>
+      </w:pPr>
+      <w:proofErr w:type="spellStart"/>
+      <w:r>
+        <w:rPr>
+          <w:rFonts w:asciiTheme="minorHAnsi" w:hAnsiTheme="minorHAnsi" w:cstheme="minorHAnsi"/>
+          <w:b/>
+          <w:bCs/>
+        </w:rPr>
+        <w:t>Repository</w:t>
+      </w:r>
+      <w:proofErr w:type="spellEnd"/>
+      <w:r>
+        <w:rPr>
+          <w:rFonts w:asciiTheme="minorHAnsi" w:hAnsiTheme="minorHAnsi" w:cstheme="minorHAnsi"/>
+          <w:b/>
+          <w:bCs/>
+        </w:rPr>
+        <w:t>:</w:t>
+      </w:r>
+      <w:r>
+        <w:rPr>
+          <w:rFonts w:asciiTheme="minorHAnsi" w:hAnsiTheme="minorHAnsi" w:cstheme="minorHAnsi"/>
+        </w:rPr>
+        <w:t xml:space="preserve"> Atualizar o </w:t>
+      </w:r>
+      <w:proofErr w:type="spellStart"/>
+      <w:r>
+        <w:rPr>
+          <w:rStyle w:val="CdigoHTML"/>
+          <w:rFonts w:asciiTheme="minorHAnsi" w:eastAsiaTheme="majorEastAsia" w:hAnsiTheme="minorHAnsi" w:cstheme="minorHAnsi"/>
+          <w:sz w:val="24"/>
+          <w:szCs w:val="24"/>
+        </w:rPr>
+        <w:t>ProdutoRepository</w:t>
+      </w:r>
+      <w:proofErr w:type="spellEnd"/>
+      <w:r>
+        <w:rPr>
+          <w:rFonts w:asciiTheme="minorHAnsi" w:hAnsiTheme="minorHAnsi" w:cstheme="minorHAnsi"/>
+        </w:rPr>
+        <w:t xml:space="preserve"> para estender </w:t>
+      </w:r>
+      <w:proofErr w:type="spellStart"/>
+      <w:r>
+        <w:rPr>
+          <w:rStyle w:val="CdigoHTML"/>
+          <w:rFonts w:asciiTheme="minorHAnsi" w:eastAsiaTheme="majorEastAsia" w:hAnsiTheme="minorHAnsi" w:cstheme="minorHAnsi"/>
+          <w:sz w:val="24"/>
+          <w:szCs w:val="24"/>
+        </w:rPr>
+        <w:t>JpaRepository</w:t>
+      </w:r>
+      <w:proofErr w:type="spellEnd"/>
+      <w:r>
+        <w:rPr>
+          <w:rStyle w:val="CdigoHTML"/>
+          <w:rFonts w:asciiTheme="minorHAnsi" w:eastAsiaTheme="majorEastAsia" w:hAnsiTheme="minorHAnsi" w:cstheme="minorHAnsi"/>
+          <w:sz w:val="24"/>
+          <w:szCs w:val="24"/>
+        </w:rPr>
+        <w:t xml:space="preserve">&lt;Produto, </w:t>
+      </w:r>
+      <w:proofErr w:type="spellStart"/>
+      <w:r>
+        <w:rPr>
+          <w:rStyle w:val="CdigoHTML"/>
+          <w:rFonts w:asciiTheme="minorHAnsi" w:eastAsiaTheme="majorEastAsia" w:hAnsiTheme="minorHAnsi" w:cstheme="minorHAnsi"/>
+          <w:sz w:val="24"/>
+          <w:szCs w:val="24"/>
+        </w:rPr>
+        <w:t>Long</w:t>
+      </w:r>
+      <w:proofErr w:type="spellEnd"/>
+      <w:r>
+        <w:rPr>
+          <w:rStyle w:val="CdigoHTML"/>
+          <w:rFonts w:asciiTheme="minorHAnsi" w:eastAsiaTheme="majorEastAsia" w:hAnsiTheme="minorHAnsi" w:cstheme="minorHAnsi"/>
+          <w:sz w:val="24"/>
+          <w:szCs w:val="24"/>
+        </w:rPr>
+        <w:t>&gt;</w:t>
+      </w:r>
+      <w:r>
+        <w:rPr>
+          <w:rFonts w:asciiTheme="minorHAnsi" w:hAnsiTheme="minorHAnsi" w:cstheme="minorHAnsi"/>
+        </w:rPr>
+        <w:t xml:space="preserve"> (que já suporta nativamente o </w:t>
+      </w:r>
+      <w:proofErr w:type="spellStart"/>
+      <w:r>
+        <w:rPr>
+          <w:rStyle w:val="CdigoHTML"/>
+          <w:rFonts w:asciiTheme="minorHAnsi" w:eastAsiaTheme="majorEastAsia" w:hAnsiTheme="minorHAnsi" w:cstheme="minorHAnsi"/>
+          <w:sz w:val="24"/>
+          <w:szCs w:val="24"/>
+        </w:rPr>
+        <w:t>Pageable</w:t>
+      </w:r>
+      <w:proofErr w:type="spellEnd"/>
+      <w:r>
+        <w:rPr>
+          <w:rFonts w:asciiTheme="minorHAnsi" w:hAnsiTheme="minorHAnsi" w:cstheme="minorHAnsi"/>
+        </w:rPr>
+        <w:t>) e opcionalmente adicionar queries customizadas de filtro (</w:t>
+      </w:r>
+      <w:proofErr w:type="spellStart"/>
+      <w:r>
+        <w:rPr>
+          <w:rFonts w:asciiTheme="minorHAnsi" w:hAnsiTheme="minorHAnsi" w:cstheme="minorHAnsi"/>
+        </w:rPr>
+        <w:t>ex</w:t>
+      </w:r>
+      <w:proofErr w:type="spellEnd"/>
+      <w:r>
+        <w:rPr>
+          <w:rFonts w:asciiTheme="minorHAnsi" w:hAnsiTheme="minorHAnsi" w:cstheme="minorHAnsi"/>
+        </w:rPr>
+        <w:t xml:space="preserve">: </w:t>
+      </w:r>
+      <w:proofErr w:type="spellStart"/>
+      <w:r>
+        <w:rPr>
+          <w:rStyle w:val="CdigoHTML"/>
+          <w:rFonts w:asciiTheme="minorHAnsi" w:eastAsiaTheme="majorEastAsia" w:hAnsiTheme="minorHAnsi" w:cstheme="minorHAnsi"/>
+          <w:sz w:val="24"/>
+          <w:szCs w:val="24"/>
+        </w:rPr>
+        <w:t>findByNomeContainingIgnoreCase</w:t>
+      </w:r>
+      <w:proofErr w:type="spellEnd"/>
+      <w:r>
+        <w:rPr>
+          <w:rFonts w:asciiTheme="minorHAnsi" w:hAnsiTheme="minorHAnsi" w:cstheme="minorHAnsi"/>
+        </w:rPr>
+        <w:t xml:space="preserve"> ou Spring Data </w:t>
+      </w:r>
+      <w:proofErr w:type="spellStart"/>
+      <w:r>
+        <w:rPr>
+          <w:rFonts w:asciiTheme="minorHAnsi" w:hAnsiTheme="minorHAnsi" w:cstheme="minorHAnsi"/>
+        </w:rPr>
+        <w:t>Specifications</w:t>
+      </w:r>
+      <w:proofErr w:type="spellEnd"/>
+      <w:r>
+        <w:rPr>
+          <w:rFonts w:asciiTheme="minorHAnsi" w:hAnsiTheme="minorHAnsi" w:cstheme="minorHAnsi"/>
+        </w:rPr>
+        <w:t>).</w:t>
+      </w:r>
+    </w:p>
+    <w:p>
+      <w:pPr>
+        <w:pStyle w:val="NormalWeb"/>
+        <w:rPr>
+          <w:rFonts w:asciiTheme="minorHAnsi" w:hAnsiTheme="minorHAnsi" w:cstheme="minorHAnsi"/>
+        </w:rPr>
+      </w:pPr>
+      <w:r>
+        <w:rPr>
+          <w:rFonts w:asciiTheme="minorHAnsi" w:hAnsiTheme="minorHAnsi" w:cstheme="minorHAnsi"/>
+        </w:rPr>
+        <w:drawing>
+          <wp:inline distT="0" distB="0" distL="0" distR="0" wp14:anchorId="799104D4" wp14:editId="724F3FCC">
+            <wp:extent cx="5357446" cy="850900"/>
+            <wp:effectExtent l="0" t="0" r="0" b="6350"/>
+            <wp:docPr id="27" name="Imagem 27"/>
+            <wp:cNvGraphicFramePr>
+              <a:graphicFrameLocks xmlns:a="http://schemas.openxmlformats.org/drawingml/2006/main" noChangeAspect="1"/>
+            </wp:cNvGraphicFramePr>
+            <a:graphic xmlns:a="http://schemas.openxmlformats.org/drawingml/2006/main">
+              <a:graphicData uri="http://schemas.openxmlformats.org/drawingml/2006/picture">
+                <pic:pic xmlns:pic="http://schemas.openxmlformats.org/drawingml/2006/picture">
+                  <pic:nvPicPr>
+                    <pic:cNvPr id="1" name=""/>
+                    <pic:cNvPicPr/>
+                  </pic:nvPicPr>
+                  <pic:blipFill>
+                    <a:blip r:embed="rId37"/>
+                    <a:stretch>
+                      <a:fillRect/>
+                    </a:stretch>
+                  </pic:blipFill>
+                  <pic:spPr>
+                    <a:xfrm>
+                      <a:off x="0" y="0"/>
+                      <a:ext cx="5387064" cy="855604"/>
+                    </a:xfrm>
+                    <a:prstGeom prst="rect">
+                      <a:avLst/>
+                    </a:prstGeom>
+                  </pic:spPr>
+                </pic:pic>
+              </a:graphicData>
+            </a:graphic>
+          </wp:inline>
+        </w:drawing>
+      </w:r>
+    </w:p>
+    <w:p>
+      <w:pPr>
+        <w:pStyle w:val="NormalWeb"/>
+        <w:numPr>
+          <w:ilvl w:val="0"/>
+          <w:numId w:val="31"/>
+        </w:numPr>
+        <w:rPr>
+          <w:rFonts w:asciiTheme="minorHAnsi" w:hAnsiTheme="minorHAnsi" w:cstheme="minorHAnsi"/>
+        </w:rPr>
+      </w:pPr>
+      <w:r>
+        <w:rPr>
+          <w:rFonts w:asciiTheme="minorHAnsi" w:hAnsiTheme="minorHAnsi" w:cstheme="minorHAnsi"/>
+          <w:b/>
+          <w:bCs/>
+        </w:rPr>
+        <w:t>Service:</w:t>
+      </w:r>
+      <w:r>
+        <w:rPr>
+          <w:rFonts w:asciiTheme="minorHAnsi" w:hAnsiTheme="minorHAnsi" w:cstheme="minorHAnsi"/>
+        </w:rPr>
+        <w:t xml:space="preserve"> Alterar o método </w:t>
+      </w:r>
+      <w:proofErr w:type="spellStart"/>
+      <w:proofErr w:type="gramStart"/>
+      <w:r>
+        <w:rPr>
+          <w:rStyle w:val="CdigoHTML"/>
+          <w:rFonts w:asciiTheme="minorHAnsi" w:eastAsiaTheme="majorEastAsia" w:hAnsiTheme="minorHAnsi" w:cstheme="minorHAnsi"/>
+          <w:sz w:val="24"/>
+          <w:szCs w:val="24"/>
+        </w:rPr>
+        <w:t>listarTodos</w:t>
+      </w:r>
+      <w:proofErr w:type="spellEnd"/>
+      <w:r>
+        <w:rPr>
+          <w:rStyle w:val="CdigoHTML"/>
+          <w:rFonts w:asciiTheme="minorHAnsi" w:eastAsiaTheme="majorEastAsia" w:hAnsiTheme="minorHAnsi" w:cstheme="minorHAnsi"/>
+          <w:sz w:val="24"/>
+          <w:szCs w:val="24"/>
+        </w:rPr>
+        <w:t>(</w:t>
+      </w:r>
+      <w:proofErr w:type="gramEnd"/>
+      <w:r>
+        <w:rPr>
+          <w:rStyle w:val="CdigoHTML"/>
+          <w:rFonts w:asciiTheme="minorHAnsi" w:eastAsiaTheme="majorEastAsia" w:hAnsiTheme="minorHAnsi" w:cstheme="minorHAnsi"/>
+          <w:sz w:val="24"/>
+          <w:szCs w:val="24"/>
+        </w:rPr>
+        <w:t>)</w:t>
+      </w:r>
+      <w:r>
+        <w:rPr>
+          <w:rFonts w:asciiTheme="minorHAnsi" w:hAnsiTheme="minorHAnsi" w:cstheme="minorHAnsi"/>
+        </w:rPr>
+        <w:t xml:space="preserve"> para aceitar parâmetros de paginação e retornar um objeto do tipo </w:t>
+      </w:r>
+      <w:r>
+        <w:rPr>
+          <w:rStyle w:val="CdigoHTML"/>
+          <w:rFonts w:asciiTheme="minorHAnsi" w:eastAsiaTheme="majorEastAsia" w:hAnsiTheme="minorHAnsi" w:cstheme="minorHAnsi"/>
+          <w:sz w:val="24"/>
+          <w:szCs w:val="24"/>
+        </w:rPr>
+        <w:t>Page&lt;Produto&gt;</w:t>
+      </w:r>
+      <w:r>
+        <w:rPr>
+          <w:rFonts w:asciiTheme="minorHAnsi" w:hAnsiTheme="minorHAnsi" w:cstheme="minorHAnsi"/>
+        </w:rPr>
+        <w:t xml:space="preserve"> em vez de uma </w:t>
+      </w:r>
+      <w:proofErr w:type="spellStart"/>
+      <w:r>
+        <w:rPr>
+          <w:rStyle w:val="CdigoHTML"/>
+          <w:rFonts w:asciiTheme="minorHAnsi" w:eastAsiaTheme="majorEastAsia" w:hAnsiTheme="minorHAnsi" w:cstheme="minorHAnsi"/>
+          <w:sz w:val="24"/>
+          <w:szCs w:val="24"/>
+        </w:rPr>
+        <w:t>List</w:t>
+      </w:r>
+      <w:proofErr w:type="spellEnd"/>
+      <w:r>
+        <w:rPr>
+          <w:rStyle w:val="CdigoHTML"/>
+          <w:rFonts w:asciiTheme="minorHAnsi" w:eastAsiaTheme="majorEastAsia" w:hAnsiTheme="minorHAnsi" w:cstheme="minorHAnsi"/>
+          <w:sz w:val="24"/>
+          <w:szCs w:val="24"/>
+        </w:rPr>
+        <w:t>&lt;Produto&gt;</w:t>
+      </w:r>
+      <w:r>
+        <w:rPr>
+          <w:rFonts w:asciiTheme="minorHAnsi" w:hAnsiTheme="minorHAnsi" w:cstheme="minorHAnsi"/>
+        </w:rPr>
+        <w:t>.</w:t>
+      </w:r>
+    </w:p>
+    <w:p>
+      <w:pPr>
+        <w:pStyle w:val="NormalWeb"/>
+        <w:rPr>
+          <w:rFonts w:asciiTheme="minorHAnsi" w:hAnsiTheme="minorHAnsi" w:cstheme="minorHAnsi"/>
+        </w:rPr>
+      </w:pPr>
+      <w:r>
+        <w:rPr>
+          <w:rFonts w:asciiTheme="minorHAnsi" w:hAnsiTheme="minorHAnsi" w:cstheme="minorHAnsi"/>
+        </w:rPr>
+        <w:drawing>
+          <wp:inline distT="0" distB="0" distL="0" distR="0" wp14:anchorId="6774E082" wp14:editId="1AB627EA">
+            <wp:extent cx="5603631" cy="890270"/>
+            <wp:effectExtent l="0" t="0" r="0" b="5080"/>
+            <wp:docPr id="37" name="Imagem 37"/>
+            <wp:cNvGraphicFramePr>
+              <a:graphicFrameLocks xmlns:a="http://schemas.openxmlformats.org/drawingml/2006/main" noChangeAspect="1"/>
+            </wp:cNvGraphicFramePr>
+            <a:graphic xmlns:a="http://schemas.openxmlformats.org/drawingml/2006/main">
+              <a:graphicData uri="http://schemas.openxmlformats.org/drawingml/2006/picture">
+                <pic:pic xmlns:pic="http://schemas.openxmlformats.org/drawingml/2006/picture">
+                  <pic:nvPicPr>
+                    <pic:cNvPr id="1" name=""/>
+                    <pic:cNvPicPr/>
+                  </pic:nvPicPr>
+                  <pic:blipFill>
+                    <a:blip r:embed="rId38"/>
+                    <a:stretch>
+                      <a:fillRect/>
+                    </a:stretch>
+                  </pic:blipFill>
+                  <pic:spPr>
+                    <a:xfrm>
+                      <a:off x="0" y="0"/>
+                      <a:ext cx="5631866" cy="894756"/>
+                    </a:xfrm>
+                    <a:prstGeom prst="rect">
+                      <a:avLst/>
+                    </a:prstGeom>
+                  </pic:spPr>
+                </pic:pic>
+              </a:graphicData>
+            </a:graphic>
+          </wp:inline>
+        </w:drawing>
+      </w:r>
+    </w:p>
+    <w:p>
+      <w:pPr>
+        <w:pStyle w:val="NormalWeb"/>
+        <w:numPr>
+          <w:ilvl w:val="0"/>
+          <w:numId w:val="31"/>
+        </w:numPr>
+        <w:rPr>
+          <w:rFonts w:asciiTheme="minorHAnsi" w:hAnsiTheme="minorHAnsi" w:cstheme="minorHAnsi"/>
+        </w:rPr>
+      </w:pPr>
+      <w:proofErr w:type="spellStart"/>
+      <w:r>
+        <w:rPr>
+          <w:rFonts w:asciiTheme="minorHAnsi" w:hAnsiTheme="minorHAnsi" w:cstheme="minorHAnsi"/>
+          <w:b/>
+          <w:bCs/>
+        </w:rPr>
+        <w:t>Controller</w:t>
+      </w:r>
+      <w:proofErr w:type="spellEnd"/>
+      <w:r>
+        <w:rPr>
+          <w:rFonts w:asciiTheme="minorHAnsi" w:hAnsiTheme="minorHAnsi" w:cstheme="minorHAnsi"/>
+          <w:b/>
+          <w:bCs/>
+        </w:rPr>
+        <w:t>:</w:t>
+      </w:r>
+      <w:r>
+        <w:rPr>
+          <w:rFonts w:asciiTheme="minorHAnsi" w:hAnsiTheme="minorHAnsi" w:cstheme="minorHAnsi"/>
+        </w:rPr>
+        <w:t xml:space="preserve"> Ajustar o </w:t>
+      </w:r>
+      <w:proofErr w:type="spellStart"/>
+      <w:r>
+        <w:rPr>
+          <w:rFonts w:asciiTheme="minorHAnsi" w:hAnsiTheme="minorHAnsi" w:cstheme="minorHAnsi"/>
+        </w:rPr>
+        <w:t>endpoint</w:t>
+      </w:r>
+      <w:proofErr w:type="spellEnd"/>
+      <w:r>
+        <w:rPr>
+          <w:rFonts w:asciiTheme="minorHAnsi" w:hAnsiTheme="minorHAnsi" w:cstheme="minorHAnsi"/>
+        </w:rPr>
+        <w:t xml:space="preserve"> </w:t>
+      </w:r>
+      <w:r>
+        <w:rPr>
+          <w:rStyle w:val="CdigoHTML"/>
+          <w:rFonts w:asciiTheme="minorHAnsi" w:eastAsiaTheme="majorEastAsia" w:hAnsiTheme="minorHAnsi" w:cstheme="minorHAnsi"/>
+          <w:sz w:val="24"/>
+          <w:szCs w:val="24"/>
+        </w:rPr>
+        <w:t>GET /</w:t>
+      </w:r>
+      <w:proofErr w:type="spellStart"/>
+      <w:r>
+        <w:rPr>
+          <w:rStyle w:val="CdigoHTML"/>
+          <w:rFonts w:asciiTheme="minorHAnsi" w:eastAsiaTheme="majorEastAsia" w:hAnsiTheme="minorHAnsi" w:cstheme="minorHAnsi"/>
+          <w:sz w:val="24"/>
+          <w:szCs w:val="24"/>
+        </w:rPr>
+        <w:t>api</w:t>
+      </w:r>
+      <w:proofErr w:type="spellEnd"/>
+      <w:r>
+        <w:rPr>
+          <w:rStyle w:val="CdigoHTML"/>
+          <w:rFonts w:asciiTheme="minorHAnsi" w:eastAsiaTheme="majorEastAsia" w:hAnsiTheme="minorHAnsi" w:cstheme="minorHAnsi"/>
+          <w:sz w:val="24"/>
+          <w:szCs w:val="24"/>
+        </w:rPr>
+        <w:t>/produtos</w:t>
+      </w:r>
+      <w:r>
+        <w:rPr>
+          <w:rFonts w:asciiTheme="minorHAnsi" w:hAnsiTheme="minorHAnsi" w:cstheme="minorHAnsi"/>
+        </w:rPr>
+        <w:t xml:space="preserve"> para receber os parâmetros </w:t>
+      </w:r>
+      <w:proofErr w:type="spellStart"/>
+      <w:r>
+        <w:rPr>
+          <w:rStyle w:val="CdigoHTML"/>
+          <w:rFonts w:asciiTheme="minorHAnsi" w:eastAsiaTheme="majorEastAsia" w:hAnsiTheme="minorHAnsi" w:cstheme="minorHAnsi"/>
+          <w:sz w:val="24"/>
+          <w:szCs w:val="24"/>
+        </w:rPr>
+        <w:t>page</w:t>
+      </w:r>
+      <w:proofErr w:type="spellEnd"/>
+      <w:r>
+        <w:rPr>
+          <w:rFonts w:asciiTheme="minorHAnsi" w:hAnsiTheme="minorHAnsi" w:cstheme="minorHAnsi"/>
+        </w:rPr>
+        <w:t xml:space="preserve">, </w:t>
+      </w:r>
+      <w:proofErr w:type="spellStart"/>
+      <w:r>
+        <w:rPr>
+          <w:rStyle w:val="CdigoHTML"/>
+          <w:rFonts w:asciiTheme="minorHAnsi" w:eastAsiaTheme="majorEastAsia" w:hAnsiTheme="minorHAnsi" w:cstheme="minorHAnsi"/>
+          <w:sz w:val="24"/>
+          <w:szCs w:val="24"/>
+        </w:rPr>
+        <w:t>size</w:t>
+      </w:r>
+      <w:proofErr w:type="spellEnd"/>
+      <w:r>
+        <w:rPr>
+          <w:rFonts w:asciiTheme="minorHAnsi" w:hAnsiTheme="minorHAnsi" w:cstheme="minorHAnsi"/>
+        </w:rPr>
+        <w:t xml:space="preserve"> e </w:t>
+      </w:r>
+      <w:proofErr w:type="spellStart"/>
+      <w:r>
+        <w:rPr>
+          <w:rStyle w:val="CdigoHTML"/>
+          <w:rFonts w:asciiTheme="minorHAnsi" w:eastAsiaTheme="majorEastAsia" w:hAnsiTheme="minorHAnsi" w:cstheme="minorHAnsi"/>
+          <w:sz w:val="24"/>
+          <w:szCs w:val="24"/>
+        </w:rPr>
+        <w:t>sort</w:t>
+      </w:r>
+      <w:proofErr w:type="spellEnd"/>
+      <w:r>
+        <w:rPr>
+          <w:rFonts w:asciiTheme="minorHAnsi" w:hAnsiTheme="minorHAnsi" w:cstheme="minorHAnsi"/>
+        </w:rPr>
+        <w:t xml:space="preserve"> (</w:t>
+      </w:r>
+      <w:proofErr w:type="spellStart"/>
+      <w:r>
+        <w:rPr>
+          <w:rFonts w:asciiTheme="minorHAnsi" w:hAnsiTheme="minorHAnsi" w:cstheme="minorHAnsi"/>
+        </w:rPr>
+        <w:t>ex</w:t>
+      </w:r>
+      <w:proofErr w:type="spellEnd"/>
+      <w:r>
+        <w:rPr>
+          <w:rFonts w:asciiTheme="minorHAnsi" w:hAnsiTheme="minorHAnsi" w:cstheme="minorHAnsi"/>
+        </w:rPr>
+        <w:t xml:space="preserve">: </w:t>
+      </w:r>
+      <w:r>
+        <w:rPr>
+          <w:rStyle w:val="CdigoHTML"/>
+          <w:rFonts w:asciiTheme="minorHAnsi" w:eastAsiaTheme="majorEastAsia" w:hAnsiTheme="minorHAnsi" w:cstheme="minorHAnsi"/>
+          <w:sz w:val="24"/>
+          <w:szCs w:val="24"/>
+        </w:rPr>
+        <w:t>/api/produtos?nome=Carreg&amp;valorInicio=100&amp;valorFinal=500&amp;page=0&amp;size=10&amp;sort=</w:t>
+      </w:r>
+      <w:proofErr w:type="gramStart"/>
+      <w:r>
+        <w:rPr>
+          <w:rStyle w:val="CdigoHTML"/>
+          <w:rFonts w:asciiTheme="minorHAnsi" w:eastAsiaTheme="majorEastAsia" w:hAnsiTheme="minorHAnsi" w:cstheme="minorHAnsi"/>
+          <w:sz w:val="24"/>
+          <w:szCs w:val="24"/>
+        </w:rPr>
+        <w:t>preco,asc</w:t>
+      </w:r>
+      <w:proofErr w:type="gramEnd"/>
+      <w:r>
+        <w:rPr>
+          <w:rFonts w:asciiTheme="minorHAnsi" w:hAnsiTheme="minorHAnsi" w:cstheme="minorHAnsi"/>
+        </w:rPr>
+        <w:t>).</w:t>
+      </w:r>
+    </w:p>
+    <w:p>
+      <w:pPr>
+        <w:pStyle w:val="NormalWeb"/>
+        <w:ind w:left="360"/>
+        <w:rPr>
+          <w:rFonts w:asciiTheme="minorHAnsi" w:hAnsiTheme="minorHAnsi" w:cstheme="minorHAnsi"/>
+        </w:rPr>
+      </w:pPr>
+      <w:r>
+        <w:rPr>
+          <w:rFonts w:asciiTheme="minorHAnsi" w:hAnsiTheme="minorHAnsi" w:cstheme="minorHAnsi"/>
+        </w:rPr>
+        <w:drawing>
+          <wp:inline distT="0" distB="0" distL="0" distR="0" wp14:anchorId="4075859E" wp14:editId="5CE16755">
+            <wp:extent cx="5550877" cy="931545"/>
+            <wp:effectExtent l="0" t="0" r="0" b="1905"/>
+            <wp:docPr id="38" name="Imagem 38"/>
+            <wp:cNvGraphicFramePr>
+              <a:graphicFrameLocks xmlns:a="http://schemas.openxmlformats.org/drawingml/2006/main" noChangeAspect="1"/>
+            </wp:cNvGraphicFramePr>
+            <a:graphic xmlns:a="http://schemas.openxmlformats.org/drawingml/2006/main">
+              <a:graphicData uri="http://schemas.openxmlformats.org/drawingml/2006/picture">
+                <pic:pic xmlns:pic="http://schemas.openxmlformats.org/drawingml/2006/picture">
+                  <pic:nvPicPr>
+                    <pic:cNvPr id="1" name=""/>
+                    <pic:cNvPicPr/>
+                  </pic:nvPicPr>
+                  <pic:blipFill>
+                    <a:blip r:embed="rId39"/>
+                    <a:stretch>
+                      <a:fillRect/>
+                    </a:stretch>
+                  </pic:blipFill>
+                  <pic:spPr>
+                    <a:xfrm>
+                      <a:off x="0" y="0"/>
+                      <a:ext cx="5577546" cy="936021"/>
+                    </a:xfrm>
+                    <a:prstGeom prst="rect">
+                      <a:avLst/>
+                    </a:prstGeom>
+                  </pic:spPr>
+                </pic:pic>
+              </a:graphicData>
+            </a:graphic>
+          </wp:inline>
+        </w:drawing>
+      </w:r>
+    </w:p>
+    <w:p>
+      <w:pPr>
+        <w:pStyle w:val="NormalWeb"/>
+        <w:ind w:left="360"/>
+        <w:rPr>
+          <w:rFonts w:asciiTheme="minorHAnsi" w:hAnsiTheme="minorHAnsi" w:cstheme="minorHAnsi"/>
+        </w:rPr>
+      </w:pPr>
+      <w:r>
+        <w:rPr>
+          <w:rFonts w:asciiTheme="minorHAnsi" w:hAnsiTheme="minorHAnsi" w:cstheme="minorHAnsi"/>
+        </w:rPr>
+        <w:t xml:space="preserve">Testes no </w:t>
+      </w:r>
+      <w:proofErr w:type="spellStart"/>
+      <w:r>
+        <w:rPr>
+          <w:rFonts w:asciiTheme="minorHAnsi" w:hAnsiTheme="minorHAnsi" w:cstheme="minorHAnsi"/>
+        </w:rPr>
+        <w:t>Postman</w:t>
+      </w:r>
+      <w:proofErr w:type="spellEnd"/>
+      <w:r>
+        <w:rPr>
+          <w:rFonts w:asciiTheme="minorHAnsi" w:hAnsiTheme="minorHAnsi" w:cstheme="minorHAnsi"/>
+        </w:rPr>
+        <w:t>:</w:t>
+      </w:r>
+    </w:p>
+    <w:p>
+      <w:pPr>
+        <w:pStyle w:val="NormalWeb"/>
+        <w:ind w:left="360"/>
+        <w:rPr>
+          <w:rFonts w:asciiTheme="minorHAnsi" w:hAnsiTheme="minorHAnsi" w:cstheme="minorHAnsi"/>
+        </w:rPr>
+      </w:pPr>
+      <w:r>
+        <w:rPr>
+          <w:rFonts w:asciiTheme="minorHAnsi" w:hAnsiTheme="minorHAnsi" w:cstheme="minorHAnsi"/>
+        </w:rPr>
+        <w:drawing>
+          <wp:inline distT="0" distB="0" distL="0" distR="0" wp14:anchorId="2F476C12" wp14:editId="4C62CA40">
+            <wp:extent cx="5322277" cy="2512695"/>
+            <wp:effectExtent l="0" t="0" r="0" b="1905"/>
+            <wp:docPr id="39" name="Imagem 39"/>
+            <wp:cNvGraphicFramePr>
+              <a:graphicFrameLocks xmlns:a="http://schemas.openxmlformats.org/drawingml/2006/main" noChangeAspect="1"/>
+            </wp:cNvGraphicFramePr>
+            <a:graphic xmlns:a="http://schemas.openxmlformats.org/drawingml/2006/main">
+              <a:graphicData uri="http://schemas.openxmlformats.org/drawingml/2006/picture">
+                <pic:pic xmlns:pic="http://schemas.openxmlformats.org/drawingml/2006/picture">
+                  <pic:nvPicPr>
+                    <pic:cNvPr id="1" name=""/>
+                    <pic:cNvPicPr/>
+                  </pic:nvPicPr>
+                  <pic:blipFill>
+                    <a:blip r:embed="rId40"/>
+                    <a:stretch>
+                      <a:fillRect/>
+                    </a:stretch>
+                  </pic:blipFill>
+                  <pic:spPr>
+                    <a:xfrm>
+                      <a:off x="0" y="0"/>
+                      <a:ext cx="5369692" cy="2535080"/>
+                    </a:xfrm>
+                    <a:prstGeom prst="rect">
+                      <a:avLst/>
+                    </a:prstGeom>
+                  </pic:spPr>
+                </pic:pic>
+              </a:graphicData>
+            </a:graphic>
+          </wp:inline>
+        </w:drawing>
+      </w:r>
+    </w:p>
+    <w:p>
+      <w:pPr>
+        <w:pStyle w:val="Ttulo1"/>
+        <w:rPr>
+          <w:rFonts w:asciiTheme="minorHAnsi" w:hAnsiTheme="minorHAnsi" w:cstheme="minorHAnsi"/>
+          <w:sz w:val="24"/>
+          <w:szCs w:val="24"/>
+        </w:rPr>
+      </w:pPr>
+      <w:r>
+        <w:rPr>
+          <w:rFonts w:asciiTheme="minorHAnsi" w:hAnsiTheme="minorHAnsi" w:cstheme="minorHAnsi"/>
+          <w:sz w:val="24"/>
+          <w:szCs w:val="24"/>
+        </w:rPr>
+        <w:lastRenderedPageBreak/>
+        <w:t xml:space="preserve">Diário de Bordo — Projeto </w:t>
+      </w:r>
+      <w:proofErr w:type="spellStart"/>
+      <w:r>
+        <w:rPr>
+          <w:rStyle w:val="CdigoHTML"/>
+          <w:rFonts w:asciiTheme="minorHAnsi" w:eastAsiaTheme="majorEastAsia" w:hAnsiTheme="minorHAnsi" w:cstheme="minorHAnsi"/>
+          <w:sz w:val="24"/>
+          <w:szCs w:val="24"/>
+        </w:rPr>
+        <w:t>ecommerce_product</w:t>
+      </w:r>
+      <w:proofErr w:type="spellEnd"/>
+    </w:p>
+    <w:p>
+      <w:pPr>
+        <w:pStyle w:val="NormalWeb"/>
+        <w:rPr>
+          <w:rFonts w:asciiTheme="minorHAnsi" w:hAnsiTheme="minorHAnsi" w:cstheme="minorHAnsi"/>
+        </w:rPr>
+      </w:pPr>
+      <w:r>
+        <w:rPr>
+          <w:rFonts w:asciiTheme="minorHAnsi" w:hAnsiTheme="minorHAnsi" w:cstheme="minorHAnsi"/>
+          <w:b/>
+          <w:bCs/>
+        </w:rPr>
+        <w:t>Data:</w:t>
+      </w:r>
+      <w:r>
+        <w:rPr>
+          <w:rFonts w:asciiTheme="minorHAnsi" w:hAnsiTheme="minorHAnsi" w:cstheme="minorHAnsi"/>
+        </w:rPr>
+        <w:t xml:space="preserve"> 27 de </w:t>
+      </w:r>
+      <w:proofErr w:type="gramStart"/>
+      <w:r>
+        <w:rPr>
+          <w:rFonts w:asciiTheme="minorHAnsi" w:hAnsiTheme="minorHAnsi" w:cstheme="minorHAnsi"/>
+        </w:rPr>
+        <w:t>Outubro</w:t>
+      </w:r>
+      <w:proofErr w:type="gramEnd"/>
+      <w:r>
+        <w:rPr>
+          <w:rFonts w:asciiTheme="minorHAnsi" w:hAnsiTheme="minorHAnsi" w:cstheme="minorHAnsi"/>
+        </w:rPr>
+        <w:t xml:space="preserve"> de 2026</w:t>
+      </w:r>
+    </w:p>
+    <w:p>
+      <w:pPr>
+        <w:pStyle w:val="NormalWeb"/>
+        <w:rPr>
+          <w:rFonts w:asciiTheme="minorHAnsi" w:hAnsiTheme="minorHAnsi" w:cstheme="minorHAnsi"/>
+        </w:rPr>
+      </w:pPr>
+      <w:r>
+        <w:rPr>
+          <w:rFonts w:asciiTheme="minorHAnsi" w:hAnsiTheme="minorHAnsi" w:cstheme="minorHAnsi"/>
+          <w:b/>
+          <w:bCs/>
+        </w:rPr>
+        <w:t>Foco do Dia:</w:t>
+      </w:r>
+      <w:r>
+        <w:rPr>
+          <w:rFonts w:asciiTheme="minorHAnsi" w:hAnsiTheme="minorHAnsi" w:cstheme="minorHAnsi"/>
+        </w:rPr>
+        <w:t xml:space="preserve"> Evolução do Catálogo de Produtos com Paginação, Ordenação, Filtros Dinâmicos e Integração do Swagger.</w:t>
+      </w:r>
+    </w:p>
+    <w:p>
+      <w:pPr>
+        <w:pStyle w:val="NormalWeb"/>
+        <w:rPr>
+          <w:rFonts w:asciiTheme="minorHAnsi" w:hAnsiTheme="minorHAnsi" w:cstheme="minorHAnsi"/>
+        </w:rPr>
+      </w:pPr>
+      <w:r>
+        <w:rPr>
+          <w:rFonts w:asciiTheme="minorHAnsi" w:hAnsiTheme="minorHAnsi" w:cstheme="minorHAnsi"/>
+        </w:rPr>
+        <w:t>O que foi realizado (TASK-06):</w:t>
+      </w:r>
+    </w:p>
+    <w:p>
+      <w:pPr>
+        <w:pStyle w:val="NormalWeb"/>
+        <w:numPr>
+          <w:ilvl w:val="0"/>
+          <w:numId w:val="32"/>
+        </w:numPr>
+        <w:rPr>
+          <w:rFonts w:asciiTheme="minorHAnsi" w:hAnsiTheme="minorHAnsi" w:cstheme="minorHAnsi"/>
+        </w:rPr>
+      </w:pPr>
+      <w:r>
+        <w:rPr>
+          <w:rFonts w:asciiTheme="minorHAnsi" w:hAnsiTheme="minorHAnsi" w:cstheme="minorHAnsi"/>
+          <w:b/>
+          <w:bCs/>
+        </w:rPr>
+        <w:t xml:space="preserve">Paginação e Ordenação: </w:t>
+      </w:r>
+      <w:r>
+        <w:rPr>
+          <w:rFonts w:asciiTheme="minorHAnsi" w:hAnsiTheme="minorHAnsi" w:cstheme="minorHAnsi"/>
+          <w:b/>
+          <w:bCs/>
+        </w:rPr>
+        <w:br/>
+      </w:r>
+      <w:r>
+        <w:rPr>
+          <w:rFonts w:asciiTheme="minorHAnsi" w:hAnsiTheme="minorHAnsi" w:cstheme="minorHAnsi"/>
+        </w:rPr>
+        <w:t xml:space="preserve">Evolução do método de listagem no </w:t>
+      </w:r>
+      <w:proofErr w:type="spellStart"/>
+      <w:r>
+        <w:rPr>
+          <w:rFonts w:asciiTheme="minorHAnsi" w:hAnsiTheme="minorHAnsi" w:cstheme="minorHAnsi"/>
+          <w:b/>
+          <w:bCs/>
+        </w:rPr>
+        <w:t>ProdutoService</w:t>
+      </w:r>
+      <w:proofErr w:type="spellEnd"/>
+      <w:r>
+        <w:rPr>
+          <w:rFonts w:asciiTheme="minorHAnsi" w:hAnsiTheme="minorHAnsi" w:cstheme="minorHAnsi"/>
+        </w:rPr>
+        <w:t xml:space="preserve"> e </w:t>
+      </w:r>
+      <w:proofErr w:type="spellStart"/>
+      <w:r>
+        <w:rPr>
+          <w:rFonts w:asciiTheme="minorHAnsi" w:hAnsiTheme="minorHAnsi" w:cstheme="minorHAnsi"/>
+          <w:b/>
+          <w:bCs/>
+        </w:rPr>
+        <w:t>ProdutoController</w:t>
+      </w:r>
+      <w:proofErr w:type="spellEnd"/>
+      <w:r>
+        <w:rPr>
+          <w:rFonts w:asciiTheme="minorHAnsi" w:hAnsiTheme="minorHAnsi" w:cstheme="minorHAnsi"/>
+        </w:rPr>
+        <w:t xml:space="preserve"> para retornar um objeto do tipo </w:t>
+      </w:r>
+      <w:r>
+        <w:rPr>
+          <w:rFonts w:asciiTheme="minorHAnsi" w:hAnsiTheme="minorHAnsi" w:cstheme="minorHAnsi"/>
+          <w:b/>
+          <w:bCs/>
+        </w:rPr>
+        <w:t>Page&lt;Produto&gt;</w:t>
+      </w:r>
+      <w:r>
+        <w:rPr>
+          <w:rFonts w:asciiTheme="minorHAnsi" w:hAnsiTheme="minorHAnsi" w:cstheme="minorHAnsi"/>
+        </w:rPr>
+        <w:t xml:space="preserve"> em vez de uma lista estática.</w:t>
+      </w:r>
+      <w:r>
+        <w:rPr>
+          <w:rFonts w:asciiTheme="minorHAnsi" w:hAnsiTheme="minorHAnsi" w:cstheme="minorHAnsi"/>
+        </w:rPr>
+        <w:br/>
+        <w:t xml:space="preserve">Configuração padrão no </w:t>
+      </w:r>
+      <w:r>
+        <w:rPr>
+          <w:rFonts w:asciiTheme="minorHAnsi" w:hAnsiTheme="minorHAnsi" w:cstheme="minorHAnsi"/>
+          <w:b/>
+          <w:bCs/>
+        </w:rPr>
+        <w:t>@PageableDefault</w:t>
+      </w:r>
+      <w:r>
+        <w:rPr>
+          <w:rFonts w:asciiTheme="minorHAnsi" w:hAnsiTheme="minorHAnsi" w:cstheme="minorHAnsi"/>
+        </w:rPr>
+        <w:t xml:space="preserve"> (</w:t>
+      </w:r>
+      <w:proofErr w:type="spellStart"/>
+      <w:r>
+        <w:rPr>
+          <w:rFonts w:asciiTheme="minorHAnsi" w:hAnsiTheme="minorHAnsi" w:cstheme="minorHAnsi"/>
+        </w:rPr>
+        <w:t>pagona</w:t>
+      </w:r>
+      <w:proofErr w:type="spellEnd"/>
+      <w:r>
+        <w:rPr>
+          <w:rFonts w:asciiTheme="minorHAnsi" w:hAnsiTheme="minorHAnsi" w:cstheme="minorHAnsi"/>
+        </w:rPr>
+        <w:t xml:space="preserve"> 0, tamanho 10, ordenação decrescente por nome).</w:t>
+      </w:r>
+    </w:p>
+    <w:p>
+      <w:pPr>
+        <w:pStyle w:val="NormalWeb"/>
+        <w:numPr>
+          <w:ilvl w:val="0"/>
+          <w:numId w:val="32"/>
+        </w:numPr>
+        <w:rPr>
+          <w:rFonts w:asciiTheme="minorHAnsi" w:hAnsiTheme="minorHAnsi" w:cstheme="minorHAnsi"/>
+        </w:rPr>
+      </w:pPr>
+      <w:r>
+        <w:rPr>
+          <w:rFonts w:asciiTheme="minorHAnsi" w:hAnsiTheme="minorHAnsi" w:cstheme="minorHAnsi"/>
+          <w:b/>
+          <w:bCs/>
+        </w:rPr>
+        <w:t>Filtros Avançados:</w:t>
+      </w:r>
+      <w:r>
+        <w:rPr>
+          <w:rFonts w:asciiTheme="minorHAnsi" w:hAnsiTheme="minorHAnsi" w:cstheme="minorHAnsi"/>
+        </w:rPr>
+        <w:t xml:space="preserve"> Implementação do método </w:t>
+      </w:r>
+      <w:proofErr w:type="spellStart"/>
+      <w:r>
+        <w:rPr>
+          <w:rFonts w:asciiTheme="minorHAnsi" w:hAnsiTheme="minorHAnsi" w:cstheme="minorHAnsi"/>
+          <w:b/>
+          <w:bCs/>
+        </w:rPr>
+        <w:t>findByNomeContainingAndPrecoBetween</w:t>
+      </w:r>
+      <w:proofErr w:type="spellEnd"/>
+      <w:r>
+        <w:rPr>
+          <w:rFonts w:asciiTheme="minorHAnsi" w:hAnsiTheme="minorHAnsi" w:cstheme="minorHAnsi"/>
+          <w:b/>
+          <w:bCs/>
+        </w:rPr>
+        <w:t xml:space="preserve"> </w:t>
+      </w:r>
+      <w:r>
+        <w:rPr>
+          <w:rFonts w:asciiTheme="minorHAnsi" w:hAnsiTheme="minorHAnsi" w:cstheme="minorHAnsi"/>
+        </w:rPr>
+        <w:t xml:space="preserve">no </w:t>
+      </w:r>
+      <w:proofErr w:type="spellStart"/>
+      <w:r>
+        <w:rPr>
+          <w:rFonts w:asciiTheme="minorHAnsi" w:hAnsiTheme="minorHAnsi" w:cstheme="minorHAnsi"/>
+          <w:b/>
+          <w:bCs/>
+        </w:rPr>
+        <w:t>ProdutoRepository</w:t>
+      </w:r>
+      <w:proofErr w:type="spellEnd"/>
+      <w:r>
+        <w:rPr>
+          <w:rFonts w:asciiTheme="minorHAnsi" w:hAnsiTheme="minorHAnsi" w:cstheme="minorHAnsi"/>
+        </w:rPr>
+        <w:t xml:space="preserve"> para suportar consultas combinadas por nome parcial e faixa de preço.</w:t>
+      </w:r>
+    </w:p>
+    <w:p>
+      <w:pPr>
+        <w:pStyle w:val="NormalWeb"/>
+        <w:numPr>
+          <w:ilvl w:val="0"/>
+          <w:numId w:val="32"/>
+        </w:numPr>
+        <w:rPr>
+          <w:rFonts w:asciiTheme="minorHAnsi" w:hAnsiTheme="minorHAnsi" w:cstheme="minorHAnsi"/>
+        </w:rPr>
+      </w:pPr>
+      <w:r>
+        <w:rPr>
+          <w:rFonts w:asciiTheme="minorHAnsi" w:hAnsiTheme="minorHAnsi" w:cstheme="minorHAnsi"/>
+          <w:b/>
+          <w:bCs/>
+        </w:rPr>
+        <w:t xml:space="preserve">Suporte a Objetos de Parâmetros </w:t>
+      </w:r>
+      <w:proofErr w:type="spellStart"/>
+      <w:r>
+        <w:rPr>
+          <w:rFonts w:asciiTheme="minorHAnsi" w:hAnsiTheme="minorHAnsi" w:cstheme="minorHAnsi"/>
+          <w:b/>
+          <w:bCs/>
+        </w:rPr>
+        <w:t>SpringDoc</w:t>
+      </w:r>
+      <w:proofErr w:type="spellEnd"/>
+      <w:r>
+        <w:rPr>
+          <w:rFonts w:asciiTheme="minorHAnsi" w:hAnsiTheme="minorHAnsi" w:cstheme="minorHAnsi"/>
+          <w:b/>
+          <w:bCs/>
+        </w:rPr>
+        <w:t>:</w:t>
+      </w:r>
+      <w:r>
+        <w:rPr>
+          <w:rFonts w:asciiTheme="minorHAnsi" w:hAnsiTheme="minorHAnsi" w:cstheme="minorHAnsi"/>
+        </w:rPr>
+        <w:t xml:space="preserve"> Adicionada a dependência do </w:t>
+      </w:r>
+      <w:proofErr w:type="spellStart"/>
+      <w:r>
+        <w:rPr>
+          <w:rStyle w:val="CdigoHTML"/>
+          <w:rFonts w:asciiTheme="minorHAnsi" w:hAnsiTheme="minorHAnsi" w:cstheme="minorHAnsi"/>
+          <w:b/>
+          <w:bCs/>
+          <w:sz w:val="24"/>
+          <w:szCs w:val="24"/>
+        </w:rPr>
+        <w:t>springdoc</w:t>
+      </w:r>
+      <w:proofErr w:type="spellEnd"/>
+      <w:r>
+        <w:rPr>
+          <w:rStyle w:val="CdigoHTML"/>
+          <w:rFonts w:asciiTheme="minorHAnsi" w:hAnsiTheme="minorHAnsi" w:cstheme="minorHAnsi"/>
+          <w:b/>
+          <w:bCs/>
+          <w:sz w:val="24"/>
+          <w:szCs w:val="24"/>
+        </w:rPr>
+        <w:t>-</w:t>
+      </w:r>
+      <w:proofErr w:type="spellStart"/>
+      <w:r>
+        <w:rPr>
+          <w:rStyle w:val="CdigoHTML"/>
+          <w:rFonts w:asciiTheme="minorHAnsi" w:hAnsiTheme="minorHAnsi" w:cstheme="minorHAnsi"/>
+          <w:b/>
+          <w:bCs/>
+          <w:sz w:val="24"/>
+          <w:szCs w:val="24"/>
+        </w:rPr>
+        <w:t>openapi</w:t>
+      </w:r>
+      <w:proofErr w:type="spellEnd"/>
+      <w:r>
+        <w:rPr>
+          <w:rStyle w:val="CdigoHTML"/>
+          <w:rFonts w:asciiTheme="minorHAnsi" w:hAnsiTheme="minorHAnsi" w:cstheme="minorHAnsi"/>
+          <w:b/>
+          <w:bCs/>
+          <w:sz w:val="24"/>
+          <w:szCs w:val="24"/>
+        </w:rPr>
+        <w:t>-starter-</w:t>
+      </w:r>
+      <w:proofErr w:type="spellStart"/>
+      <w:r>
+        <w:rPr>
+          <w:rStyle w:val="CdigoHTML"/>
+          <w:rFonts w:asciiTheme="minorHAnsi" w:hAnsiTheme="minorHAnsi" w:cstheme="minorHAnsi"/>
+          <w:b/>
+          <w:bCs/>
+          <w:sz w:val="24"/>
+          <w:szCs w:val="24"/>
+        </w:rPr>
+        <w:t>webmvc</w:t>
+      </w:r>
+      <w:proofErr w:type="spellEnd"/>
+      <w:r>
+        <w:rPr>
+          <w:rStyle w:val="CdigoHTML"/>
+          <w:rFonts w:asciiTheme="minorHAnsi" w:hAnsiTheme="minorHAnsi" w:cstheme="minorHAnsi"/>
+          <w:b/>
+          <w:bCs/>
+          <w:sz w:val="24"/>
+          <w:szCs w:val="24"/>
+        </w:rPr>
+        <w:t>-ui</w:t>
+      </w:r>
+      <w:r>
+        <w:rPr>
+          <w:rFonts w:asciiTheme="minorHAnsi" w:hAnsiTheme="minorHAnsi" w:cstheme="minorHAnsi"/>
+        </w:rPr>
+        <w:t xml:space="preserve"> no </w:t>
+      </w:r>
+      <w:r>
+        <w:rPr>
+          <w:rStyle w:val="CdigoHTML"/>
+          <w:rFonts w:asciiTheme="minorHAnsi" w:hAnsiTheme="minorHAnsi" w:cstheme="minorHAnsi"/>
+          <w:b/>
+          <w:bCs/>
+          <w:sz w:val="24"/>
+          <w:szCs w:val="24"/>
+        </w:rPr>
+        <w:t>pom.xml</w:t>
+      </w:r>
+      <w:r>
+        <w:rPr>
+          <w:rStyle w:val="CdigoHTML"/>
+          <w:rFonts w:asciiTheme="minorHAnsi" w:hAnsiTheme="minorHAnsi" w:cstheme="minorHAnsi"/>
+          <w:b/>
+          <w:bCs/>
+          <w:sz w:val="24"/>
+          <w:szCs w:val="24"/>
+        </w:rPr>
+        <w:t xml:space="preserve"> </w:t>
+      </w:r>
+      <w:r>
+        <w:rPr>
+          <w:rStyle w:val="CdigoHTML"/>
+          <w:rFonts w:asciiTheme="minorHAnsi" w:hAnsiTheme="minorHAnsi" w:cstheme="minorHAnsi"/>
+          <w:sz w:val="24"/>
+          <w:szCs w:val="24"/>
+        </w:rPr>
+        <w:t xml:space="preserve">e aplicação da anotação </w:t>
+      </w:r>
+      <w:r>
+        <w:rPr>
+          <w:rStyle w:val="CdigoHTML"/>
+          <w:rFonts w:asciiTheme="minorHAnsi" w:hAnsiTheme="minorHAnsi" w:cstheme="minorHAnsi"/>
+          <w:b/>
+          <w:bCs/>
+          <w:sz w:val="24"/>
+          <w:szCs w:val="24"/>
+        </w:rPr>
+        <w:t>@ParameterObject</w:t>
+      </w:r>
+      <w:r>
+        <w:rPr>
+          <w:rStyle w:val="CdigoHTML"/>
+          <w:rFonts w:asciiTheme="minorHAnsi" w:hAnsiTheme="minorHAnsi" w:cstheme="minorHAnsi"/>
+          <w:sz w:val="24"/>
+          <w:szCs w:val="24"/>
+        </w:rPr>
+        <w:t xml:space="preserve"> para estruturar os parâmetros de paginação</w:t>
+      </w:r>
     </w:p>
     <w:p>
       <w:pPr>
@@ -10949,6 +12233,119 @@
     </w:lvl>
   </w:abstractNum>
   <w:abstractNum w:abstractNumId="6" w15:restartNumberingAfterBreak="0">
+    <w:nsid w:val="1BC222D4"/>
+    <w:multiLevelType w:val="multilevel"/>
+    <w:tmpl w:val="BE5423E8"/>
+    <w:lvl w:ilvl="0">
+      <w:start w:val="1"/>
+      <w:numFmt w:val="decimal"/>
+      <w:lvlText w:val="%1."/>
+      <w:lvlJc w:val="left"/>
+      <w:pPr>
+        <w:tabs>
+          <w:tab w:val="num" w:pos="720"/>
+        </w:tabs>
+        <w:ind w:left="720" w:hanging="360"/>
+      </w:pPr>
+    </w:lvl>
+    <w:lvl w:ilvl="1" w:tentative="1">
+      <w:start w:val="1"/>
+      <w:numFmt w:val="decimal"/>
+      <w:lvlText w:val="%2."/>
+      <w:lvlJc w:val="left"/>
+      <w:pPr>
+        <w:tabs>
+          <w:tab w:val="num" w:pos="1440"/>
+        </w:tabs>
+        <w:ind w:left="1440" w:hanging="360"/>
+      </w:pPr>
+    </w:lvl>
+    <w:lvl w:ilvl="2" w:tentative="1">
+      <w:start w:val="1"/>
+      <w:numFmt w:val="decimal"/>
+      <w:lvlText w:val="%3."/>
+      <w:lvlJc w:val="left"/>
+      <w:pPr>
+        <w:tabs>
+          <w:tab w:val="num" w:pos="2160"/>
+        </w:tabs>
+        <w:ind w:left="2160" w:hanging="360"/>
+      </w:pPr>
+    </w:lvl>
+    <w:lvl w:ilvl="3" w:tentative="1">
+      <w:start w:val="1"/>
+      <w:numFmt w:val="decimal"/>
+      <w:lvlText w:val="%4."/>
+      <w:lvlJc w:val="left"/>
+      <w:pPr>
+        <w:tabs>
+          <w:tab w:val="num" w:pos="2880"/>
+        </w:tabs>
+        <w:ind w:left="2880" w:hanging="360"/>
+      </w:pPr>
+    </w:lvl>
+    <w:lvl w:ilvl="4" w:tentative="1">
+      <w:start w:val="1"/>
+      <w:numFmt w:val="decimal"/>
+      <w:lvlText w:val="%5."/>
+      <w:lvlJc w:val="left"/>
+      <w:pPr>
+        <w:tabs>
+          <w:tab w:val="num" w:pos="3600"/>
+        </w:tabs>
+        <w:ind w:left="3600" w:hanging="360"/>
+      </w:pPr>
+    </w:lvl>
+    <w:lvl w:ilvl="5" w:tentative="1">
+      <w:start w:val="1"/>
+      <w:numFmt w:val="decimal"/>
+      <w:lvlText w:val="%6."/>
+      <w:lvlJc w:val="left"/>
+      <w:pPr>
+        <w:tabs>
+          <w:tab w:val="num" w:pos="4320"/>
+        </w:tabs>
+        <w:ind w:left="4320" w:hanging="360"/>
+      </w:pPr>
+    </w:lvl>
+    <w:lvl w:ilvl="6" w:tentative="1">
+      <w:start w:val="1"/>
+      <w:numFmt w:val="decimal"/>
+      <w:lvlText w:val="%7."/>
+      <w:lvlJc w:val="left"/>
+      <w:pPr>
+        <w:tabs>
+          <w:tab w:val="num" w:pos="5040"/>
+        </w:tabs>
+        <w:ind w:left="5040" w:hanging="360"/>
+      </w:pPr>
+    </w:lvl>
+    <w:lvl w:ilvl="7" w:tentative="1">
+      <w:start w:val="1"/>
+      <w:numFmt w:val="decimal"/>
+      <w:lvlText w:val="%8."/>
+      <w:lvlJc w:val="left"/>
+      <w:pPr>
+        <w:tabs>
+          <w:tab w:val="num" w:pos="5760"/>
+        </w:tabs>
+        <w:ind w:left="5760" w:hanging="360"/>
+      </w:pPr>
+    </w:lvl>
+    <w:lvl w:ilvl="8" w:tentative="1">
+      <w:start w:val="1"/>
+      <w:numFmt w:val="decimal"/>
+      <w:lvlText w:val="%9."/>
+      <w:lvlJc w:val="left"/>
+      <w:pPr>
+        <w:tabs>
+          <w:tab w:val="num" w:pos="6480"/>
+        </w:tabs>
+        <w:ind w:left="6480" w:hanging="360"/>
+      </w:pPr>
+    </w:lvl>
+  </w:abstractNum>
+  <w:abstractNum w:abstractNumId="7" w15:restartNumberingAfterBreak="0">
     <w:nsid w:val="1EBF3377"/>
     <w:multiLevelType w:val="hybridMultilevel"/>
     <w:tmpl w:val="12B89DD6"/>
@@ -11061,7 +12458,7 @@
       </w:rPr>
     </w:lvl>
   </w:abstractNum>
-  <w:abstractNum w:abstractNumId="7" w15:restartNumberingAfterBreak="0">
+  <w:abstractNum w:abstractNumId="8" w15:restartNumberingAfterBreak="0">
     <w:nsid w:val="37CE0CFB"/>
     <w:multiLevelType w:val="multilevel"/>
     <w:tmpl w:val="33E8DADC"/>
@@ -11210,7 +12607,7 @@
       </w:rPr>
     </w:lvl>
   </w:abstractNum>
-  <w:abstractNum w:abstractNumId="8" w15:restartNumberingAfterBreak="0">
+  <w:abstractNum w:abstractNumId="9" w15:restartNumberingAfterBreak="0">
     <w:nsid w:val="3AA935FA"/>
     <w:multiLevelType w:val="multilevel"/>
     <w:tmpl w:val="F5BCCEAE"/>
@@ -11359,7 +12756,7 @@
       </w:rPr>
     </w:lvl>
   </w:abstractNum>
-  <w:abstractNum w:abstractNumId="9" w15:restartNumberingAfterBreak="0">
+  <w:abstractNum w:abstractNumId="10" w15:restartNumberingAfterBreak="0">
     <w:nsid w:val="3D105E2B"/>
     <w:multiLevelType w:val="multilevel"/>
     <w:tmpl w:val="E0CEC248"/>
@@ -11508,7 +12905,7 @@
       </w:rPr>
     </w:lvl>
   </w:abstractNum>
-  <w:abstractNum w:abstractNumId="10" w15:restartNumberingAfterBreak="0">
+  <w:abstractNum w:abstractNumId="11" w15:restartNumberingAfterBreak="0">
     <w:nsid w:val="3E655DC9"/>
     <w:multiLevelType w:val="hybridMultilevel"/>
     <w:tmpl w:val="5EFA183E"/>
@@ -11621,7 +13018,7 @@
       </w:rPr>
     </w:lvl>
   </w:abstractNum>
-  <w:abstractNum w:abstractNumId="11" w15:restartNumberingAfterBreak="0">
+  <w:abstractNum w:abstractNumId="12" w15:restartNumberingAfterBreak="0">
     <w:nsid w:val="40716A41"/>
     <w:multiLevelType w:val="hybridMultilevel"/>
     <w:tmpl w:val="389C314C"/>
@@ -11734,10 +13131,10 @@
       </w:rPr>
     </w:lvl>
   </w:abstractNum>
-  <w:abstractNum w:abstractNumId="12" w15:restartNumberingAfterBreak="0">
+  <w:abstractNum w:abstractNumId="13" w15:restartNumberingAfterBreak="0">
     <w:nsid w:val="40B80731"/>
     <w:multiLevelType w:val="hybridMultilevel"/>
-    <w:tmpl w:val="A120DF80"/>
+    <w:tmpl w:val="F63C0878"/>
     <w:lvl w:ilvl="0" w:tplc="0416000F">
       <w:start w:val="1"/>
       <w:numFmt w:val="decimal"/>
@@ -11820,7 +13217,7 @@
       </w:pPr>
     </w:lvl>
   </w:abstractNum>
-  <w:abstractNum w:abstractNumId="13" w15:restartNumberingAfterBreak="0">
+  <w:abstractNum w:abstractNumId="14" w15:restartNumberingAfterBreak="0">
     <w:nsid w:val="475A0EB4"/>
     <w:multiLevelType w:val="multilevel"/>
     <w:tmpl w:val="892251C2"/>
@@ -11969,7 +13366,7 @@
       </w:rPr>
     </w:lvl>
   </w:abstractNum>
-  <w:abstractNum w:abstractNumId="14" w15:restartNumberingAfterBreak="0">
+  <w:abstractNum w:abstractNumId="15" w15:restartNumberingAfterBreak="0">
     <w:nsid w:val="4AB832C4"/>
     <w:multiLevelType w:val="multilevel"/>
     <w:tmpl w:val="96D04A62"/>
@@ -12118,7 +13515,7 @@
       </w:rPr>
     </w:lvl>
   </w:abstractNum>
-  <w:abstractNum w:abstractNumId="15" w15:restartNumberingAfterBreak="0">
+  <w:abstractNum w:abstractNumId="16" w15:restartNumberingAfterBreak="0">
     <w:nsid w:val="58EE5E10"/>
     <w:multiLevelType w:val="multilevel"/>
     <w:tmpl w:val="CD6E82FC"/>
@@ -12267,7 +13664,7 @@
       </w:rPr>
     </w:lvl>
   </w:abstractNum>
-  <w:abstractNum w:abstractNumId="16" w15:restartNumberingAfterBreak="0">
+  <w:abstractNum w:abstractNumId="17" w15:restartNumberingAfterBreak="0">
     <w:nsid w:val="59211560"/>
     <w:multiLevelType w:val="multilevel"/>
     <w:tmpl w:val="4D0C3446"/>
@@ -12416,7 +13813,7 @@
       </w:rPr>
     </w:lvl>
   </w:abstractNum>
-  <w:abstractNum w:abstractNumId="17" w15:restartNumberingAfterBreak="0">
+  <w:abstractNum w:abstractNumId="18" w15:restartNumberingAfterBreak="0">
     <w:nsid w:val="593B7802"/>
     <w:multiLevelType w:val="multilevel"/>
     <w:tmpl w:val="51FEE8A6"/>
@@ -12561,7 +13958,7 @@
       </w:rPr>
     </w:lvl>
   </w:abstractNum>
-  <w:abstractNum w:abstractNumId="18" w15:restartNumberingAfterBreak="0">
+  <w:abstractNum w:abstractNumId="19" w15:restartNumberingAfterBreak="0">
     <w:nsid w:val="5B0E7E21"/>
     <w:multiLevelType w:val="multilevel"/>
     <w:tmpl w:val="24D4249E"/>
@@ -12710,7 +14107,7 @@
       </w:rPr>
     </w:lvl>
   </w:abstractNum>
-  <w:abstractNum w:abstractNumId="19" w15:restartNumberingAfterBreak="0">
+  <w:abstractNum w:abstractNumId="20" w15:restartNumberingAfterBreak="0">
     <w:nsid w:val="5D80315B"/>
     <w:multiLevelType w:val="multilevel"/>
     <w:tmpl w:val="3530E922"/>
@@ -12859,7 +14256,7 @@
       </w:rPr>
     </w:lvl>
   </w:abstractNum>
-  <w:abstractNum w:abstractNumId="20" w15:restartNumberingAfterBreak="0">
+  <w:abstractNum w:abstractNumId="21" w15:restartNumberingAfterBreak="0">
     <w:nsid w:val="63080127"/>
     <w:multiLevelType w:val="multilevel"/>
     <w:tmpl w:val="E46A3900"/>
@@ -13008,7 +14405,7 @@
       </w:rPr>
     </w:lvl>
   </w:abstractNum>
-  <w:abstractNum w:abstractNumId="21" w15:restartNumberingAfterBreak="0">
+  <w:abstractNum w:abstractNumId="22" w15:restartNumberingAfterBreak="0">
     <w:nsid w:val="644B4CE7"/>
     <w:multiLevelType w:val="multilevel"/>
     <w:tmpl w:val="F8625AEE"/>
@@ -13157,7 +14554,7 @@
       </w:rPr>
     </w:lvl>
   </w:abstractNum>
-  <w:abstractNum w:abstractNumId="22" w15:restartNumberingAfterBreak="0">
+  <w:abstractNum w:abstractNumId="23" w15:restartNumberingAfterBreak="0">
     <w:nsid w:val="687513C2"/>
     <w:multiLevelType w:val="multilevel"/>
     <w:tmpl w:val="410E12DC"/>
@@ -13306,7 +14703,7 @@
       </w:rPr>
     </w:lvl>
   </w:abstractNum>
-  <w:abstractNum w:abstractNumId="23" w15:restartNumberingAfterBreak="0">
+  <w:abstractNum w:abstractNumId="24" w15:restartNumberingAfterBreak="0">
     <w:nsid w:val="6AFE50EE"/>
     <w:multiLevelType w:val="multilevel"/>
     <w:tmpl w:val="E826B948"/>
@@ -13455,7 +14852,7 @@
       </w:rPr>
     </w:lvl>
   </w:abstractNum>
-  <w:abstractNum w:abstractNumId="24" w15:restartNumberingAfterBreak="0">
+  <w:abstractNum w:abstractNumId="25" w15:restartNumberingAfterBreak="0">
     <w:nsid w:val="6D0B1F67"/>
     <w:multiLevelType w:val="multilevel"/>
     <w:tmpl w:val="CCFEE40A"/>
@@ -13604,7 +15001,7 @@
       </w:rPr>
     </w:lvl>
   </w:abstractNum>
-  <w:abstractNum w:abstractNumId="25" w15:restartNumberingAfterBreak="0">
+  <w:abstractNum w:abstractNumId="26" w15:restartNumberingAfterBreak="0">
     <w:nsid w:val="6D7E522B"/>
     <w:multiLevelType w:val="multilevel"/>
     <w:tmpl w:val="FA54FB1A"/>
@@ -13753,7 +15150,120 @@
       </w:rPr>
     </w:lvl>
   </w:abstractNum>
-  <w:abstractNum w:abstractNumId="26" w15:restartNumberingAfterBreak="0">
+  <w:abstractNum w:abstractNumId="27" w15:restartNumberingAfterBreak="0">
+    <w:nsid w:val="6F95013B"/>
+    <w:multiLevelType w:val="hybridMultilevel"/>
+    <w:tmpl w:val="D62012BA"/>
+    <w:lvl w:ilvl="0" w:tplc="04160001">
+      <w:start w:val="1"/>
+      <w:numFmt w:val="bullet"/>
+      <w:lvlText w:val=""/>
+      <w:lvlJc w:val="left"/>
+      <w:pPr>
+        <w:ind w:left="720" w:hanging="360"/>
+      </w:pPr>
+      <w:rPr>
+        <w:rFonts w:ascii="Symbol" w:hAnsi="Symbol" w:hint="default"/>
+      </w:rPr>
+    </w:lvl>
+    <w:lvl w:ilvl="1" w:tplc="04160003" w:tentative="1">
+      <w:start w:val="1"/>
+      <w:numFmt w:val="bullet"/>
+      <w:lvlText w:val="o"/>
+      <w:lvlJc w:val="left"/>
+      <w:pPr>
+        <w:ind w:left="1440" w:hanging="360"/>
+      </w:pPr>
+      <w:rPr>
+        <w:rFonts w:ascii="Courier New" w:hAnsi="Courier New" w:cs="Courier New" w:hint="default"/>
+      </w:rPr>
+    </w:lvl>
+    <w:lvl w:ilvl="2" w:tplc="04160005" w:tentative="1">
+      <w:start w:val="1"/>
+      <w:numFmt w:val="bullet"/>
+      <w:lvlText w:val=""/>
+      <w:lvlJc w:val="left"/>
+      <w:pPr>
+        <w:ind w:left="2160" w:hanging="360"/>
+      </w:pPr>
+      <w:rPr>
+        <w:rFonts w:ascii="Wingdings" w:hAnsi="Wingdings" w:hint="default"/>
+      </w:rPr>
+    </w:lvl>
+    <w:lvl w:ilvl="3" w:tplc="04160001" w:tentative="1">
+      <w:start w:val="1"/>
+      <w:numFmt w:val="bullet"/>
+      <w:lvlText w:val=""/>
+      <w:lvlJc w:val="left"/>
+      <w:pPr>
+        <w:ind w:left="2880" w:hanging="360"/>
+      </w:pPr>
+      <w:rPr>
+        <w:rFonts w:ascii="Symbol" w:hAnsi="Symbol" w:hint="default"/>
+      </w:rPr>
+    </w:lvl>
+    <w:lvl w:ilvl="4" w:tplc="04160003" w:tentative="1">
+      <w:start w:val="1"/>
+      <w:numFmt w:val="bullet"/>
+      <w:lvlText w:val="o"/>
+      <w:lvlJc w:val="left"/>
+      <w:pPr>
+        <w:ind w:left="3600" w:hanging="360"/>
+      </w:pPr>
+      <w:rPr>
+        <w:rFonts w:ascii="Courier New" w:hAnsi="Courier New" w:cs="Courier New" w:hint="default"/>
+      </w:rPr>
+    </w:lvl>
+    <w:lvl w:ilvl="5" w:tplc="04160005" w:tentative="1">
+      <w:start w:val="1"/>
+      <w:numFmt w:val="bullet"/>
+      <w:lvlText w:val=""/>
+      <w:lvlJc w:val="left"/>
+      <w:pPr>
+        <w:ind w:left="4320" w:hanging="360"/>
+      </w:pPr>
+      <w:rPr>
+        <w:rFonts w:ascii="Wingdings" w:hAnsi="Wingdings" w:hint="default"/>
+      </w:rPr>
+    </w:lvl>
+    <w:lvl w:ilvl="6" w:tplc="04160001" w:tentative="1">
+      <w:start w:val="1"/>
+      <w:numFmt w:val="bullet"/>
+      <w:lvlText w:val=""/>
+      <w:lvlJc w:val="left"/>
+      <w:pPr>
+        <w:ind w:left="5040" w:hanging="360"/>
+      </w:pPr>
+      <w:rPr>
+        <w:rFonts w:ascii="Symbol" w:hAnsi="Symbol" w:hint="default"/>
+      </w:rPr>
+    </w:lvl>
+    <w:lvl w:ilvl="7" w:tplc="04160003" w:tentative="1">
+      <w:start w:val="1"/>
+      <w:numFmt w:val="bullet"/>
+      <w:lvlText w:val="o"/>
+      <w:lvlJc w:val="left"/>
+      <w:pPr>
+        <w:ind w:left="5760" w:hanging="360"/>
+      </w:pPr>
+      <w:rPr>
+        <w:rFonts w:ascii="Courier New" w:hAnsi="Courier New" w:cs="Courier New" w:hint="default"/>
+      </w:rPr>
+    </w:lvl>
+    <w:lvl w:ilvl="8" w:tplc="04160005" w:tentative="1">
+      <w:start w:val="1"/>
+      <w:numFmt w:val="bullet"/>
+      <w:lvlText w:val=""/>
+      <w:lvlJc w:val="left"/>
+      <w:pPr>
+        <w:ind w:left="6480" w:hanging="360"/>
+      </w:pPr>
+      <w:rPr>
+        <w:rFonts w:ascii="Wingdings" w:hAnsi="Wingdings" w:hint="default"/>
+      </w:rPr>
+    </w:lvl>
+  </w:abstractNum>
+  <w:abstractNum w:abstractNumId="28" w15:restartNumberingAfterBreak="0">
     <w:nsid w:val="75A3362A"/>
     <w:multiLevelType w:val="hybridMultilevel"/>
     <w:tmpl w:val="630C620C"/>
@@ -13866,7 +15376,7 @@
       </w:rPr>
     </w:lvl>
   </w:abstractNum>
-  <w:abstractNum w:abstractNumId="27" w15:restartNumberingAfterBreak="0">
+  <w:abstractNum w:abstractNumId="29" w15:restartNumberingAfterBreak="0">
     <w:nsid w:val="775E2E2D"/>
     <w:multiLevelType w:val="multilevel"/>
     <w:tmpl w:val="6F8A8C6E"/>
@@ -14015,7 +15525,7 @@
       </w:rPr>
     </w:lvl>
   </w:abstractNum>
-  <w:abstractNum w:abstractNumId="28" w15:restartNumberingAfterBreak="0">
+  <w:abstractNum w:abstractNumId="30" w15:restartNumberingAfterBreak="0">
     <w:nsid w:val="79A21BD2"/>
     <w:multiLevelType w:val="hybridMultilevel"/>
     <w:tmpl w:val="FE9422B6"/>
@@ -14128,7 +15638,7 @@
       </w:rPr>
     </w:lvl>
   </w:abstractNum>
-  <w:abstractNum w:abstractNumId="29" w15:restartNumberingAfterBreak="0">
+  <w:abstractNum w:abstractNumId="31" w15:restartNumberingAfterBreak="0">
     <w:nsid w:val="7ADF7EEB"/>
     <w:multiLevelType w:val="hybridMultilevel"/>
     <w:tmpl w:val="9F7006D2"/>
@@ -14242,76 +15752,76 @@
     </w:lvl>
   </w:abstractNum>
   <w:num w:numId="1">
-    <w:abstractNumId w:val="12"/>
+    <w:abstractNumId w:val="13"/>
   </w:num>
   <w:num w:numId="2">
-    <w:abstractNumId w:val="16"/>
+    <w:abstractNumId w:val="17"/>
   </w:num>
   <w:num w:numId="3">
-    <w:abstractNumId w:val="18"/>
+    <w:abstractNumId w:val="19"/>
   </w:num>
   <w:num w:numId="4">
     <w:abstractNumId w:val="1"/>
   </w:num>
   <w:num w:numId="5">
-    <w:abstractNumId w:val="17"/>
+    <w:abstractNumId w:val="18"/>
   </w:num>
   <w:num w:numId="6">
-    <w:abstractNumId w:val="26"/>
+    <w:abstractNumId w:val="28"/>
   </w:num>
   <w:num w:numId="7">
     <w:abstractNumId w:val="5"/>
   </w:num>
   <w:num w:numId="8">
+    <w:abstractNumId w:val="8"/>
+  </w:num>
+  <w:num w:numId="9">
+    <w:abstractNumId w:val="29"/>
+  </w:num>
+  <w:num w:numId="10">
     <w:abstractNumId w:val="7"/>
   </w:num>
-  <w:num w:numId="9">
-    <w:abstractNumId w:val="27"/>
-  </w:num>
-  <w:num w:numId="10">
-    <w:abstractNumId w:val="6"/>
-  </w:num>
   <w:num w:numId="11">
-    <w:abstractNumId w:val="29"/>
+    <w:abstractNumId w:val="31"/>
   </w:num>
   <w:num w:numId="12">
-    <w:abstractNumId w:val="20"/>
+    <w:abstractNumId w:val="21"/>
   </w:num>
   <w:num w:numId="13">
     <w:abstractNumId w:val="3"/>
   </w:num>
   <w:num w:numId="14">
-    <w:abstractNumId w:val="14"/>
+    <w:abstractNumId w:val="15"/>
   </w:num>
   <w:num w:numId="15">
-    <w:abstractNumId w:val="15"/>
+    <w:abstractNumId w:val="16"/>
   </w:num>
   <w:num w:numId="16">
-    <w:abstractNumId w:val="28"/>
+    <w:abstractNumId w:val="30"/>
   </w:num>
   <w:num w:numId="17">
-    <w:abstractNumId w:val="21"/>
+    <w:abstractNumId w:val="22"/>
   </w:num>
   <w:num w:numId="18">
+    <w:abstractNumId w:val="25"/>
+  </w:num>
+  <w:num w:numId="19">
     <w:abstractNumId w:val="24"/>
   </w:num>
-  <w:num w:numId="19">
-    <w:abstractNumId w:val="23"/>
-  </w:num>
   <w:num w:numId="20">
-    <w:abstractNumId w:val="8"/>
+    <w:abstractNumId w:val="9"/>
   </w:num>
   <w:num w:numId="21">
-    <w:abstractNumId w:val="25"/>
+    <w:abstractNumId w:val="26"/>
   </w:num>
   <w:num w:numId="22">
     <w:abstractNumId w:val="4"/>
   </w:num>
   <w:num w:numId="23">
-    <w:abstractNumId w:val="22"/>
+    <w:abstractNumId w:val="23"/>
   </w:num>
   <w:num w:numId="24">
-    <w:abstractNumId w:val="11"/>
+    <w:abstractNumId w:val="12"/>
   </w:num>
   <w:num w:numId="25">
     <w:abstractNumId w:val="0"/>
@@ -14320,16 +15830,22 @@
     <w:abstractNumId w:val="2"/>
   </w:num>
   <w:num w:numId="27">
-    <w:abstractNumId w:val="9"/>
+    <w:abstractNumId w:val="10"/>
   </w:num>
   <w:num w:numId="28">
-    <w:abstractNumId w:val="19"/>
+    <w:abstractNumId w:val="20"/>
   </w:num>
   <w:num w:numId="29">
-    <w:abstractNumId w:val="13"/>
+    <w:abstractNumId w:val="14"/>
   </w:num>
   <w:num w:numId="30">
-    <w:abstractNumId w:val="10"/>
+    <w:abstractNumId w:val="11"/>
+  </w:num>
+  <w:num w:numId="31">
+    <w:abstractNumId w:val="6"/>
+  </w:num>
+  <w:num w:numId="32">
+    <w:abstractNumId w:val="27"/>
   </w:num>
 </w:numbering>
 </file>
@@ -14854,7 +16370,6 @@
     <w:name w:val="Normal (Web)"/>
     <w:basedOn w:val="Normal"/>
     <w:uiPriority w:val="99"/>
-    <w:semiHidden/>
     <w:unhideWhenUsed/>
     <w:rsid w:val="00BE6B35"/>
     <w:pPr>

</xml_diff>

<commit_message>
feat: implementacao de DTOs de Request/Response na TASK-07 para desacoplamento da camada REST
</commit_message>
<xml_diff>
--- a/API Ecommerce.docx
+++ b/API Ecommerce.docx
@@ -10370,6 +10370,7 @@
       <w:r>
         <w:rPr>
           <w:rFonts w:asciiTheme="minorHAnsi" w:hAnsiTheme="minorHAnsi" w:cstheme="minorHAnsi"/>
+          <w:noProof/>
         </w:rPr>
         <w:drawing>
           <wp:inline distT="0" distB="0" distL="0" distR="0" wp14:anchorId="799104D4" wp14:editId="724F3FCC">
@@ -10522,6 +10523,7 @@
       <w:r>
         <w:rPr>
           <w:rFonts w:asciiTheme="minorHAnsi" w:hAnsiTheme="minorHAnsi" w:cstheme="minorHAnsi"/>
+          <w:noProof/>
         </w:rPr>
         <w:drawing>
           <wp:inline distT="0" distB="0" distL="0" distR="0" wp14:anchorId="6774E082" wp14:editId="1AB627EA">
@@ -10747,6 +10749,7 @@
       <w:r>
         <w:rPr>
           <w:rFonts w:asciiTheme="minorHAnsi" w:hAnsiTheme="minorHAnsi" w:cstheme="minorHAnsi"/>
+          <w:noProof/>
         </w:rPr>
         <w:drawing>
           <wp:inline distT="0" distB="0" distL="0" distR="0" wp14:anchorId="4075859E" wp14:editId="5CE16755">
@@ -10825,6 +10828,7 @@
       <w:r>
         <w:rPr>
           <w:rFonts w:asciiTheme="minorHAnsi" w:hAnsiTheme="minorHAnsi" w:cstheme="minorHAnsi"/>
+          <w:noProof/>
         </w:rPr>
         <w:drawing>
           <wp:inline distT="0" distB="0" distL="0" distR="0" wp14:anchorId="2F476C12" wp14:editId="4C62CA40">
@@ -11154,7 +11158,10 @@
           <w:numId w:val="32"/>
         </w:numPr>
         <w:rPr>
-          <w:rFonts w:asciiTheme="minorHAnsi" w:hAnsiTheme="minorHAnsi" w:cstheme="minorHAnsi"/>
+          <w:rStyle w:val="CdigoHTML"/>
+          <w:rFonts w:asciiTheme="minorHAnsi" w:hAnsiTheme="minorHAnsi" w:cstheme="minorHAnsi"/>
+          <w:sz w:val="24"/>
+          <w:szCs w:val="24"/>
         </w:rPr>
       </w:pPr>
       <w:r>
@@ -11318,6 +11325,1912 @@
         </w:rPr>
         <w:t xml:space="preserve"> para estruturar os parâmetros de paginação</w:t>
       </w:r>
+    </w:p>
+    <w:p>
+      <w:pPr>
+        <w:pStyle w:val="NormalWeb"/>
+        <w:numPr>
+          <w:ilvl w:val="0"/>
+          <w:numId w:val="1"/>
+        </w:numPr>
+        <w:jc w:val="center"/>
+        <w:rPr>
+          <w:rFonts w:asciiTheme="minorHAnsi" w:hAnsiTheme="minorHAnsi" w:cstheme="minorHAnsi"/>
+          <w:b/>
+          <w:bCs/>
+          <w:sz w:val="32"/>
+          <w:szCs w:val="32"/>
+        </w:rPr>
+      </w:pPr>
+      <w:r>
+        <w:rPr>
+          <w:rFonts w:asciiTheme="minorHAnsi" w:hAnsiTheme="minorHAnsi" w:cstheme="minorHAnsi"/>
+          <w:b/>
+          <w:bCs/>
+          <w:sz w:val="32"/>
+          <w:szCs w:val="32"/>
+        </w:rPr>
+        <w:t xml:space="preserve">TASK-07: Implementação de </w:t>
+      </w:r>
+      <w:proofErr w:type="spellStart"/>
+      <w:r>
+        <w:rPr>
+          <w:rFonts w:asciiTheme="minorHAnsi" w:hAnsiTheme="minorHAnsi" w:cstheme="minorHAnsi"/>
+          <w:b/>
+          <w:bCs/>
+          <w:sz w:val="32"/>
+          <w:szCs w:val="32"/>
+        </w:rPr>
+        <w:t>DTOs</w:t>
+      </w:r>
+      <w:proofErr w:type="spellEnd"/>
+      <w:r>
+        <w:rPr>
+          <w:rFonts w:asciiTheme="minorHAnsi" w:hAnsiTheme="minorHAnsi" w:cstheme="minorHAnsi"/>
+          <w:b/>
+          <w:bCs/>
+          <w:sz w:val="32"/>
+          <w:szCs w:val="32"/>
+        </w:rPr>
+        <w:t xml:space="preserve"> (</w:t>
+      </w:r>
+      <w:proofErr w:type="spellStart"/>
+      <w:r>
+        <w:rPr>
+          <w:rFonts w:asciiTheme="minorHAnsi" w:hAnsiTheme="minorHAnsi" w:cstheme="minorHAnsi"/>
+          <w:b/>
+          <w:bCs/>
+          <w:sz w:val="32"/>
+          <w:szCs w:val="32"/>
+        </w:rPr>
+        <w:t>Request</w:t>
+      </w:r>
+      <w:proofErr w:type="spellEnd"/>
+      <w:r>
+        <w:rPr>
+          <w:rFonts w:asciiTheme="minorHAnsi" w:hAnsiTheme="minorHAnsi" w:cstheme="minorHAnsi"/>
+          <w:b/>
+          <w:bCs/>
+          <w:sz w:val="32"/>
+          <w:szCs w:val="32"/>
+        </w:rPr>
+        <w:t xml:space="preserve"> / Response) e </w:t>
+      </w:r>
+      <w:proofErr w:type="spellStart"/>
+      <w:r>
+        <w:rPr>
+          <w:rFonts w:asciiTheme="minorHAnsi" w:hAnsiTheme="minorHAnsi" w:cstheme="minorHAnsi"/>
+          <w:b/>
+          <w:bCs/>
+          <w:sz w:val="32"/>
+          <w:szCs w:val="32"/>
+        </w:rPr>
+        <w:t>MapStruct</w:t>
+      </w:r>
+      <w:proofErr w:type="spellEnd"/>
+      <w:r>
+        <w:rPr>
+          <w:rFonts w:asciiTheme="minorHAnsi" w:hAnsiTheme="minorHAnsi" w:cstheme="minorHAnsi"/>
+          <w:b/>
+          <w:bCs/>
+          <w:sz w:val="32"/>
+          <w:szCs w:val="32"/>
+        </w:rPr>
+        <w:t>/</w:t>
+      </w:r>
+      <w:proofErr w:type="spellStart"/>
+      <w:r>
+        <w:rPr>
+          <w:rFonts w:asciiTheme="minorHAnsi" w:hAnsiTheme="minorHAnsi" w:cstheme="minorHAnsi"/>
+          <w:b/>
+          <w:bCs/>
+          <w:sz w:val="32"/>
+          <w:szCs w:val="32"/>
+        </w:rPr>
+        <w:t>ModelMapper</w:t>
+      </w:r>
+      <w:proofErr w:type="spellEnd"/>
+    </w:p>
+    <w:p>
+      <w:pPr>
+        <w:pStyle w:val="Ttulo3"/>
+        <w:rPr>
+          <w:rFonts w:asciiTheme="minorHAnsi" w:hAnsiTheme="minorHAnsi" w:cstheme="minorHAnsi"/>
+        </w:rPr>
+      </w:pPr>
+      <w:r>
+        <w:rPr>
+          <w:rFonts w:asciiTheme="minorHAnsi" w:hAnsiTheme="minorHAnsi" w:cstheme="minorHAnsi"/>
+        </w:rPr>
+        <w:t>Objetivo</w:t>
+      </w:r>
+    </w:p>
+    <w:p>
+      <w:pPr>
+        <w:pStyle w:val="NormalWeb"/>
+        <w:rPr>
+          <w:rFonts w:asciiTheme="minorHAnsi" w:hAnsiTheme="minorHAnsi" w:cstheme="minorHAnsi"/>
+        </w:rPr>
+      </w:pPr>
+      <w:r>
+        <w:rPr>
+          <w:rFonts w:asciiTheme="minorHAnsi" w:hAnsiTheme="minorHAnsi" w:cstheme="minorHAnsi"/>
+        </w:rPr>
+        <w:t>Desacoplar a nossa entidade de banco de dados (</w:t>
+      </w:r>
+      <w:r>
+        <w:rPr>
+          <w:rStyle w:val="CdigoHTML"/>
+          <w:rFonts w:asciiTheme="minorHAnsi" w:eastAsiaTheme="majorEastAsia" w:hAnsiTheme="minorHAnsi" w:cstheme="minorHAnsi"/>
+          <w:b/>
+          <w:bCs/>
+          <w:sz w:val="24"/>
+          <w:szCs w:val="24"/>
+        </w:rPr>
+        <w:t>Produto</w:t>
+      </w:r>
+      <w:r>
+        <w:rPr>
+          <w:rFonts w:asciiTheme="minorHAnsi" w:hAnsiTheme="minorHAnsi" w:cstheme="minorHAnsi"/>
+        </w:rPr>
+        <w:t>) da camada de exposição REST. A partir de agora, a API não recebe nem devolve a entidade diretamente; ela transita dados através de objetos de transferência (</w:t>
+      </w:r>
+      <w:proofErr w:type="spellStart"/>
+      <w:r>
+        <w:rPr>
+          <w:rStyle w:val="CdigoHTML"/>
+          <w:rFonts w:asciiTheme="minorHAnsi" w:eastAsiaTheme="majorEastAsia" w:hAnsiTheme="minorHAnsi" w:cstheme="minorHAnsi"/>
+          <w:b/>
+          <w:bCs/>
+          <w:sz w:val="24"/>
+          <w:szCs w:val="24"/>
+        </w:rPr>
+        <w:t>DTOs</w:t>
+      </w:r>
+      <w:proofErr w:type="spellEnd"/>
+      <w:r>
+        <w:rPr>
+          <w:rFonts w:asciiTheme="minorHAnsi" w:hAnsiTheme="minorHAnsi" w:cstheme="minorHAnsi"/>
+        </w:rPr>
+        <w:t>), garantindo segurança, controle de versão dos contratos e isolamento das regras de persistência.</w:t>
+      </w:r>
+    </w:p>
+    <w:p>
+      <w:pPr>
+        <w:pStyle w:val="Ttulo3"/>
+        <w:rPr>
+          <w:rFonts w:asciiTheme="minorHAnsi" w:hAnsiTheme="minorHAnsi" w:cstheme="minorHAnsi"/>
+        </w:rPr>
+      </w:pPr>
+      <w:r>
+        <w:rPr>
+          <w:rFonts w:asciiTheme="minorHAnsi" w:hAnsiTheme="minorHAnsi" w:cstheme="minorHAnsi"/>
+        </w:rPr>
+        <w:t>Passos de Implementação:</w:t>
+      </w:r>
+    </w:p>
+    <w:p>
+      <w:pPr>
+        <w:pStyle w:val="NormalWeb"/>
+        <w:numPr>
+          <w:ilvl w:val="0"/>
+          <w:numId w:val="33"/>
+        </w:numPr>
+        <w:rPr>
+          <w:rFonts w:asciiTheme="minorHAnsi" w:hAnsiTheme="minorHAnsi" w:cstheme="minorHAnsi"/>
+        </w:rPr>
+      </w:pPr>
+      <w:r>
+        <w:rPr>
+          <w:rFonts w:asciiTheme="minorHAnsi" w:hAnsiTheme="minorHAnsi" w:cstheme="minorHAnsi"/>
+          <w:b/>
+          <w:bCs/>
+        </w:rPr>
+        <w:t xml:space="preserve">Criar </w:t>
+      </w:r>
+      <w:proofErr w:type="spellStart"/>
+      <w:r>
+        <w:rPr>
+          <w:rStyle w:val="CdigoHTML"/>
+          <w:rFonts w:asciiTheme="minorHAnsi" w:eastAsiaTheme="majorEastAsia" w:hAnsiTheme="minorHAnsi" w:cstheme="minorHAnsi"/>
+          <w:b/>
+          <w:bCs/>
+          <w:sz w:val="24"/>
+          <w:szCs w:val="24"/>
+        </w:rPr>
+        <w:t>ProdutoRequestDTO</w:t>
+      </w:r>
+      <w:proofErr w:type="spellEnd"/>
+      <w:r>
+        <w:rPr>
+          <w:rFonts w:asciiTheme="minorHAnsi" w:hAnsiTheme="minorHAnsi" w:cstheme="minorHAnsi"/>
+          <w:b/>
+          <w:bCs/>
+        </w:rPr>
+        <w:t>:</w:t>
+      </w:r>
+    </w:p>
+    <w:p>
+      <w:pPr>
+        <w:pStyle w:val="NormalWeb"/>
+        <w:numPr>
+          <w:ilvl w:val="1"/>
+          <w:numId w:val="33"/>
+        </w:numPr>
+        <w:rPr>
+          <w:rFonts w:asciiTheme="minorHAnsi" w:hAnsiTheme="minorHAnsi" w:cstheme="minorHAnsi"/>
+        </w:rPr>
+      </w:pPr>
+      <w:r>
+        <w:rPr>
+          <w:rFonts w:asciiTheme="minorHAnsi" w:hAnsiTheme="minorHAnsi" w:cstheme="minorHAnsi"/>
+        </w:rPr>
+        <w:t xml:space="preserve">Contendo as anotações de </w:t>
+      </w:r>
+      <w:proofErr w:type="spellStart"/>
+      <w:r>
+        <w:rPr>
+          <w:rFonts w:asciiTheme="minorHAnsi" w:hAnsiTheme="minorHAnsi" w:cstheme="minorHAnsi"/>
+        </w:rPr>
+        <w:t>Bean</w:t>
+      </w:r>
+      <w:proofErr w:type="spellEnd"/>
+      <w:r>
+        <w:rPr>
+          <w:rFonts w:asciiTheme="minorHAnsi" w:hAnsiTheme="minorHAnsi" w:cstheme="minorHAnsi"/>
+        </w:rPr>
+        <w:t xml:space="preserve"> </w:t>
+      </w:r>
+      <w:proofErr w:type="spellStart"/>
+      <w:r>
+        <w:rPr>
+          <w:rFonts w:asciiTheme="minorHAnsi" w:hAnsiTheme="minorHAnsi" w:cstheme="minorHAnsi"/>
+        </w:rPr>
+        <w:t>Validation</w:t>
+      </w:r>
+      <w:proofErr w:type="spellEnd"/>
+      <w:r>
+        <w:rPr>
+          <w:rFonts w:asciiTheme="minorHAnsi" w:hAnsiTheme="minorHAnsi" w:cstheme="minorHAnsi"/>
+        </w:rPr>
+        <w:t xml:space="preserve"> (</w:t>
+      </w:r>
+      <w:r>
+        <w:rPr>
+          <w:rStyle w:val="CdigoHTML"/>
+          <w:rFonts w:asciiTheme="minorHAnsi" w:eastAsiaTheme="majorEastAsia" w:hAnsiTheme="minorHAnsi" w:cstheme="minorHAnsi"/>
+          <w:sz w:val="24"/>
+          <w:szCs w:val="24"/>
+        </w:rPr>
+        <w:t>@</w:t>
+      </w:r>
+      <w:r>
+        <w:rPr>
+          <w:rStyle w:val="CdigoHTML"/>
+          <w:rFonts w:asciiTheme="minorHAnsi" w:eastAsiaTheme="majorEastAsia" w:hAnsiTheme="minorHAnsi" w:cstheme="minorHAnsi"/>
+          <w:b/>
+          <w:bCs/>
+          <w:sz w:val="24"/>
+          <w:szCs w:val="24"/>
+        </w:rPr>
+        <w:t>NotBlank</w:t>
+      </w:r>
+      <w:r>
+        <w:rPr>
+          <w:rFonts w:asciiTheme="minorHAnsi" w:hAnsiTheme="minorHAnsi" w:cstheme="minorHAnsi"/>
+        </w:rPr>
+        <w:t xml:space="preserve">, </w:t>
+      </w:r>
+      <w:r>
+        <w:rPr>
+          <w:rStyle w:val="CdigoHTML"/>
+          <w:rFonts w:asciiTheme="minorHAnsi" w:eastAsiaTheme="majorEastAsia" w:hAnsiTheme="minorHAnsi" w:cstheme="minorHAnsi"/>
+          <w:sz w:val="24"/>
+          <w:szCs w:val="24"/>
+        </w:rPr>
+        <w:t>@</w:t>
+      </w:r>
+      <w:r>
+        <w:rPr>
+          <w:rStyle w:val="CdigoHTML"/>
+          <w:rFonts w:asciiTheme="minorHAnsi" w:eastAsiaTheme="majorEastAsia" w:hAnsiTheme="minorHAnsi" w:cstheme="minorHAnsi"/>
+          <w:b/>
+          <w:bCs/>
+          <w:sz w:val="24"/>
+          <w:szCs w:val="24"/>
+        </w:rPr>
+        <w:t>NotNull</w:t>
+      </w:r>
+      <w:r>
+        <w:rPr>
+          <w:rFonts w:asciiTheme="minorHAnsi" w:hAnsiTheme="minorHAnsi" w:cstheme="minorHAnsi"/>
+        </w:rPr>
+        <w:t xml:space="preserve">, </w:t>
+      </w:r>
+      <w:r>
+        <w:rPr>
+          <w:rStyle w:val="CdigoHTML"/>
+          <w:rFonts w:asciiTheme="minorHAnsi" w:eastAsiaTheme="majorEastAsia" w:hAnsiTheme="minorHAnsi" w:cstheme="minorHAnsi"/>
+          <w:sz w:val="24"/>
+          <w:szCs w:val="24"/>
+        </w:rPr>
+        <w:t>@</w:t>
+      </w:r>
+      <w:r>
+        <w:rPr>
+          <w:rStyle w:val="CdigoHTML"/>
+          <w:rFonts w:asciiTheme="minorHAnsi" w:eastAsiaTheme="majorEastAsia" w:hAnsiTheme="minorHAnsi" w:cstheme="minorHAnsi"/>
+          <w:b/>
+          <w:bCs/>
+          <w:sz w:val="24"/>
+          <w:szCs w:val="24"/>
+        </w:rPr>
+        <w:t>Positive</w:t>
+      </w:r>
+      <w:r>
+        <w:rPr>
+          <w:rFonts w:asciiTheme="minorHAnsi" w:hAnsiTheme="minorHAnsi" w:cstheme="minorHAnsi"/>
+        </w:rPr>
+        <w:t xml:space="preserve">, etc.) exclusivas para a entrada de dados nas requisições de </w:t>
+      </w:r>
+      <w:r>
+        <w:rPr>
+          <w:rStyle w:val="CdigoHTML"/>
+          <w:rFonts w:asciiTheme="minorHAnsi" w:eastAsiaTheme="majorEastAsia" w:hAnsiTheme="minorHAnsi" w:cstheme="minorHAnsi"/>
+          <w:sz w:val="24"/>
+          <w:szCs w:val="24"/>
+        </w:rPr>
+        <w:t>POST</w:t>
+      </w:r>
+      <w:r>
+        <w:rPr>
+          <w:rFonts w:asciiTheme="minorHAnsi" w:hAnsiTheme="minorHAnsi" w:cstheme="minorHAnsi"/>
+        </w:rPr>
+        <w:t xml:space="preserve"> e </w:t>
+      </w:r>
+      <w:r>
+        <w:rPr>
+          <w:rStyle w:val="CdigoHTML"/>
+          <w:rFonts w:asciiTheme="minorHAnsi" w:eastAsiaTheme="majorEastAsia" w:hAnsiTheme="minorHAnsi" w:cstheme="minorHAnsi"/>
+          <w:sz w:val="24"/>
+          <w:szCs w:val="24"/>
+        </w:rPr>
+        <w:t>PUT</w:t>
+      </w:r>
+      <w:r>
+        <w:rPr>
+          <w:rFonts w:asciiTheme="minorHAnsi" w:hAnsiTheme="minorHAnsi" w:cstheme="minorHAnsi"/>
+        </w:rPr>
+        <w:t>.</w:t>
+      </w:r>
+    </w:p>
+    <w:p>
+      <w:pPr>
+        <w:pStyle w:val="NormalWeb"/>
+        <w:rPr>
+          <w:rFonts w:asciiTheme="minorHAnsi" w:hAnsiTheme="minorHAnsi" w:cstheme="minorHAnsi"/>
+        </w:rPr>
+      </w:pPr>
+      <w:r>
+        <w:rPr>
+          <w:rFonts w:asciiTheme="minorHAnsi" w:hAnsiTheme="minorHAnsi" w:cstheme="minorHAnsi"/>
+        </w:rPr>
+        <w:lastRenderedPageBreak/>
+        <w:drawing>
+          <wp:inline distT="0" distB="0" distL="0" distR="0" wp14:anchorId="0490E98E" wp14:editId="402BD964">
+            <wp:extent cx="5808785" cy="2310130"/>
+            <wp:effectExtent l="0" t="0" r="1905" b="0"/>
+            <wp:docPr id="36" name="Imagem 36"/>
+            <wp:cNvGraphicFramePr>
+              <a:graphicFrameLocks xmlns:a="http://schemas.openxmlformats.org/drawingml/2006/main" noChangeAspect="1"/>
+            </wp:cNvGraphicFramePr>
+            <a:graphic xmlns:a="http://schemas.openxmlformats.org/drawingml/2006/main">
+              <a:graphicData uri="http://schemas.openxmlformats.org/drawingml/2006/picture">
+                <pic:pic xmlns:pic="http://schemas.openxmlformats.org/drawingml/2006/picture">
+                  <pic:nvPicPr>
+                    <pic:cNvPr id="1" name=""/>
+                    <pic:cNvPicPr/>
+                  </pic:nvPicPr>
+                  <pic:blipFill>
+                    <a:blip r:embed="rId41"/>
+                    <a:stretch>
+                      <a:fillRect/>
+                    </a:stretch>
+                  </pic:blipFill>
+                  <pic:spPr>
+                    <a:xfrm>
+                      <a:off x="0" y="0"/>
+                      <a:ext cx="5908888" cy="2349940"/>
+                    </a:xfrm>
+                    <a:prstGeom prst="rect">
+                      <a:avLst/>
+                    </a:prstGeom>
+                  </pic:spPr>
+                </pic:pic>
+              </a:graphicData>
+            </a:graphic>
+          </wp:inline>
+        </w:drawing>
+      </w:r>
+    </w:p>
+    <w:p>
+      <w:pPr>
+        <w:pStyle w:val="NormalWeb"/>
+        <w:numPr>
+          <w:ilvl w:val="0"/>
+          <w:numId w:val="33"/>
+        </w:numPr>
+        <w:rPr>
+          <w:rFonts w:asciiTheme="minorHAnsi" w:hAnsiTheme="minorHAnsi" w:cstheme="minorHAnsi"/>
+        </w:rPr>
+      </w:pPr>
+      <w:r>
+        <w:rPr>
+          <w:rFonts w:asciiTheme="minorHAnsi" w:hAnsiTheme="minorHAnsi" w:cstheme="minorHAnsi"/>
+          <w:b/>
+          <w:bCs/>
+        </w:rPr>
+        <w:t xml:space="preserve">Criar </w:t>
+      </w:r>
+      <w:proofErr w:type="spellStart"/>
+      <w:r>
+        <w:rPr>
+          <w:rStyle w:val="CdigoHTML"/>
+          <w:rFonts w:asciiTheme="minorHAnsi" w:eastAsiaTheme="majorEastAsia" w:hAnsiTheme="minorHAnsi" w:cstheme="minorHAnsi"/>
+          <w:b/>
+          <w:bCs/>
+          <w:sz w:val="24"/>
+          <w:szCs w:val="24"/>
+        </w:rPr>
+        <w:t>ProdutoResponseDTO</w:t>
+      </w:r>
+      <w:proofErr w:type="spellEnd"/>
+      <w:r>
+        <w:rPr>
+          <w:rFonts w:asciiTheme="minorHAnsi" w:hAnsiTheme="minorHAnsi" w:cstheme="minorHAnsi"/>
+          <w:b/>
+          <w:bCs/>
+        </w:rPr>
+        <w:t>:</w:t>
+      </w:r>
+    </w:p>
+    <w:p>
+      <w:pPr>
+        <w:pStyle w:val="NormalWeb"/>
+        <w:numPr>
+          <w:ilvl w:val="1"/>
+          <w:numId w:val="33"/>
+        </w:numPr>
+        <w:rPr>
+          <w:rFonts w:asciiTheme="minorHAnsi" w:hAnsiTheme="minorHAnsi" w:cstheme="minorHAnsi"/>
+        </w:rPr>
+      </w:pPr>
+      <w:r>
+        <w:rPr>
+          <w:rFonts w:asciiTheme="minorHAnsi" w:hAnsiTheme="minorHAnsi" w:cstheme="minorHAnsi"/>
+        </w:rPr>
+        <w:t>Contendo apenas os campos que devem ser expostos para o cliente da API (excluindo dados internos sensíveis ou de auditoria, caso existam no futuro).</w:t>
+      </w:r>
+    </w:p>
+    <w:p>
+      <w:pPr>
+        <w:pStyle w:val="NormalWeb"/>
+        <w:rPr>
+          <w:rFonts w:asciiTheme="minorHAnsi" w:hAnsiTheme="minorHAnsi" w:cstheme="minorHAnsi"/>
+        </w:rPr>
+      </w:pPr>
+      <w:r>
+        <w:rPr>
+          <w:rFonts w:asciiTheme="minorHAnsi" w:hAnsiTheme="minorHAnsi" w:cstheme="minorHAnsi"/>
+        </w:rPr>
+        <w:drawing>
+          <wp:inline distT="0" distB="0" distL="0" distR="0" wp14:anchorId="2D744A67" wp14:editId="3149B52D">
+            <wp:extent cx="5715000" cy="2520134"/>
+            <wp:effectExtent l="0" t="0" r="0" b="0"/>
+            <wp:docPr id="40" name="Imagem 40"/>
+            <wp:cNvGraphicFramePr>
+              <a:graphicFrameLocks xmlns:a="http://schemas.openxmlformats.org/drawingml/2006/main" noChangeAspect="1"/>
+            </wp:cNvGraphicFramePr>
+            <a:graphic xmlns:a="http://schemas.openxmlformats.org/drawingml/2006/main">
+              <a:graphicData uri="http://schemas.openxmlformats.org/drawingml/2006/picture">
+                <pic:pic xmlns:pic="http://schemas.openxmlformats.org/drawingml/2006/picture">
+                  <pic:nvPicPr>
+                    <pic:cNvPr id="1" name=""/>
+                    <pic:cNvPicPr/>
+                  </pic:nvPicPr>
+                  <pic:blipFill>
+                    <a:blip r:embed="rId42"/>
+                    <a:stretch>
+                      <a:fillRect/>
+                    </a:stretch>
+                  </pic:blipFill>
+                  <pic:spPr>
+                    <a:xfrm>
+                      <a:off x="0" y="0"/>
+                      <a:ext cx="5742975" cy="2532470"/>
+                    </a:xfrm>
+                    <a:prstGeom prst="rect">
+                      <a:avLst/>
+                    </a:prstGeom>
+                  </pic:spPr>
+                </pic:pic>
+              </a:graphicData>
+            </a:graphic>
+          </wp:inline>
+        </w:drawing>
+      </w:r>
+    </w:p>
+    <w:p>
+      <w:pPr>
+        <w:pStyle w:val="NormalWeb"/>
+        <w:numPr>
+          <w:ilvl w:val="0"/>
+          <w:numId w:val="33"/>
+        </w:numPr>
+        <w:rPr>
+          <w:rFonts w:asciiTheme="minorHAnsi" w:hAnsiTheme="minorHAnsi" w:cstheme="minorHAnsi"/>
+        </w:rPr>
+      </w:pPr>
+      <w:r>
+        <w:rPr>
+          <w:rFonts w:asciiTheme="minorHAnsi" w:hAnsiTheme="minorHAnsi" w:cstheme="minorHAnsi"/>
+          <w:b/>
+          <w:bCs/>
+        </w:rPr>
+        <w:t xml:space="preserve">Ajustar o </w:t>
+      </w:r>
+      <w:proofErr w:type="spellStart"/>
+      <w:r>
+        <w:rPr>
+          <w:rStyle w:val="CdigoHTML"/>
+          <w:rFonts w:asciiTheme="minorHAnsi" w:eastAsiaTheme="majorEastAsia" w:hAnsiTheme="minorHAnsi" w:cstheme="minorHAnsi"/>
+          <w:b/>
+          <w:bCs/>
+          <w:sz w:val="24"/>
+          <w:szCs w:val="24"/>
+        </w:rPr>
+        <w:t>ProdutoService</w:t>
+      </w:r>
+      <w:proofErr w:type="spellEnd"/>
+      <w:r>
+        <w:rPr>
+          <w:rFonts w:asciiTheme="minorHAnsi" w:hAnsiTheme="minorHAnsi" w:cstheme="minorHAnsi"/>
+          <w:b/>
+          <w:bCs/>
+        </w:rPr>
+        <w:t>:</w:t>
+      </w:r>
+    </w:p>
+    <w:p>
+      <w:pPr>
+        <w:pStyle w:val="NormalWeb"/>
+        <w:numPr>
+          <w:ilvl w:val="1"/>
+          <w:numId w:val="33"/>
+        </w:numPr>
+        <w:rPr>
+          <w:rFonts w:asciiTheme="minorHAnsi" w:hAnsiTheme="minorHAnsi" w:cstheme="minorHAnsi"/>
+        </w:rPr>
+      </w:pPr>
+      <w:r>
+        <w:rPr>
+          <w:rFonts w:asciiTheme="minorHAnsi" w:hAnsiTheme="minorHAnsi" w:cstheme="minorHAnsi"/>
+        </w:rPr>
+        <w:t>Atualizar os métodos de cadastro, atualização e listagem para converter a Entidade em DTO (e vice-versa), utilizando mapeamento manual limpo ou um conversor dedicado.</w:t>
+      </w:r>
+    </w:p>
+    <w:p>
+      <w:pPr>
+        <w:pStyle w:val="NormalWeb"/>
+        <w:rPr>
+          <w:rFonts w:asciiTheme="minorHAnsi" w:hAnsiTheme="minorHAnsi" w:cstheme="minorHAnsi"/>
+        </w:rPr>
+      </w:pPr>
+      <w:r>
+        <w:rPr>
+          <w:rFonts w:asciiTheme="minorHAnsi" w:hAnsiTheme="minorHAnsi" w:cstheme="minorHAnsi"/>
+        </w:rPr>
+        <w:lastRenderedPageBreak/>
+        <w:drawing>
+          <wp:inline distT="0" distB="0" distL="0" distR="0" wp14:anchorId="7C60B35C" wp14:editId="01DA5510">
+            <wp:extent cx="5955323" cy="2312035"/>
+            <wp:effectExtent l="0" t="0" r="7620" b="0"/>
+            <wp:docPr id="41" name="Imagem 41"/>
+            <wp:cNvGraphicFramePr>
+              <a:graphicFrameLocks xmlns:a="http://schemas.openxmlformats.org/drawingml/2006/main" noChangeAspect="1"/>
+            </wp:cNvGraphicFramePr>
+            <a:graphic xmlns:a="http://schemas.openxmlformats.org/drawingml/2006/main">
+              <a:graphicData uri="http://schemas.openxmlformats.org/drawingml/2006/picture">
+                <pic:pic xmlns:pic="http://schemas.openxmlformats.org/drawingml/2006/picture">
+                  <pic:nvPicPr>
+                    <pic:cNvPr id="1" name=""/>
+                    <pic:cNvPicPr/>
+                  </pic:nvPicPr>
+                  <pic:blipFill>
+                    <a:blip r:embed="rId43"/>
+                    <a:stretch>
+                      <a:fillRect/>
+                    </a:stretch>
+                  </pic:blipFill>
+                  <pic:spPr>
+                    <a:xfrm>
+                      <a:off x="0" y="0"/>
+                      <a:ext cx="5968283" cy="2317066"/>
+                    </a:xfrm>
+                    <a:prstGeom prst="rect">
+                      <a:avLst/>
+                    </a:prstGeom>
+                  </pic:spPr>
+                </pic:pic>
+              </a:graphicData>
+            </a:graphic>
+          </wp:inline>
+        </w:drawing>
+      </w:r>
+    </w:p>
+    <w:p>
+      <w:pPr>
+        <w:pStyle w:val="NormalWeb"/>
+        <w:rPr>
+          <w:rFonts w:asciiTheme="minorHAnsi" w:hAnsiTheme="minorHAnsi" w:cstheme="minorHAnsi"/>
+        </w:rPr>
+      </w:pPr>
+      <w:r>
+        <w:rPr>
+          <w:rFonts w:asciiTheme="minorHAnsi" w:hAnsiTheme="minorHAnsi" w:cstheme="minorHAnsi"/>
+        </w:rPr>
+        <w:drawing>
+          <wp:inline distT="0" distB="0" distL="0" distR="0" wp14:anchorId="7F4B481F" wp14:editId="74A7BC70">
+            <wp:extent cx="5972908" cy="1287145"/>
+            <wp:effectExtent l="0" t="0" r="8890" b="8255"/>
+            <wp:docPr id="42" name="Imagem 42"/>
+            <wp:cNvGraphicFramePr>
+              <a:graphicFrameLocks xmlns:a="http://schemas.openxmlformats.org/drawingml/2006/main" noChangeAspect="1"/>
+            </wp:cNvGraphicFramePr>
+            <a:graphic xmlns:a="http://schemas.openxmlformats.org/drawingml/2006/main">
+              <a:graphicData uri="http://schemas.openxmlformats.org/drawingml/2006/picture">
+                <pic:pic xmlns:pic="http://schemas.openxmlformats.org/drawingml/2006/picture">
+                  <pic:nvPicPr>
+                    <pic:cNvPr id="1" name=""/>
+                    <pic:cNvPicPr/>
+                  </pic:nvPicPr>
+                  <pic:blipFill>
+                    <a:blip r:embed="rId44"/>
+                    <a:stretch>
+                      <a:fillRect/>
+                    </a:stretch>
+                  </pic:blipFill>
+                  <pic:spPr>
+                    <a:xfrm>
+                      <a:off x="0" y="0"/>
+                      <a:ext cx="5986823" cy="1290144"/>
+                    </a:xfrm>
+                    <a:prstGeom prst="rect">
+                      <a:avLst/>
+                    </a:prstGeom>
+                  </pic:spPr>
+                </pic:pic>
+              </a:graphicData>
+            </a:graphic>
+          </wp:inline>
+        </w:drawing>
+      </w:r>
+    </w:p>
+    <w:p>
+      <w:pPr>
+        <w:pStyle w:val="NormalWeb"/>
+        <w:rPr>
+          <w:rFonts w:asciiTheme="minorHAnsi" w:hAnsiTheme="minorHAnsi" w:cstheme="minorHAnsi"/>
+        </w:rPr>
+      </w:pPr>
+      <w:r>
+        <w:rPr>
+          <w:rFonts w:asciiTheme="minorHAnsi" w:hAnsiTheme="minorHAnsi" w:cstheme="minorHAnsi"/>
+        </w:rPr>
+        <w:drawing>
+          <wp:inline distT="0" distB="0" distL="0" distR="0" wp14:anchorId="7213D916" wp14:editId="0BE948A3">
+            <wp:extent cx="5961185" cy="2354580"/>
+            <wp:effectExtent l="0" t="0" r="1905" b="7620"/>
+            <wp:docPr id="43" name="Imagem 43"/>
+            <wp:cNvGraphicFramePr>
+              <a:graphicFrameLocks xmlns:a="http://schemas.openxmlformats.org/drawingml/2006/main" noChangeAspect="1"/>
+            </wp:cNvGraphicFramePr>
+            <a:graphic xmlns:a="http://schemas.openxmlformats.org/drawingml/2006/main">
+              <a:graphicData uri="http://schemas.openxmlformats.org/drawingml/2006/picture">
+                <pic:pic xmlns:pic="http://schemas.openxmlformats.org/drawingml/2006/picture">
+                  <pic:nvPicPr>
+                    <pic:cNvPr id="1" name=""/>
+                    <pic:cNvPicPr/>
+                  </pic:nvPicPr>
+                  <pic:blipFill>
+                    <a:blip r:embed="rId45"/>
+                    <a:stretch>
+                      <a:fillRect/>
+                    </a:stretch>
+                  </pic:blipFill>
+                  <pic:spPr>
+                    <a:xfrm>
+                      <a:off x="0" y="0"/>
+                      <a:ext cx="5980475" cy="2362199"/>
+                    </a:xfrm>
+                    <a:prstGeom prst="rect">
+                      <a:avLst/>
+                    </a:prstGeom>
+                  </pic:spPr>
+                </pic:pic>
+              </a:graphicData>
+            </a:graphic>
+          </wp:inline>
+        </w:drawing>
+      </w:r>
+    </w:p>
+    <w:p>
+      <w:pPr>
+        <w:pStyle w:val="NormalWeb"/>
+        <w:rPr>
+          <w:rFonts w:asciiTheme="minorHAnsi" w:hAnsiTheme="minorHAnsi" w:cstheme="minorHAnsi"/>
+        </w:rPr>
+      </w:pPr>
+      <w:r>
+        <w:rPr>
+          <w:rFonts w:asciiTheme="minorHAnsi" w:hAnsiTheme="minorHAnsi" w:cstheme="minorHAnsi"/>
+        </w:rPr>
+        <w:drawing>
+          <wp:inline distT="0" distB="0" distL="0" distR="0" wp14:anchorId="5EF99EA2" wp14:editId="52833EC9">
+            <wp:extent cx="5960745" cy="2340610"/>
+            <wp:effectExtent l="0" t="0" r="1905" b="2540"/>
+            <wp:docPr id="44" name="Imagem 44"/>
+            <wp:cNvGraphicFramePr>
+              <a:graphicFrameLocks xmlns:a="http://schemas.openxmlformats.org/drawingml/2006/main" noChangeAspect="1"/>
+            </wp:cNvGraphicFramePr>
+            <a:graphic xmlns:a="http://schemas.openxmlformats.org/drawingml/2006/main">
+              <a:graphicData uri="http://schemas.openxmlformats.org/drawingml/2006/picture">
+                <pic:pic xmlns:pic="http://schemas.openxmlformats.org/drawingml/2006/picture">
+                  <pic:nvPicPr>
+                    <pic:cNvPr id="1" name=""/>
+                    <pic:cNvPicPr/>
+                  </pic:nvPicPr>
+                  <pic:blipFill>
+                    <a:blip r:embed="rId46"/>
+                    <a:stretch>
+                      <a:fillRect/>
+                    </a:stretch>
+                  </pic:blipFill>
+                  <pic:spPr>
+                    <a:xfrm>
+                      <a:off x="0" y="0"/>
+                      <a:ext cx="5986487" cy="2350718"/>
+                    </a:xfrm>
+                    <a:prstGeom prst="rect">
+                      <a:avLst/>
+                    </a:prstGeom>
+                  </pic:spPr>
+                </pic:pic>
+              </a:graphicData>
+            </a:graphic>
+          </wp:inline>
+        </w:drawing>
+      </w:r>
+    </w:p>
+    <w:p>
+      <w:pPr>
+        <w:pStyle w:val="NormalWeb"/>
+        <w:rPr>
+          <w:rFonts w:asciiTheme="minorHAnsi" w:hAnsiTheme="minorHAnsi" w:cstheme="minorHAnsi"/>
+        </w:rPr>
+      </w:pPr>
+      <w:r>
+        <w:rPr>
+          <w:rFonts w:asciiTheme="minorHAnsi" w:hAnsiTheme="minorHAnsi" w:cstheme="minorHAnsi"/>
+        </w:rPr>
+        <w:lastRenderedPageBreak/>
+        <w:drawing>
+          <wp:inline distT="0" distB="0" distL="0" distR="0" wp14:anchorId="0D7CB3B2" wp14:editId="7903364E">
+            <wp:extent cx="5926015" cy="1864874"/>
+            <wp:effectExtent l="0" t="0" r="0" b="2540"/>
+            <wp:docPr id="45" name="Imagem 45"/>
+            <wp:cNvGraphicFramePr>
+              <a:graphicFrameLocks xmlns:a="http://schemas.openxmlformats.org/drawingml/2006/main" noChangeAspect="1"/>
+            </wp:cNvGraphicFramePr>
+            <a:graphic xmlns:a="http://schemas.openxmlformats.org/drawingml/2006/main">
+              <a:graphicData uri="http://schemas.openxmlformats.org/drawingml/2006/picture">
+                <pic:pic xmlns:pic="http://schemas.openxmlformats.org/drawingml/2006/picture">
+                  <pic:nvPicPr>
+                    <pic:cNvPr id="1" name=""/>
+                    <pic:cNvPicPr/>
+                  </pic:nvPicPr>
+                  <pic:blipFill>
+                    <a:blip r:embed="rId47"/>
+                    <a:stretch>
+                      <a:fillRect/>
+                    </a:stretch>
+                  </pic:blipFill>
+                  <pic:spPr>
+                    <a:xfrm>
+                      <a:off x="0" y="0"/>
+                      <a:ext cx="5964543" cy="1876998"/>
+                    </a:xfrm>
+                    <a:prstGeom prst="rect">
+                      <a:avLst/>
+                    </a:prstGeom>
+                  </pic:spPr>
+                </pic:pic>
+              </a:graphicData>
+            </a:graphic>
+          </wp:inline>
+        </w:drawing>
+      </w:r>
+    </w:p>
+    <w:p>
+      <w:pPr>
+        <w:pStyle w:val="NormalWeb"/>
+        <w:rPr>
+          <w:rFonts w:asciiTheme="minorHAnsi" w:hAnsiTheme="minorHAnsi" w:cstheme="minorHAnsi"/>
+        </w:rPr>
+      </w:pPr>
+    </w:p>
+    <w:p>
+      <w:pPr>
+        <w:pStyle w:val="NormalWeb"/>
+        <w:numPr>
+          <w:ilvl w:val="0"/>
+          <w:numId w:val="33"/>
+        </w:numPr>
+        <w:rPr>
+          <w:rFonts w:asciiTheme="minorHAnsi" w:hAnsiTheme="minorHAnsi" w:cstheme="minorHAnsi"/>
+        </w:rPr>
+      </w:pPr>
+      <w:r>
+        <w:rPr>
+          <w:rFonts w:asciiTheme="minorHAnsi" w:hAnsiTheme="minorHAnsi" w:cstheme="minorHAnsi"/>
+          <w:b/>
+          <w:bCs/>
+        </w:rPr>
+        <w:t xml:space="preserve">Atualizar o </w:t>
+      </w:r>
+      <w:proofErr w:type="spellStart"/>
+      <w:r>
+        <w:rPr>
+          <w:rStyle w:val="CdigoHTML"/>
+          <w:rFonts w:asciiTheme="minorHAnsi" w:eastAsiaTheme="majorEastAsia" w:hAnsiTheme="minorHAnsi" w:cstheme="minorHAnsi"/>
+          <w:b/>
+          <w:bCs/>
+          <w:sz w:val="24"/>
+          <w:szCs w:val="24"/>
+        </w:rPr>
+        <w:t>ProdutoController</w:t>
+      </w:r>
+      <w:proofErr w:type="spellEnd"/>
+      <w:r>
+        <w:rPr>
+          <w:rFonts w:asciiTheme="minorHAnsi" w:hAnsiTheme="minorHAnsi" w:cstheme="minorHAnsi"/>
+          <w:b/>
+          <w:bCs/>
+        </w:rPr>
+        <w:t>:</w:t>
+      </w:r>
+    </w:p>
+    <w:p>
+      <w:pPr>
+        <w:pStyle w:val="NormalWeb"/>
+        <w:numPr>
+          <w:ilvl w:val="1"/>
+          <w:numId w:val="33"/>
+        </w:numPr>
+        <w:rPr>
+          <w:rFonts w:asciiTheme="minorHAnsi" w:hAnsiTheme="minorHAnsi" w:cstheme="minorHAnsi"/>
+        </w:rPr>
+      </w:pPr>
+      <w:r>
+        <w:rPr>
+          <w:rFonts w:asciiTheme="minorHAnsi" w:hAnsiTheme="minorHAnsi" w:cstheme="minorHAnsi"/>
+        </w:rPr>
+        <w:t xml:space="preserve">Modificar as assinaturas dos </w:t>
+      </w:r>
+      <w:proofErr w:type="spellStart"/>
+      <w:r>
+        <w:rPr>
+          <w:rFonts w:asciiTheme="minorHAnsi" w:hAnsiTheme="minorHAnsi" w:cstheme="minorHAnsi"/>
+        </w:rPr>
+        <w:t>endpoints</w:t>
+      </w:r>
+      <w:proofErr w:type="spellEnd"/>
+      <w:r>
+        <w:rPr>
+          <w:rFonts w:asciiTheme="minorHAnsi" w:hAnsiTheme="minorHAnsi" w:cstheme="minorHAnsi"/>
+        </w:rPr>
+        <w:t xml:space="preserve"> para aceitar o </w:t>
+      </w:r>
+      <w:proofErr w:type="spellStart"/>
+      <w:r>
+        <w:rPr>
+          <w:rStyle w:val="CdigoHTML"/>
+          <w:rFonts w:asciiTheme="minorHAnsi" w:eastAsiaTheme="majorEastAsia" w:hAnsiTheme="minorHAnsi" w:cstheme="minorHAnsi"/>
+          <w:b/>
+          <w:bCs/>
+          <w:sz w:val="24"/>
+          <w:szCs w:val="24"/>
+        </w:rPr>
+        <w:t>ProdutoRequestDTO</w:t>
+      </w:r>
+      <w:proofErr w:type="spellEnd"/>
+      <w:r>
+        <w:rPr>
+          <w:rFonts w:asciiTheme="minorHAnsi" w:hAnsiTheme="minorHAnsi" w:cstheme="minorHAnsi"/>
+        </w:rPr>
+        <w:t xml:space="preserve"> e retornar o </w:t>
+      </w:r>
+      <w:proofErr w:type="spellStart"/>
+      <w:r>
+        <w:rPr>
+          <w:rStyle w:val="CdigoHTML"/>
+          <w:rFonts w:asciiTheme="minorHAnsi" w:eastAsiaTheme="majorEastAsia" w:hAnsiTheme="minorHAnsi" w:cstheme="minorHAnsi"/>
+          <w:b/>
+          <w:bCs/>
+          <w:sz w:val="24"/>
+          <w:szCs w:val="24"/>
+        </w:rPr>
+        <w:t>ProdutoResponseDTO</w:t>
+      </w:r>
+      <w:proofErr w:type="spellEnd"/>
+      <w:r>
+        <w:rPr>
+          <w:rFonts w:asciiTheme="minorHAnsi" w:hAnsiTheme="minorHAnsi" w:cstheme="minorHAnsi"/>
+        </w:rPr>
+        <w:t xml:space="preserve"> (ou </w:t>
+      </w:r>
+      <w:r>
+        <w:rPr>
+          <w:rStyle w:val="CdigoHTML"/>
+          <w:rFonts w:asciiTheme="minorHAnsi" w:eastAsiaTheme="majorEastAsia" w:hAnsiTheme="minorHAnsi" w:cstheme="minorHAnsi"/>
+          <w:b/>
+          <w:bCs/>
+          <w:sz w:val="24"/>
+          <w:szCs w:val="24"/>
+        </w:rPr>
+        <w:t>Page&lt;</w:t>
+      </w:r>
+      <w:proofErr w:type="spellStart"/>
+      <w:r>
+        <w:rPr>
+          <w:rStyle w:val="CdigoHTML"/>
+          <w:rFonts w:asciiTheme="minorHAnsi" w:eastAsiaTheme="majorEastAsia" w:hAnsiTheme="minorHAnsi" w:cstheme="minorHAnsi"/>
+          <w:b/>
+          <w:bCs/>
+          <w:sz w:val="24"/>
+          <w:szCs w:val="24"/>
+        </w:rPr>
+        <w:t>ProdutoResponseDTO</w:t>
+      </w:r>
+      <w:proofErr w:type="spellEnd"/>
+      <w:r>
+        <w:rPr>
+          <w:rStyle w:val="CdigoHTML"/>
+          <w:rFonts w:asciiTheme="minorHAnsi" w:eastAsiaTheme="majorEastAsia" w:hAnsiTheme="minorHAnsi" w:cstheme="minorHAnsi"/>
+          <w:b/>
+          <w:bCs/>
+          <w:sz w:val="24"/>
+          <w:szCs w:val="24"/>
+        </w:rPr>
+        <w:t>&gt;</w:t>
+      </w:r>
+      <w:r>
+        <w:rPr>
+          <w:rFonts w:asciiTheme="minorHAnsi" w:hAnsiTheme="minorHAnsi" w:cstheme="minorHAnsi"/>
+          <w:b/>
+          <w:bCs/>
+        </w:rPr>
+        <w:t>).</w:t>
+      </w:r>
+    </w:p>
+    <w:p>
+      <w:pPr>
+        <w:pStyle w:val="NormalWeb"/>
+        <w:rPr>
+          <w:rFonts w:asciiTheme="minorHAnsi" w:hAnsiTheme="minorHAnsi" w:cstheme="minorHAnsi"/>
+        </w:rPr>
+      </w:pPr>
+      <w:r>
+        <w:rPr>
+          <w:rFonts w:asciiTheme="minorHAnsi" w:hAnsiTheme="minorHAnsi" w:cstheme="minorHAnsi"/>
+        </w:rPr>
+        <w:drawing>
+          <wp:inline distT="0" distB="0" distL="0" distR="0" wp14:anchorId="0B2291BE" wp14:editId="0043292F">
+            <wp:extent cx="6054969" cy="2216150"/>
+            <wp:effectExtent l="0" t="0" r="3175" b="0"/>
+            <wp:docPr id="46" name="Imagem 46"/>
+            <wp:cNvGraphicFramePr>
+              <a:graphicFrameLocks xmlns:a="http://schemas.openxmlformats.org/drawingml/2006/main" noChangeAspect="1"/>
+            </wp:cNvGraphicFramePr>
+            <a:graphic xmlns:a="http://schemas.openxmlformats.org/drawingml/2006/main">
+              <a:graphicData uri="http://schemas.openxmlformats.org/drawingml/2006/picture">
+                <pic:pic xmlns:pic="http://schemas.openxmlformats.org/drawingml/2006/picture">
+                  <pic:nvPicPr>
+                    <pic:cNvPr id="1" name=""/>
+                    <pic:cNvPicPr/>
+                  </pic:nvPicPr>
+                  <pic:blipFill>
+                    <a:blip r:embed="rId48"/>
+                    <a:stretch>
+                      <a:fillRect/>
+                    </a:stretch>
+                  </pic:blipFill>
+                  <pic:spPr>
+                    <a:xfrm>
+                      <a:off x="0" y="0"/>
+                      <a:ext cx="6067696" cy="2220808"/>
+                    </a:xfrm>
+                    <a:prstGeom prst="rect">
+                      <a:avLst/>
+                    </a:prstGeom>
+                  </pic:spPr>
+                </pic:pic>
+              </a:graphicData>
+            </a:graphic>
+          </wp:inline>
+        </w:drawing>
+      </w:r>
+    </w:p>
+    <w:p>
+      <w:pPr>
+        <w:pStyle w:val="NormalWeb"/>
+        <w:rPr>
+          <w:rFonts w:asciiTheme="minorHAnsi" w:hAnsiTheme="minorHAnsi" w:cstheme="minorHAnsi"/>
+        </w:rPr>
+      </w:pPr>
+      <w:r>
+        <w:rPr>
+          <w:rFonts w:asciiTheme="minorHAnsi" w:hAnsiTheme="minorHAnsi" w:cstheme="minorHAnsi"/>
+        </w:rPr>
+        <w:drawing>
+          <wp:inline distT="0" distB="0" distL="0" distR="0" wp14:anchorId="413322AB" wp14:editId="4A56A87C">
+            <wp:extent cx="6078415" cy="1458595"/>
+            <wp:effectExtent l="0" t="0" r="0" b="8255"/>
+            <wp:docPr id="47" name="Imagem 47"/>
+            <wp:cNvGraphicFramePr>
+              <a:graphicFrameLocks xmlns:a="http://schemas.openxmlformats.org/drawingml/2006/main" noChangeAspect="1"/>
+            </wp:cNvGraphicFramePr>
+            <a:graphic xmlns:a="http://schemas.openxmlformats.org/drawingml/2006/main">
+              <a:graphicData uri="http://schemas.openxmlformats.org/drawingml/2006/picture">
+                <pic:pic xmlns:pic="http://schemas.openxmlformats.org/drawingml/2006/picture">
+                  <pic:nvPicPr>
+                    <pic:cNvPr id="1" name=""/>
+                    <pic:cNvPicPr/>
+                  </pic:nvPicPr>
+                  <pic:blipFill>
+                    <a:blip r:embed="rId49"/>
+                    <a:stretch>
+                      <a:fillRect/>
+                    </a:stretch>
+                  </pic:blipFill>
+                  <pic:spPr>
+                    <a:xfrm>
+                      <a:off x="0" y="0"/>
+                      <a:ext cx="6096820" cy="1463011"/>
+                    </a:xfrm>
+                    <a:prstGeom prst="rect">
+                      <a:avLst/>
+                    </a:prstGeom>
+                  </pic:spPr>
+                </pic:pic>
+              </a:graphicData>
+            </a:graphic>
+          </wp:inline>
+        </w:drawing>
+      </w:r>
+    </w:p>
+    <w:p>
+      <w:pPr>
+        <w:pStyle w:val="NormalWeb"/>
+        <w:rPr>
+          <w:rFonts w:asciiTheme="minorHAnsi" w:hAnsiTheme="minorHAnsi" w:cstheme="minorHAnsi"/>
+        </w:rPr>
+      </w:pPr>
+    </w:p>
+    <w:p>
+      <w:pPr>
+        <w:pStyle w:val="NormalWeb"/>
+        <w:rPr>
+          <w:rFonts w:asciiTheme="minorHAnsi" w:hAnsiTheme="minorHAnsi" w:cstheme="minorHAnsi"/>
+        </w:rPr>
+      </w:pPr>
+    </w:p>
+    <w:p>
+      <w:pPr>
+        <w:pStyle w:val="NormalWeb"/>
+        <w:rPr>
+          <w:rFonts w:asciiTheme="minorHAnsi" w:hAnsiTheme="minorHAnsi" w:cstheme="minorHAnsi"/>
+        </w:rPr>
+      </w:pPr>
+    </w:p>
+    <w:p>
+      <w:pPr>
+        <w:pStyle w:val="NormalWeb"/>
+        <w:rPr>
+          <w:rFonts w:asciiTheme="minorHAnsi" w:hAnsiTheme="minorHAnsi" w:cstheme="minorHAnsi"/>
+        </w:rPr>
+      </w:pPr>
+    </w:p>
+    <w:p>
+      <w:pPr>
+        <w:pStyle w:val="NormalWeb"/>
+        <w:rPr>
+          <w:rFonts w:asciiTheme="minorHAnsi" w:hAnsiTheme="minorHAnsi" w:cstheme="minorHAnsi"/>
+        </w:rPr>
+      </w:pPr>
+      <w:r>
+        <w:rPr>
+          <w:rFonts w:asciiTheme="minorHAnsi" w:hAnsiTheme="minorHAnsi" w:cstheme="minorHAnsi"/>
+        </w:rPr>
+        <w:lastRenderedPageBreak/>
+        <w:t xml:space="preserve">Realizado teste no </w:t>
+      </w:r>
+      <w:proofErr w:type="spellStart"/>
+      <w:r>
+        <w:rPr>
+          <w:rFonts w:asciiTheme="minorHAnsi" w:hAnsiTheme="minorHAnsi" w:cstheme="minorHAnsi"/>
+        </w:rPr>
+        <w:t>postman</w:t>
+      </w:r>
+      <w:proofErr w:type="spellEnd"/>
+      <w:r>
+        <w:rPr>
+          <w:rFonts w:asciiTheme="minorHAnsi" w:hAnsiTheme="minorHAnsi" w:cstheme="minorHAnsi"/>
+        </w:rPr>
+        <w:t xml:space="preserve"> e foi concluído:</w:t>
+      </w:r>
+    </w:p>
+    <w:p>
+      <w:pPr>
+        <w:pStyle w:val="NormalWeb"/>
+        <w:rPr>
+          <w:rFonts w:asciiTheme="minorHAnsi" w:hAnsiTheme="minorHAnsi" w:cstheme="minorHAnsi"/>
+        </w:rPr>
+      </w:pPr>
+      <w:r>
+        <w:rPr>
+          <w:rFonts w:asciiTheme="minorHAnsi" w:hAnsiTheme="minorHAnsi" w:cstheme="minorHAnsi"/>
+        </w:rPr>
+        <w:drawing>
+          <wp:inline distT="0" distB="0" distL="0" distR="0" wp14:anchorId="5C532F7E" wp14:editId="3B4BFA32">
+            <wp:extent cx="5673969" cy="1917700"/>
+            <wp:effectExtent l="0" t="0" r="3175" b="6350"/>
+            <wp:docPr id="48" name="Imagem 48"/>
+            <wp:cNvGraphicFramePr>
+              <a:graphicFrameLocks xmlns:a="http://schemas.openxmlformats.org/drawingml/2006/main" noChangeAspect="1"/>
+            </wp:cNvGraphicFramePr>
+            <a:graphic xmlns:a="http://schemas.openxmlformats.org/drawingml/2006/main">
+              <a:graphicData uri="http://schemas.openxmlformats.org/drawingml/2006/picture">
+                <pic:pic xmlns:pic="http://schemas.openxmlformats.org/drawingml/2006/picture">
+                  <pic:nvPicPr>
+                    <pic:cNvPr id="1" name=""/>
+                    <pic:cNvPicPr/>
+                  </pic:nvPicPr>
+                  <pic:blipFill>
+                    <a:blip r:embed="rId50"/>
+                    <a:stretch>
+                      <a:fillRect/>
+                    </a:stretch>
+                  </pic:blipFill>
+                  <pic:spPr>
+                    <a:xfrm>
+                      <a:off x="0" y="0"/>
+                      <a:ext cx="5699955" cy="1926483"/>
+                    </a:xfrm>
+                    <a:prstGeom prst="rect">
+                      <a:avLst/>
+                    </a:prstGeom>
+                  </pic:spPr>
+                </pic:pic>
+              </a:graphicData>
+            </a:graphic>
+          </wp:inline>
+        </w:drawing>
+      </w:r>
+    </w:p>
+    <w:p>
+      <w:pPr>
+        <w:pStyle w:val="NormalWeb"/>
+        <w:rPr>
+          <w:rFonts w:asciiTheme="minorHAnsi" w:hAnsiTheme="minorHAnsi" w:cstheme="minorHAnsi"/>
+        </w:rPr>
+      </w:pPr>
+      <w:r>
+        <w:rPr>
+          <w:rFonts w:asciiTheme="minorHAnsi" w:hAnsiTheme="minorHAnsi" w:cstheme="minorHAnsi"/>
+        </w:rPr>
+        <w:drawing>
+          <wp:inline distT="0" distB="0" distL="0" distR="0" wp14:anchorId="62004111" wp14:editId="46DD580C">
+            <wp:extent cx="5662246" cy="3239100"/>
+            <wp:effectExtent l="0" t="0" r="0" b="0"/>
+            <wp:docPr id="49" name="Imagem 49"/>
+            <wp:cNvGraphicFramePr>
+              <a:graphicFrameLocks xmlns:a="http://schemas.openxmlformats.org/drawingml/2006/main" noChangeAspect="1"/>
+            </wp:cNvGraphicFramePr>
+            <a:graphic xmlns:a="http://schemas.openxmlformats.org/drawingml/2006/main">
+              <a:graphicData uri="http://schemas.openxmlformats.org/drawingml/2006/picture">
+                <pic:pic xmlns:pic="http://schemas.openxmlformats.org/drawingml/2006/picture">
+                  <pic:nvPicPr>
+                    <pic:cNvPr id="1" name=""/>
+                    <pic:cNvPicPr/>
+                  </pic:nvPicPr>
+                  <pic:blipFill>
+                    <a:blip r:embed="rId51"/>
+                    <a:stretch>
+                      <a:fillRect/>
+                    </a:stretch>
+                  </pic:blipFill>
+                  <pic:spPr>
+                    <a:xfrm>
+                      <a:off x="0" y="0"/>
+                      <a:ext cx="5687969" cy="3253815"/>
+                    </a:xfrm>
+                    <a:prstGeom prst="rect">
+                      <a:avLst/>
+                    </a:prstGeom>
+                  </pic:spPr>
+                </pic:pic>
+              </a:graphicData>
+            </a:graphic>
+          </wp:inline>
+        </w:drawing>
+      </w:r>
+    </w:p>
+    <w:p>
+      <w:pPr>
+        <w:pStyle w:val="NormalWeb"/>
+        <w:rPr>
+          <w:rFonts w:asciiTheme="minorHAnsi" w:hAnsiTheme="minorHAnsi" w:cstheme="minorHAnsi"/>
+        </w:rPr>
+      </w:pPr>
+      <w:r>
+        <w:rPr>
+          <w:rFonts w:asciiTheme="minorHAnsi" w:hAnsiTheme="minorHAnsi" w:cstheme="minorHAnsi"/>
+        </w:rPr>
+        <w:drawing>
+          <wp:inline distT="0" distB="0" distL="0" distR="0" wp14:anchorId="33C755B8" wp14:editId="11FC4FCE">
+            <wp:extent cx="5650523" cy="2676421"/>
+            <wp:effectExtent l="0" t="0" r="7620" b="0"/>
+            <wp:docPr id="50" name="Imagem 50"/>
+            <wp:cNvGraphicFramePr>
+              <a:graphicFrameLocks xmlns:a="http://schemas.openxmlformats.org/drawingml/2006/main" noChangeAspect="1"/>
+            </wp:cNvGraphicFramePr>
+            <a:graphic xmlns:a="http://schemas.openxmlformats.org/drawingml/2006/main">
+              <a:graphicData uri="http://schemas.openxmlformats.org/drawingml/2006/picture">
+                <pic:pic xmlns:pic="http://schemas.openxmlformats.org/drawingml/2006/picture">
+                  <pic:nvPicPr>
+                    <pic:cNvPr id="1" name=""/>
+                    <pic:cNvPicPr/>
+                  </pic:nvPicPr>
+                  <pic:blipFill>
+                    <a:blip r:embed="rId52"/>
+                    <a:stretch>
+                      <a:fillRect/>
+                    </a:stretch>
+                  </pic:blipFill>
+                  <pic:spPr>
+                    <a:xfrm>
+                      <a:off x="0" y="0"/>
+                      <a:ext cx="5670968" cy="2686105"/>
+                    </a:xfrm>
+                    <a:prstGeom prst="rect">
+                      <a:avLst/>
+                    </a:prstGeom>
+                  </pic:spPr>
+                </pic:pic>
+              </a:graphicData>
+            </a:graphic>
+          </wp:inline>
+        </w:drawing>
+      </w:r>
+    </w:p>
+    <w:p>
+      <w:pPr>
+        <w:pStyle w:val="NormalWeb"/>
+        <w:rPr>
+          <w:rFonts w:asciiTheme="minorHAnsi" w:hAnsiTheme="minorHAnsi" w:cstheme="minorHAnsi"/>
+        </w:rPr>
+      </w:pPr>
+      <w:r>
+        <w:rPr>
+          <w:rFonts w:asciiTheme="minorHAnsi" w:hAnsiTheme="minorHAnsi" w:cstheme="minorHAnsi"/>
+        </w:rPr>
+        <w:lastRenderedPageBreak/>
+        <w:drawing>
+          <wp:inline distT="0" distB="0" distL="0" distR="0" wp14:anchorId="1175D6DA" wp14:editId="6C0A7D00">
+            <wp:extent cx="5867400" cy="2555875"/>
+            <wp:effectExtent l="0" t="0" r="0" b="0"/>
+            <wp:docPr id="51" name="Imagem 51"/>
+            <wp:cNvGraphicFramePr>
+              <a:graphicFrameLocks xmlns:a="http://schemas.openxmlformats.org/drawingml/2006/main" noChangeAspect="1"/>
+            </wp:cNvGraphicFramePr>
+            <a:graphic xmlns:a="http://schemas.openxmlformats.org/drawingml/2006/main">
+              <a:graphicData uri="http://schemas.openxmlformats.org/drawingml/2006/picture">
+                <pic:pic xmlns:pic="http://schemas.openxmlformats.org/drawingml/2006/picture">
+                  <pic:nvPicPr>
+                    <pic:cNvPr id="1" name=""/>
+                    <pic:cNvPicPr/>
+                  </pic:nvPicPr>
+                  <pic:blipFill>
+                    <a:blip r:embed="rId53"/>
+                    <a:stretch>
+                      <a:fillRect/>
+                    </a:stretch>
+                  </pic:blipFill>
+                  <pic:spPr>
+                    <a:xfrm>
+                      <a:off x="0" y="0"/>
+                      <a:ext cx="5878473" cy="2560698"/>
+                    </a:xfrm>
+                    <a:prstGeom prst="rect">
+                      <a:avLst/>
+                    </a:prstGeom>
+                  </pic:spPr>
+                </pic:pic>
+              </a:graphicData>
+            </a:graphic>
+          </wp:inline>
+        </w:drawing>
+      </w:r>
+    </w:p>
+    <w:p>
+      <w:pPr>
+        <w:pStyle w:val="Ttulo3"/>
+        <w:rPr>
+          <w:rFonts w:asciiTheme="minorHAnsi" w:hAnsiTheme="minorHAnsi" w:cstheme="minorHAnsi"/>
+        </w:rPr>
+      </w:pPr>
+      <w:r>
+        <w:rPr>
+          <w:rFonts w:asciiTheme="minorHAnsi" w:hAnsiTheme="minorHAnsi" w:cstheme="minorHAnsi"/>
+        </w:rPr>
+        <w:t xml:space="preserve">Diário de Bordo — Projeto </w:t>
+      </w:r>
+      <w:proofErr w:type="spellStart"/>
+      <w:r>
+        <w:rPr>
+          <w:rStyle w:val="CdigoHTML"/>
+          <w:rFonts w:asciiTheme="minorHAnsi" w:eastAsiaTheme="majorEastAsia" w:hAnsiTheme="minorHAnsi" w:cstheme="minorHAnsi"/>
+          <w:sz w:val="24"/>
+          <w:szCs w:val="24"/>
+        </w:rPr>
+        <w:t>ecommerce_product</w:t>
+      </w:r>
+      <w:proofErr w:type="spellEnd"/>
+    </w:p>
+    <w:p>
+      <w:pPr>
+        <w:pStyle w:val="NormalWeb"/>
+        <w:rPr>
+          <w:rFonts w:asciiTheme="minorHAnsi" w:hAnsiTheme="minorHAnsi" w:cstheme="minorHAnsi"/>
+        </w:rPr>
+      </w:pPr>
+      <w:r>
+        <w:rPr>
+          <w:rFonts w:asciiTheme="minorHAnsi" w:hAnsiTheme="minorHAnsi" w:cstheme="minorHAnsi"/>
+          <w:b/>
+          <w:bCs/>
+        </w:rPr>
+        <w:t>Data:</w:t>
+      </w:r>
+      <w:r>
+        <w:rPr>
+          <w:rFonts w:asciiTheme="minorHAnsi" w:hAnsiTheme="minorHAnsi" w:cstheme="minorHAnsi"/>
+        </w:rPr>
+        <w:t xml:space="preserve"> 28 de </w:t>
+      </w:r>
+      <w:proofErr w:type="gramStart"/>
+      <w:r>
+        <w:rPr>
+          <w:rFonts w:asciiTheme="minorHAnsi" w:hAnsiTheme="minorHAnsi" w:cstheme="minorHAnsi"/>
+        </w:rPr>
+        <w:t>Outubro</w:t>
+      </w:r>
+      <w:proofErr w:type="gramEnd"/>
+      <w:r>
+        <w:rPr>
+          <w:rFonts w:asciiTheme="minorHAnsi" w:hAnsiTheme="minorHAnsi" w:cstheme="minorHAnsi"/>
+        </w:rPr>
+        <w:t xml:space="preserve"> de 2026</w:t>
+      </w:r>
+    </w:p>
+    <w:p>
+      <w:pPr>
+        <w:pStyle w:val="NormalWeb"/>
+        <w:rPr>
+          <w:rFonts w:asciiTheme="minorHAnsi" w:hAnsiTheme="minorHAnsi" w:cstheme="minorHAnsi"/>
+        </w:rPr>
+      </w:pPr>
+      <w:r>
+        <w:rPr>
+          <w:rFonts w:asciiTheme="minorHAnsi" w:hAnsiTheme="minorHAnsi" w:cstheme="minorHAnsi"/>
+          <w:b/>
+          <w:bCs/>
+        </w:rPr>
+        <w:t>Foco do Dia:</w:t>
+      </w:r>
+      <w:r>
+        <w:rPr>
+          <w:rFonts w:asciiTheme="minorHAnsi" w:hAnsiTheme="minorHAnsi" w:cstheme="minorHAnsi"/>
+        </w:rPr>
+        <w:t xml:space="preserve"> Separação de Camadas via </w:t>
+      </w:r>
+      <w:proofErr w:type="spellStart"/>
+      <w:r>
+        <w:rPr>
+          <w:rFonts w:asciiTheme="minorHAnsi" w:hAnsiTheme="minorHAnsi" w:cstheme="minorHAnsi"/>
+        </w:rPr>
+        <w:t>DTOs</w:t>
+      </w:r>
+      <w:proofErr w:type="spellEnd"/>
+      <w:r>
+        <w:rPr>
+          <w:rFonts w:asciiTheme="minorHAnsi" w:hAnsiTheme="minorHAnsi" w:cstheme="minorHAnsi"/>
+        </w:rPr>
+        <w:t xml:space="preserve"> (</w:t>
+      </w:r>
+      <w:proofErr w:type="spellStart"/>
+      <w:r>
+        <w:rPr>
+          <w:rFonts w:asciiTheme="minorHAnsi" w:hAnsiTheme="minorHAnsi" w:cstheme="minorHAnsi"/>
+        </w:rPr>
+        <w:t>Request</w:t>
+      </w:r>
+      <w:proofErr w:type="spellEnd"/>
+      <w:r>
+        <w:rPr>
+          <w:rFonts w:asciiTheme="minorHAnsi" w:hAnsiTheme="minorHAnsi" w:cstheme="minorHAnsi"/>
+        </w:rPr>
+        <w:t>/Response) e Validação de Contrato REST.</w:t>
+      </w:r>
+    </w:p>
+    <w:p>
+      <w:pPr>
+        <w:pStyle w:val="NormalWeb"/>
+      </w:pPr>
+      <w:r>
+        <w:t>O que foi realizado (TASK-07):</w:t>
+      </w:r>
+    </w:p>
+    <w:p>
+      <w:pPr>
+        <w:pStyle w:val="NormalWeb"/>
+        <w:numPr>
+          <w:ilvl w:val="0"/>
+          <w:numId w:val="34"/>
+        </w:numPr>
+        <w:rPr>
+          <w:rFonts w:asciiTheme="minorHAnsi" w:hAnsiTheme="minorHAnsi" w:cstheme="minorHAnsi"/>
+        </w:rPr>
+      </w:pPr>
+      <w:r>
+        <w:rPr>
+          <w:rFonts w:asciiTheme="minorHAnsi" w:hAnsiTheme="minorHAnsi" w:cstheme="minorHAnsi"/>
+          <w:b/>
+          <w:bCs/>
+        </w:rPr>
+        <w:t xml:space="preserve">Criação da Camada </w:t>
+      </w:r>
+      <w:proofErr w:type="spellStart"/>
+      <w:r>
+        <w:rPr>
+          <w:rFonts w:asciiTheme="minorHAnsi" w:hAnsiTheme="minorHAnsi" w:cstheme="minorHAnsi"/>
+          <w:b/>
+          <w:bCs/>
+        </w:rPr>
+        <w:t>DTOs</w:t>
+      </w:r>
+      <w:proofErr w:type="spellEnd"/>
+      <w:r>
+        <w:rPr>
+          <w:rFonts w:asciiTheme="minorHAnsi" w:hAnsiTheme="minorHAnsi" w:cstheme="minorHAnsi"/>
+          <w:b/>
+          <w:bCs/>
+        </w:rPr>
+        <w:t>:</w:t>
+      </w:r>
+      <w:r>
+        <w:rPr>
+          <w:rFonts w:asciiTheme="minorHAnsi" w:hAnsiTheme="minorHAnsi" w:cstheme="minorHAnsi"/>
+        </w:rPr>
+        <w:br/>
+      </w:r>
+      <w:proofErr w:type="spellStart"/>
+      <w:r>
+        <w:rPr>
+          <w:rFonts w:asciiTheme="minorHAnsi" w:hAnsiTheme="minorHAnsi" w:cstheme="minorHAnsi"/>
+          <w:b/>
+          <w:bCs/>
+        </w:rPr>
+        <w:t>ProdutoRequestDTO</w:t>
+      </w:r>
+      <w:proofErr w:type="spellEnd"/>
+      <w:r>
+        <w:rPr>
+          <w:rFonts w:asciiTheme="minorHAnsi" w:hAnsiTheme="minorHAnsi" w:cstheme="minorHAnsi"/>
+          <w:b/>
+          <w:bCs/>
+        </w:rPr>
+        <w:t xml:space="preserve">: </w:t>
+      </w:r>
+      <w:r>
+        <w:rPr>
+          <w:rFonts w:asciiTheme="minorHAnsi" w:hAnsiTheme="minorHAnsi" w:cstheme="minorHAnsi"/>
+        </w:rPr>
+        <w:t xml:space="preserve">Criado para encapsular as requisições de cadastro e atualização, centralizando as regras do </w:t>
+      </w:r>
+      <w:proofErr w:type="spellStart"/>
+      <w:r>
+        <w:rPr>
+          <w:rFonts w:asciiTheme="minorHAnsi" w:hAnsiTheme="minorHAnsi" w:cstheme="minorHAnsi"/>
+        </w:rPr>
+        <w:t>Bean</w:t>
+      </w:r>
+      <w:proofErr w:type="spellEnd"/>
+      <w:r>
+        <w:rPr>
+          <w:rFonts w:asciiTheme="minorHAnsi" w:hAnsiTheme="minorHAnsi" w:cstheme="minorHAnsi"/>
+        </w:rPr>
+        <w:t xml:space="preserve"> </w:t>
+      </w:r>
+      <w:proofErr w:type="spellStart"/>
+      <w:proofErr w:type="gramStart"/>
+      <w:r>
+        <w:rPr>
+          <w:rFonts w:asciiTheme="minorHAnsi" w:hAnsiTheme="minorHAnsi" w:cstheme="minorHAnsi"/>
+        </w:rPr>
+        <w:t>Validation</w:t>
+      </w:r>
+      <w:proofErr w:type="spellEnd"/>
+      <w:r>
+        <w:rPr>
+          <w:rFonts w:asciiTheme="minorHAnsi" w:hAnsiTheme="minorHAnsi" w:cstheme="minorHAnsi"/>
+        </w:rPr>
+        <w:t>(</w:t>
+      </w:r>
+      <w:proofErr w:type="gramEnd"/>
+      <w:r>
+        <w:rPr>
+          <w:rFonts w:asciiTheme="minorHAnsi" w:hAnsiTheme="minorHAnsi" w:cstheme="minorHAnsi"/>
+          <w:b/>
+          <w:bCs/>
+        </w:rPr>
+        <w:t>@NotBlank, @NotNull, @Positive</w:t>
+      </w:r>
+      <w:r>
+        <w:rPr>
+          <w:rFonts w:asciiTheme="minorHAnsi" w:hAnsiTheme="minorHAnsi" w:cstheme="minorHAnsi"/>
+        </w:rPr>
+        <w:t>)</w:t>
+      </w:r>
+      <w:r>
+        <w:rPr>
+          <w:rFonts w:asciiTheme="minorHAnsi" w:hAnsiTheme="minorHAnsi" w:cstheme="minorHAnsi"/>
+        </w:rPr>
+        <w:br/>
+      </w:r>
+      <w:proofErr w:type="spellStart"/>
+      <w:r>
+        <w:rPr>
+          <w:rFonts w:asciiTheme="minorHAnsi" w:hAnsiTheme="minorHAnsi" w:cstheme="minorHAnsi"/>
+          <w:b/>
+          <w:bCs/>
+        </w:rPr>
+        <w:t>ProdutoResponseDTO</w:t>
+      </w:r>
+      <w:proofErr w:type="spellEnd"/>
+      <w:r>
+        <w:rPr>
+          <w:rFonts w:asciiTheme="minorHAnsi" w:hAnsiTheme="minorHAnsi" w:cstheme="minorHAnsi"/>
+          <w:b/>
+          <w:bCs/>
+        </w:rPr>
+        <w:t xml:space="preserve">: </w:t>
+      </w:r>
+      <w:r>
+        <w:rPr>
+          <w:rFonts w:asciiTheme="minorHAnsi" w:hAnsiTheme="minorHAnsi" w:cstheme="minorHAnsi"/>
+        </w:rPr>
+        <w:t xml:space="preserve">Criado para encapsular e padronizar o </w:t>
+      </w:r>
+      <w:proofErr w:type="spellStart"/>
+      <w:r>
+        <w:rPr>
+          <w:rFonts w:asciiTheme="minorHAnsi" w:hAnsiTheme="minorHAnsi" w:cstheme="minorHAnsi"/>
+        </w:rPr>
+        <w:t>payload</w:t>
+      </w:r>
+      <w:proofErr w:type="spellEnd"/>
+      <w:r>
+        <w:rPr>
+          <w:rFonts w:asciiTheme="minorHAnsi" w:hAnsiTheme="minorHAnsi" w:cstheme="minorHAnsi"/>
+        </w:rPr>
+        <w:t xml:space="preserve"> de saída da API(protegendo a entidade de banco </w:t>
+      </w:r>
+      <w:r>
+        <w:rPr>
+          <w:rFonts w:asciiTheme="minorHAnsi" w:hAnsiTheme="minorHAnsi" w:cstheme="minorHAnsi"/>
+          <w:b/>
+          <w:bCs/>
+        </w:rPr>
+        <w:t>Produto</w:t>
+      </w:r>
+      <w:r>
+        <w:rPr>
+          <w:rFonts w:asciiTheme="minorHAnsi" w:hAnsiTheme="minorHAnsi" w:cstheme="minorHAnsi"/>
+        </w:rPr>
+        <w:t>)</w:t>
+      </w:r>
+    </w:p>
+    <w:p>
+      <w:pPr>
+        <w:pStyle w:val="NormalWeb"/>
+        <w:numPr>
+          <w:ilvl w:val="0"/>
+          <w:numId w:val="34"/>
+        </w:numPr>
+        <w:rPr>
+          <w:rFonts w:asciiTheme="minorHAnsi" w:hAnsiTheme="minorHAnsi" w:cstheme="minorHAnsi"/>
+        </w:rPr>
+      </w:pPr>
+      <w:proofErr w:type="spellStart"/>
+      <w:r>
+        <w:rPr>
+          <w:rFonts w:asciiTheme="minorHAnsi" w:hAnsiTheme="minorHAnsi" w:cstheme="minorHAnsi"/>
+          <w:b/>
+          <w:bCs/>
+        </w:rPr>
+        <w:t>Refatoração</w:t>
+      </w:r>
+      <w:proofErr w:type="spellEnd"/>
+      <w:r>
+        <w:rPr>
+          <w:rFonts w:asciiTheme="minorHAnsi" w:hAnsiTheme="minorHAnsi" w:cstheme="minorHAnsi"/>
+          <w:b/>
+          <w:bCs/>
+        </w:rPr>
+        <w:t xml:space="preserve"> das Camadas de Serviço </w:t>
+      </w:r>
+      <w:proofErr w:type="spellStart"/>
+      <w:r>
+        <w:rPr>
+          <w:rFonts w:asciiTheme="minorHAnsi" w:hAnsiTheme="minorHAnsi" w:cstheme="minorHAnsi"/>
+          <w:b/>
+          <w:bCs/>
+        </w:rPr>
+        <w:t>Controller</w:t>
+      </w:r>
+      <w:proofErr w:type="spellEnd"/>
+      <w:r>
+        <w:rPr>
+          <w:rFonts w:asciiTheme="minorHAnsi" w:hAnsiTheme="minorHAnsi" w:cstheme="minorHAnsi"/>
+          <w:b/>
+          <w:bCs/>
+        </w:rPr>
+        <w:t>:</w:t>
+      </w:r>
+      <w:r>
+        <w:rPr>
+          <w:rFonts w:asciiTheme="minorHAnsi" w:hAnsiTheme="minorHAnsi" w:cstheme="minorHAnsi"/>
+        </w:rPr>
+        <w:br/>
+      </w:r>
+      <w:proofErr w:type="spellStart"/>
+      <w:r>
+        <w:rPr>
+          <w:rFonts w:asciiTheme="minorHAnsi" w:hAnsiTheme="minorHAnsi" w:cstheme="minorHAnsi"/>
+          <w:b/>
+          <w:bCs/>
+        </w:rPr>
+        <w:t>ProdutoService</w:t>
+      </w:r>
+      <w:proofErr w:type="spellEnd"/>
+      <w:r>
+        <w:rPr>
+          <w:rFonts w:asciiTheme="minorHAnsi" w:hAnsiTheme="minorHAnsi" w:cstheme="minorHAnsi"/>
+          <w:b/>
+          <w:bCs/>
+        </w:rPr>
+        <w:t xml:space="preserve">: </w:t>
+      </w:r>
+      <w:r>
+        <w:rPr>
+          <w:rFonts w:asciiTheme="minorHAnsi" w:hAnsiTheme="minorHAnsi" w:cstheme="minorHAnsi"/>
+        </w:rPr>
+        <w:t xml:space="preserve">Atualizado para receber </w:t>
+      </w:r>
+      <w:proofErr w:type="spellStart"/>
+      <w:r>
+        <w:rPr>
+          <w:rFonts w:asciiTheme="minorHAnsi" w:hAnsiTheme="minorHAnsi" w:cstheme="minorHAnsi"/>
+          <w:b/>
+          <w:bCs/>
+        </w:rPr>
+        <w:t>ProdutoRequestDTO</w:t>
+      </w:r>
+      <w:proofErr w:type="spellEnd"/>
+      <w:r>
+        <w:rPr>
+          <w:rFonts w:asciiTheme="minorHAnsi" w:hAnsiTheme="minorHAnsi" w:cstheme="minorHAnsi"/>
+        </w:rPr>
+        <w:t xml:space="preserve">, realizar o mapeamento para o </w:t>
+      </w:r>
+      <w:r>
+        <w:rPr>
+          <w:rFonts w:asciiTheme="minorHAnsi" w:hAnsiTheme="minorHAnsi" w:cstheme="minorHAnsi"/>
+          <w:b/>
+          <w:bCs/>
+        </w:rPr>
+        <w:t>Produto</w:t>
+      </w:r>
+      <w:r>
+        <w:rPr>
+          <w:rFonts w:asciiTheme="minorHAnsi" w:hAnsiTheme="minorHAnsi" w:cstheme="minorHAnsi"/>
+        </w:rPr>
+        <w:t xml:space="preserve"> e retornar </w:t>
+      </w:r>
+      <w:proofErr w:type="spellStart"/>
+      <w:proofErr w:type="gramStart"/>
+      <w:r>
+        <w:rPr>
+          <w:rFonts w:asciiTheme="minorHAnsi" w:hAnsiTheme="minorHAnsi" w:cstheme="minorHAnsi"/>
+          <w:b/>
+          <w:bCs/>
+        </w:rPr>
+        <w:t>ProdutoResponseDTO</w:t>
+      </w:r>
+      <w:proofErr w:type="spellEnd"/>
+      <w:r>
+        <w:rPr>
+          <w:rFonts w:asciiTheme="minorHAnsi" w:hAnsiTheme="minorHAnsi" w:cstheme="minorHAnsi"/>
+          <w:b/>
+          <w:bCs/>
+        </w:rPr>
+        <w:t>(</w:t>
+      </w:r>
+      <w:proofErr w:type="gramEnd"/>
+      <w:r>
+        <w:rPr>
+          <w:rFonts w:asciiTheme="minorHAnsi" w:hAnsiTheme="minorHAnsi" w:cstheme="minorHAnsi"/>
+        </w:rPr>
+        <w:t xml:space="preserve">Incluindo o mapeamento dinâmico no </w:t>
+      </w:r>
+      <w:proofErr w:type="spellStart"/>
+      <w:r>
+        <w:rPr>
+          <w:rFonts w:asciiTheme="minorHAnsi" w:hAnsiTheme="minorHAnsi" w:cstheme="minorHAnsi"/>
+        </w:rPr>
+        <w:t>Page.MAP</w:t>
+      </w:r>
+      <w:proofErr w:type="spellEnd"/>
+      <w:r>
+        <w:rPr>
+          <w:rFonts w:asciiTheme="minorHAnsi" w:hAnsiTheme="minorHAnsi" w:cstheme="minorHAnsi"/>
+          <w:b/>
+          <w:bCs/>
+        </w:rPr>
+        <w:t>)</w:t>
+      </w:r>
+      <w:r>
+        <w:rPr>
+          <w:rFonts w:asciiTheme="minorHAnsi" w:hAnsiTheme="minorHAnsi" w:cstheme="minorHAnsi"/>
+        </w:rPr>
+        <w:t>.</w:t>
+      </w:r>
+      <w:r>
+        <w:rPr>
+          <w:rFonts w:asciiTheme="minorHAnsi" w:hAnsiTheme="minorHAnsi" w:cstheme="minorHAnsi"/>
+        </w:rPr>
+        <w:br/>
+      </w:r>
+      <w:proofErr w:type="spellStart"/>
+      <w:r>
+        <w:rPr>
+          <w:rFonts w:asciiTheme="minorHAnsi" w:hAnsiTheme="minorHAnsi" w:cstheme="minorHAnsi"/>
+          <w:b/>
+          <w:bCs/>
+        </w:rPr>
+        <w:t>ProdutoController</w:t>
+      </w:r>
+      <w:proofErr w:type="spellEnd"/>
+      <w:r>
+        <w:rPr>
+          <w:rFonts w:asciiTheme="minorHAnsi" w:hAnsiTheme="minorHAnsi" w:cstheme="minorHAnsi"/>
+          <w:b/>
+          <w:bCs/>
+        </w:rPr>
+        <w:t xml:space="preserve">: </w:t>
+      </w:r>
+      <w:r>
+        <w:rPr>
+          <w:rFonts w:asciiTheme="minorHAnsi" w:hAnsiTheme="minorHAnsi" w:cstheme="minorHAnsi"/>
+        </w:rPr>
+        <w:t xml:space="preserve">Assinaturas de </w:t>
+      </w:r>
+      <w:proofErr w:type="spellStart"/>
+      <w:r>
+        <w:rPr>
+          <w:rFonts w:asciiTheme="minorHAnsi" w:hAnsiTheme="minorHAnsi" w:cstheme="minorHAnsi"/>
+        </w:rPr>
+        <w:t>Endpoints</w:t>
+      </w:r>
+      <w:proofErr w:type="spellEnd"/>
+      <w:r>
+        <w:rPr>
+          <w:rFonts w:asciiTheme="minorHAnsi" w:hAnsiTheme="minorHAnsi" w:cstheme="minorHAnsi"/>
+        </w:rPr>
+        <w:t xml:space="preserve"> atualizadas para trabalhar exclusivamente com </w:t>
+      </w:r>
+      <w:proofErr w:type="spellStart"/>
+      <w:r>
+        <w:rPr>
+          <w:rFonts w:asciiTheme="minorHAnsi" w:hAnsiTheme="minorHAnsi" w:cstheme="minorHAnsi"/>
+        </w:rPr>
+        <w:t>DTOs</w:t>
+      </w:r>
+      <w:proofErr w:type="spellEnd"/>
+      <w:r>
+        <w:rPr>
+          <w:rFonts w:asciiTheme="minorHAnsi" w:hAnsiTheme="minorHAnsi" w:cstheme="minorHAnsi"/>
+        </w:rPr>
+        <w:t>.</w:t>
+      </w:r>
+    </w:p>
+    <w:p>
+      <w:pPr>
+        <w:pStyle w:val="NormalWeb"/>
+        <w:numPr>
+          <w:ilvl w:val="0"/>
+          <w:numId w:val="34"/>
+        </w:numPr>
+        <w:rPr>
+          <w:rFonts w:asciiTheme="minorHAnsi" w:hAnsiTheme="minorHAnsi" w:cstheme="minorHAnsi"/>
+        </w:rPr>
+      </w:pPr>
+      <w:r>
+        <w:rPr>
+          <w:rFonts w:asciiTheme="minorHAnsi" w:hAnsiTheme="minorHAnsi" w:cstheme="minorHAnsi"/>
+          <w:b/>
+          <w:bCs/>
+        </w:rPr>
+        <w:t>Validação:</w:t>
+      </w:r>
+      <w:r>
+        <w:rPr>
+          <w:rFonts w:asciiTheme="minorHAnsi" w:hAnsiTheme="minorHAnsi" w:cstheme="minorHAnsi"/>
+        </w:rPr>
+        <w:t xml:space="preserve"> </w:t>
+      </w:r>
+      <w:proofErr w:type="spellStart"/>
+      <w:r>
+        <w:rPr>
+          <w:rFonts w:asciiTheme="minorHAnsi" w:hAnsiTheme="minorHAnsi" w:cstheme="minorHAnsi"/>
+        </w:rPr>
+        <w:t>Endpoints</w:t>
+      </w:r>
+      <w:proofErr w:type="spellEnd"/>
+      <w:r>
+        <w:rPr>
+          <w:rFonts w:asciiTheme="minorHAnsi" w:hAnsiTheme="minorHAnsi" w:cstheme="minorHAnsi"/>
+        </w:rPr>
+        <w:t xml:space="preserve"> CRUD e paginação testados e validados com sucesso no POSTMAN.</w:t>
+      </w:r>
+    </w:p>
+    <w:p>
+      <w:pPr>
+        <w:pStyle w:val="NormalWeb"/>
+        <w:rPr>
+          <w:rFonts w:asciiTheme="minorHAnsi" w:hAnsiTheme="minorHAnsi" w:cstheme="minorHAnsi"/>
+        </w:rPr>
+      </w:pPr>
+    </w:p>
+    <w:p>
+      <w:pPr>
+        <w:pStyle w:val="NormalWeb"/>
+        <w:rPr>
+          <w:rFonts w:asciiTheme="minorHAnsi" w:hAnsiTheme="minorHAnsi" w:cstheme="minorHAnsi"/>
+        </w:rPr>
+      </w:pPr>
     </w:p>
     <w:p>
       <w:pPr>
@@ -13134,7 +15047,7 @@
   <w:abstractNum w:abstractNumId="13" w15:restartNumberingAfterBreak="0">
     <w:nsid w:val="40B80731"/>
     <w:multiLevelType w:val="hybridMultilevel"/>
-    <w:tmpl w:val="F63C0878"/>
+    <w:tmpl w:val="380231DE"/>
     <w:lvl w:ilvl="0" w:tplc="0416000F">
       <w:start w:val="1"/>
       <w:numFmt w:val="decimal"/>
@@ -13516,6 +15429,119 @@
     </w:lvl>
   </w:abstractNum>
   <w:abstractNum w:abstractNumId="16" w15:restartNumberingAfterBreak="0">
+    <w:nsid w:val="58E33ED0"/>
+    <w:multiLevelType w:val="hybridMultilevel"/>
+    <w:tmpl w:val="F270762E"/>
+    <w:lvl w:ilvl="0" w:tplc="04160001">
+      <w:start w:val="1"/>
+      <w:numFmt w:val="bullet"/>
+      <w:lvlText w:val=""/>
+      <w:lvlJc w:val="left"/>
+      <w:pPr>
+        <w:ind w:left="720" w:hanging="360"/>
+      </w:pPr>
+      <w:rPr>
+        <w:rFonts w:ascii="Symbol" w:hAnsi="Symbol" w:hint="default"/>
+      </w:rPr>
+    </w:lvl>
+    <w:lvl w:ilvl="1" w:tplc="04160003" w:tentative="1">
+      <w:start w:val="1"/>
+      <w:numFmt w:val="bullet"/>
+      <w:lvlText w:val="o"/>
+      <w:lvlJc w:val="left"/>
+      <w:pPr>
+        <w:ind w:left="1440" w:hanging="360"/>
+      </w:pPr>
+      <w:rPr>
+        <w:rFonts w:ascii="Courier New" w:hAnsi="Courier New" w:cs="Courier New" w:hint="default"/>
+      </w:rPr>
+    </w:lvl>
+    <w:lvl w:ilvl="2" w:tplc="04160005" w:tentative="1">
+      <w:start w:val="1"/>
+      <w:numFmt w:val="bullet"/>
+      <w:lvlText w:val=""/>
+      <w:lvlJc w:val="left"/>
+      <w:pPr>
+        <w:ind w:left="2160" w:hanging="360"/>
+      </w:pPr>
+      <w:rPr>
+        <w:rFonts w:ascii="Wingdings" w:hAnsi="Wingdings" w:hint="default"/>
+      </w:rPr>
+    </w:lvl>
+    <w:lvl w:ilvl="3" w:tplc="04160001" w:tentative="1">
+      <w:start w:val="1"/>
+      <w:numFmt w:val="bullet"/>
+      <w:lvlText w:val=""/>
+      <w:lvlJc w:val="left"/>
+      <w:pPr>
+        <w:ind w:left="2880" w:hanging="360"/>
+      </w:pPr>
+      <w:rPr>
+        <w:rFonts w:ascii="Symbol" w:hAnsi="Symbol" w:hint="default"/>
+      </w:rPr>
+    </w:lvl>
+    <w:lvl w:ilvl="4" w:tplc="04160003" w:tentative="1">
+      <w:start w:val="1"/>
+      <w:numFmt w:val="bullet"/>
+      <w:lvlText w:val="o"/>
+      <w:lvlJc w:val="left"/>
+      <w:pPr>
+        <w:ind w:left="3600" w:hanging="360"/>
+      </w:pPr>
+      <w:rPr>
+        <w:rFonts w:ascii="Courier New" w:hAnsi="Courier New" w:cs="Courier New" w:hint="default"/>
+      </w:rPr>
+    </w:lvl>
+    <w:lvl w:ilvl="5" w:tplc="04160005" w:tentative="1">
+      <w:start w:val="1"/>
+      <w:numFmt w:val="bullet"/>
+      <w:lvlText w:val=""/>
+      <w:lvlJc w:val="left"/>
+      <w:pPr>
+        <w:ind w:left="4320" w:hanging="360"/>
+      </w:pPr>
+      <w:rPr>
+        <w:rFonts w:ascii="Wingdings" w:hAnsi="Wingdings" w:hint="default"/>
+      </w:rPr>
+    </w:lvl>
+    <w:lvl w:ilvl="6" w:tplc="04160001" w:tentative="1">
+      <w:start w:val="1"/>
+      <w:numFmt w:val="bullet"/>
+      <w:lvlText w:val=""/>
+      <w:lvlJc w:val="left"/>
+      <w:pPr>
+        <w:ind w:left="5040" w:hanging="360"/>
+      </w:pPr>
+      <w:rPr>
+        <w:rFonts w:ascii="Symbol" w:hAnsi="Symbol" w:hint="default"/>
+      </w:rPr>
+    </w:lvl>
+    <w:lvl w:ilvl="7" w:tplc="04160003" w:tentative="1">
+      <w:start w:val="1"/>
+      <w:numFmt w:val="bullet"/>
+      <w:lvlText w:val="o"/>
+      <w:lvlJc w:val="left"/>
+      <w:pPr>
+        <w:ind w:left="5760" w:hanging="360"/>
+      </w:pPr>
+      <w:rPr>
+        <w:rFonts w:ascii="Courier New" w:hAnsi="Courier New" w:cs="Courier New" w:hint="default"/>
+      </w:rPr>
+    </w:lvl>
+    <w:lvl w:ilvl="8" w:tplc="04160005" w:tentative="1">
+      <w:start w:val="1"/>
+      <w:numFmt w:val="bullet"/>
+      <w:lvlText w:val=""/>
+      <w:lvlJc w:val="left"/>
+      <w:pPr>
+        <w:ind w:left="6480" w:hanging="360"/>
+      </w:pPr>
+      <w:rPr>
+        <w:rFonts w:ascii="Wingdings" w:hAnsi="Wingdings" w:hint="default"/>
+      </w:rPr>
+    </w:lvl>
+  </w:abstractNum>
+  <w:abstractNum w:abstractNumId="17" w15:restartNumberingAfterBreak="0">
     <w:nsid w:val="58EE5E10"/>
     <w:multiLevelType w:val="multilevel"/>
     <w:tmpl w:val="CD6E82FC"/>
@@ -13664,7 +15690,7 @@
       </w:rPr>
     </w:lvl>
   </w:abstractNum>
-  <w:abstractNum w:abstractNumId="17" w15:restartNumberingAfterBreak="0">
+  <w:abstractNum w:abstractNumId="18" w15:restartNumberingAfterBreak="0">
     <w:nsid w:val="59211560"/>
     <w:multiLevelType w:val="multilevel"/>
     <w:tmpl w:val="4D0C3446"/>
@@ -13813,7 +15839,7 @@
       </w:rPr>
     </w:lvl>
   </w:abstractNum>
-  <w:abstractNum w:abstractNumId="18" w15:restartNumberingAfterBreak="0">
+  <w:abstractNum w:abstractNumId="19" w15:restartNumberingAfterBreak="0">
     <w:nsid w:val="593B7802"/>
     <w:multiLevelType w:val="multilevel"/>
     <w:tmpl w:val="51FEE8A6"/>
@@ -13958,7 +15984,7 @@
       </w:rPr>
     </w:lvl>
   </w:abstractNum>
-  <w:abstractNum w:abstractNumId="19" w15:restartNumberingAfterBreak="0">
+  <w:abstractNum w:abstractNumId="20" w15:restartNumberingAfterBreak="0">
     <w:nsid w:val="5B0E7E21"/>
     <w:multiLevelType w:val="multilevel"/>
     <w:tmpl w:val="24D4249E"/>
@@ -14107,7 +16133,7 @@
       </w:rPr>
     </w:lvl>
   </w:abstractNum>
-  <w:abstractNum w:abstractNumId="20" w15:restartNumberingAfterBreak="0">
+  <w:abstractNum w:abstractNumId="21" w15:restartNumberingAfterBreak="0">
     <w:nsid w:val="5D80315B"/>
     <w:multiLevelType w:val="multilevel"/>
     <w:tmpl w:val="3530E922"/>
@@ -14256,7 +16282,7 @@
       </w:rPr>
     </w:lvl>
   </w:abstractNum>
-  <w:abstractNum w:abstractNumId="21" w15:restartNumberingAfterBreak="0">
+  <w:abstractNum w:abstractNumId="22" w15:restartNumberingAfterBreak="0">
     <w:nsid w:val="63080127"/>
     <w:multiLevelType w:val="multilevel"/>
     <w:tmpl w:val="E46A3900"/>
@@ -14405,7 +16431,7 @@
       </w:rPr>
     </w:lvl>
   </w:abstractNum>
-  <w:abstractNum w:abstractNumId="22" w15:restartNumberingAfterBreak="0">
+  <w:abstractNum w:abstractNumId="23" w15:restartNumberingAfterBreak="0">
     <w:nsid w:val="644B4CE7"/>
     <w:multiLevelType w:val="multilevel"/>
     <w:tmpl w:val="F8625AEE"/>
@@ -14554,7 +16580,7 @@
       </w:rPr>
     </w:lvl>
   </w:abstractNum>
-  <w:abstractNum w:abstractNumId="23" w15:restartNumberingAfterBreak="0">
+  <w:abstractNum w:abstractNumId="24" w15:restartNumberingAfterBreak="0">
     <w:nsid w:val="687513C2"/>
     <w:multiLevelType w:val="multilevel"/>
     <w:tmpl w:val="410E12DC"/>
@@ -14703,7 +16729,7 @@
       </w:rPr>
     </w:lvl>
   </w:abstractNum>
-  <w:abstractNum w:abstractNumId="24" w15:restartNumberingAfterBreak="0">
+  <w:abstractNum w:abstractNumId="25" w15:restartNumberingAfterBreak="0">
     <w:nsid w:val="6AFE50EE"/>
     <w:multiLevelType w:val="multilevel"/>
     <w:tmpl w:val="E826B948"/>
@@ -14852,7 +16878,7 @@
       </w:rPr>
     </w:lvl>
   </w:abstractNum>
-  <w:abstractNum w:abstractNumId="25" w15:restartNumberingAfterBreak="0">
+  <w:abstractNum w:abstractNumId="26" w15:restartNumberingAfterBreak="0">
     <w:nsid w:val="6D0B1F67"/>
     <w:multiLevelType w:val="multilevel"/>
     <w:tmpl w:val="CCFEE40A"/>
@@ -15001,7 +17027,7 @@
       </w:rPr>
     </w:lvl>
   </w:abstractNum>
-  <w:abstractNum w:abstractNumId="26" w15:restartNumberingAfterBreak="0">
+  <w:abstractNum w:abstractNumId="27" w15:restartNumberingAfterBreak="0">
     <w:nsid w:val="6D7E522B"/>
     <w:multiLevelType w:val="multilevel"/>
     <w:tmpl w:val="FA54FB1A"/>
@@ -15150,7 +17176,7 @@
       </w:rPr>
     </w:lvl>
   </w:abstractNum>
-  <w:abstractNum w:abstractNumId="27" w15:restartNumberingAfterBreak="0">
+  <w:abstractNum w:abstractNumId="28" w15:restartNumberingAfterBreak="0">
     <w:nsid w:val="6F95013B"/>
     <w:multiLevelType w:val="hybridMultilevel"/>
     <w:tmpl w:val="D62012BA"/>
@@ -15263,7 +17289,124 @@
       </w:rPr>
     </w:lvl>
   </w:abstractNum>
-  <w:abstractNum w:abstractNumId="28" w15:restartNumberingAfterBreak="0">
+  <w:abstractNum w:abstractNumId="29" w15:restartNumberingAfterBreak="0">
+    <w:nsid w:val="73BF2D69"/>
+    <w:multiLevelType w:val="multilevel"/>
+    <w:tmpl w:val="B3B6CCD2"/>
+    <w:lvl w:ilvl="0">
+      <w:start w:val="1"/>
+      <w:numFmt w:val="decimal"/>
+      <w:lvlText w:val="%1."/>
+      <w:lvlJc w:val="left"/>
+      <w:pPr>
+        <w:tabs>
+          <w:tab w:val="num" w:pos="720"/>
+        </w:tabs>
+        <w:ind w:left="720" w:hanging="360"/>
+      </w:pPr>
+    </w:lvl>
+    <w:lvl w:ilvl="1">
+      <w:start w:val="1"/>
+      <w:numFmt w:val="bullet"/>
+      <w:lvlText w:val="o"/>
+      <w:lvlJc w:val="left"/>
+      <w:pPr>
+        <w:tabs>
+          <w:tab w:val="num" w:pos="1440"/>
+        </w:tabs>
+        <w:ind w:left="1440" w:hanging="360"/>
+      </w:pPr>
+      <w:rPr>
+        <w:rFonts w:ascii="Courier New" w:hAnsi="Courier New" w:hint="default"/>
+        <w:sz w:val="20"/>
+      </w:rPr>
+    </w:lvl>
+    <w:lvl w:ilvl="2" w:tentative="1">
+      <w:start w:val="1"/>
+      <w:numFmt w:val="decimal"/>
+      <w:lvlText w:val="%3."/>
+      <w:lvlJc w:val="left"/>
+      <w:pPr>
+        <w:tabs>
+          <w:tab w:val="num" w:pos="2160"/>
+        </w:tabs>
+        <w:ind w:left="2160" w:hanging="360"/>
+      </w:pPr>
+    </w:lvl>
+    <w:lvl w:ilvl="3" w:tentative="1">
+      <w:start w:val="1"/>
+      <w:numFmt w:val="decimal"/>
+      <w:lvlText w:val="%4."/>
+      <w:lvlJc w:val="left"/>
+      <w:pPr>
+        <w:tabs>
+          <w:tab w:val="num" w:pos="2880"/>
+        </w:tabs>
+        <w:ind w:left="2880" w:hanging="360"/>
+      </w:pPr>
+    </w:lvl>
+    <w:lvl w:ilvl="4" w:tentative="1">
+      <w:start w:val="1"/>
+      <w:numFmt w:val="decimal"/>
+      <w:lvlText w:val="%5."/>
+      <w:lvlJc w:val="left"/>
+      <w:pPr>
+        <w:tabs>
+          <w:tab w:val="num" w:pos="3600"/>
+        </w:tabs>
+        <w:ind w:left="3600" w:hanging="360"/>
+      </w:pPr>
+    </w:lvl>
+    <w:lvl w:ilvl="5" w:tentative="1">
+      <w:start w:val="1"/>
+      <w:numFmt w:val="decimal"/>
+      <w:lvlText w:val="%6."/>
+      <w:lvlJc w:val="left"/>
+      <w:pPr>
+        <w:tabs>
+          <w:tab w:val="num" w:pos="4320"/>
+        </w:tabs>
+        <w:ind w:left="4320" w:hanging="360"/>
+      </w:pPr>
+    </w:lvl>
+    <w:lvl w:ilvl="6" w:tentative="1">
+      <w:start w:val="1"/>
+      <w:numFmt w:val="decimal"/>
+      <w:lvlText w:val="%7."/>
+      <w:lvlJc w:val="left"/>
+      <w:pPr>
+        <w:tabs>
+          <w:tab w:val="num" w:pos="5040"/>
+        </w:tabs>
+        <w:ind w:left="5040" w:hanging="360"/>
+      </w:pPr>
+    </w:lvl>
+    <w:lvl w:ilvl="7" w:tentative="1">
+      <w:start w:val="1"/>
+      <w:numFmt w:val="decimal"/>
+      <w:lvlText w:val="%8."/>
+      <w:lvlJc w:val="left"/>
+      <w:pPr>
+        <w:tabs>
+          <w:tab w:val="num" w:pos="5760"/>
+        </w:tabs>
+        <w:ind w:left="5760" w:hanging="360"/>
+      </w:pPr>
+    </w:lvl>
+    <w:lvl w:ilvl="8" w:tentative="1">
+      <w:start w:val="1"/>
+      <w:numFmt w:val="decimal"/>
+      <w:lvlText w:val="%9."/>
+      <w:lvlJc w:val="left"/>
+      <w:pPr>
+        <w:tabs>
+          <w:tab w:val="num" w:pos="6480"/>
+        </w:tabs>
+        <w:ind w:left="6480" w:hanging="360"/>
+      </w:pPr>
+    </w:lvl>
+  </w:abstractNum>
+  <w:abstractNum w:abstractNumId="30" w15:restartNumberingAfterBreak="0">
     <w:nsid w:val="75A3362A"/>
     <w:multiLevelType w:val="hybridMultilevel"/>
     <w:tmpl w:val="630C620C"/>
@@ -15376,7 +17519,7 @@
       </w:rPr>
     </w:lvl>
   </w:abstractNum>
-  <w:abstractNum w:abstractNumId="29" w15:restartNumberingAfterBreak="0">
+  <w:abstractNum w:abstractNumId="31" w15:restartNumberingAfterBreak="0">
     <w:nsid w:val="775E2E2D"/>
     <w:multiLevelType w:val="multilevel"/>
     <w:tmpl w:val="6F8A8C6E"/>
@@ -15525,7 +17668,7 @@
       </w:rPr>
     </w:lvl>
   </w:abstractNum>
-  <w:abstractNum w:abstractNumId="30" w15:restartNumberingAfterBreak="0">
+  <w:abstractNum w:abstractNumId="32" w15:restartNumberingAfterBreak="0">
     <w:nsid w:val="79A21BD2"/>
     <w:multiLevelType w:val="hybridMultilevel"/>
     <w:tmpl w:val="FE9422B6"/>
@@ -15638,7 +17781,7 @@
       </w:rPr>
     </w:lvl>
   </w:abstractNum>
-  <w:abstractNum w:abstractNumId="31" w15:restartNumberingAfterBreak="0">
+  <w:abstractNum w:abstractNumId="33" w15:restartNumberingAfterBreak="0">
     <w:nsid w:val="7ADF7EEB"/>
     <w:multiLevelType w:val="hybridMultilevel"/>
     <w:tmpl w:val="9F7006D2"/>
@@ -15755,19 +17898,19 @@
     <w:abstractNumId w:val="13"/>
   </w:num>
   <w:num w:numId="2">
-    <w:abstractNumId w:val="17"/>
+    <w:abstractNumId w:val="18"/>
   </w:num>
   <w:num w:numId="3">
-    <w:abstractNumId w:val="19"/>
+    <w:abstractNumId w:val="20"/>
   </w:num>
   <w:num w:numId="4">
     <w:abstractNumId w:val="1"/>
   </w:num>
   <w:num w:numId="5">
-    <w:abstractNumId w:val="18"/>
+    <w:abstractNumId w:val="19"/>
   </w:num>
   <w:num w:numId="6">
-    <w:abstractNumId w:val="28"/>
+    <w:abstractNumId w:val="30"/>
   </w:num>
   <w:num w:numId="7">
     <w:abstractNumId w:val="5"/>
@@ -15776,16 +17919,16 @@
     <w:abstractNumId w:val="8"/>
   </w:num>
   <w:num w:numId="9">
-    <w:abstractNumId w:val="29"/>
+    <w:abstractNumId w:val="31"/>
   </w:num>
   <w:num w:numId="10">
     <w:abstractNumId w:val="7"/>
   </w:num>
   <w:num w:numId="11">
-    <w:abstractNumId w:val="31"/>
+    <w:abstractNumId w:val="33"/>
   </w:num>
   <w:num w:numId="12">
-    <w:abstractNumId w:val="21"/>
+    <w:abstractNumId w:val="22"/>
   </w:num>
   <w:num w:numId="13">
     <w:abstractNumId w:val="3"/>
@@ -15794,31 +17937,31 @@
     <w:abstractNumId w:val="15"/>
   </w:num>
   <w:num w:numId="15">
-    <w:abstractNumId w:val="16"/>
+    <w:abstractNumId w:val="17"/>
   </w:num>
   <w:num w:numId="16">
-    <w:abstractNumId w:val="30"/>
+    <w:abstractNumId w:val="32"/>
   </w:num>
   <w:num w:numId="17">
-    <w:abstractNumId w:val="22"/>
+    <w:abstractNumId w:val="23"/>
   </w:num>
   <w:num w:numId="18">
-    <w:abstractNumId w:val="25"/>
+    <w:abstractNumId w:val="26"/>
   </w:num>
   <w:num w:numId="19">
-    <w:abstractNumId w:val="24"/>
+    <w:abstractNumId w:val="25"/>
   </w:num>
   <w:num w:numId="20">
     <w:abstractNumId w:val="9"/>
   </w:num>
   <w:num w:numId="21">
-    <w:abstractNumId w:val="26"/>
+    <w:abstractNumId w:val="27"/>
   </w:num>
   <w:num w:numId="22">
     <w:abstractNumId w:val="4"/>
   </w:num>
   <w:num w:numId="23">
-    <w:abstractNumId w:val="23"/>
+    <w:abstractNumId w:val="24"/>
   </w:num>
   <w:num w:numId="24">
     <w:abstractNumId w:val="12"/>
@@ -15833,7 +17976,7 @@
     <w:abstractNumId w:val="10"/>
   </w:num>
   <w:num w:numId="28">
-    <w:abstractNumId w:val="20"/>
+    <w:abstractNumId w:val="21"/>
   </w:num>
   <w:num w:numId="29">
     <w:abstractNumId w:val="14"/>
@@ -15845,7 +17988,13 @@
     <w:abstractNumId w:val="6"/>
   </w:num>
   <w:num w:numId="32">
-    <w:abstractNumId w:val="27"/>
+    <w:abstractNumId w:val="28"/>
+  </w:num>
+  <w:num w:numId="33">
+    <w:abstractNumId w:val="29"/>
+  </w:num>
+  <w:num w:numId="34">
+    <w:abstractNumId w:val="16"/>
   </w:num>
 </w:numbering>
 </file>

</xml_diff>

<commit_message>
feat: implementacao de testes unitarios com JUnit 5 e Mockito na TASK-08
</commit_message>
<xml_diff>
--- a/API Ecommerce.docx
+++ b/API Ecommerce.docx
@@ -11714,6 +11714,7 @@
       <w:r>
         <w:rPr>
           <w:rFonts w:asciiTheme="minorHAnsi" w:hAnsiTheme="minorHAnsi" w:cstheme="minorHAnsi"/>
+          <w:noProof/>
         </w:rPr>
         <w:lastRenderedPageBreak/>
         <w:drawing>
@@ -11822,6 +11823,7 @@
       <w:r>
         <w:rPr>
           <w:rFonts w:asciiTheme="minorHAnsi" w:hAnsiTheme="minorHAnsi" w:cstheme="minorHAnsi"/>
+          <w:noProof/>
         </w:rPr>
         <w:drawing>
           <wp:inline distT="0" distB="0" distL="0" distR="0" wp14:anchorId="2D744A67" wp14:editId="3149B52D">
@@ -11929,6 +11931,7 @@
       <w:r>
         <w:rPr>
           <w:rFonts w:asciiTheme="minorHAnsi" w:hAnsiTheme="minorHAnsi" w:cstheme="minorHAnsi"/>
+          <w:noProof/>
         </w:rPr>
         <w:lastRenderedPageBreak/>
         <w:drawing>
@@ -11978,6 +11981,7 @@
       <w:r>
         <w:rPr>
           <w:rFonts w:asciiTheme="minorHAnsi" w:hAnsiTheme="minorHAnsi" w:cstheme="minorHAnsi"/>
+          <w:noProof/>
         </w:rPr>
         <w:drawing>
           <wp:inline distT="0" distB="0" distL="0" distR="0" wp14:anchorId="7F4B481F" wp14:editId="74A7BC70">
@@ -12026,6 +12030,7 @@
       <w:r>
         <w:rPr>
           <w:rFonts w:asciiTheme="minorHAnsi" w:hAnsiTheme="minorHAnsi" w:cstheme="minorHAnsi"/>
+          <w:noProof/>
         </w:rPr>
         <w:drawing>
           <wp:inline distT="0" distB="0" distL="0" distR="0" wp14:anchorId="7213D916" wp14:editId="0BE948A3">
@@ -12074,6 +12079,7 @@
       <w:r>
         <w:rPr>
           <w:rFonts w:asciiTheme="minorHAnsi" w:hAnsiTheme="minorHAnsi" w:cstheme="minorHAnsi"/>
+          <w:noProof/>
         </w:rPr>
         <w:drawing>
           <wp:inline distT="0" distB="0" distL="0" distR="0" wp14:anchorId="5EF99EA2" wp14:editId="52833EC9">
@@ -12122,6 +12128,7 @@
       <w:r>
         <w:rPr>
           <w:rFonts w:asciiTheme="minorHAnsi" w:hAnsiTheme="minorHAnsi" w:cstheme="minorHAnsi"/>
+          <w:noProof/>
         </w:rPr>
         <w:lastRenderedPageBreak/>
         <w:drawing>
@@ -12333,6 +12340,7 @@
       <w:r>
         <w:rPr>
           <w:rFonts w:asciiTheme="minorHAnsi" w:hAnsiTheme="minorHAnsi" w:cstheme="minorHAnsi"/>
+          <w:noProof/>
         </w:rPr>
         <w:drawing>
           <wp:inline distT="0" distB="0" distL="0" distR="0" wp14:anchorId="0B2291BE" wp14:editId="0043292F">
@@ -12381,6 +12389,7 @@
       <w:r>
         <w:rPr>
           <w:rFonts w:asciiTheme="minorHAnsi" w:hAnsiTheme="minorHAnsi" w:cstheme="minorHAnsi"/>
+          <w:noProof/>
         </w:rPr>
         <w:drawing>
           <wp:inline distT="0" distB="0" distL="0" distR="0" wp14:anchorId="413322AB" wp14:editId="4A56A87C">
@@ -12490,6 +12499,7 @@
       <w:r>
         <w:rPr>
           <w:rFonts w:asciiTheme="minorHAnsi" w:hAnsiTheme="minorHAnsi" w:cstheme="minorHAnsi"/>
+          <w:noProof/>
         </w:rPr>
         <w:drawing>
           <wp:inline distT="0" distB="0" distL="0" distR="0" wp14:anchorId="5C532F7E" wp14:editId="3B4BFA32">
@@ -12538,6 +12548,7 @@
       <w:r>
         <w:rPr>
           <w:rFonts w:asciiTheme="minorHAnsi" w:hAnsiTheme="minorHAnsi" w:cstheme="minorHAnsi"/>
+          <w:noProof/>
         </w:rPr>
         <w:drawing>
           <wp:inline distT="0" distB="0" distL="0" distR="0" wp14:anchorId="62004111" wp14:editId="46DD580C">
@@ -12586,6 +12597,7 @@
       <w:r>
         <w:rPr>
           <w:rFonts w:asciiTheme="minorHAnsi" w:hAnsiTheme="minorHAnsi" w:cstheme="minorHAnsi"/>
+          <w:noProof/>
         </w:rPr>
         <w:drawing>
           <wp:inline distT="0" distB="0" distL="0" distR="0" wp14:anchorId="33C755B8" wp14:editId="11FC4FCE">
@@ -12634,6 +12646,7 @@
       <w:r>
         <w:rPr>
           <w:rFonts w:asciiTheme="minorHAnsi" w:hAnsiTheme="minorHAnsi" w:cstheme="minorHAnsi"/>
+          <w:noProof/>
         </w:rPr>
         <w:lastRenderedPageBreak/>
         <w:drawing>
@@ -13240,6 +13253,2196 @@
         </w:rPr>
       </w:pPr>
     </w:p>
+    <w:p>
+      <w:pPr>
+        <w:pStyle w:val="NormalWeb"/>
+        <w:rPr>
+          <w:rFonts w:asciiTheme="minorHAnsi" w:hAnsiTheme="minorHAnsi" w:cstheme="minorHAnsi"/>
+        </w:rPr>
+      </w:pPr>
+    </w:p>
+    <w:p>
+      <w:pPr>
+        <w:pStyle w:val="NormalWeb"/>
+        <w:numPr>
+          <w:ilvl w:val="0"/>
+          <w:numId w:val="1"/>
+        </w:numPr>
+        <w:jc w:val="center"/>
+        <w:rPr>
+          <w:rFonts w:asciiTheme="minorHAnsi" w:hAnsiTheme="minorHAnsi" w:cstheme="minorHAnsi"/>
+          <w:b/>
+          <w:bCs/>
+          <w:sz w:val="32"/>
+          <w:szCs w:val="32"/>
+        </w:rPr>
+      </w:pPr>
+      <w:r>
+        <w:rPr>
+          <w:b/>
+          <w:bCs/>
+          <w:sz w:val="32"/>
+          <w:szCs w:val="32"/>
+        </w:rPr>
+        <w:lastRenderedPageBreak/>
+        <w:t>T</w:t>
+      </w:r>
+      <w:r>
+        <w:rPr>
+          <w:b/>
+          <w:bCs/>
+          <w:sz w:val="32"/>
+          <w:szCs w:val="32"/>
+        </w:rPr>
+        <w:t xml:space="preserve">ASK-08: Testes Unitários de Regra de Negócio com </w:t>
+      </w:r>
+      <w:proofErr w:type="spellStart"/>
+      <w:r>
+        <w:rPr>
+          <w:b/>
+          <w:bCs/>
+          <w:sz w:val="32"/>
+          <w:szCs w:val="32"/>
+        </w:rPr>
+        <w:t>JUnit</w:t>
+      </w:r>
+      <w:proofErr w:type="spellEnd"/>
+      <w:r>
+        <w:rPr>
+          <w:b/>
+          <w:bCs/>
+          <w:sz w:val="32"/>
+          <w:szCs w:val="32"/>
+        </w:rPr>
+        <w:t xml:space="preserve"> 5 &amp; </w:t>
+      </w:r>
+      <w:proofErr w:type="spellStart"/>
+      <w:r>
+        <w:rPr>
+          <w:b/>
+          <w:bCs/>
+          <w:sz w:val="32"/>
+          <w:szCs w:val="32"/>
+        </w:rPr>
+        <w:t>Mockito</w:t>
+      </w:r>
+      <w:proofErr w:type="spellEnd"/>
+    </w:p>
+    <w:p>
+      <w:pPr>
+        <w:pStyle w:val="Ttulo3"/>
+        <w:rPr>
+          <w:rFonts w:asciiTheme="minorHAnsi" w:hAnsiTheme="minorHAnsi" w:cstheme="minorHAnsi"/>
+        </w:rPr>
+      </w:pPr>
+      <w:r>
+        <w:rPr>
+          <w:rFonts w:asciiTheme="minorHAnsi" w:hAnsiTheme="minorHAnsi" w:cstheme="minorHAnsi"/>
+        </w:rPr>
+        <w:t>Objetivo</w:t>
+      </w:r>
+    </w:p>
+    <w:p>
+      <w:pPr>
+        <w:pStyle w:val="NormalWeb"/>
+        <w:rPr>
+          <w:rFonts w:asciiTheme="minorHAnsi" w:hAnsiTheme="minorHAnsi" w:cstheme="minorHAnsi"/>
+        </w:rPr>
+      </w:pPr>
+      <w:r>
+        <w:rPr>
+          <w:rFonts w:asciiTheme="minorHAnsi" w:hAnsiTheme="minorHAnsi" w:cstheme="minorHAnsi"/>
+        </w:rPr>
+        <w:t xml:space="preserve">Garantir a alta </w:t>
+      </w:r>
+      <w:proofErr w:type="spellStart"/>
+      <w:r>
+        <w:rPr>
+          <w:rFonts w:asciiTheme="minorHAnsi" w:hAnsiTheme="minorHAnsi" w:cstheme="minorHAnsi"/>
+        </w:rPr>
+        <w:t>testabilidade</w:t>
+      </w:r>
+      <w:proofErr w:type="spellEnd"/>
+      <w:r>
+        <w:rPr>
+          <w:rFonts w:asciiTheme="minorHAnsi" w:hAnsiTheme="minorHAnsi" w:cstheme="minorHAnsi"/>
+        </w:rPr>
+        <w:t xml:space="preserve"> e a qualidade do código da nossa API. Vamos criar a </w:t>
+      </w:r>
+      <w:proofErr w:type="spellStart"/>
+      <w:r>
+        <w:rPr>
+          <w:rFonts w:asciiTheme="minorHAnsi" w:hAnsiTheme="minorHAnsi" w:cstheme="minorHAnsi"/>
+        </w:rPr>
+        <w:t>suite</w:t>
+      </w:r>
+      <w:proofErr w:type="spellEnd"/>
+      <w:r>
+        <w:rPr>
+          <w:rFonts w:asciiTheme="minorHAnsi" w:hAnsiTheme="minorHAnsi" w:cstheme="minorHAnsi"/>
+        </w:rPr>
+        <w:t xml:space="preserve"> de testes unitários para a camada de serviço (</w:t>
+      </w:r>
+      <w:proofErr w:type="spellStart"/>
+      <w:r>
+        <w:rPr>
+          <w:rStyle w:val="CdigoHTML"/>
+          <w:rFonts w:asciiTheme="minorHAnsi" w:eastAsiaTheme="majorEastAsia" w:hAnsiTheme="minorHAnsi" w:cstheme="minorHAnsi"/>
+          <w:sz w:val="24"/>
+          <w:szCs w:val="24"/>
+        </w:rPr>
+        <w:t>ProdutoService</w:t>
+      </w:r>
+      <w:proofErr w:type="spellEnd"/>
+      <w:r>
+        <w:rPr>
+          <w:rFonts w:asciiTheme="minorHAnsi" w:hAnsiTheme="minorHAnsi" w:cstheme="minorHAnsi"/>
+        </w:rPr>
+        <w:t xml:space="preserve">), isolando as dependências do banco de dados com </w:t>
+      </w:r>
+      <w:proofErr w:type="spellStart"/>
+      <w:r>
+        <w:rPr>
+          <w:rFonts w:asciiTheme="minorHAnsi" w:hAnsiTheme="minorHAnsi" w:cstheme="minorHAnsi"/>
+          <w:b/>
+          <w:bCs/>
+        </w:rPr>
+        <w:t>Mockito</w:t>
+      </w:r>
+      <w:proofErr w:type="spellEnd"/>
+      <w:r>
+        <w:rPr>
+          <w:rFonts w:asciiTheme="minorHAnsi" w:hAnsiTheme="minorHAnsi" w:cstheme="minorHAnsi"/>
+        </w:rPr>
+        <w:t xml:space="preserve"> e validando os cenários de sucesso e as exceções da aplicação.</w:t>
+      </w:r>
+    </w:p>
+    <w:p>
+      <w:pPr>
+        <w:pStyle w:val="Ttulo3"/>
+        <w:rPr>
+          <w:rFonts w:asciiTheme="minorHAnsi" w:hAnsiTheme="minorHAnsi" w:cstheme="minorHAnsi"/>
+        </w:rPr>
+      </w:pPr>
+      <w:r>
+        <w:rPr>
+          <w:rFonts w:asciiTheme="minorHAnsi" w:hAnsiTheme="minorHAnsi" w:cstheme="minorHAnsi"/>
+        </w:rPr>
+        <w:t>Passos de Implementação:</w:t>
+      </w:r>
+    </w:p>
+    <w:p>
+      <w:pPr>
+        <w:pStyle w:val="NormalWeb"/>
+        <w:numPr>
+          <w:ilvl w:val="0"/>
+          <w:numId w:val="35"/>
+        </w:numPr>
+        <w:rPr>
+          <w:rFonts w:asciiTheme="minorHAnsi" w:hAnsiTheme="minorHAnsi" w:cstheme="minorHAnsi"/>
+        </w:rPr>
+      </w:pPr>
+      <w:r>
+        <w:rPr>
+          <w:rFonts w:asciiTheme="minorHAnsi" w:hAnsiTheme="minorHAnsi" w:cstheme="minorHAnsi"/>
+          <w:b/>
+          <w:bCs/>
+        </w:rPr>
+        <w:t>Estrutura de Teste:</w:t>
+      </w:r>
+    </w:p>
+    <w:p>
+      <w:pPr>
+        <w:pStyle w:val="NormalWeb"/>
+        <w:numPr>
+          <w:ilvl w:val="1"/>
+          <w:numId w:val="35"/>
+        </w:numPr>
+        <w:rPr>
+          <w:rFonts w:asciiTheme="minorHAnsi" w:hAnsiTheme="minorHAnsi" w:cstheme="minorHAnsi"/>
+        </w:rPr>
+      </w:pPr>
+      <w:r>
+        <w:rPr>
+          <w:rFonts w:asciiTheme="minorHAnsi" w:hAnsiTheme="minorHAnsi" w:cstheme="minorHAnsi"/>
+        </w:rPr>
+        <w:t xml:space="preserve">Criar a classe </w:t>
+      </w:r>
+      <w:proofErr w:type="spellStart"/>
+      <w:r>
+        <w:rPr>
+          <w:rStyle w:val="CdigoHTML"/>
+          <w:rFonts w:asciiTheme="minorHAnsi" w:eastAsiaTheme="majorEastAsia" w:hAnsiTheme="minorHAnsi" w:cstheme="minorHAnsi"/>
+          <w:b/>
+          <w:bCs/>
+          <w:sz w:val="24"/>
+          <w:szCs w:val="24"/>
+        </w:rPr>
+        <w:t>ProdutoServiceTest</w:t>
+      </w:r>
+      <w:proofErr w:type="spellEnd"/>
+      <w:r>
+        <w:rPr>
+          <w:rFonts w:asciiTheme="minorHAnsi" w:hAnsiTheme="minorHAnsi" w:cstheme="minorHAnsi"/>
+        </w:rPr>
+        <w:t xml:space="preserve"> no diretório </w:t>
+      </w:r>
+      <w:proofErr w:type="spellStart"/>
+      <w:r>
+        <w:rPr>
+          <w:rStyle w:val="CdigoHTML"/>
+          <w:rFonts w:asciiTheme="minorHAnsi" w:eastAsiaTheme="majorEastAsia" w:hAnsiTheme="minorHAnsi" w:cstheme="minorHAnsi"/>
+          <w:b/>
+          <w:bCs/>
+          <w:sz w:val="24"/>
+          <w:szCs w:val="24"/>
+        </w:rPr>
+        <w:t>src</w:t>
+      </w:r>
+      <w:proofErr w:type="spellEnd"/>
+      <w:r>
+        <w:rPr>
+          <w:rStyle w:val="CdigoHTML"/>
+          <w:rFonts w:asciiTheme="minorHAnsi" w:eastAsiaTheme="majorEastAsia" w:hAnsiTheme="minorHAnsi" w:cstheme="minorHAnsi"/>
+          <w:b/>
+          <w:bCs/>
+          <w:sz w:val="24"/>
+          <w:szCs w:val="24"/>
+        </w:rPr>
+        <w:t>/</w:t>
+      </w:r>
+      <w:proofErr w:type="spellStart"/>
+      <w:r>
+        <w:rPr>
+          <w:rStyle w:val="CdigoHTML"/>
+          <w:rFonts w:asciiTheme="minorHAnsi" w:eastAsiaTheme="majorEastAsia" w:hAnsiTheme="minorHAnsi" w:cstheme="minorHAnsi"/>
+          <w:b/>
+          <w:bCs/>
+          <w:sz w:val="24"/>
+          <w:szCs w:val="24"/>
+        </w:rPr>
+        <w:t>test</w:t>
+      </w:r>
+      <w:proofErr w:type="spellEnd"/>
+      <w:r>
+        <w:rPr>
+          <w:rStyle w:val="CdigoHTML"/>
+          <w:rFonts w:asciiTheme="minorHAnsi" w:eastAsiaTheme="majorEastAsia" w:hAnsiTheme="minorHAnsi" w:cstheme="minorHAnsi"/>
+          <w:b/>
+          <w:bCs/>
+          <w:sz w:val="24"/>
+          <w:szCs w:val="24"/>
+        </w:rPr>
+        <w:t>/</w:t>
+      </w:r>
+      <w:proofErr w:type="spellStart"/>
+      <w:r>
+        <w:rPr>
+          <w:rStyle w:val="CdigoHTML"/>
+          <w:rFonts w:asciiTheme="minorHAnsi" w:eastAsiaTheme="majorEastAsia" w:hAnsiTheme="minorHAnsi" w:cstheme="minorHAnsi"/>
+          <w:b/>
+          <w:bCs/>
+          <w:sz w:val="24"/>
+          <w:szCs w:val="24"/>
+        </w:rPr>
+        <w:t>java</w:t>
+      </w:r>
+      <w:proofErr w:type="spellEnd"/>
+      <w:r>
+        <w:rPr>
+          <w:rStyle w:val="CdigoHTML"/>
+          <w:rFonts w:asciiTheme="minorHAnsi" w:eastAsiaTheme="majorEastAsia" w:hAnsiTheme="minorHAnsi" w:cstheme="minorHAnsi"/>
+          <w:b/>
+          <w:bCs/>
+          <w:sz w:val="24"/>
+          <w:szCs w:val="24"/>
+        </w:rPr>
+        <w:t>/</w:t>
+      </w:r>
+      <w:proofErr w:type="spellStart"/>
+      <w:r>
+        <w:rPr>
+          <w:rStyle w:val="CdigoHTML"/>
+          <w:rFonts w:asciiTheme="minorHAnsi" w:eastAsiaTheme="majorEastAsia" w:hAnsiTheme="minorHAnsi" w:cstheme="minorHAnsi"/>
+          <w:b/>
+          <w:bCs/>
+          <w:sz w:val="24"/>
+          <w:szCs w:val="24"/>
+        </w:rPr>
+        <w:t>br</w:t>
+      </w:r>
+      <w:proofErr w:type="spellEnd"/>
+      <w:r>
+        <w:rPr>
+          <w:rStyle w:val="CdigoHTML"/>
+          <w:rFonts w:asciiTheme="minorHAnsi" w:eastAsiaTheme="majorEastAsia" w:hAnsiTheme="minorHAnsi" w:cstheme="minorHAnsi"/>
+          <w:b/>
+          <w:bCs/>
+          <w:sz w:val="24"/>
+          <w:szCs w:val="24"/>
+        </w:rPr>
+        <w:t>/com/</w:t>
+      </w:r>
+      <w:proofErr w:type="spellStart"/>
+      <w:r>
+        <w:rPr>
+          <w:rStyle w:val="CdigoHTML"/>
+          <w:rFonts w:asciiTheme="minorHAnsi" w:eastAsiaTheme="majorEastAsia" w:hAnsiTheme="minorHAnsi" w:cstheme="minorHAnsi"/>
+          <w:b/>
+          <w:bCs/>
+          <w:sz w:val="24"/>
+          <w:szCs w:val="24"/>
+        </w:rPr>
+        <w:t>jaanalves</w:t>
+      </w:r>
+      <w:proofErr w:type="spellEnd"/>
+      <w:r>
+        <w:rPr>
+          <w:rStyle w:val="CdigoHTML"/>
+          <w:rFonts w:asciiTheme="minorHAnsi" w:eastAsiaTheme="majorEastAsia" w:hAnsiTheme="minorHAnsi" w:cstheme="minorHAnsi"/>
+          <w:b/>
+          <w:bCs/>
+          <w:sz w:val="24"/>
+          <w:szCs w:val="24"/>
+        </w:rPr>
+        <w:t>/</w:t>
+      </w:r>
+      <w:proofErr w:type="spellStart"/>
+      <w:r>
+        <w:rPr>
+          <w:rStyle w:val="CdigoHTML"/>
+          <w:rFonts w:asciiTheme="minorHAnsi" w:eastAsiaTheme="majorEastAsia" w:hAnsiTheme="minorHAnsi" w:cstheme="minorHAnsi"/>
+          <w:b/>
+          <w:bCs/>
+          <w:sz w:val="24"/>
+          <w:szCs w:val="24"/>
+        </w:rPr>
+        <w:t>ecommerce_product</w:t>
+      </w:r>
+      <w:proofErr w:type="spellEnd"/>
+      <w:r>
+        <w:rPr>
+          <w:rStyle w:val="CdigoHTML"/>
+          <w:rFonts w:asciiTheme="minorHAnsi" w:eastAsiaTheme="majorEastAsia" w:hAnsiTheme="minorHAnsi" w:cstheme="minorHAnsi"/>
+          <w:b/>
+          <w:bCs/>
+          <w:sz w:val="24"/>
+          <w:szCs w:val="24"/>
+        </w:rPr>
+        <w:t>/</w:t>
+      </w:r>
+      <w:proofErr w:type="spellStart"/>
+      <w:r>
+        <w:rPr>
+          <w:rStyle w:val="CdigoHTML"/>
+          <w:rFonts w:asciiTheme="minorHAnsi" w:eastAsiaTheme="majorEastAsia" w:hAnsiTheme="minorHAnsi" w:cstheme="minorHAnsi"/>
+          <w:b/>
+          <w:bCs/>
+          <w:sz w:val="24"/>
+          <w:szCs w:val="24"/>
+        </w:rPr>
+        <w:t>services</w:t>
+      </w:r>
+      <w:proofErr w:type="spellEnd"/>
+      <w:r>
+        <w:rPr>
+          <w:rStyle w:val="CdigoHTML"/>
+          <w:rFonts w:asciiTheme="minorHAnsi" w:eastAsiaTheme="majorEastAsia" w:hAnsiTheme="minorHAnsi" w:cstheme="minorHAnsi"/>
+          <w:b/>
+          <w:bCs/>
+          <w:sz w:val="24"/>
+          <w:szCs w:val="24"/>
+        </w:rPr>
+        <w:t>/</w:t>
+      </w:r>
+      <w:r>
+        <w:rPr>
+          <w:rFonts w:asciiTheme="minorHAnsi" w:hAnsiTheme="minorHAnsi" w:cstheme="minorHAnsi"/>
+        </w:rPr>
+        <w:t>.</w:t>
+      </w:r>
+    </w:p>
+    <w:p>
+      <w:pPr>
+        <w:pStyle w:val="NormalWeb"/>
+        <w:numPr>
+          <w:ilvl w:val="1"/>
+          <w:numId w:val="35"/>
+        </w:numPr>
+        <w:rPr>
+          <w:rFonts w:asciiTheme="minorHAnsi" w:hAnsiTheme="minorHAnsi" w:cstheme="minorHAnsi"/>
+        </w:rPr>
+      </w:pPr>
+      <w:r>
+        <w:rPr>
+          <w:rFonts w:asciiTheme="minorHAnsi" w:hAnsiTheme="minorHAnsi" w:cstheme="minorHAnsi"/>
+        </w:rPr>
+        <w:t xml:space="preserve">Utilizar a anotação </w:t>
+      </w:r>
+      <w:r>
+        <w:rPr>
+          <w:rStyle w:val="CdigoHTML"/>
+          <w:rFonts w:asciiTheme="minorHAnsi" w:eastAsiaTheme="majorEastAsia" w:hAnsiTheme="minorHAnsi" w:cstheme="minorHAnsi"/>
+          <w:b/>
+          <w:bCs/>
+          <w:sz w:val="24"/>
+          <w:szCs w:val="24"/>
+        </w:rPr>
+        <w:t>@</w:t>
+      </w:r>
+      <w:proofErr w:type="gramStart"/>
+      <w:r>
+        <w:rPr>
+          <w:rStyle w:val="CdigoHTML"/>
+          <w:rFonts w:asciiTheme="minorHAnsi" w:eastAsiaTheme="majorEastAsia" w:hAnsiTheme="minorHAnsi" w:cstheme="minorHAnsi"/>
+          <w:b/>
+          <w:bCs/>
+          <w:sz w:val="24"/>
+          <w:szCs w:val="24"/>
+        </w:rPr>
+        <w:t>ExtendWith(</w:t>
+      </w:r>
+      <w:proofErr w:type="gramEnd"/>
+      <w:r>
+        <w:rPr>
+          <w:rStyle w:val="CdigoHTML"/>
+          <w:rFonts w:asciiTheme="minorHAnsi" w:eastAsiaTheme="majorEastAsia" w:hAnsiTheme="minorHAnsi" w:cstheme="minorHAnsi"/>
+          <w:b/>
+          <w:bCs/>
+          <w:sz w:val="24"/>
+          <w:szCs w:val="24"/>
+        </w:rPr>
+        <w:t>MockitoExtension.class)</w:t>
+      </w:r>
+      <w:r>
+        <w:rPr>
+          <w:rFonts w:asciiTheme="minorHAnsi" w:hAnsiTheme="minorHAnsi" w:cstheme="minorHAnsi"/>
+        </w:rPr>
+        <w:t>.</w:t>
+      </w:r>
+    </w:p>
+    <w:p>
+      <w:pPr>
+        <w:pStyle w:val="NormalWeb"/>
+        <w:numPr>
+          <w:ilvl w:val="1"/>
+          <w:numId w:val="35"/>
+        </w:numPr>
+        <w:rPr>
+          <w:rFonts w:asciiTheme="minorHAnsi" w:hAnsiTheme="minorHAnsi" w:cstheme="minorHAnsi"/>
+        </w:rPr>
+      </w:pPr>
+      <w:r>
+        <w:rPr>
+          <w:rFonts w:asciiTheme="minorHAnsi" w:hAnsiTheme="minorHAnsi" w:cstheme="minorHAnsi"/>
+        </w:rPr>
+        <w:t xml:space="preserve">Anotar o </w:t>
+      </w:r>
+      <w:proofErr w:type="spellStart"/>
+      <w:r>
+        <w:rPr>
+          <w:rStyle w:val="CdigoHTML"/>
+          <w:rFonts w:asciiTheme="minorHAnsi" w:eastAsiaTheme="majorEastAsia" w:hAnsiTheme="minorHAnsi" w:cstheme="minorHAnsi"/>
+          <w:b/>
+          <w:bCs/>
+          <w:sz w:val="24"/>
+          <w:szCs w:val="24"/>
+        </w:rPr>
+        <w:t>ProdutoRepository</w:t>
+      </w:r>
+      <w:proofErr w:type="spellEnd"/>
+      <w:r>
+        <w:rPr>
+          <w:rFonts w:asciiTheme="minorHAnsi" w:hAnsiTheme="minorHAnsi" w:cstheme="minorHAnsi"/>
+        </w:rPr>
+        <w:t xml:space="preserve"> com </w:t>
+      </w:r>
+      <w:r>
+        <w:rPr>
+          <w:rStyle w:val="CdigoHTML"/>
+          <w:rFonts w:asciiTheme="minorHAnsi" w:eastAsiaTheme="majorEastAsia" w:hAnsiTheme="minorHAnsi" w:cstheme="minorHAnsi"/>
+          <w:b/>
+          <w:bCs/>
+          <w:sz w:val="24"/>
+          <w:szCs w:val="24"/>
+        </w:rPr>
+        <w:t>@Mock</w:t>
+      </w:r>
+      <w:r>
+        <w:rPr>
+          <w:rFonts w:asciiTheme="minorHAnsi" w:hAnsiTheme="minorHAnsi" w:cstheme="minorHAnsi"/>
+        </w:rPr>
+        <w:t xml:space="preserve"> e o </w:t>
+      </w:r>
+      <w:proofErr w:type="spellStart"/>
+      <w:r>
+        <w:rPr>
+          <w:rStyle w:val="CdigoHTML"/>
+          <w:rFonts w:asciiTheme="minorHAnsi" w:eastAsiaTheme="majorEastAsia" w:hAnsiTheme="minorHAnsi" w:cstheme="minorHAnsi"/>
+          <w:b/>
+          <w:bCs/>
+          <w:sz w:val="24"/>
+          <w:szCs w:val="24"/>
+        </w:rPr>
+        <w:t>ProdutoService</w:t>
+      </w:r>
+      <w:proofErr w:type="spellEnd"/>
+      <w:r>
+        <w:rPr>
+          <w:rFonts w:asciiTheme="minorHAnsi" w:hAnsiTheme="minorHAnsi" w:cstheme="minorHAnsi"/>
+        </w:rPr>
+        <w:t xml:space="preserve"> com </w:t>
+      </w:r>
+      <w:r>
+        <w:rPr>
+          <w:rStyle w:val="CdigoHTML"/>
+          <w:rFonts w:asciiTheme="minorHAnsi" w:eastAsiaTheme="majorEastAsia" w:hAnsiTheme="minorHAnsi" w:cstheme="minorHAnsi"/>
+          <w:b/>
+          <w:bCs/>
+          <w:sz w:val="24"/>
+          <w:szCs w:val="24"/>
+        </w:rPr>
+        <w:t>@InjectMocks</w:t>
+      </w:r>
+      <w:r>
+        <w:rPr>
+          <w:rFonts w:asciiTheme="minorHAnsi" w:hAnsiTheme="minorHAnsi" w:cstheme="minorHAnsi"/>
+          <w:b/>
+          <w:bCs/>
+        </w:rPr>
+        <w:t>.</w:t>
+      </w:r>
+    </w:p>
+    <w:p>
+      <w:pPr>
+        <w:pStyle w:val="NormalWeb"/>
+        <w:rPr>
+          <w:rFonts w:asciiTheme="minorHAnsi" w:hAnsiTheme="minorHAnsi" w:cstheme="minorHAnsi"/>
+        </w:rPr>
+      </w:pPr>
+      <w:r>
+        <w:rPr>
+          <w:rFonts w:asciiTheme="minorHAnsi" w:hAnsiTheme="minorHAnsi" w:cstheme="minorHAnsi"/>
+        </w:rPr>
+        <w:drawing>
+          <wp:inline distT="0" distB="0" distL="0" distR="0" wp14:anchorId="2FDF648C" wp14:editId="32BC8467">
+            <wp:extent cx="5832231" cy="1778552"/>
+            <wp:effectExtent l="0" t="0" r="0" b="0"/>
+            <wp:docPr id="52" name="Imagem 52"/>
+            <wp:cNvGraphicFramePr>
+              <a:graphicFrameLocks xmlns:a="http://schemas.openxmlformats.org/drawingml/2006/main" noChangeAspect="1"/>
+            </wp:cNvGraphicFramePr>
+            <a:graphic xmlns:a="http://schemas.openxmlformats.org/drawingml/2006/main">
+              <a:graphicData uri="http://schemas.openxmlformats.org/drawingml/2006/picture">
+                <pic:pic xmlns:pic="http://schemas.openxmlformats.org/drawingml/2006/picture">
+                  <pic:nvPicPr>
+                    <pic:cNvPr id="1" name=""/>
+                    <pic:cNvPicPr/>
+                  </pic:nvPicPr>
+                  <pic:blipFill>
+                    <a:blip r:embed="rId54"/>
+                    <a:stretch>
+                      <a:fillRect/>
+                    </a:stretch>
+                  </pic:blipFill>
+                  <pic:spPr>
+                    <a:xfrm>
+                      <a:off x="0" y="0"/>
+                      <a:ext cx="5871856" cy="1790636"/>
+                    </a:xfrm>
+                    <a:prstGeom prst="rect">
+                      <a:avLst/>
+                    </a:prstGeom>
+                  </pic:spPr>
+                </pic:pic>
+              </a:graphicData>
+            </a:graphic>
+          </wp:inline>
+        </w:drawing>
+      </w:r>
+    </w:p>
+    <w:p>
+      <w:pPr>
+        <w:pStyle w:val="NormalWeb"/>
+        <w:rPr>
+          <w:rFonts w:asciiTheme="minorHAnsi" w:hAnsiTheme="minorHAnsi" w:cstheme="minorHAnsi"/>
+        </w:rPr>
+      </w:pPr>
+      <w:r>
+        <w:rPr>
+          <w:rFonts w:asciiTheme="minorHAnsi" w:hAnsiTheme="minorHAnsi" w:cstheme="minorHAnsi"/>
+        </w:rPr>
+        <w:drawing>
+          <wp:inline distT="0" distB="0" distL="0" distR="0" wp14:anchorId="7639F24D" wp14:editId="2B59B25D">
+            <wp:extent cx="5961185" cy="826135"/>
+            <wp:effectExtent l="0" t="0" r="1905" b="0"/>
+            <wp:docPr id="53" name="Imagem 53"/>
+            <wp:cNvGraphicFramePr>
+              <a:graphicFrameLocks xmlns:a="http://schemas.openxmlformats.org/drawingml/2006/main" noChangeAspect="1"/>
+            </wp:cNvGraphicFramePr>
+            <a:graphic xmlns:a="http://schemas.openxmlformats.org/drawingml/2006/main">
+              <a:graphicData uri="http://schemas.openxmlformats.org/drawingml/2006/picture">
+                <pic:pic xmlns:pic="http://schemas.openxmlformats.org/drawingml/2006/picture">
+                  <pic:nvPicPr>
+                    <pic:cNvPr id="1" name=""/>
+                    <pic:cNvPicPr/>
+                  </pic:nvPicPr>
+                  <pic:blipFill>
+                    <a:blip r:embed="rId55"/>
+                    <a:stretch>
+                      <a:fillRect/>
+                    </a:stretch>
+                  </pic:blipFill>
+                  <pic:spPr>
+                    <a:xfrm>
+                      <a:off x="0" y="0"/>
+                      <a:ext cx="5963845" cy="826504"/>
+                    </a:xfrm>
+                    <a:prstGeom prst="rect">
+                      <a:avLst/>
+                    </a:prstGeom>
+                  </pic:spPr>
+                </pic:pic>
+              </a:graphicData>
+            </a:graphic>
+          </wp:inline>
+        </w:drawing>
+      </w:r>
+    </w:p>
+    <w:p>
+      <w:pPr>
+        <w:pStyle w:val="NormalWeb"/>
+        <w:numPr>
+          <w:ilvl w:val="0"/>
+          <w:numId w:val="35"/>
+        </w:numPr>
+        <w:rPr>
+          <w:rFonts w:asciiTheme="minorHAnsi" w:hAnsiTheme="minorHAnsi" w:cstheme="minorHAnsi"/>
+        </w:rPr>
+      </w:pPr>
+      <w:r>
+        <w:rPr>
+          <w:rFonts w:asciiTheme="minorHAnsi" w:hAnsiTheme="minorHAnsi" w:cstheme="minorHAnsi"/>
+          <w:b/>
+          <w:bCs/>
+        </w:rPr>
+        <w:t>Cenários Principais a Serem Testados:</w:t>
+      </w:r>
+    </w:p>
+    <w:p>
+      <w:pPr>
+        <w:pStyle w:val="NormalWeb"/>
+        <w:numPr>
+          <w:ilvl w:val="1"/>
+          <w:numId w:val="35"/>
+        </w:numPr>
+        <w:rPr>
+          <w:rFonts w:asciiTheme="minorHAnsi" w:hAnsiTheme="minorHAnsi" w:cstheme="minorHAnsi"/>
+        </w:rPr>
+      </w:pPr>
+      <w:proofErr w:type="spellStart"/>
+      <w:r>
+        <w:rPr>
+          <w:rStyle w:val="CdigoHTML"/>
+          <w:rFonts w:asciiTheme="minorHAnsi" w:eastAsiaTheme="majorEastAsia" w:hAnsiTheme="minorHAnsi" w:cstheme="minorHAnsi"/>
+          <w:b/>
+          <w:bCs/>
+          <w:sz w:val="24"/>
+          <w:szCs w:val="24"/>
+        </w:rPr>
+        <w:t>cadastrarProduto</w:t>
+      </w:r>
+      <w:proofErr w:type="spellEnd"/>
+      <w:r>
+        <w:rPr>
+          <w:rFonts w:asciiTheme="minorHAnsi" w:hAnsiTheme="minorHAnsi" w:cstheme="minorHAnsi"/>
+          <w:b/>
+          <w:bCs/>
+        </w:rPr>
+        <w:t>:</w:t>
+      </w:r>
+    </w:p>
+    <w:p>
+      <w:pPr>
+        <w:pStyle w:val="NormalWeb"/>
+        <w:numPr>
+          <w:ilvl w:val="2"/>
+          <w:numId w:val="35"/>
+        </w:numPr>
+        <w:rPr>
+          <w:rFonts w:asciiTheme="minorHAnsi" w:hAnsiTheme="minorHAnsi" w:cstheme="minorHAnsi"/>
+        </w:rPr>
+      </w:pPr>
+      <w:r>
+        <w:rPr>
+          <w:rFonts w:asciiTheme="minorHAnsi" w:hAnsiTheme="minorHAnsi" w:cstheme="minorHAnsi"/>
+          <w:i/>
+          <w:iCs/>
+        </w:rPr>
+        <w:t>Sucesso:</w:t>
+      </w:r>
+      <w:r>
+        <w:rPr>
+          <w:rFonts w:asciiTheme="minorHAnsi" w:hAnsiTheme="minorHAnsi" w:cstheme="minorHAnsi"/>
+        </w:rPr>
+        <w:t xml:space="preserve"> Deve cadastrar e retornar o </w:t>
+      </w:r>
+      <w:proofErr w:type="spellStart"/>
+      <w:r>
+        <w:rPr>
+          <w:rStyle w:val="CdigoHTML"/>
+          <w:rFonts w:asciiTheme="minorHAnsi" w:eastAsiaTheme="majorEastAsia" w:hAnsiTheme="minorHAnsi" w:cstheme="minorHAnsi"/>
+          <w:b/>
+          <w:bCs/>
+          <w:sz w:val="24"/>
+          <w:szCs w:val="24"/>
+        </w:rPr>
+        <w:t>ProdutoResponseDTO</w:t>
+      </w:r>
+      <w:proofErr w:type="spellEnd"/>
+      <w:r>
+        <w:rPr>
+          <w:rFonts w:asciiTheme="minorHAnsi" w:hAnsiTheme="minorHAnsi" w:cstheme="minorHAnsi"/>
+        </w:rPr>
+        <w:t xml:space="preserve"> quando o nome do produto não existir no banco.</w:t>
+      </w:r>
+    </w:p>
+    <w:p>
+      <w:pPr>
+        <w:pStyle w:val="NormalWeb"/>
+        <w:rPr>
+          <w:rFonts w:asciiTheme="minorHAnsi" w:hAnsiTheme="minorHAnsi" w:cstheme="minorHAnsi"/>
+        </w:rPr>
+      </w:pPr>
+      <w:r>
+        <w:rPr>
+          <w:rFonts w:asciiTheme="minorHAnsi" w:hAnsiTheme="minorHAnsi" w:cstheme="minorHAnsi"/>
+        </w:rPr>
+        <w:lastRenderedPageBreak/>
+        <w:drawing>
+          <wp:inline distT="0" distB="0" distL="0" distR="0" wp14:anchorId="0308749C" wp14:editId="644BF796">
+            <wp:extent cx="5867400" cy="2221230"/>
+            <wp:effectExtent l="0" t="0" r="0" b="7620"/>
+            <wp:docPr id="54" name="Imagem 54"/>
+            <wp:cNvGraphicFramePr>
+              <a:graphicFrameLocks xmlns:a="http://schemas.openxmlformats.org/drawingml/2006/main" noChangeAspect="1"/>
+            </wp:cNvGraphicFramePr>
+            <a:graphic xmlns:a="http://schemas.openxmlformats.org/drawingml/2006/main">
+              <a:graphicData uri="http://schemas.openxmlformats.org/drawingml/2006/picture">
+                <pic:pic xmlns:pic="http://schemas.openxmlformats.org/drawingml/2006/picture">
+                  <pic:nvPicPr>
+                    <pic:cNvPr id="1" name=""/>
+                    <pic:cNvPicPr/>
+                  </pic:nvPicPr>
+                  <pic:blipFill>
+                    <a:blip r:embed="rId56"/>
+                    <a:stretch>
+                      <a:fillRect/>
+                    </a:stretch>
+                  </pic:blipFill>
+                  <pic:spPr>
+                    <a:xfrm>
+                      <a:off x="0" y="0"/>
+                      <a:ext cx="5917982" cy="2240379"/>
+                    </a:xfrm>
+                    <a:prstGeom prst="rect">
+                      <a:avLst/>
+                    </a:prstGeom>
+                  </pic:spPr>
+                </pic:pic>
+              </a:graphicData>
+            </a:graphic>
+          </wp:inline>
+        </w:drawing>
+      </w:r>
+    </w:p>
+    <w:p>
+      <w:pPr>
+        <w:pStyle w:val="NormalWeb"/>
+        <w:numPr>
+          <w:ilvl w:val="2"/>
+          <w:numId w:val="35"/>
+        </w:numPr>
+        <w:rPr>
+          <w:rFonts w:asciiTheme="minorHAnsi" w:hAnsiTheme="minorHAnsi" w:cstheme="minorHAnsi"/>
+        </w:rPr>
+      </w:pPr>
+      <w:r>
+        <w:rPr>
+          <w:rFonts w:asciiTheme="minorHAnsi" w:hAnsiTheme="minorHAnsi" w:cstheme="minorHAnsi"/>
+          <w:i/>
+          <w:iCs/>
+        </w:rPr>
+        <w:t>Erro (Exceção):</w:t>
+      </w:r>
+      <w:r>
+        <w:rPr>
+          <w:rFonts w:asciiTheme="minorHAnsi" w:hAnsiTheme="minorHAnsi" w:cstheme="minorHAnsi"/>
+        </w:rPr>
+        <w:t xml:space="preserve"> Deve lançar </w:t>
+      </w:r>
+      <w:proofErr w:type="spellStart"/>
+      <w:r>
+        <w:rPr>
+          <w:rStyle w:val="CdigoHTML"/>
+          <w:rFonts w:asciiTheme="minorHAnsi" w:eastAsiaTheme="majorEastAsia" w:hAnsiTheme="minorHAnsi" w:cstheme="minorHAnsi"/>
+          <w:b/>
+          <w:bCs/>
+          <w:sz w:val="24"/>
+          <w:szCs w:val="24"/>
+        </w:rPr>
+        <w:t>IllegalArgumentException</w:t>
+      </w:r>
+      <w:proofErr w:type="spellEnd"/>
+      <w:r>
+        <w:rPr>
+          <w:rFonts w:asciiTheme="minorHAnsi" w:hAnsiTheme="minorHAnsi" w:cstheme="minorHAnsi"/>
+        </w:rPr>
+        <w:t xml:space="preserve"> quando o nome já existir (</w:t>
+      </w:r>
+      <w:proofErr w:type="spellStart"/>
+      <w:r>
+        <w:rPr>
+          <w:rStyle w:val="CdigoHTML"/>
+          <w:rFonts w:asciiTheme="minorHAnsi" w:eastAsiaTheme="majorEastAsia" w:hAnsiTheme="minorHAnsi" w:cstheme="minorHAnsi"/>
+          <w:b/>
+          <w:bCs/>
+          <w:sz w:val="24"/>
+          <w:szCs w:val="24"/>
+        </w:rPr>
+        <w:t>existsByNome</w:t>
+      </w:r>
+      <w:proofErr w:type="spellEnd"/>
+      <w:r>
+        <w:rPr>
+          <w:rFonts w:asciiTheme="minorHAnsi" w:hAnsiTheme="minorHAnsi" w:cstheme="minorHAnsi"/>
+        </w:rPr>
+        <w:t xml:space="preserve"> retornar </w:t>
+      </w:r>
+      <w:proofErr w:type="spellStart"/>
+      <w:r>
+        <w:rPr>
+          <w:rStyle w:val="CdigoHTML"/>
+          <w:rFonts w:asciiTheme="minorHAnsi" w:eastAsiaTheme="majorEastAsia" w:hAnsiTheme="minorHAnsi" w:cstheme="minorHAnsi"/>
+          <w:b/>
+          <w:bCs/>
+          <w:sz w:val="24"/>
+          <w:szCs w:val="24"/>
+        </w:rPr>
+        <w:t>true</w:t>
+      </w:r>
+      <w:proofErr w:type="spellEnd"/>
+      <w:r>
+        <w:rPr>
+          <w:rFonts w:asciiTheme="minorHAnsi" w:hAnsiTheme="minorHAnsi" w:cstheme="minorHAnsi"/>
+        </w:rPr>
+        <w:t>).</w:t>
+      </w:r>
+    </w:p>
+    <w:p>
+      <w:pPr>
+        <w:pStyle w:val="NormalWeb"/>
+        <w:rPr>
+          <w:rFonts w:asciiTheme="minorHAnsi" w:hAnsiTheme="minorHAnsi" w:cstheme="minorHAnsi"/>
+        </w:rPr>
+      </w:pPr>
+      <w:r>
+        <w:rPr>
+          <w:rFonts w:asciiTheme="minorHAnsi" w:hAnsiTheme="minorHAnsi" w:cstheme="minorHAnsi"/>
+        </w:rPr>
+        <w:drawing>
+          <wp:inline distT="0" distB="0" distL="0" distR="0" wp14:anchorId="67408919" wp14:editId="7819485D">
+            <wp:extent cx="5920154" cy="1814830"/>
+            <wp:effectExtent l="0" t="0" r="4445" b="0"/>
+            <wp:docPr id="55" name="Imagem 55"/>
+            <wp:cNvGraphicFramePr>
+              <a:graphicFrameLocks xmlns:a="http://schemas.openxmlformats.org/drawingml/2006/main" noChangeAspect="1"/>
+            </wp:cNvGraphicFramePr>
+            <a:graphic xmlns:a="http://schemas.openxmlformats.org/drawingml/2006/main">
+              <a:graphicData uri="http://schemas.openxmlformats.org/drawingml/2006/picture">
+                <pic:pic xmlns:pic="http://schemas.openxmlformats.org/drawingml/2006/picture">
+                  <pic:nvPicPr>
+                    <pic:cNvPr id="1" name=""/>
+                    <pic:cNvPicPr/>
+                  </pic:nvPicPr>
+                  <pic:blipFill>
+                    <a:blip r:embed="rId57"/>
+                    <a:stretch>
+                      <a:fillRect/>
+                    </a:stretch>
+                  </pic:blipFill>
+                  <pic:spPr>
+                    <a:xfrm>
+                      <a:off x="0" y="0"/>
+                      <a:ext cx="5922760" cy="1815629"/>
+                    </a:xfrm>
+                    <a:prstGeom prst="rect">
+                      <a:avLst/>
+                    </a:prstGeom>
+                  </pic:spPr>
+                </pic:pic>
+              </a:graphicData>
+            </a:graphic>
+          </wp:inline>
+        </w:drawing>
+      </w:r>
+    </w:p>
+    <w:p>
+      <w:pPr>
+        <w:pStyle w:val="NormalWeb"/>
+        <w:numPr>
+          <w:ilvl w:val="1"/>
+          <w:numId w:val="35"/>
+        </w:numPr>
+        <w:rPr>
+          <w:rFonts w:asciiTheme="minorHAnsi" w:hAnsiTheme="minorHAnsi" w:cstheme="minorHAnsi"/>
+        </w:rPr>
+      </w:pPr>
+      <w:proofErr w:type="spellStart"/>
+      <w:r>
+        <w:rPr>
+          <w:rStyle w:val="CdigoHTML"/>
+          <w:rFonts w:asciiTheme="minorHAnsi" w:eastAsiaTheme="majorEastAsia" w:hAnsiTheme="minorHAnsi" w:cstheme="minorHAnsi"/>
+          <w:b/>
+          <w:bCs/>
+          <w:sz w:val="24"/>
+          <w:szCs w:val="24"/>
+        </w:rPr>
+        <w:t>buscarPorId</w:t>
+      </w:r>
+      <w:proofErr w:type="spellEnd"/>
+      <w:r>
+        <w:rPr>
+          <w:rFonts w:asciiTheme="minorHAnsi" w:hAnsiTheme="minorHAnsi" w:cstheme="minorHAnsi"/>
+          <w:b/>
+          <w:bCs/>
+        </w:rPr>
+        <w:t>:</w:t>
+      </w:r>
+    </w:p>
+    <w:p>
+      <w:pPr>
+        <w:pStyle w:val="NormalWeb"/>
+        <w:numPr>
+          <w:ilvl w:val="2"/>
+          <w:numId w:val="35"/>
+        </w:numPr>
+        <w:rPr>
+          <w:rFonts w:asciiTheme="minorHAnsi" w:hAnsiTheme="minorHAnsi" w:cstheme="minorHAnsi"/>
+        </w:rPr>
+      </w:pPr>
+      <w:r>
+        <w:rPr>
+          <w:rFonts w:asciiTheme="minorHAnsi" w:hAnsiTheme="minorHAnsi" w:cstheme="minorHAnsi"/>
+          <w:i/>
+          <w:iCs/>
+        </w:rPr>
+        <w:t>Sucesso:</w:t>
+      </w:r>
+      <w:r>
+        <w:rPr>
+          <w:rFonts w:asciiTheme="minorHAnsi" w:hAnsiTheme="minorHAnsi" w:cstheme="minorHAnsi"/>
+        </w:rPr>
+        <w:t xml:space="preserve"> Deve retornar o </w:t>
+      </w:r>
+      <w:proofErr w:type="spellStart"/>
+      <w:r>
+        <w:rPr>
+          <w:rStyle w:val="CdigoHTML"/>
+          <w:rFonts w:asciiTheme="minorHAnsi" w:eastAsiaTheme="majorEastAsia" w:hAnsiTheme="minorHAnsi" w:cstheme="minorHAnsi"/>
+          <w:b/>
+          <w:bCs/>
+          <w:sz w:val="24"/>
+          <w:szCs w:val="24"/>
+        </w:rPr>
+        <w:t>ProdutoResponseDTO</w:t>
+      </w:r>
+      <w:proofErr w:type="spellEnd"/>
+      <w:r>
+        <w:rPr>
+          <w:rFonts w:asciiTheme="minorHAnsi" w:hAnsiTheme="minorHAnsi" w:cstheme="minorHAnsi"/>
+        </w:rPr>
+        <w:t xml:space="preserve"> quando o ID existir.</w:t>
+      </w:r>
+    </w:p>
+    <w:p>
+      <w:pPr>
+        <w:pStyle w:val="NormalWeb"/>
+        <w:rPr>
+          <w:rFonts w:asciiTheme="minorHAnsi" w:hAnsiTheme="minorHAnsi" w:cstheme="minorHAnsi"/>
+        </w:rPr>
+      </w:pPr>
+      <w:r>
+        <w:rPr>
+          <w:rFonts w:asciiTheme="minorHAnsi" w:hAnsiTheme="minorHAnsi" w:cstheme="minorHAnsi"/>
+        </w:rPr>
+        <w:drawing>
+          <wp:inline distT="0" distB="0" distL="0" distR="0" wp14:anchorId="42DB5005" wp14:editId="74E97A56">
+            <wp:extent cx="5972908" cy="1691563"/>
+            <wp:effectExtent l="0" t="0" r="0" b="4445"/>
+            <wp:docPr id="56" name="Imagem 56"/>
+            <wp:cNvGraphicFramePr>
+              <a:graphicFrameLocks xmlns:a="http://schemas.openxmlformats.org/drawingml/2006/main" noChangeAspect="1"/>
+            </wp:cNvGraphicFramePr>
+            <a:graphic xmlns:a="http://schemas.openxmlformats.org/drawingml/2006/main">
+              <a:graphicData uri="http://schemas.openxmlformats.org/drawingml/2006/picture">
+                <pic:pic xmlns:pic="http://schemas.openxmlformats.org/drawingml/2006/picture">
+                  <pic:nvPicPr>
+                    <pic:cNvPr id="1" name=""/>
+                    <pic:cNvPicPr/>
+                  </pic:nvPicPr>
+                  <pic:blipFill>
+                    <a:blip r:embed="rId58"/>
+                    <a:stretch>
+                      <a:fillRect/>
+                    </a:stretch>
+                  </pic:blipFill>
+                  <pic:spPr>
+                    <a:xfrm>
+                      <a:off x="0" y="0"/>
+                      <a:ext cx="6021959" cy="1705455"/>
+                    </a:xfrm>
+                    <a:prstGeom prst="rect">
+                      <a:avLst/>
+                    </a:prstGeom>
+                  </pic:spPr>
+                </pic:pic>
+              </a:graphicData>
+            </a:graphic>
+          </wp:inline>
+        </w:drawing>
+      </w:r>
+    </w:p>
+    <w:p>
+      <w:pPr>
+        <w:pStyle w:val="NormalWeb"/>
+        <w:numPr>
+          <w:ilvl w:val="2"/>
+          <w:numId w:val="35"/>
+        </w:numPr>
+        <w:rPr>
+          <w:rFonts w:asciiTheme="minorHAnsi" w:hAnsiTheme="minorHAnsi" w:cstheme="minorHAnsi"/>
+        </w:rPr>
+      </w:pPr>
+      <w:r>
+        <w:rPr>
+          <w:rFonts w:asciiTheme="minorHAnsi" w:hAnsiTheme="minorHAnsi" w:cstheme="minorHAnsi"/>
+          <w:i/>
+          <w:iCs/>
+        </w:rPr>
+        <w:t>Erro (Exceção):</w:t>
+      </w:r>
+      <w:r>
+        <w:rPr>
+          <w:rFonts w:asciiTheme="minorHAnsi" w:hAnsiTheme="minorHAnsi" w:cstheme="minorHAnsi"/>
+        </w:rPr>
+        <w:t xml:space="preserve"> Deve lançar </w:t>
+      </w:r>
+      <w:proofErr w:type="spellStart"/>
+      <w:r>
+        <w:rPr>
+          <w:rStyle w:val="CdigoHTML"/>
+          <w:rFonts w:asciiTheme="minorHAnsi" w:eastAsiaTheme="majorEastAsia" w:hAnsiTheme="minorHAnsi" w:cstheme="minorHAnsi"/>
+          <w:b/>
+          <w:bCs/>
+          <w:sz w:val="24"/>
+          <w:szCs w:val="24"/>
+        </w:rPr>
+        <w:t>ResourceNotFoundException</w:t>
+      </w:r>
+      <w:proofErr w:type="spellEnd"/>
+      <w:r>
+        <w:rPr>
+          <w:rFonts w:asciiTheme="minorHAnsi" w:hAnsiTheme="minorHAnsi" w:cstheme="minorHAnsi"/>
+        </w:rPr>
+        <w:t xml:space="preserve"> quando o ID não for encontrado no repositório.</w:t>
+      </w:r>
+    </w:p>
+    <w:p>
+      <w:pPr>
+        <w:pStyle w:val="NormalWeb"/>
+        <w:rPr>
+          <w:rFonts w:asciiTheme="minorHAnsi" w:hAnsiTheme="minorHAnsi" w:cstheme="minorHAnsi"/>
+        </w:rPr>
+      </w:pPr>
+      <w:r>
+        <w:rPr>
+          <w:rFonts w:asciiTheme="minorHAnsi" w:hAnsiTheme="minorHAnsi" w:cstheme="minorHAnsi"/>
+        </w:rPr>
+        <w:lastRenderedPageBreak/>
+        <w:drawing>
+          <wp:inline distT="0" distB="0" distL="0" distR="0" wp14:anchorId="471D9B3A" wp14:editId="4E8A6B45">
+            <wp:extent cx="5400040" cy="1409700"/>
+            <wp:effectExtent l="0" t="0" r="0" b="0"/>
+            <wp:docPr id="57" name="Imagem 57"/>
+            <wp:cNvGraphicFramePr>
+              <a:graphicFrameLocks xmlns:a="http://schemas.openxmlformats.org/drawingml/2006/main" noChangeAspect="1"/>
+            </wp:cNvGraphicFramePr>
+            <a:graphic xmlns:a="http://schemas.openxmlformats.org/drawingml/2006/main">
+              <a:graphicData uri="http://schemas.openxmlformats.org/drawingml/2006/picture">
+                <pic:pic xmlns:pic="http://schemas.openxmlformats.org/drawingml/2006/picture">
+                  <pic:nvPicPr>
+                    <pic:cNvPr id="1" name=""/>
+                    <pic:cNvPicPr/>
+                  </pic:nvPicPr>
+                  <pic:blipFill>
+                    <a:blip r:embed="rId59"/>
+                    <a:stretch>
+                      <a:fillRect/>
+                    </a:stretch>
+                  </pic:blipFill>
+                  <pic:spPr>
+                    <a:xfrm>
+                      <a:off x="0" y="0"/>
+                      <a:ext cx="5400040" cy="1409700"/>
+                    </a:xfrm>
+                    <a:prstGeom prst="rect">
+                      <a:avLst/>
+                    </a:prstGeom>
+                  </pic:spPr>
+                </pic:pic>
+              </a:graphicData>
+            </a:graphic>
+          </wp:inline>
+        </w:drawing>
+      </w:r>
+    </w:p>
+    <w:p>
+      <w:pPr>
+        <w:pStyle w:val="NormalWeb"/>
+        <w:numPr>
+          <w:ilvl w:val="1"/>
+          <w:numId w:val="35"/>
+        </w:numPr>
+        <w:rPr>
+          <w:rFonts w:asciiTheme="minorHAnsi" w:hAnsiTheme="minorHAnsi" w:cstheme="minorHAnsi"/>
+        </w:rPr>
+      </w:pPr>
+      <w:proofErr w:type="spellStart"/>
+      <w:r>
+        <w:rPr>
+          <w:rStyle w:val="CdigoHTML"/>
+          <w:rFonts w:asciiTheme="minorHAnsi" w:eastAsiaTheme="majorEastAsia" w:hAnsiTheme="minorHAnsi" w:cstheme="minorHAnsi"/>
+          <w:b/>
+          <w:bCs/>
+          <w:sz w:val="24"/>
+          <w:szCs w:val="24"/>
+        </w:rPr>
+        <w:t>atualizarProdutoPorId</w:t>
+      </w:r>
+      <w:proofErr w:type="spellEnd"/>
+      <w:r>
+        <w:rPr>
+          <w:rFonts w:asciiTheme="minorHAnsi" w:hAnsiTheme="minorHAnsi" w:cstheme="minorHAnsi"/>
+          <w:b/>
+          <w:bCs/>
+        </w:rPr>
+        <w:t>:</w:t>
+      </w:r>
+    </w:p>
+    <w:p>
+      <w:pPr>
+        <w:pStyle w:val="NormalWeb"/>
+        <w:numPr>
+          <w:ilvl w:val="2"/>
+          <w:numId w:val="35"/>
+        </w:numPr>
+        <w:rPr>
+          <w:rFonts w:asciiTheme="minorHAnsi" w:hAnsiTheme="minorHAnsi" w:cstheme="minorHAnsi"/>
+        </w:rPr>
+      </w:pPr>
+      <w:r>
+        <w:rPr>
+          <w:rFonts w:asciiTheme="minorHAnsi" w:hAnsiTheme="minorHAnsi" w:cstheme="minorHAnsi"/>
+          <w:i/>
+          <w:iCs/>
+        </w:rPr>
+        <w:t>Sucesso:</w:t>
+      </w:r>
+      <w:r>
+        <w:rPr>
+          <w:rFonts w:asciiTheme="minorHAnsi" w:hAnsiTheme="minorHAnsi" w:cstheme="minorHAnsi"/>
+        </w:rPr>
+        <w:t xml:space="preserve"> Deve atualizar e retornar o DTO atualizado.</w:t>
+      </w:r>
+    </w:p>
+    <w:p>
+      <w:pPr>
+        <w:pStyle w:val="NormalWeb"/>
+        <w:rPr>
+          <w:rFonts w:asciiTheme="minorHAnsi" w:hAnsiTheme="minorHAnsi" w:cstheme="minorHAnsi"/>
+        </w:rPr>
+      </w:pPr>
+      <w:r>
+        <w:rPr>
+          <w:rFonts w:asciiTheme="minorHAnsi" w:hAnsiTheme="minorHAnsi" w:cstheme="minorHAnsi"/>
+        </w:rPr>
+        <w:drawing>
+          <wp:inline distT="0" distB="0" distL="0" distR="0" wp14:anchorId="05303B16" wp14:editId="3B93F6F3">
+            <wp:extent cx="5597769" cy="2526016"/>
+            <wp:effectExtent l="0" t="0" r="3175" b="8255"/>
+            <wp:docPr id="58" name="Imagem 58"/>
+            <wp:cNvGraphicFramePr>
+              <a:graphicFrameLocks xmlns:a="http://schemas.openxmlformats.org/drawingml/2006/main" noChangeAspect="1"/>
+            </wp:cNvGraphicFramePr>
+            <a:graphic xmlns:a="http://schemas.openxmlformats.org/drawingml/2006/main">
+              <a:graphicData uri="http://schemas.openxmlformats.org/drawingml/2006/picture">
+                <pic:pic xmlns:pic="http://schemas.openxmlformats.org/drawingml/2006/picture">
+                  <pic:nvPicPr>
+                    <pic:cNvPr id="1" name=""/>
+                    <pic:cNvPicPr/>
+                  </pic:nvPicPr>
+                  <pic:blipFill>
+                    <a:blip r:embed="rId60"/>
+                    <a:stretch>
+                      <a:fillRect/>
+                    </a:stretch>
+                  </pic:blipFill>
+                  <pic:spPr>
+                    <a:xfrm>
+                      <a:off x="0" y="0"/>
+                      <a:ext cx="5639452" cy="2544826"/>
+                    </a:xfrm>
+                    <a:prstGeom prst="rect">
+                      <a:avLst/>
+                    </a:prstGeom>
+                  </pic:spPr>
+                </pic:pic>
+              </a:graphicData>
+            </a:graphic>
+          </wp:inline>
+        </w:drawing>
+      </w:r>
+    </w:p>
+    <w:p>
+      <w:pPr>
+        <w:pStyle w:val="NormalWeb"/>
+        <w:numPr>
+          <w:ilvl w:val="2"/>
+          <w:numId w:val="35"/>
+        </w:numPr>
+        <w:rPr>
+          <w:rFonts w:asciiTheme="minorHAnsi" w:hAnsiTheme="minorHAnsi" w:cstheme="minorHAnsi"/>
+        </w:rPr>
+      </w:pPr>
+      <w:r>
+        <w:rPr>
+          <w:rFonts w:asciiTheme="minorHAnsi" w:hAnsiTheme="minorHAnsi" w:cstheme="minorHAnsi"/>
+          <w:i/>
+          <w:iCs/>
+        </w:rPr>
+        <w:t>Erro (Exceção):</w:t>
+      </w:r>
+      <w:r>
+        <w:rPr>
+          <w:rFonts w:asciiTheme="minorHAnsi" w:hAnsiTheme="minorHAnsi" w:cstheme="minorHAnsi"/>
+        </w:rPr>
+        <w:t xml:space="preserve"> Deve lançar </w:t>
+      </w:r>
+      <w:proofErr w:type="spellStart"/>
+      <w:r>
+        <w:rPr>
+          <w:rStyle w:val="CdigoHTML"/>
+          <w:rFonts w:asciiTheme="minorHAnsi" w:eastAsiaTheme="majorEastAsia" w:hAnsiTheme="minorHAnsi" w:cstheme="minorHAnsi"/>
+          <w:b/>
+          <w:bCs/>
+          <w:sz w:val="24"/>
+          <w:szCs w:val="24"/>
+        </w:rPr>
+        <w:t>ResourceNotFoundException</w:t>
+      </w:r>
+      <w:proofErr w:type="spellEnd"/>
+      <w:r>
+        <w:rPr>
+          <w:rFonts w:asciiTheme="minorHAnsi" w:hAnsiTheme="minorHAnsi" w:cstheme="minorHAnsi"/>
+        </w:rPr>
+        <w:t xml:space="preserve"> caso o ID não exista.</w:t>
+      </w:r>
+    </w:p>
+    <w:p>
+      <w:pPr>
+        <w:pStyle w:val="NormalWeb"/>
+        <w:rPr>
+          <w:rFonts w:asciiTheme="minorHAnsi" w:hAnsiTheme="minorHAnsi" w:cstheme="minorHAnsi"/>
+        </w:rPr>
+      </w:pPr>
+      <w:r>
+        <w:rPr>
+          <w:rFonts w:asciiTheme="minorHAnsi" w:hAnsiTheme="minorHAnsi" w:cstheme="minorHAnsi"/>
+        </w:rPr>
+        <w:drawing>
+          <wp:inline distT="0" distB="0" distL="0" distR="0" wp14:anchorId="6734B479" wp14:editId="344F3A67">
+            <wp:extent cx="5400040" cy="1409700"/>
+            <wp:effectExtent l="0" t="0" r="0" b="0"/>
+            <wp:docPr id="59" name="Imagem 59"/>
+            <wp:cNvGraphicFramePr>
+              <a:graphicFrameLocks xmlns:a="http://schemas.openxmlformats.org/drawingml/2006/main" noChangeAspect="1"/>
+            </wp:cNvGraphicFramePr>
+            <a:graphic xmlns:a="http://schemas.openxmlformats.org/drawingml/2006/main">
+              <a:graphicData uri="http://schemas.openxmlformats.org/drawingml/2006/picture">
+                <pic:pic xmlns:pic="http://schemas.openxmlformats.org/drawingml/2006/picture">
+                  <pic:nvPicPr>
+                    <pic:cNvPr id="1" name=""/>
+                    <pic:cNvPicPr/>
+                  </pic:nvPicPr>
+                  <pic:blipFill>
+                    <a:blip r:embed="rId59"/>
+                    <a:stretch>
+                      <a:fillRect/>
+                    </a:stretch>
+                  </pic:blipFill>
+                  <pic:spPr>
+                    <a:xfrm>
+                      <a:off x="0" y="0"/>
+                      <a:ext cx="5400040" cy="1409700"/>
+                    </a:xfrm>
+                    <a:prstGeom prst="rect">
+                      <a:avLst/>
+                    </a:prstGeom>
+                  </pic:spPr>
+                </pic:pic>
+              </a:graphicData>
+            </a:graphic>
+          </wp:inline>
+        </w:drawing>
+      </w:r>
+    </w:p>
+    <w:p>
+      <w:pPr>
+        <w:pStyle w:val="NormalWeb"/>
+        <w:numPr>
+          <w:ilvl w:val="1"/>
+          <w:numId w:val="35"/>
+        </w:numPr>
+        <w:rPr>
+          <w:rFonts w:asciiTheme="minorHAnsi" w:hAnsiTheme="minorHAnsi" w:cstheme="minorHAnsi"/>
+        </w:rPr>
+      </w:pPr>
+      <w:proofErr w:type="spellStart"/>
+      <w:r>
+        <w:rPr>
+          <w:rStyle w:val="CdigoHTML"/>
+          <w:rFonts w:asciiTheme="minorHAnsi" w:eastAsiaTheme="majorEastAsia" w:hAnsiTheme="minorHAnsi" w:cstheme="minorHAnsi"/>
+          <w:b/>
+          <w:bCs/>
+          <w:sz w:val="24"/>
+          <w:szCs w:val="24"/>
+        </w:rPr>
+        <w:t>excluirProduto</w:t>
+      </w:r>
+      <w:proofErr w:type="spellEnd"/>
+      <w:r>
+        <w:rPr>
+          <w:rFonts w:asciiTheme="minorHAnsi" w:hAnsiTheme="minorHAnsi" w:cstheme="minorHAnsi"/>
+          <w:b/>
+          <w:bCs/>
+        </w:rPr>
+        <w:t>:</w:t>
+      </w:r>
+    </w:p>
+    <w:p>
+      <w:pPr>
+        <w:pStyle w:val="NormalWeb"/>
+        <w:numPr>
+          <w:ilvl w:val="2"/>
+          <w:numId w:val="35"/>
+        </w:numPr>
+        <w:rPr>
+          <w:rFonts w:asciiTheme="minorHAnsi" w:hAnsiTheme="minorHAnsi" w:cstheme="minorHAnsi"/>
+        </w:rPr>
+      </w:pPr>
+      <w:r>
+        <w:rPr>
+          <w:rFonts w:asciiTheme="minorHAnsi" w:hAnsiTheme="minorHAnsi" w:cstheme="minorHAnsi"/>
+          <w:i/>
+          <w:iCs/>
+        </w:rPr>
+        <w:t>Sucesso:</w:t>
+      </w:r>
+      <w:r>
+        <w:rPr>
+          <w:rFonts w:asciiTheme="minorHAnsi" w:hAnsiTheme="minorHAnsi" w:cstheme="minorHAnsi"/>
+        </w:rPr>
+        <w:t xml:space="preserve"> Deve invocar </w:t>
+      </w:r>
+      <w:proofErr w:type="gramStart"/>
+      <w:r>
+        <w:rPr>
+          <w:rStyle w:val="CdigoHTML"/>
+          <w:rFonts w:asciiTheme="minorHAnsi" w:eastAsiaTheme="majorEastAsia" w:hAnsiTheme="minorHAnsi" w:cstheme="minorHAnsi"/>
+          <w:b/>
+          <w:bCs/>
+          <w:sz w:val="24"/>
+          <w:szCs w:val="24"/>
+        </w:rPr>
+        <w:t>delete(</w:t>
+      </w:r>
+      <w:proofErr w:type="gramEnd"/>
+      <w:r>
+        <w:rPr>
+          <w:rStyle w:val="CdigoHTML"/>
+          <w:rFonts w:asciiTheme="minorHAnsi" w:eastAsiaTheme="majorEastAsia" w:hAnsiTheme="minorHAnsi" w:cstheme="minorHAnsi"/>
+          <w:b/>
+          <w:bCs/>
+          <w:sz w:val="24"/>
+          <w:szCs w:val="24"/>
+        </w:rPr>
+        <w:t>)</w:t>
+      </w:r>
+      <w:r>
+        <w:rPr>
+          <w:rFonts w:asciiTheme="minorHAnsi" w:hAnsiTheme="minorHAnsi" w:cstheme="minorHAnsi"/>
+        </w:rPr>
+        <w:t xml:space="preserve"> no repositório quando o ID for válido.</w:t>
+      </w:r>
+    </w:p>
+    <w:p>
+      <w:pPr>
+        <w:pStyle w:val="NormalWeb"/>
+        <w:rPr>
+          <w:rFonts w:asciiTheme="minorHAnsi" w:hAnsiTheme="minorHAnsi" w:cstheme="minorHAnsi"/>
+        </w:rPr>
+      </w:pPr>
+      <w:r>
+        <w:rPr>
+          <w:rFonts w:asciiTheme="minorHAnsi" w:hAnsiTheme="minorHAnsi" w:cstheme="minorHAnsi"/>
+        </w:rPr>
+        <w:lastRenderedPageBreak/>
+        <w:drawing>
+          <wp:inline distT="0" distB="0" distL="0" distR="0" wp14:anchorId="3FCAC95F" wp14:editId="1B8729D5">
+            <wp:extent cx="5615354" cy="1599473"/>
+            <wp:effectExtent l="0" t="0" r="4445" b="1270"/>
+            <wp:docPr id="61" name="Imagem 61"/>
+            <wp:cNvGraphicFramePr>
+              <a:graphicFrameLocks xmlns:a="http://schemas.openxmlformats.org/drawingml/2006/main" noChangeAspect="1"/>
+            </wp:cNvGraphicFramePr>
+            <a:graphic xmlns:a="http://schemas.openxmlformats.org/drawingml/2006/main">
+              <a:graphicData uri="http://schemas.openxmlformats.org/drawingml/2006/picture">
+                <pic:pic xmlns:pic="http://schemas.openxmlformats.org/drawingml/2006/picture">
+                  <pic:nvPicPr>
+                    <pic:cNvPr id="1" name=""/>
+                    <pic:cNvPicPr/>
+                  </pic:nvPicPr>
+                  <pic:blipFill>
+                    <a:blip r:embed="rId61"/>
+                    <a:stretch>
+                      <a:fillRect/>
+                    </a:stretch>
+                  </pic:blipFill>
+                  <pic:spPr>
+                    <a:xfrm>
+                      <a:off x="0" y="0"/>
+                      <a:ext cx="5649251" cy="1609128"/>
+                    </a:xfrm>
+                    <a:prstGeom prst="rect">
+                      <a:avLst/>
+                    </a:prstGeom>
+                  </pic:spPr>
+                </pic:pic>
+              </a:graphicData>
+            </a:graphic>
+          </wp:inline>
+        </w:drawing>
+      </w:r>
+    </w:p>
+    <w:p>
+      <w:pPr>
+        <w:pStyle w:val="NormalWeb"/>
+        <w:numPr>
+          <w:ilvl w:val="2"/>
+          <w:numId w:val="35"/>
+        </w:numPr>
+        <w:rPr>
+          <w:rFonts w:asciiTheme="minorHAnsi" w:hAnsiTheme="minorHAnsi" w:cstheme="minorHAnsi"/>
+        </w:rPr>
+      </w:pPr>
+      <w:r>
+        <w:rPr>
+          <w:rFonts w:asciiTheme="minorHAnsi" w:hAnsiTheme="minorHAnsi" w:cstheme="minorHAnsi"/>
+          <w:i/>
+          <w:iCs/>
+        </w:rPr>
+        <w:t>Erro (Exceção):</w:t>
+      </w:r>
+      <w:r>
+        <w:rPr>
+          <w:rFonts w:asciiTheme="minorHAnsi" w:hAnsiTheme="minorHAnsi" w:cstheme="minorHAnsi"/>
+        </w:rPr>
+        <w:t xml:space="preserve"> Deve lançar </w:t>
+      </w:r>
+      <w:proofErr w:type="spellStart"/>
+      <w:r>
+        <w:rPr>
+          <w:rStyle w:val="CdigoHTML"/>
+          <w:rFonts w:asciiTheme="minorHAnsi" w:eastAsiaTheme="majorEastAsia" w:hAnsiTheme="minorHAnsi" w:cstheme="minorHAnsi"/>
+          <w:b/>
+          <w:bCs/>
+          <w:sz w:val="24"/>
+          <w:szCs w:val="24"/>
+        </w:rPr>
+        <w:t>ResourceNotFoundException</w:t>
+      </w:r>
+      <w:proofErr w:type="spellEnd"/>
+      <w:r>
+        <w:rPr>
+          <w:rFonts w:asciiTheme="minorHAnsi" w:hAnsiTheme="minorHAnsi" w:cstheme="minorHAnsi"/>
+        </w:rPr>
+        <w:t xml:space="preserve"> caso o ID não exista.</w:t>
+      </w:r>
+    </w:p>
+    <w:p>
+      <w:pPr>
+        <w:pStyle w:val="NormalWeb"/>
+        <w:rPr>
+          <w:rFonts w:asciiTheme="minorHAnsi" w:hAnsiTheme="minorHAnsi" w:cstheme="minorHAnsi"/>
+        </w:rPr>
+      </w:pPr>
+      <w:r>
+        <w:rPr>
+          <w:rFonts w:asciiTheme="minorHAnsi" w:hAnsiTheme="minorHAnsi" w:cstheme="minorHAnsi"/>
+        </w:rPr>
+        <w:drawing>
+          <wp:inline distT="0" distB="0" distL="0" distR="0" wp14:anchorId="6159F6BA" wp14:editId="686618EB">
+            <wp:extent cx="5767754" cy="1409700"/>
+            <wp:effectExtent l="0" t="0" r="4445" b="0"/>
+            <wp:docPr id="60" name="Imagem 60"/>
+            <wp:cNvGraphicFramePr>
+              <a:graphicFrameLocks xmlns:a="http://schemas.openxmlformats.org/drawingml/2006/main" noChangeAspect="1"/>
+            </wp:cNvGraphicFramePr>
+            <a:graphic xmlns:a="http://schemas.openxmlformats.org/drawingml/2006/main">
+              <a:graphicData uri="http://schemas.openxmlformats.org/drawingml/2006/picture">
+                <pic:pic xmlns:pic="http://schemas.openxmlformats.org/drawingml/2006/picture">
+                  <pic:nvPicPr>
+                    <pic:cNvPr id="1" name=""/>
+                    <pic:cNvPicPr/>
+                  </pic:nvPicPr>
+                  <pic:blipFill>
+                    <a:blip r:embed="rId59"/>
+                    <a:stretch>
+                      <a:fillRect/>
+                    </a:stretch>
+                  </pic:blipFill>
+                  <pic:spPr>
+                    <a:xfrm>
+                      <a:off x="0" y="0"/>
+                      <a:ext cx="5772043" cy="1410748"/>
+                    </a:xfrm>
+                    <a:prstGeom prst="rect">
+                      <a:avLst/>
+                    </a:prstGeom>
+                  </pic:spPr>
+                </pic:pic>
+              </a:graphicData>
+            </a:graphic>
+          </wp:inline>
+        </w:drawing>
+      </w:r>
+    </w:p>
+    <w:p>
+      <w:pPr>
+        <w:pStyle w:val="Ttulo1"/>
+        <w:rPr>
+          <w:rFonts w:asciiTheme="minorHAnsi" w:hAnsiTheme="minorHAnsi" w:cstheme="minorHAnsi"/>
+          <w:sz w:val="24"/>
+          <w:szCs w:val="24"/>
+        </w:rPr>
+      </w:pPr>
+      <w:r>
+        <w:rPr>
+          <w:rFonts w:asciiTheme="minorHAnsi" w:hAnsiTheme="minorHAnsi" w:cstheme="minorHAnsi"/>
+          <w:sz w:val="24"/>
+          <w:szCs w:val="24"/>
+        </w:rPr>
+        <w:t xml:space="preserve">Diário de Bordo — Projeto </w:t>
+      </w:r>
+      <w:proofErr w:type="spellStart"/>
+      <w:r>
+        <w:rPr>
+          <w:rStyle w:val="CdigoHTML"/>
+          <w:rFonts w:asciiTheme="minorHAnsi" w:eastAsiaTheme="majorEastAsia" w:hAnsiTheme="minorHAnsi" w:cstheme="minorHAnsi"/>
+          <w:sz w:val="24"/>
+          <w:szCs w:val="24"/>
+        </w:rPr>
+        <w:t>ecommerce_product</w:t>
+      </w:r>
+      <w:proofErr w:type="spellEnd"/>
+    </w:p>
+    <w:p>
+      <w:pPr>
+        <w:pStyle w:val="NormalWeb"/>
+        <w:rPr>
+          <w:rFonts w:asciiTheme="minorHAnsi" w:hAnsiTheme="minorHAnsi" w:cstheme="minorHAnsi"/>
+        </w:rPr>
+      </w:pPr>
+      <w:r>
+        <w:rPr>
+          <w:rFonts w:asciiTheme="minorHAnsi" w:hAnsiTheme="minorHAnsi" w:cstheme="minorHAnsi"/>
+          <w:b/>
+          <w:bCs/>
+        </w:rPr>
+        <w:t>Data:</w:t>
+      </w:r>
+      <w:r>
+        <w:rPr>
+          <w:rFonts w:asciiTheme="minorHAnsi" w:hAnsiTheme="minorHAnsi" w:cstheme="minorHAnsi"/>
+        </w:rPr>
+        <w:t xml:space="preserve"> 29 de </w:t>
+      </w:r>
+      <w:proofErr w:type="gramStart"/>
+      <w:r>
+        <w:rPr>
+          <w:rFonts w:asciiTheme="minorHAnsi" w:hAnsiTheme="minorHAnsi" w:cstheme="minorHAnsi"/>
+        </w:rPr>
+        <w:t>Outubro</w:t>
+      </w:r>
+      <w:proofErr w:type="gramEnd"/>
+      <w:r>
+        <w:rPr>
+          <w:rFonts w:asciiTheme="minorHAnsi" w:hAnsiTheme="minorHAnsi" w:cstheme="minorHAnsi"/>
+        </w:rPr>
+        <w:t xml:space="preserve"> de 2026</w:t>
+      </w:r>
+    </w:p>
+    <w:p>
+      <w:pPr>
+        <w:pStyle w:val="NormalWeb"/>
+        <w:rPr>
+          <w:rFonts w:asciiTheme="minorHAnsi" w:hAnsiTheme="minorHAnsi" w:cstheme="minorHAnsi"/>
+        </w:rPr>
+      </w:pPr>
+      <w:r>
+        <w:rPr>
+          <w:rFonts w:asciiTheme="minorHAnsi" w:hAnsiTheme="minorHAnsi" w:cstheme="minorHAnsi"/>
+          <w:b/>
+          <w:bCs/>
+        </w:rPr>
+        <w:t>Foco do Dia:</w:t>
+      </w:r>
+      <w:r>
+        <w:rPr>
+          <w:rFonts w:asciiTheme="minorHAnsi" w:hAnsiTheme="minorHAnsi" w:cstheme="minorHAnsi"/>
+        </w:rPr>
+        <w:t xml:space="preserve"> Implementação de Testes Unitários na Camada de Serviço (</w:t>
+      </w:r>
+      <w:proofErr w:type="spellStart"/>
+      <w:r>
+        <w:rPr>
+          <w:rStyle w:val="CdigoHTML"/>
+          <w:rFonts w:asciiTheme="minorHAnsi" w:hAnsiTheme="minorHAnsi" w:cstheme="minorHAnsi"/>
+          <w:sz w:val="24"/>
+          <w:szCs w:val="24"/>
+        </w:rPr>
+        <w:t>ProdutoService</w:t>
+      </w:r>
+      <w:proofErr w:type="spellEnd"/>
+      <w:r>
+        <w:rPr>
+          <w:rFonts w:asciiTheme="minorHAnsi" w:hAnsiTheme="minorHAnsi" w:cstheme="minorHAnsi"/>
+        </w:rPr>
+        <w:t xml:space="preserve">) com </w:t>
+      </w:r>
+      <w:proofErr w:type="spellStart"/>
+      <w:r>
+        <w:rPr>
+          <w:rFonts w:asciiTheme="minorHAnsi" w:hAnsiTheme="minorHAnsi" w:cstheme="minorHAnsi"/>
+        </w:rPr>
+        <w:t>JUnit</w:t>
+      </w:r>
+      <w:proofErr w:type="spellEnd"/>
+      <w:r>
+        <w:rPr>
+          <w:rFonts w:asciiTheme="minorHAnsi" w:hAnsiTheme="minorHAnsi" w:cstheme="minorHAnsi"/>
+        </w:rPr>
+        <w:t xml:space="preserve"> 5 e </w:t>
+      </w:r>
+      <w:proofErr w:type="spellStart"/>
+      <w:r>
+        <w:rPr>
+          <w:rFonts w:asciiTheme="minorHAnsi" w:hAnsiTheme="minorHAnsi" w:cstheme="minorHAnsi"/>
+        </w:rPr>
+        <w:t>Mockito</w:t>
+      </w:r>
+      <w:proofErr w:type="spellEnd"/>
+      <w:r>
+        <w:rPr>
+          <w:rFonts w:asciiTheme="minorHAnsi" w:hAnsiTheme="minorHAnsi" w:cstheme="minorHAnsi"/>
+        </w:rPr>
+        <w:t xml:space="preserve"> (</w:t>
+      </w:r>
+      <w:r>
+        <w:rPr>
+          <w:rFonts w:asciiTheme="minorHAnsi" w:hAnsiTheme="minorHAnsi" w:cstheme="minorHAnsi"/>
+          <w:b/>
+          <w:bCs/>
+        </w:rPr>
+        <w:t>TASK-08</w:t>
+      </w:r>
+      <w:r>
+        <w:rPr>
+          <w:rFonts w:asciiTheme="minorHAnsi" w:hAnsiTheme="minorHAnsi" w:cstheme="minorHAnsi"/>
+        </w:rPr>
+        <w:t>).</w:t>
+      </w:r>
+    </w:p>
+    <w:p>
+      <w:pPr>
+        <w:pStyle w:val="NormalWeb"/>
+        <w:rPr>
+          <w:b/>
+          <w:bCs/>
+        </w:rPr>
+      </w:pPr>
+      <w:r>
+        <w:rPr>
+          <w:b/>
+          <w:bCs/>
+        </w:rPr>
+        <w:t>O que foi realizado (TASK-08):</w:t>
+      </w:r>
+    </w:p>
+    <w:p>
+      <w:pPr>
+        <w:pStyle w:val="NormalWeb"/>
+        <w:numPr>
+          <w:ilvl w:val="0"/>
+          <w:numId w:val="36"/>
+        </w:numPr>
+        <w:rPr>
+          <w:rFonts w:asciiTheme="minorHAnsi" w:hAnsiTheme="minorHAnsi" w:cstheme="minorHAnsi"/>
+          <w:b/>
+          <w:bCs/>
+        </w:rPr>
+      </w:pPr>
+      <w:proofErr w:type="spellStart"/>
+      <w:r>
+        <w:rPr>
+          <w:rFonts w:asciiTheme="minorHAnsi" w:hAnsiTheme="minorHAnsi" w:cstheme="minorHAnsi"/>
+          <w:b/>
+          <w:bCs/>
+        </w:rPr>
+        <w:t>Suite</w:t>
+      </w:r>
+      <w:proofErr w:type="spellEnd"/>
+      <w:r>
+        <w:rPr>
+          <w:rFonts w:asciiTheme="minorHAnsi" w:hAnsiTheme="minorHAnsi" w:cstheme="minorHAnsi"/>
+          <w:b/>
+          <w:bCs/>
+        </w:rPr>
+        <w:t xml:space="preserve"> de testes </w:t>
+      </w:r>
+      <w:proofErr w:type="spellStart"/>
+      <w:proofErr w:type="gramStart"/>
+      <w:r>
+        <w:rPr>
+          <w:rFonts w:asciiTheme="minorHAnsi" w:hAnsiTheme="minorHAnsi" w:cstheme="minorHAnsi"/>
+          <w:b/>
+          <w:bCs/>
+        </w:rPr>
+        <w:t>Unitarios</w:t>
+      </w:r>
+      <w:proofErr w:type="spellEnd"/>
+      <w:r>
+        <w:rPr>
+          <w:rFonts w:asciiTheme="minorHAnsi" w:hAnsiTheme="minorHAnsi" w:cstheme="minorHAnsi"/>
+          <w:b/>
+          <w:bCs/>
+        </w:rPr>
+        <w:t>(</w:t>
+      </w:r>
+      <w:proofErr w:type="spellStart"/>
+      <w:proofErr w:type="gramEnd"/>
+      <w:r>
+        <w:rPr>
+          <w:rFonts w:asciiTheme="minorHAnsi" w:hAnsiTheme="minorHAnsi" w:cstheme="minorHAnsi"/>
+          <w:b/>
+          <w:bCs/>
+        </w:rPr>
+        <w:t>ProdutoServiceTest</w:t>
+      </w:r>
+      <w:proofErr w:type="spellEnd"/>
+      <w:r>
+        <w:rPr>
+          <w:rFonts w:asciiTheme="minorHAnsi" w:hAnsiTheme="minorHAnsi" w:cstheme="minorHAnsi"/>
+          <w:b/>
+          <w:bCs/>
+        </w:rPr>
+        <w:t>):</w:t>
+      </w:r>
+      <w:r>
+        <w:rPr>
+          <w:rFonts w:asciiTheme="minorHAnsi" w:hAnsiTheme="minorHAnsi" w:cstheme="minorHAnsi"/>
+          <w:b/>
+          <w:bCs/>
+        </w:rPr>
+        <w:br/>
+      </w:r>
+      <w:r>
+        <w:rPr>
+          <w:rFonts w:asciiTheme="minorHAnsi" w:hAnsiTheme="minorHAnsi" w:cstheme="minorHAnsi"/>
+        </w:rPr>
+        <w:t xml:space="preserve">Configuração do ambiente de teste isolado utilizando </w:t>
+      </w:r>
+      <w:r>
+        <w:rPr>
+          <w:rFonts w:asciiTheme="minorHAnsi" w:hAnsiTheme="minorHAnsi" w:cstheme="minorHAnsi"/>
+          <w:b/>
+          <w:bCs/>
+        </w:rPr>
+        <w:t>@ExtendWith(MockitoExtension.class)</w:t>
+      </w:r>
+      <w:r>
+        <w:rPr>
+          <w:rFonts w:asciiTheme="minorHAnsi" w:hAnsiTheme="minorHAnsi" w:cstheme="minorHAnsi"/>
+          <w:b/>
+          <w:bCs/>
+        </w:rPr>
+        <w:br/>
+      </w:r>
+      <w:r>
+        <w:rPr>
+          <w:rFonts w:asciiTheme="minorHAnsi" w:hAnsiTheme="minorHAnsi" w:cstheme="minorHAnsi"/>
+        </w:rPr>
+        <w:t xml:space="preserve">Criação de </w:t>
+      </w:r>
+      <w:proofErr w:type="spellStart"/>
+      <w:r>
+        <w:rPr>
+          <w:rFonts w:asciiTheme="minorHAnsi" w:hAnsiTheme="minorHAnsi" w:cstheme="minorHAnsi"/>
+        </w:rPr>
+        <w:t>mocks</w:t>
+      </w:r>
+      <w:proofErr w:type="spellEnd"/>
+      <w:r>
+        <w:rPr>
+          <w:rFonts w:asciiTheme="minorHAnsi" w:hAnsiTheme="minorHAnsi" w:cstheme="minorHAnsi"/>
+        </w:rPr>
+        <w:t xml:space="preserve"> para o </w:t>
+      </w:r>
+      <w:proofErr w:type="spellStart"/>
+      <w:r>
+        <w:rPr>
+          <w:rFonts w:asciiTheme="minorHAnsi" w:hAnsiTheme="minorHAnsi" w:cstheme="minorHAnsi"/>
+          <w:b/>
+          <w:bCs/>
+        </w:rPr>
+        <w:t>ProdutoRepository</w:t>
+      </w:r>
+      <w:proofErr w:type="spellEnd"/>
+      <w:r>
+        <w:rPr>
+          <w:rFonts w:asciiTheme="minorHAnsi" w:hAnsiTheme="minorHAnsi" w:cstheme="minorHAnsi"/>
+        </w:rPr>
+        <w:t xml:space="preserve"> (</w:t>
+      </w:r>
+      <w:r>
+        <w:rPr>
+          <w:rFonts w:asciiTheme="minorHAnsi" w:hAnsiTheme="minorHAnsi" w:cstheme="minorHAnsi"/>
+          <w:b/>
+          <w:bCs/>
+        </w:rPr>
+        <w:t>@Mock</w:t>
+      </w:r>
+      <w:r>
+        <w:rPr>
+          <w:rFonts w:asciiTheme="minorHAnsi" w:hAnsiTheme="minorHAnsi" w:cstheme="minorHAnsi"/>
+        </w:rPr>
+        <w:t>)</w:t>
+      </w:r>
+      <w:r>
+        <w:rPr>
+          <w:rFonts w:asciiTheme="minorHAnsi" w:hAnsiTheme="minorHAnsi" w:cstheme="minorHAnsi"/>
+          <w:b/>
+          <w:bCs/>
+        </w:rPr>
+        <w:t xml:space="preserve"> </w:t>
+      </w:r>
+      <w:r>
+        <w:rPr>
+          <w:rFonts w:asciiTheme="minorHAnsi" w:hAnsiTheme="minorHAnsi" w:cstheme="minorHAnsi"/>
+        </w:rPr>
+        <w:t xml:space="preserve">e injeção no </w:t>
+      </w:r>
+      <w:proofErr w:type="spellStart"/>
+      <w:r>
+        <w:rPr>
+          <w:rFonts w:asciiTheme="minorHAnsi" w:hAnsiTheme="minorHAnsi" w:cstheme="minorHAnsi"/>
+          <w:b/>
+          <w:bCs/>
+        </w:rPr>
+        <w:t>ProdutoService</w:t>
+      </w:r>
+      <w:proofErr w:type="spellEnd"/>
+      <w:r>
+        <w:rPr>
+          <w:rFonts w:asciiTheme="minorHAnsi" w:hAnsiTheme="minorHAnsi" w:cstheme="minorHAnsi"/>
+          <w:b/>
+          <w:bCs/>
+        </w:rPr>
+        <w:t xml:space="preserve"> (@InjectMocks)</w:t>
+      </w:r>
+      <w:r>
+        <w:rPr>
+          <w:rFonts w:asciiTheme="minorHAnsi" w:hAnsiTheme="minorHAnsi" w:cstheme="minorHAnsi"/>
+          <w:b/>
+          <w:bCs/>
+        </w:rPr>
+        <w:br/>
+      </w:r>
+      <w:r>
+        <w:rPr>
+          <w:rFonts w:asciiTheme="minorHAnsi" w:hAnsiTheme="minorHAnsi" w:cstheme="minorHAnsi"/>
+        </w:rPr>
+        <w:t xml:space="preserve">Configuração de massa de dados reutilizável com o </w:t>
+      </w:r>
+      <w:r>
+        <w:rPr>
+          <w:rFonts w:asciiTheme="minorHAnsi" w:hAnsiTheme="minorHAnsi" w:cstheme="minorHAnsi"/>
+          <w:b/>
+          <w:bCs/>
+        </w:rPr>
+        <w:t>@BeforeEach.</w:t>
+      </w:r>
+    </w:p>
+    <w:p>
+      <w:pPr>
+        <w:pStyle w:val="NormalWeb"/>
+        <w:numPr>
+          <w:ilvl w:val="0"/>
+          <w:numId w:val="36"/>
+        </w:numPr>
+        <w:rPr>
+          <w:rFonts w:asciiTheme="minorHAnsi" w:hAnsiTheme="minorHAnsi" w:cstheme="minorHAnsi"/>
+          <w:b/>
+          <w:bCs/>
+        </w:rPr>
+      </w:pPr>
+      <w:r>
+        <w:rPr>
+          <w:rFonts w:asciiTheme="minorHAnsi" w:hAnsiTheme="minorHAnsi" w:cstheme="minorHAnsi"/>
+          <w:b/>
+          <w:bCs/>
+        </w:rPr>
+        <w:t>Cenários Testados e Validados:</w:t>
+      </w:r>
+      <w:r>
+        <w:rPr>
+          <w:rFonts w:asciiTheme="minorHAnsi" w:hAnsiTheme="minorHAnsi" w:cstheme="minorHAnsi"/>
+          <w:b/>
+          <w:bCs/>
+        </w:rPr>
+        <w:br/>
+        <w:t xml:space="preserve">Cadastro: </w:t>
+      </w:r>
+      <w:r>
+        <w:rPr>
+          <w:rFonts w:asciiTheme="minorHAnsi" w:hAnsiTheme="minorHAnsi" w:cstheme="minorHAnsi"/>
+        </w:rPr>
+        <w:t>Validação de sucesso para nome inédito e garantia de exceção (</w:t>
+      </w:r>
+      <w:proofErr w:type="spellStart"/>
+      <w:r>
+        <w:rPr>
+          <w:rFonts w:asciiTheme="minorHAnsi" w:hAnsiTheme="minorHAnsi" w:cstheme="minorHAnsi"/>
+          <w:b/>
+          <w:bCs/>
+        </w:rPr>
+        <w:t>IllegalArgumentException</w:t>
+      </w:r>
+      <w:proofErr w:type="spellEnd"/>
+      <w:r>
+        <w:rPr>
+          <w:rFonts w:asciiTheme="minorHAnsi" w:hAnsiTheme="minorHAnsi" w:cstheme="minorHAnsi"/>
+        </w:rPr>
+        <w:t>) para nomes duplicados (</w:t>
+      </w:r>
+      <w:proofErr w:type="spellStart"/>
+      <w:r>
+        <w:rPr>
+          <w:rFonts w:asciiTheme="minorHAnsi" w:hAnsiTheme="minorHAnsi" w:cstheme="minorHAnsi"/>
+          <w:b/>
+          <w:bCs/>
+        </w:rPr>
+        <w:t>existsByNome</w:t>
+      </w:r>
+      <w:proofErr w:type="spellEnd"/>
+      <w:r>
+        <w:rPr>
+          <w:rFonts w:asciiTheme="minorHAnsi" w:hAnsiTheme="minorHAnsi" w:cstheme="minorHAnsi"/>
+        </w:rPr>
+        <w:t>)</w:t>
+      </w:r>
+      <w:r>
+        <w:rPr>
+          <w:rFonts w:asciiTheme="minorHAnsi" w:hAnsiTheme="minorHAnsi" w:cstheme="minorHAnsi"/>
+        </w:rPr>
+        <w:br/>
+      </w:r>
+      <w:r>
+        <w:rPr>
+          <w:rFonts w:asciiTheme="minorHAnsi" w:hAnsiTheme="minorHAnsi" w:cstheme="minorHAnsi"/>
+          <w:b/>
+          <w:bCs/>
+        </w:rPr>
+        <w:t xml:space="preserve">Buscar Por ID: </w:t>
+      </w:r>
+      <w:r>
+        <w:rPr>
+          <w:rFonts w:asciiTheme="minorHAnsi" w:hAnsiTheme="minorHAnsi" w:cstheme="minorHAnsi"/>
+        </w:rPr>
+        <w:t>Validação de retorno bem-sucedido e tratamento de exceção (</w:t>
+      </w:r>
+      <w:proofErr w:type="spellStart"/>
+      <w:r>
+        <w:rPr>
+          <w:rFonts w:asciiTheme="minorHAnsi" w:hAnsiTheme="minorHAnsi" w:cstheme="minorHAnsi"/>
+          <w:b/>
+          <w:bCs/>
+        </w:rPr>
+        <w:t>ResourceNotFoundException</w:t>
+      </w:r>
+      <w:proofErr w:type="spellEnd"/>
+      <w:r>
+        <w:rPr>
+          <w:rFonts w:asciiTheme="minorHAnsi" w:hAnsiTheme="minorHAnsi" w:cstheme="minorHAnsi"/>
+        </w:rPr>
+        <w:t xml:space="preserve">) para </w:t>
+      </w:r>
+      <w:proofErr w:type="spellStart"/>
+      <w:r>
+        <w:rPr>
+          <w:rFonts w:asciiTheme="minorHAnsi" w:hAnsiTheme="minorHAnsi" w:cstheme="minorHAnsi"/>
+        </w:rPr>
+        <w:t>IDs</w:t>
+      </w:r>
+      <w:proofErr w:type="spellEnd"/>
+      <w:r>
+        <w:rPr>
+          <w:rFonts w:asciiTheme="minorHAnsi" w:hAnsiTheme="minorHAnsi" w:cstheme="minorHAnsi"/>
+        </w:rPr>
+        <w:t xml:space="preserve"> inexistentes (</w:t>
+      </w:r>
+      <w:proofErr w:type="spellStart"/>
+      <w:r>
+        <w:rPr>
+          <w:rFonts w:asciiTheme="minorHAnsi" w:hAnsiTheme="minorHAnsi" w:cstheme="minorHAnsi"/>
+          <w:b/>
+          <w:bCs/>
+        </w:rPr>
+        <w:t>Optional.empty</w:t>
+      </w:r>
+      <w:proofErr w:type="spellEnd"/>
+      <w:r>
+        <w:rPr>
+          <w:rFonts w:asciiTheme="minorHAnsi" w:hAnsiTheme="minorHAnsi" w:cstheme="minorHAnsi"/>
+          <w:b/>
+          <w:bCs/>
+        </w:rPr>
+        <w:t>()</w:t>
+      </w:r>
+      <w:r>
+        <w:rPr>
+          <w:rFonts w:asciiTheme="minorHAnsi" w:hAnsiTheme="minorHAnsi" w:cstheme="minorHAnsi"/>
+        </w:rPr>
+        <w:t>).</w:t>
+      </w:r>
+      <w:r>
+        <w:rPr>
+          <w:rFonts w:asciiTheme="minorHAnsi" w:hAnsiTheme="minorHAnsi" w:cstheme="minorHAnsi"/>
+        </w:rPr>
+        <w:br/>
+      </w:r>
+      <w:r>
+        <w:rPr>
+          <w:rFonts w:asciiTheme="minorHAnsi" w:hAnsiTheme="minorHAnsi" w:cstheme="minorHAnsi"/>
+          <w:b/>
+          <w:bCs/>
+        </w:rPr>
+        <w:t xml:space="preserve">Atualização: </w:t>
+      </w:r>
+      <w:r>
+        <w:rPr>
+          <w:rFonts w:asciiTheme="minorHAnsi" w:hAnsiTheme="minorHAnsi" w:cstheme="minorHAnsi"/>
+        </w:rPr>
+        <w:t xml:space="preserve">Testes de alteração bem-sucedida de registros via ID utilizando </w:t>
+      </w:r>
+      <w:proofErr w:type="spellStart"/>
+      <w:r>
+        <w:rPr>
+          <w:rFonts w:asciiTheme="minorHAnsi" w:hAnsiTheme="minorHAnsi" w:cstheme="minorHAnsi"/>
+          <w:b/>
+          <w:bCs/>
+        </w:rPr>
+        <w:t>thenAnswer</w:t>
+      </w:r>
+      <w:proofErr w:type="spellEnd"/>
+      <w:r>
+        <w:rPr>
+          <w:rFonts w:asciiTheme="minorHAnsi" w:hAnsiTheme="minorHAnsi" w:cstheme="minorHAnsi"/>
+        </w:rPr>
+        <w:t xml:space="preserve"> para simular o comportamento do repositório.</w:t>
+      </w:r>
+      <w:r>
+        <w:rPr>
+          <w:rFonts w:asciiTheme="minorHAnsi" w:hAnsiTheme="minorHAnsi" w:cstheme="minorHAnsi"/>
+          <w:b/>
+          <w:bCs/>
+        </w:rPr>
+        <w:br/>
+        <w:t xml:space="preserve">Exclusão: </w:t>
+      </w:r>
+      <w:r>
+        <w:rPr>
+          <w:rFonts w:asciiTheme="minorHAnsi" w:hAnsiTheme="minorHAnsi" w:cstheme="minorHAnsi"/>
+        </w:rPr>
+        <w:t>Validação do fluxo de deleção de produtos com sucesso.</w:t>
+      </w:r>
+    </w:p>
+    <w:p>
+      <w:pPr>
+        <w:pStyle w:val="NormalWeb"/>
+        <w:rPr>
+          <w:rFonts w:asciiTheme="minorHAnsi" w:hAnsiTheme="minorHAnsi" w:cstheme="minorHAnsi"/>
+        </w:rPr>
+      </w:pPr>
+    </w:p>
+    <w:p>
+      <w:pPr>
+        <w:pStyle w:val="NormalWeb"/>
+      </w:pPr>
+    </w:p>
+    <w:p>
+      <w:pPr>
+        <w:pStyle w:val="NormalWeb"/>
+        <w:rPr>
+          <w:rFonts w:asciiTheme="minorHAnsi" w:hAnsiTheme="minorHAnsi" w:cstheme="minorHAnsi"/>
+        </w:rPr>
+      </w:pPr>
+    </w:p>
+    <w:p>
+      <w:pPr>
+        <w:pStyle w:val="NormalWeb"/>
+        <w:rPr>
+          <w:rFonts w:asciiTheme="minorHAnsi" w:hAnsiTheme="minorHAnsi" w:cstheme="minorHAnsi"/>
+        </w:rPr>
+      </w:pPr>
+    </w:p>
+    <w:p>
+      <w:pPr>
+        <w:pStyle w:val="NormalWeb"/>
+        <w:rPr>
+          <w:rFonts w:asciiTheme="minorHAnsi" w:hAnsiTheme="minorHAnsi" w:cstheme="minorHAnsi"/>
+        </w:rPr>
+      </w:pPr>
+    </w:p>
+    <w:p>
+      <w:pPr>
+        <w:pStyle w:val="NormalWeb"/>
+        <w:rPr>
+          <w:rFonts w:asciiTheme="minorHAnsi" w:hAnsiTheme="minorHAnsi" w:cstheme="minorHAnsi"/>
+        </w:rPr>
+      </w:pPr>
+    </w:p>
     <w:p/>
     <w:p>
       <w:pPr>
@@ -15047,7 +17250,7 @@
   <w:abstractNum w:abstractNumId="13" w15:restartNumberingAfterBreak="0">
     <w:nsid w:val="40B80731"/>
     <w:multiLevelType w:val="hybridMultilevel"/>
-    <w:tmpl w:val="380231DE"/>
+    <w:tmpl w:val="CAC20F0C"/>
     <w:lvl w:ilvl="0" w:tplc="0416000F">
       <w:start w:val="1"/>
       <w:numFmt w:val="decimal"/>
@@ -15429,6 +17632,119 @@
     </w:lvl>
   </w:abstractNum>
   <w:abstractNum w:abstractNumId="16" w15:restartNumberingAfterBreak="0">
+    <w:nsid w:val="4CD726A2"/>
+    <w:multiLevelType w:val="hybridMultilevel"/>
+    <w:tmpl w:val="9BF812D8"/>
+    <w:lvl w:ilvl="0" w:tplc="04160001">
+      <w:start w:val="1"/>
+      <w:numFmt w:val="bullet"/>
+      <w:lvlText w:val=""/>
+      <w:lvlJc w:val="left"/>
+      <w:pPr>
+        <w:ind w:left="720" w:hanging="360"/>
+      </w:pPr>
+      <w:rPr>
+        <w:rFonts w:ascii="Symbol" w:hAnsi="Symbol" w:hint="default"/>
+      </w:rPr>
+    </w:lvl>
+    <w:lvl w:ilvl="1" w:tplc="04160003" w:tentative="1">
+      <w:start w:val="1"/>
+      <w:numFmt w:val="bullet"/>
+      <w:lvlText w:val="o"/>
+      <w:lvlJc w:val="left"/>
+      <w:pPr>
+        <w:ind w:left="1440" w:hanging="360"/>
+      </w:pPr>
+      <w:rPr>
+        <w:rFonts w:ascii="Courier New" w:hAnsi="Courier New" w:cs="Courier New" w:hint="default"/>
+      </w:rPr>
+    </w:lvl>
+    <w:lvl w:ilvl="2" w:tplc="04160005" w:tentative="1">
+      <w:start w:val="1"/>
+      <w:numFmt w:val="bullet"/>
+      <w:lvlText w:val=""/>
+      <w:lvlJc w:val="left"/>
+      <w:pPr>
+        <w:ind w:left="2160" w:hanging="360"/>
+      </w:pPr>
+      <w:rPr>
+        <w:rFonts w:ascii="Wingdings" w:hAnsi="Wingdings" w:hint="default"/>
+      </w:rPr>
+    </w:lvl>
+    <w:lvl w:ilvl="3" w:tplc="04160001" w:tentative="1">
+      <w:start w:val="1"/>
+      <w:numFmt w:val="bullet"/>
+      <w:lvlText w:val=""/>
+      <w:lvlJc w:val="left"/>
+      <w:pPr>
+        <w:ind w:left="2880" w:hanging="360"/>
+      </w:pPr>
+      <w:rPr>
+        <w:rFonts w:ascii="Symbol" w:hAnsi="Symbol" w:hint="default"/>
+      </w:rPr>
+    </w:lvl>
+    <w:lvl w:ilvl="4" w:tplc="04160003" w:tentative="1">
+      <w:start w:val="1"/>
+      <w:numFmt w:val="bullet"/>
+      <w:lvlText w:val="o"/>
+      <w:lvlJc w:val="left"/>
+      <w:pPr>
+        <w:ind w:left="3600" w:hanging="360"/>
+      </w:pPr>
+      <w:rPr>
+        <w:rFonts w:ascii="Courier New" w:hAnsi="Courier New" w:cs="Courier New" w:hint="default"/>
+      </w:rPr>
+    </w:lvl>
+    <w:lvl w:ilvl="5" w:tplc="04160005" w:tentative="1">
+      <w:start w:val="1"/>
+      <w:numFmt w:val="bullet"/>
+      <w:lvlText w:val=""/>
+      <w:lvlJc w:val="left"/>
+      <w:pPr>
+        <w:ind w:left="4320" w:hanging="360"/>
+      </w:pPr>
+      <w:rPr>
+        <w:rFonts w:ascii="Wingdings" w:hAnsi="Wingdings" w:hint="default"/>
+      </w:rPr>
+    </w:lvl>
+    <w:lvl w:ilvl="6" w:tplc="04160001" w:tentative="1">
+      <w:start w:val="1"/>
+      <w:numFmt w:val="bullet"/>
+      <w:lvlText w:val=""/>
+      <w:lvlJc w:val="left"/>
+      <w:pPr>
+        <w:ind w:left="5040" w:hanging="360"/>
+      </w:pPr>
+      <w:rPr>
+        <w:rFonts w:ascii="Symbol" w:hAnsi="Symbol" w:hint="default"/>
+      </w:rPr>
+    </w:lvl>
+    <w:lvl w:ilvl="7" w:tplc="04160003" w:tentative="1">
+      <w:start w:val="1"/>
+      <w:numFmt w:val="bullet"/>
+      <w:lvlText w:val="o"/>
+      <w:lvlJc w:val="left"/>
+      <w:pPr>
+        <w:ind w:left="5760" w:hanging="360"/>
+      </w:pPr>
+      <w:rPr>
+        <w:rFonts w:ascii="Courier New" w:hAnsi="Courier New" w:cs="Courier New" w:hint="default"/>
+      </w:rPr>
+    </w:lvl>
+    <w:lvl w:ilvl="8" w:tplc="04160005" w:tentative="1">
+      <w:start w:val="1"/>
+      <w:numFmt w:val="bullet"/>
+      <w:lvlText w:val=""/>
+      <w:lvlJc w:val="left"/>
+      <w:pPr>
+        <w:ind w:left="6480" w:hanging="360"/>
+      </w:pPr>
+      <w:rPr>
+        <w:rFonts w:ascii="Wingdings" w:hAnsi="Wingdings" w:hint="default"/>
+      </w:rPr>
+    </w:lvl>
+  </w:abstractNum>
+  <w:abstractNum w:abstractNumId="17" w15:restartNumberingAfterBreak="0">
     <w:nsid w:val="58E33ED0"/>
     <w:multiLevelType w:val="hybridMultilevel"/>
     <w:tmpl w:val="F270762E"/>
@@ -15541,7 +17857,7 @@
       </w:rPr>
     </w:lvl>
   </w:abstractNum>
-  <w:abstractNum w:abstractNumId="17" w15:restartNumberingAfterBreak="0">
+  <w:abstractNum w:abstractNumId="18" w15:restartNumberingAfterBreak="0">
     <w:nsid w:val="58EE5E10"/>
     <w:multiLevelType w:val="multilevel"/>
     <w:tmpl w:val="CD6E82FC"/>
@@ -15690,7 +18006,7 @@
       </w:rPr>
     </w:lvl>
   </w:abstractNum>
-  <w:abstractNum w:abstractNumId="18" w15:restartNumberingAfterBreak="0">
+  <w:abstractNum w:abstractNumId="19" w15:restartNumberingAfterBreak="0">
     <w:nsid w:val="59211560"/>
     <w:multiLevelType w:val="multilevel"/>
     <w:tmpl w:val="4D0C3446"/>
@@ -15839,7 +18155,7 @@
       </w:rPr>
     </w:lvl>
   </w:abstractNum>
-  <w:abstractNum w:abstractNumId="19" w15:restartNumberingAfterBreak="0">
+  <w:abstractNum w:abstractNumId="20" w15:restartNumberingAfterBreak="0">
     <w:nsid w:val="593B7802"/>
     <w:multiLevelType w:val="multilevel"/>
     <w:tmpl w:val="51FEE8A6"/>
@@ -15984,7 +18300,7 @@
       </w:rPr>
     </w:lvl>
   </w:abstractNum>
-  <w:abstractNum w:abstractNumId="20" w15:restartNumberingAfterBreak="0">
+  <w:abstractNum w:abstractNumId="21" w15:restartNumberingAfterBreak="0">
     <w:nsid w:val="5B0E7E21"/>
     <w:multiLevelType w:val="multilevel"/>
     <w:tmpl w:val="24D4249E"/>
@@ -16133,7 +18449,128 @@
       </w:rPr>
     </w:lvl>
   </w:abstractNum>
-  <w:abstractNum w:abstractNumId="21" w15:restartNumberingAfterBreak="0">
+  <w:abstractNum w:abstractNumId="22" w15:restartNumberingAfterBreak="0">
+    <w:nsid w:val="5D572AC4"/>
+    <w:multiLevelType w:val="multilevel"/>
+    <w:tmpl w:val="D9F427BE"/>
+    <w:lvl w:ilvl="0">
+      <w:start w:val="1"/>
+      <w:numFmt w:val="decimal"/>
+      <w:lvlText w:val="%1."/>
+      <w:lvlJc w:val="left"/>
+      <w:pPr>
+        <w:tabs>
+          <w:tab w:val="num" w:pos="720"/>
+        </w:tabs>
+        <w:ind w:left="720" w:hanging="360"/>
+      </w:pPr>
+    </w:lvl>
+    <w:lvl w:ilvl="1">
+      <w:start w:val="1"/>
+      <w:numFmt w:val="bullet"/>
+      <w:lvlText w:val="o"/>
+      <w:lvlJc w:val="left"/>
+      <w:pPr>
+        <w:tabs>
+          <w:tab w:val="num" w:pos="1440"/>
+        </w:tabs>
+        <w:ind w:left="1440" w:hanging="360"/>
+      </w:pPr>
+      <w:rPr>
+        <w:rFonts w:ascii="Courier New" w:hAnsi="Courier New" w:hint="default"/>
+        <w:sz w:val="20"/>
+      </w:rPr>
+    </w:lvl>
+    <w:lvl w:ilvl="2">
+      <w:start w:val="1"/>
+      <w:numFmt w:val="bullet"/>
+      <w:lvlText w:val=""/>
+      <w:lvlJc w:val="left"/>
+      <w:pPr>
+        <w:tabs>
+          <w:tab w:val="num" w:pos="2160"/>
+        </w:tabs>
+        <w:ind w:left="2160" w:hanging="360"/>
+      </w:pPr>
+      <w:rPr>
+        <w:rFonts w:ascii="Wingdings" w:hAnsi="Wingdings" w:hint="default"/>
+        <w:sz w:val="20"/>
+      </w:rPr>
+    </w:lvl>
+    <w:lvl w:ilvl="3" w:tentative="1">
+      <w:start w:val="1"/>
+      <w:numFmt w:val="decimal"/>
+      <w:lvlText w:val="%4."/>
+      <w:lvlJc w:val="left"/>
+      <w:pPr>
+        <w:tabs>
+          <w:tab w:val="num" w:pos="2880"/>
+        </w:tabs>
+        <w:ind w:left="2880" w:hanging="360"/>
+      </w:pPr>
+    </w:lvl>
+    <w:lvl w:ilvl="4" w:tentative="1">
+      <w:start w:val="1"/>
+      <w:numFmt w:val="decimal"/>
+      <w:lvlText w:val="%5."/>
+      <w:lvlJc w:val="left"/>
+      <w:pPr>
+        <w:tabs>
+          <w:tab w:val="num" w:pos="3600"/>
+        </w:tabs>
+        <w:ind w:left="3600" w:hanging="360"/>
+      </w:pPr>
+    </w:lvl>
+    <w:lvl w:ilvl="5" w:tentative="1">
+      <w:start w:val="1"/>
+      <w:numFmt w:val="decimal"/>
+      <w:lvlText w:val="%6."/>
+      <w:lvlJc w:val="left"/>
+      <w:pPr>
+        <w:tabs>
+          <w:tab w:val="num" w:pos="4320"/>
+        </w:tabs>
+        <w:ind w:left="4320" w:hanging="360"/>
+      </w:pPr>
+    </w:lvl>
+    <w:lvl w:ilvl="6" w:tentative="1">
+      <w:start w:val="1"/>
+      <w:numFmt w:val="decimal"/>
+      <w:lvlText w:val="%7."/>
+      <w:lvlJc w:val="left"/>
+      <w:pPr>
+        <w:tabs>
+          <w:tab w:val="num" w:pos="5040"/>
+        </w:tabs>
+        <w:ind w:left="5040" w:hanging="360"/>
+      </w:pPr>
+    </w:lvl>
+    <w:lvl w:ilvl="7" w:tentative="1">
+      <w:start w:val="1"/>
+      <w:numFmt w:val="decimal"/>
+      <w:lvlText w:val="%8."/>
+      <w:lvlJc w:val="left"/>
+      <w:pPr>
+        <w:tabs>
+          <w:tab w:val="num" w:pos="5760"/>
+        </w:tabs>
+        <w:ind w:left="5760" w:hanging="360"/>
+      </w:pPr>
+    </w:lvl>
+    <w:lvl w:ilvl="8" w:tentative="1">
+      <w:start w:val="1"/>
+      <w:numFmt w:val="decimal"/>
+      <w:lvlText w:val="%9."/>
+      <w:lvlJc w:val="left"/>
+      <w:pPr>
+        <w:tabs>
+          <w:tab w:val="num" w:pos="6480"/>
+        </w:tabs>
+        <w:ind w:left="6480" w:hanging="360"/>
+      </w:pPr>
+    </w:lvl>
+  </w:abstractNum>
+  <w:abstractNum w:abstractNumId="23" w15:restartNumberingAfterBreak="0">
     <w:nsid w:val="5D80315B"/>
     <w:multiLevelType w:val="multilevel"/>
     <w:tmpl w:val="3530E922"/>
@@ -16282,7 +18719,7 @@
       </w:rPr>
     </w:lvl>
   </w:abstractNum>
-  <w:abstractNum w:abstractNumId="22" w15:restartNumberingAfterBreak="0">
+  <w:abstractNum w:abstractNumId="24" w15:restartNumberingAfterBreak="0">
     <w:nsid w:val="63080127"/>
     <w:multiLevelType w:val="multilevel"/>
     <w:tmpl w:val="E46A3900"/>
@@ -16431,7 +18868,7 @@
       </w:rPr>
     </w:lvl>
   </w:abstractNum>
-  <w:abstractNum w:abstractNumId="23" w15:restartNumberingAfterBreak="0">
+  <w:abstractNum w:abstractNumId="25" w15:restartNumberingAfterBreak="0">
     <w:nsid w:val="644B4CE7"/>
     <w:multiLevelType w:val="multilevel"/>
     <w:tmpl w:val="F8625AEE"/>
@@ -16580,7 +19017,7 @@
       </w:rPr>
     </w:lvl>
   </w:abstractNum>
-  <w:abstractNum w:abstractNumId="24" w15:restartNumberingAfterBreak="0">
+  <w:abstractNum w:abstractNumId="26" w15:restartNumberingAfterBreak="0">
     <w:nsid w:val="687513C2"/>
     <w:multiLevelType w:val="multilevel"/>
     <w:tmpl w:val="410E12DC"/>
@@ -16729,7 +19166,7 @@
       </w:rPr>
     </w:lvl>
   </w:abstractNum>
-  <w:abstractNum w:abstractNumId="25" w15:restartNumberingAfterBreak="0">
+  <w:abstractNum w:abstractNumId="27" w15:restartNumberingAfterBreak="0">
     <w:nsid w:val="6AFE50EE"/>
     <w:multiLevelType w:val="multilevel"/>
     <w:tmpl w:val="E826B948"/>
@@ -16878,7 +19315,7 @@
       </w:rPr>
     </w:lvl>
   </w:abstractNum>
-  <w:abstractNum w:abstractNumId="26" w15:restartNumberingAfterBreak="0">
+  <w:abstractNum w:abstractNumId="28" w15:restartNumberingAfterBreak="0">
     <w:nsid w:val="6D0B1F67"/>
     <w:multiLevelType w:val="multilevel"/>
     <w:tmpl w:val="CCFEE40A"/>
@@ -17027,7 +19464,7 @@
       </w:rPr>
     </w:lvl>
   </w:abstractNum>
-  <w:abstractNum w:abstractNumId="27" w15:restartNumberingAfterBreak="0">
+  <w:abstractNum w:abstractNumId="29" w15:restartNumberingAfterBreak="0">
     <w:nsid w:val="6D7E522B"/>
     <w:multiLevelType w:val="multilevel"/>
     <w:tmpl w:val="FA54FB1A"/>
@@ -17176,7 +19613,7 @@
       </w:rPr>
     </w:lvl>
   </w:abstractNum>
-  <w:abstractNum w:abstractNumId="28" w15:restartNumberingAfterBreak="0">
+  <w:abstractNum w:abstractNumId="30" w15:restartNumberingAfterBreak="0">
     <w:nsid w:val="6F95013B"/>
     <w:multiLevelType w:val="hybridMultilevel"/>
     <w:tmpl w:val="D62012BA"/>
@@ -17289,7 +19726,7 @@
       </w:rPr>
     </w:lvl>
   </w:abstractNum>
-  <w:abstractNum w:abstractNumId="29" w15:restartNumberingAfterBreak="0">
+  <w:abstractNum w:abstractNumId="31" w15:restartNumberingAfterBreak="0">
     <w:nsid w:val="73BF2D69"/>
     <w:multiLevelType w:val="multilevel"/>
     <w:tmpl w:val="B3B6CCD2"/>
@@ -17406,7 +19843,7 @@
       </w:pPr>
     </w:lvl>
   </w:abstractNum>
-  <w:abstractNum w:abstractNumId="30" w15:restartNumberingAfterBreak="0">
+  <w:abstractNum w:abstractNumId="32" w15:restartNumberingAfterBreak="0">
     <w:nsid w:val="75A3362A"/>
     <w:multiLevelType w:val="hybridMultilevel"/>
     <w:tmpl w:val="630C620C"/>
@@ -17519,7 +19956,7 @@
       </w:rPr>
     </w:lvl>
   </w:abstractNum>
-  <w:abstractNum w:abstractNumId="31" w15:restartNumberingAfterBreak="0">
+  <w:abstractNum w:abstractNumId="33" w15:restartNumberingAfterBreak="0">
     <w:nsid w:val="775E2E2D"/>
     <w:multiLevelType w:val="multilevel"/>
     <w:tmpl w:val="6F8A8C6E"/>
@@ -17668,7 +20105,7 @@
       </w:rPr>
     </w:lvl>
   </w:abstractNum>
-  <w:abstractNum w:abstractNumId="32" w15:restartNumberingAfterBreak="0">
+  <w:abstractNum w:abstractNumId="34" w15:restartNumberingAfterBreak="0">
     <w:nsid w:val="79A21BD2"/>
     <w:multiLevelType w:val="hybridMultilevel"/>
     <w:tmpl w:val="FE9422B6"/>
@@ -17781,7 +20218,7 @@
       </w:rPr>
     </w:lvl>
   </w:abstractNum>
-  <w:abstractNum w:abstractNumId="33" w15:restartNumberingAfterBreak="0">
+  <w:abstractNum w:abstractNumId="35" w15:restartNumberingAfterBreak="0">
     <w:nsid w:val="7ADF7EEB"/>
     <w:multiLevelType w:val="hybridMultilevel"/>
     <w:tmpl w:val="9F7006D2"/>
@@ -17898,19 +20335,19 @@
     <w:abstractNumId w:val="13"/>
   </w:num>
   <w:num w:numId="2">
-    <w:abstractNumId w:val="18"/>
+    <w:abstractNumId w:val="19"/>
   </w:num>
   <w:num w:numId="3">
-    <w:abstractNumId w:val="20"/>
+    <w:abstractNumId w:val="21"/>
   </w:num>
   <w:num w:numId="4">
     <w:abstractNumId w:val="1"/>
   </w:num>
   <w:num w:numId="5">
-    <w:abstractNumId w:val="19"/>
+    <w:abstractNumId w:val="20"/>
   </w:num>
   <w:num w:numId="6">
-    <w:abstractNumId w:val="30"/>
+    <w:abstractNumId w:val="32"/>
   </w:num>
   <w:num w:numId="7">
     <w:abstractNumId w:val="5"/>
@@ -17919,16 +20356,16 @@
     <w:abstractNumId w:val="8"/>
   </w:num>
   <w:num w:numId="9">
-    <w:abstractNumId w:val="31"/>
+    <w:abstractNumId w:val="33"/>
   </w:num>
   <w:num w:numId="10">
     <w:abstractNumId w:val="7"/>
   </w:num>
   <w:num w:numId="11">
-    <w:abstractNumId w:val="33"/>
+    <w:abstractNumId w:val="35"/>
   </w:num>
   <w:num w:numId="12">
-    <w:abstractNumId w:val="22"/>
+    <w:abstractNumId w:val="24"/>
   </w:num>
   <w:num w:numId="13">
     <w:abstractNumId w:val="3"/>
@@ -17937,31 +20374,31 @@
     <w:abstractNumId w:val="15"/>
   </w:num>
   <w:num w:numId="15">
-    <w:abstractNumId w:val="17"/>
+    <w:abstractNumId w:val="18"/>
   </w:num>
   <w:num w:numId="16">
-    <w:abstractNumId w:val="32"/>
+    <w:abstractNumId w:val="34"/>
   </w:num>
   <w:num w:numId="17">
-    <w:abstractNumId w:val="23"/>
+    <w:abstractNumId w:val="25"/>
   </w:num>
   <w:num w:numId="18">
-    <w:abstractNumId w:val="26"/>
+    <w:abstractNumId w:val="28"/>
   </w:num>
   <w:num w:numId="19">
-    <w:abstractNumId w:val="25"/>
+    <w:abstractNumId w:val="27"/>
   </w:num>
   <w:num w:numId="20">
     <w:abstractNumId w:val="9"/>
   </w:num>
   <w:num w:numId="21">
-    <w:abstractNumId w:val="27"/>
+    <w:abstractNumId w:val="29"/>
   </w:num>
   <w:num w:numId="22">
     <w:abstractNumId w:val="4"/>
   </w:num>
   <w:num w:numId="23">
-    <w:abstractNumId w:val="24"/>
+    <w:abstractNumId w:val="26"/>
   </w:num>
   <w:num w:numId="24">
     <w:abstractNumId w:val="12"/>
@@ -17976,7 +20413,7 @@
     <w:abstractNumId w:val="10"/>
   </w:num>
   <w:num w:numId="28">
-    <w:abstractNumId w:val="21"/>
+    <w:abstractNumId w:val="23"/>
   </w:num>
   <w:num w:numId="29">
     <w:abstractNumId w:val="14"/>
@@ -17988,12 +20425,18 @@
     <w:abstractNumId w:val="6"/>
   </w:num>
   <w:num w:numId="32">
-    <w:abstractNumId w:val="28"/>
+    <w:abstractNumId w:val="30"/>
   </w:num>
   <w:num w:numId="33">
-    <w:abstractNumId w:val="29"/>
+    <w:abstractNumId w:val="31"/>
   </w:num>
   <w:num w:numId="34">
+    <w:abstractNumId w:val="17"/>
+  </w:num>
+  <w:num w:numId="35">
+    <w:abstractNumId w:val="22"/>
+  </w:num>
+  <w:num w:numId="36">
     <w:abstractNumId w:val="16"/>
   </w:num>
 </w:numbering>

</xml_diff>